<commit_message>
added some more notes to report
</commit_message>
<xml_diff>
--- a/Technical Development Report.docx
+++ b/Technical Development Report.docx
@@ -1934,7 +1934,6 @@
           <w:id w:val="1226797730"/>
           <w:citation/>
         </w:sdtPr>
-        <w:sdtEndPr/>
         <w:sdtContent>
           <w:r>
             <w:fldChar w:fldCharType="begin"/>
@@ -1979,7 +1978,6 @@
           <w:id w:val="1390226164"/>
           <w:citation/>
         </w:sdtPr>
-        <w:sdtEndPr/>
         <w:sdtContent>
           <w:r>
             <w:fldChar w:fldCharType="begin"/>
@@ -3489,6 +3487,58 @@
       </w:r>
     </w:p>
     <w:p/>
+    <w:p/>
+    <w:p>
+      <w:pPr>
+        <w:pStyle w:val="Heading2"/>
+      </w:pPr>
+      <w:r>
+        <w:t>Implementation</w:t>
+      </w:r>
+    </w:p>
+    <w:p>
+      <w:pPr>
+        <w:pStyle w:val="Heading3"/>
+      </w:pPr>
+      <w:r>
+        <w:t>Particle settings</w:t>
+      </w:r>
+    </w:p>
+    <w:p>
+      <w:pPr>
+        <w:pStyle w:val="Heading3"/>
+      </w:pPr>
+      <w:r>
+        <w:t>Particle spawner</w:t>
+      </w:r>
+    </w:p>
+    <w:p>
+      <w:pPr>
+        <w:pStyle w:val="Heading3"/>
+      </w:pPr>
+      <w:r>
+        <w:t>Pressure</w:t>
+      </w:r>
+    </w:p>
+    <w:p>
+      <w:pPr>
+        <w:pStyle w:val="Heading3"/>
+      </w:pPr>
+      <w:r>
+        <w:t>Viscosity</w:t>
+      </w:r>
+    </w:p>
+    <w:p>
+      <w:pPr>
+        <w:pStyle w:val="Heading3"/>
+      </w:pPr>
+      <w:r>
+        <w:t>Surface tension</w:t>
+      </w:r>
+    </w:p>
+    <w:p/>
+    <w:p/>
+    <w:p/>
     <w:p>
       <w:pPr>
         <w:pStyle w:val="Heading1"/>
@@ -4275,7 +4325,6 @@
           <w:docPartUnique/>
         </w:docPartObj>
       </w:sdtPr>
-      <w:sdtEndPr/>
       <w:sdtContent>
         <w:p>
           <w:pPr>
@@ -4291,7 +4340,6 @@
             <w:id w:val="-573587230"/>
             <w:bibliography/>
           </w:sdtPr>
-          <w:sdtEndPr/>
           <w:sdtContent>
             <w:p>
               <w:pPr>

</xml_diff>

<commit_message>
report writing - context mostly done
</commit_message>
<xml_diff>
--- a/Technical Development Report.docx
+++ b/Technical Development Report.docx
@@ -252,7 +252,15 @@
           <w:sz w:val="40"/>
           <w:szCs w:val="40"/>
         </w:rPr>
-        <w:t>: #######</w:t>
+        <w:t xml:space="preserve">: </w:t>
+      </w:r>
+      <w:r>
+        <w:rPr>
+          <w:rFonts w:ascii="Arial" w:hAnsi="Arial" w:cs="Arial"/>
+          <w:sz w:val="40"/>
+          <w:szCs w:val="40"/>
+        </w:rPr>
+        <w:t>2307552</w:t>
       </w:r>
     </w:p>
     <w:p>
@@ -380,37 +388,6 @@
     </w:p>
     <w:p>
       <w:pPr>
-        <w:pStyle w:val="Quote"/>
-      </w:pPr>
-      <w:r>
-        <w:t xml:space="preserve">Delete as applicable, to put credit where it’s due and help avoid any impression of academic misconduct. You </w:t>
-      </w:r>
-      <w:r>
-        <w:t>must</w:t>
-      </w:r>
-      <w:r>
-        <w:t xml:space="preserve"> use external sources as described in the assignment materials and the </w:t>
-      </w:r>
-      <w:proofErr w:type="gramStart"/>
-      <w:r>
-        <w:t xml:space="preserve">course, </w:t>
-      </w:r>
-      <w:r>
-        <w:t>and</w:t>
-      </w:r>
-      <w:proofErr w:type="gramEnd"/>
-      <w:r>
-        <w:t xml:space="preserve"> </w:t>
-      </w:r>
-      <w:r>
-        <w:t xml:space="preserve">must make sure </w:t>
-      </w:r>
-      <w:r>
-        <w:t>that the text of the report is properly attributed, where it is not yours.</w:t>
-      </w:r>
-    </w:p>
-    <w:p>
-      <w:pPr>
         <w:rPr>
           <w:b/>
           <w:bCs/>
@@ -450,74 +427,6 @@
       <w:r>
         <w:t>I have used no AI tools in the creation of the report or the artefact.</w:t>
       </w:r>
-    </w:p>
-    <w:p>
-      <w:pPr>
-        <w:pStyle w:val="Quote"/>
-      </w:pPr>
-      <w:r>
-        <w:t xml:space="preserve">Delete as applicable: you might keep only the last </w:t>
-      </w:r>
-      <w:proofErr w:type="gramStart"/>
-      <w:r>
-        <w:t>statement, or</w:t>
-      </w:r>
-      <w:proofErr w:type="gramEnd"/>
-      <w:r>
-        <w:t xml:space="preserve"> use any combination of the others.</w:t>
-      </w:r>
-    </w:p>
-    <w:p>
-      <w:pPr>
-        <w:pStyle w:val="Quote"/>
-      </w:pPr>
-      <w:r>
-        <w:t xml:space="preserve">Please note the university’s guide to the use of AI in studies, at </w:t>
-      </w:r>
-      <w:hyperlink r:id="rId12" w:history="1">
-        <w:r>
-          <w:t>https://anglia.libguides.com/ai</w:t>
-        </w:r>
-      </w:hyperlink>
-      <w:r>
-        <w:t>. Our tools tend to flag AI-generated text and prompt us to investigate whether it is your work: failure to acknowledge the tools you’ve used is likely to result in an Academic Misconduct investigation, which may delay your results and progression/graduation or could result in penalties per the regulations on AM.</w:t>
-      </w:r>
-    </w:p>
-    <w:p>
-      <w:pPr>
-        <w:pStyle w:val="Quote"/>
-      </w:pPr>
-      <w:r>
-        <w:t xml:space="preserve">Make sure that there is enough of your work in your report. AI </w:t>
-      </w:r>
-      <w:proofErr w:type="gramStart"/>
-      <w:r>
-        <w:t>has a tendency to</w:t>
-      </w:r>
-      <w:proofErr w:type="gramEnd"/>
-      <w:r>
-        <w:t xml:space="preserve"> speak generally and may have difficulties commenting on the specifics of your investigation. This may make it difficult to get the marks you deserve. You must still make sure substantive statements (especially in the </w:t>
-      </w:r>
-      <w:r>
-        <w:t>literature review sections</w:t>
-      </w:r>
-      <w:r>
-        <w:t>) are supported by cited evidence.</w:t>
-      </w:r>
-      <w:bookmarkEnd w:id="2"/>
-    </w:p>
-    <w:p>
-      <w:pPr>
-        <w:pStyle w:val="Quote"/>
-        <w:sectPr>
-          <w:headerReference w:type="default" r:id="rId13"/>
-          <w:footerReference w:type="default" r:id="rId14"/>
-          <w:pgSz w:w="11906" w:h="16838"/>
-          <w:pgMar w:top="1440" w:right="1440" w:bottom="1440" w:left="1440" w:header="708" w:footer="708" w:gutter="0"/>
-          <w:pgNumType w:start="1"/>
-          <w:cols w:space="720"/>
-        </w:sectPr>
-      </w:pPr>
     </w:p>
     <w:p>
       <w:pPr>
@@ -526,6 +435,7 @@
       <w:bookmarkStart w:id="6" w:name="_Toc221287546"/>
       <w:bookmarkStart w:id="7" w:name="_Toc20846673"/>
       <w:bookmarkStart w:id="8" w:name="_Toc56439735"/>
+      <w:bookmarkEnd w:id="2"/>
       <w:bookmarkEnd w:id="3"/>
       <w:bookmarkEnd w:id="4"/>
       <w:r>
@@ -1892,6 +1802,27 @@
         <w:t>Introduction</w:t>
       </w:r>
       <w:bookmarkEnd w:id="10"/>
+      <w:r>
+        <w:t xml:space="preserve"> – </w:t>
+      </w:r>
+      <w:r>
+        <w:rPr>
+          <w:color w:val="70AD47" w:themeColor="accent6"/>
+        </w:rPr>
+        <w:t>22</w:t>
+      </w:r>
+      <w:r>
+        <w:rPr>
+          <w:color w:val="70AD47" w:themeColor="accent6"/>
+        </w:rPr>
+        <w:t>9</w:t>
+      </w:r>
+      <w:r>
+        <w:rPr>
+          <w:color w:val="70AD47" w:themeColor="accent6"/>
+        </w:rPr>
+        <w:t>w</w:t>
+      </w:r>
     </w:p>
     <w:p>
       <w:r>
@@ -1901,7 +1832,13 @@
         <w:t>complex system</w:t>
       </w:r>
       <w:r>
-        <w:t xml:space="preserve"> used to model the behaviour of liquids and gases, with applications across industries including aerospace, automotive, energy, and HVAC. CFD </w:t>
+        <w:t xml:space="preserve"> used to model the behaviour of liquids and gases, with applications across industries including aerospace, automotive, energy,</w:t>
+      </w:r>
+      <w:r>
+        <w:t xml:space="preserve"> water-treatment</w:t>
+      </w:r>
+      <w:r>
+        <w:t xml:space="preserve"> and HVAC. CFD </w:t>
       </w:r>
       <w:r>
         <w:t>is</w:t>
@@ -2017,7 +1954,13 @@
     </w:p>
     <w:p>
       <w:r>
-        <w:t xml:space="preserve">A key consideration when creating a CFD model is the computational cost associated with simulating thousands of particles and </w:t>
+        <w:t xml:space="preserve">A key consideration when creating a CFD model is the computational cost associated with simulating </w:t>
+      </w:r>
+      <w:r>
+        <w:t>many</w:t>
+      </w:r>
+      <w:r>
+        <w:t xml:space="preserve"> particles and </w:t>
       </w:r>
       <w:r>
         <w:t>interactions</w:t>
@@ -2032,16 +1975,31 @@
         <w:t>investigate</w:t>
       </w:r>
       <w:r>
-        <w:t xml:space="preserve"> how CFD models have previously been implemented, with the aim of identifying methods to improve computational efficiency and enable the modelling of larger, more complex systems.</w:t>
+        <w:t xml:space="preserve"> how CFD models have previously been implemented, with the aim of </w:t>
+      </w:r>
+      <w:r>
+        <w:t>understanding practical applications of CFD</w:t>
+      </w:r>
+      <w:r>
+        <w:t>,</w:t>
       </w:r>
       <w:r>
         <w:t xml:space="preserve"> </w:t>
       </w:r>
       <w:r>
+        <w:t>identifying methods to improve computational efficiency and enable the modelling of larger, more complex systems.</w:t>
+      </w:r>
+      <w:r>
+        <w:t xml:space="preserve"> </w:t>
+      </w:r>
+      <w:r>
         <w:t xml:space="preserve">A model of 2D fluid dynamics </w:t>
       </w:r>
       <w:r>
-        <w:t xml:space="preserve">will be created alongside this report and </w:t>
+        <w:t xml:space="preserve">has been </w:t>
+      </w:r>
+      <w:r>
+        <w:t xml:space="preserve">created alongside this report and </w:t>
       </w:r>
       <w:r>
         <w:t>is provided</w:t>
@@ -2053,7 +2011,13 @@
         <w:t xml:space="preserve"> this</w:t>
       </w:r>
       <w:r>
-        <w:t xml:space="preserve"> uses a Euler-Lagrangian method</w:t>
+        <w:t xml:space="preserve"> uses a </w:t>
+      </w:r>
+      <w:r>
+        <w:rPr>
+          <w:color w:val="EE0000"/>
+        </w:rPr>
+        <w:t>Euler-Lagrangian method</w:t>
       </w:r>
       <w:r>
         <w:t xml:space="preserve">, with each </w:t>
@@ -2070,274 +2034,61 @@
     </w:p>
     <w:p>
       <w:pPr>
-        <w:rPr>
-          <w:color w:val="70AD47" w:themeColor="accent6"/>
-        </w:rPr>
-      </w:pPr>
-      <w:r>
-        <w:rPr>
-          <w:color w:val="70AD47" w:themeColor="accent6"/>
-        </w:rPr>
-        <w:t>224</w:t>
-      </w:r>
-      <w:r>
-        <w:rPr>
-          <w:color w:val="70AD47" w:themeColor="accent6"/>
-        </w:rPr>
-        <w:t xml:space="preserve"> words</w:t>
-      </w:r>
-    </w:p>
-    <w:p>
-      <w:pPr>
-        <w:rPr>
-          <w:color w:val="7030A0"/>
-        </w:rPr>
-      </w:pPr>
-      <w:r>
-        <w:rPr>
-          <w:color w:val="7030A0"/>
-        </w:rPr>
-        <w:t>A brief introduction section (~200 words) prepares the reader for an appropriate investigation to improve your skills, with a clear idea of what you want to discover.</w:t>
-      </w:r>
-      <w:r>
-        <w:rPr>
-          <w:color w:val="7030A0"/>
-        </w:rPr>
-        <w:br/>
-        <w:t>The report in general is presented effectively, either for a professional or academic audience, with sensible use of diagrams or other figures where appropriate.</w:t>
-      </w:r>
-    </w:p>
-    <w:p>
-      <w:pPr>
-        <w:suppressAutoHyphens w:val="0"/>
+        <w:pStyle w:val="Heading1"/>
       </w:pPr>
       <w:bookmarkStart w:id="11" w:name="_Toc88436908"/>
-      <w:r>
-        <w:br w:type="page"/>
-      </w:r>
-    </w:p>
-    <w:p>
-      <w:pPr>
-        <w:suppressAutoHyphens w:val="0"/>
-      </w:pPr>
-    </w:p>
-    <w:p>
-      <w:pPr>
-        <w:suppressAutoHyphens w:val="0"/>
-        <w:rPr>
-          <w:rFonts w:eastAsia="Times New Roman"/>
-          <w:color w:val="EE0000"/>
-          <w:sz w:val="40"/>
-          <w:szCs w:val="40"/>
-        </w:rPr>
-      </w:pPr>
-      <w:r>
-        <w:rPr>
-          <w:rFonts w:eastAsia="Times New Roman"/>
-          <w:color w:val="EE0000"/>
-          <w:sz w:val="40"/>
-          <w:szCs w:val="40"/>
-        </w:rPr>
-        <w:t xml:space="preserve">Look into: </w:t>
-      </w:r>
-      <w:r>
-        <w:rPr>
-          <w:rFonts w:eastAsia="Times New Roman"/>
-          <w:color w:val="EE0000"/>
-          <w:sz w:val="40"/>
-          <w:szCs w:val="40"/>
-        </w:rPr>
-        <w:t>Navier-Stokes equations</w:t>
-      </w:r>
-    </w:p>
-    <w:p>
-      <w:pPr>
-        <w:suppressAutoHyphens w:val="0"/>
-        <w:rPr>
-          <w:rFonts w:eastAsia="Times New Roman"/>
-          <w:color w:val="EE0000"/>
-          <w:sz w:val="40"/>
-          <w:szCs w:val="40"/>
-        </w:rPr>
-      </w:pPr>
-      <w:r>
-        <w:rPr>
-          <w:rFonts w:eastAsia="Times New Roman"/>
-          <w:color w:val="EE0000"/>
-          <w:sz w:val="40"/>
-          <w:szCs w:val="40"/>
-        </w:rPr>
-        <w:t>Compute shaders</w:t>
-      </w:r>
-    </w:p>
-    <w:p>
-      <w:pPr>
-        <w:suppressAutoHyphens w:val="0"/>
-        <w:rPr>
-          <w:rFonts w:eastAsia="Times New Roman"/>
-          <w:color w:val="EE0000"/>
-          <w:sz w:val="40"/>
-          <w:szCs w:val="40"/>
-        </w:rPr>
-      </w:pPr>
-    </w:p>
-    <w:p>
-      <w:pPr>
-        <w:suppressAutoHyphens w:val="0"/>
-        <w:rPr>
-          <w:rFonts w:eastAsia="Times New Roman"/>
-          <w:b/>
-          <w:bCs/>
-          <w:color w:val="EE0000"/>
-          <w:sz w:val="40"/>
-          <w:szCs w:val="40"/>
-        </w:rPr>
-      </w:pPr>
-      <w:r>
-        <w:rPr>
-          <w:rFonts w:eastAsia="Times New Roman"/>
-          <w:b/>
-          <w:bCs/>
-          <w:color w:val="EE0000"/>
-          <w:sz w:val="40"/>
-          <w:szCs w:val="40"/>
-        </w:rPr>
-        <w:t>Requirements</w:t>
-      </w:r>
-    </w:p>
-    <w:p>
-      <w:pPr>
-        <w:pStyle w:val="ListParagraph"/>
-        <w:numPr>
-          <w:ilvl w:val="0"/>
-          <w:numId w:val="4"/>
-        </w:numPr>
-        <w:suppressAutoHyphens w:val="0"/>
-        <w:rPr>
-          <w:rFonts w:eastAsia="Times New Roman"/>
-          <w:color w:val="EE0000"/>
-          <w:sz w:val="40"/>
-          <w:szCs w:val="40"/>
-        </w:rPr>
-      </w:pPr>
-      <w:r>
-        <w:rPr>
-          <w:rFonts w:eastAsia="Times New Roman"/>
-          <w:color w:val="EE0000"/>
-          <w:sz w:val="40"/>
-          <w:szCs w:val="40"/>
-        </w:rPr>
-        <w:t>Grid based system</w:t>
-      </w:r>
-    </w:p>
-    <w:p>
-      <w:pPr>
-        <w:pStyle w:val="ListParagraph"/>
-        <w:numPr>
-          <w:ilvl w:val="1"/>
-          <w:numId w:val="4"/>
-        </w:numPr>
-        <w:suppressAutoHyphens w:val="0"/>
-        <w:rPr>
-          <w:rFonts w:eastAsia="Times New Roman"/>
-          <w:color w:val="EE0000"/>
-          <w:sz w:val="40"/>
-          <w:szCs w:val="40"/>
-        </w:rPr>
-      </w:pPr>
-      <w:r>
-        <w:rPr>
-          <w:rFonts w:eastAsia="Times New Roman"/>
-          <w:color w:val="EE0000"/>
-          <w:sz w:val="40"/>
-          <w:szCs w:val="40"/>
-        </w:rPr>
-        <w:t>Split area into grid cells, these will be stored in the grid</w:t>
-      </w:r>
-    </w:p>
-    <w:p>
-      <w:pPr>
-        <w:pStyle w:val="ListParagraph"/>
-        <w:numPr>
-          <w:ilvl w:val="1"/>
-          <w:numId w:val="4"/>
-        </w:numPr>
-        <w:suppressAutoHyphens w:val="0"/>
-        <w:rPr>
-          <w:rFonts w:eastAsia="Times New Roman"/>
-          <w:color w:val="EE0000"/>
-          <w:sz w:val="40"/>
-          <w:szCs w:val="40"/>
-        </w:rPr>
-      </w:pPr>
-      <w:r>
-        <w:rPr>
-          <w:rFonts w:eastAsia="Times New Roman"/>
-          <w:color w:val="EE0000"/>
-          <w:sz w:val="40"/>
-          <w:szCs w:val="40"/>
-        </w:rPr>
-        <w:t xml:space="preserve">Var: position, particles inside, </w:t>
-      </w:r>
-      <w:proofErr w:type="spellStart"/>
-      <w:r>
-        <w:rPr>
-          <w:rFonts w:eastAsia="Times New Roman"/>
-          <w:color w:val="EE0000"/>
-          <w:sz w:val="40"/>
-          <w:szCs w:val="40"/>
-        </w:rPr>
-        <w:t>avgdensity</w:t>
-      </w:r>
-      <w:proofErr w:type="spellEnd"/>
-    </w:p>
-    <w:p>
-      <w:pPr>
-        <w:pStyle w:val="ListParagraph"/>
-        <w:numPr>
-          <w:ilvl w:val="0"/>
-          <w:numId w:val="4"/>
-        </w:numPr>
-        <w:suppressAutoHyphens w:val="0"/>
-        <w:rPr>
-          <w:rFonts w:eastAsia="Times New Roman"/>
-          <w:color w:val="EE0000"/>
-          <w:sz w:val="40"/>
-          <w:szCs w:val="40"/>
-        </w:rPr>
-      </w:pPr>
-      <w:r>
-        <w:rPr>
-          <w:rFonts w:eastAsia="Times New Roman"/>
-          <w:color w:val="EE0000"/>
-          <w:sz w:val="40"/>
-          <w:szCs w:val="40"/>
-        </w:rPr>
-        <w:t>Particle simulating</w:t>
-      </w:r>
-    </w:p>
-    <w:p>
-      <w:pPr>
-        <w:suppressAutoHyphens w:val="0"/>
-        <w:rPr>
-          <w:rFonts w:eastAsia="Times New Roman"/>
-          <w:color w:val="EE0000"/>
-          <w:sz w:val="40"/>
-          <w:szCs w:val="40"/>
-        </w:rPr>
-      </w:pPr>
-      <w:r>
-        <w:rPr>
-          <w:rFonts w:eastAsia="Times New Roman"/>
-          <w:color w:val="EE0000"/>
-          <w:sz w:val="40"/>
-          <w:szCs w:val="40"/>
+      <w:bookmarkStart w:id="12" w:name="_Toc221287549"/>
+      <w:r>
+        <w:lastRenderedPageBreak/>
+        <w:t>Context</w:t>
+      </w:r>
+      <w:bookmarkEnd w:id="12"/>
+    </w:p>
+    <w:p>
+      <w:pPr>
+        <w:pStyle w:val="Heading2"/>
+      </w:pPr>
+      <w:r>
+        <w:t xml:space="preserve">CFD: </w:t>
+      </w:r>
+      <w:r>
+        <w:t>The Why</w:t>
+      </w:r>
+    </w:p>
+    <w:p>
+      <w:r>
+        <w:t>When considering the practical uses for CFD, there are three main reasons</w:t>
+      </w:r>
+      <w:r>
+        <w:t>, to save time, to save costs, and to obtain more optimal processes.</w:t>
+      </w:r>
+      <w:r>
+        <w:t xml:space="preserve"> </w:t>
+      </w:r>
+      <w:r>
+        <w:t>Fig1 (below) shows a matrix given by</w:t>
+      </w:r>
+      <w:r>
+        <w:t xml:space="preserve"> Auden</w:t>
+      </w:r>
+      <w:r>
+        <w:t>aert which outlines these.</w:t>
+      </w:r>
+    </w:p>
+    <w:p/>
+    <w:p>
+      <w:pPr>
+        <w:keepNext/>
+      </w:pPr>
+      <w:r>
+        <w:rPr>
+          <w:noProof/>
         </w:rPr>
         <w:drawing>
-          <wp:inline distT="0" distB="0" distL="0" distR="0" wp14:anchorId="36D1B440" wp14:editId="25FCDDEF">
-            <wp:extent cx="4944165" cy="990738"/>
-            <wp:effectExtent l="0" t="0" r="8890" b="0"/>
-            <wp:docPr id="426547623" name="Picture 1"/>
+          <wp:inline distT="0" distB="0" distL="0" distR="0" wp14:anchorId="45EDCF54" wp14:editId="00835A2F">
+            <wp:extent cx="5731510" cy="2109470"/>
+            <wp:effectExtent l="0" t="0" r="2540" b="5080"/>
+            <wp:docPr id="1334483550" name="Picture 2" descr="The advantages of CFD in terms of cost, time saving and optimal process design"/>
             <wp:cNvGraphicFramePr>
               <a:graphicFrameLocks xmlns:a="http://schemas.openxmlformats.org/drawingml/2006/main" noChangeAspect="1"/>
             </wp:cNvGraphicFramePr>
@@ -2345,23 +2096,36 @@
               <a:graphicData uri="http://schemas.openxmlformats.org/drawingml/2006/picture">
                 <pic:pic xmlns:pic="http://schemas.openxmlformats.org/drawingml/2006/picture">
                   <pic:nvPicPr>
-                    <pic:cNvPr id="426547623" name=""/>
-                    <pic:cNvPicPr/>
+                    <pic:cNvPr id="0" name="Picture 1" descr="The advantages of CFD in terms of cost, time saving and optimal process design"/>
+                    <pic:cNvPicPr>
+                      <a:picLocks noChangeAspect="1" noChangeArrowheads="1"/>
+                    </pic:cNvPicPr>
                   </pic:nvPicPr>
                   <pic:blipFill>
-                    <a:blip r:embed="rId15"/>
+                    <a:blip r:embed="rId12" cstate="print">
+                      <a:extLst>
+                        <a:ext uri="{28A0092B-C50C-407E-A947-70E740481C1C}">
+                          <a14:useLocalDpi xmlns:a14="http://schemas.microsoft.com/office/drawing/2010/main" val="0"/>
+                        </a:ext>
+                      </a:extLst>
+                    </a:blip>
+                    <a:srcRect/>
                     <a:stretch>
                       <a:fillRect/>
                     </a:stretch>
                   </pic:blipFill>
-                  <pic:spPr>
+                  <pic:spPr bwMode="auto">
                     <a:xfrm>
                       <a:off x="0" y="0"/>
-                      <a:ext cx="4944165" cy="990738"/>
+                      <a:ext cx="5731510" cy="2109470"/>
                     </a:xfrm>
                     <a:prstGeom prst="rect">
                       <a:avLst/>
                     </a:prstGeom>
+                    <a:noFill/>
+                    <a:ln>
+                      <a:noFill/>
+                    </a:ln>
                   </pic:spPr>
                 </pic:pic>
               </a:graphicData>
@@ -2372,507 +2136,1491 @@
     </w:p>
     <w:p>
       <w:pPr>
-        <w:suppressAutoHyphens w:val="0"/>
-        <w:rPr>
-          <w:rFonts w:eastAsia="Times New Roman"/>
-          <w:color w:val="EE0000"/>
-          <w:sz w:val="40"/>
-          <w:szCs w:val="40"/>
-        </w:rPr>
-      </w:pPr>
-    </w:p>
-    <w:p>
-      <w:pPr>
-        <w:suppressAutoHyphens w:val="0"/>
-        <w:rPr>
-          <w:rFonts w:eastAsia="Times New Roman"/>
-          <w:color w:val="EE0000"/>
-          <w:sz w:val="40"/>
-          <w:szCs w:val="40"/>
-        </w:rPr>
-      </w:pPr>
-      <w:r>
-        <w:rPr>
-          <w:rFonts w:eastAsia="Times New Roman"/>
-          <w:color w:val="EE0000"/>
-          <w:sz w:val="40"/>
-          <w:szCs w:val="40"/>
-        </w:rPr>
-        <w:t>Where:</w:t>
-      </w:r>
-    </w:p>
-    <w:p>
-      <w:pPr>
+        <w:pStyle w:val="Caption"/>
+      </w:pPr>
+      <w:r>
+        <w:t xml:space="preserve">Figure </w:t>
+      </w:r>
+      <w:r>
+        <w:fldChar w:fldCharType="begin"/>
+      </w:r>
+      <w:r>
+        <w:instrText xml:space="preserve"> SEQ Figure \* ARABIC </w:instrText>
+      </w:r>
+      <w:r>
+        <w:fldChar w:fldCharType="separate"/>
+      </w:r>
+      <w:r>
+        <w:rPr>
+          <w:noProof/>
+        </w:rPr>
+        <w:t>1</w:t>
+      </w:r>
+      <w:r>
+        <w:fldChar w:fldCharType="end"/>
+      </w:r>
+      <w:r>
+        <w:t xml:space="preserve"> </w:t>
+      </w:r>
+      <w:r>
+        <w:t>The three reasons why water technologists use advanced CFD</w:t>
+      </w:r>
+      <w:r>
+        <w:t xml:space="preserve"> </w:t>
+      </w:r>
+      <w:sdt>
+        <w:sdtPr>
+          <w:id w:val="1336428368"/>
+          <w:citation/>
+        </w:sdtPr>
+        <w:sdtEndPr>
+          <w:rPr>
+            <w:highlight w:val="yellow"/>
+          </w:rPr>
+        </w:sdtEndPr>
+        <w:sdtContent>
+          <w:r>
+            <w:rPr>
+              <w:highlight w:val="yellow"/>
+            </w:rPr>
+            <w:fldChar w:fldCharType="begin"/>
+          </w:r>
+          <w:r>
+            <w:rPr>
+              <w:highlight w:val="yellow"/>
+              <w:lang w:val="en-US"/>
+            </w:rPr>
+            <w:instrText xml:space="preserve"> CITATION Aud23 \l 1033 </w:instrText>
+          </w:r>
+          <w:r>
+            <w:rPr>
+              <w:highlight w:val="yellow"/>
+            </w:rPr>
+            <w:fldChar w:fldCharType="separate"/>
+          </w:r>
+          <w:r>
+            <w:rPr>
+              <w:noProof/>
+              <w:highlight w:val="yellow"/>
+              <w:lang w:val="en-US"/>
+            </w:rPr>
+            <w:t>(Audenaert, 2023)</w:t>
+          </w:r>
+          <w:r>
+            <w:rPr>
+              <w:highlight w:val="yellow"/>
+            </w:rPr>
+            <w:fldChar w:fldCharType="end"/>
+          </w:r>
+        </w:sdtContent>
+      </w:sdt>
+    </w:p>
+    <w:p>
+      <w:pPr>
+        <w:pStyle w:val="Heading3"/>
+      </w:pPr>
+      <w:r>
+        <w:t>Saving Time</w:t>
+      </w:r>
+    </w:p>
+    <w:p>
+      <w:r>
+        <w:t xml:space="preserve">By using a computer model for fluid flows, it is more time efficient to test different </w:t>
+      </w:r>
+      <w:r>
+        <w:t xml:space="preserve">design </w:t>
+      </w:r>
+      <w:r>
+        <w:t xml:space="preserve">scenarios in the easily configurable environment of a </w:t>
+      </w:r>
+      <w:r>
+        <w:t>computer-based</w:t>
+      </w:r>
+      <w:r>
+        <w:t xml:space="preserve"> model when compared to building real-world systems</w:t>
+      </w:r>
+      <w:r>
+        <w:t xml:space="preserve">, additionally when constructing or commercialising a </w:t>
+      </w:r>
+      <w:r>
+        <w:t>new design</w:t>
+      </w:r>
+      <w:r>
+        <w:t xml:space="preserve"> it will be </w:t>
+      </w:r>
+      <w:r>
+        <w:t>faster</w:t>
+      </w:r>
+      <w:r>
+        <w:t xml:space="preserve"> and more efficient.</w:t>
+      </w:r>
+    </w:p>
+    <w:p>
+      <w:pPr>
+        <w:pStyle w:val="Heading3"/>
+      </w:pPr>
+      <w:r>
+        <w:t>Saving Costs</w:t>
+      </w:r>
+    </w:p>
+    <w:p>
+      <w:r>
+        <w:t xml:space="preserve">By not having to spend time and money on the manufacturing and implementation of a design before it has been validated it can save considerable amounts of money to the engineering </w:t>
+      </w:r>
+      <w:r>
+        <w:t>process and</w:t>
+      </w:r>
+      <w:r>
+        <w:t xml:space="preserve"> can reduce experimental testing down to fewer real-world scenarios. </w:t>
+      </w:r>
+    </w:p>
+    <w:p>
+      <w:pPr>
+        <w:rPr>
+          <w:lang w:val="en-US"/>
+        </w:rPr>
+      </w:pPr>
+      <w:r>
+        <w:t xml:space="preserve">Testing of different design structures can be used to get the most efficient placements of the components of the design, for example </w:t>
+      </w:r>
+      <w:r>
+        <w:t xml:space="preserve">testing placement of pumps, and mixers in a larger water system to determine </w:t>
+      </w:r>
+      <w:r>
+        <w:t xml:space="preserve">where, and how many are required to achieve the desired outcome, this could allow reducing the total amount of pumps required, or determining at which flow rates a given pump can be switched off to reduce </w:t>
+      </w:r>
+      <w:proofErr w:type="spellStart"/>
+      <w:r>
+        <w:rPr>
+          <w:lang w:val="en-US"/>
+        </w:rPr>
+        <w:t>CapEx</w:t>
+      </w:r>
+      <w:proofErr w:type="spellEnd"/>
+      <w:r>
+        <w:rPr>
+          <w:lang w:val="en-US"/>
+        </w:rPr>
+        <w:t xml:space="preserve"> / </w:t>
+      </w:r>
+      <w:proofErr w:type="spellStart"/>
+      <w:r>
+        <w:rPr>
+          <w:lang w:val="en-US"/>
+        </w:rPr>
+        <w:t>OpEx</w:t>
+      </w:r>
+      <w:proofErr w:type="spellEnd"/>
+      <w:r>
+        <w:rPr>
+          <w:lang w:val="en-US"/>
+        </w:rPr>
+        <w:t>.</w:t>
+      </w:r>
+    </w:p>
+    <w:p>
+      <w:pPr>
+        <w:pStyle w:val="Heading3"/>
+      </w:pPr>
+      <w:r>
+        <w:t>Obtaining Optimal Processes</w:t>
+      </w:r>
+    </w:p>
+    <w:p>
+      <w:r>
+        <w:t xml:space="preserve">The last core reason given by Audenaert is process optimisation, he shows that </w:t>
+      </w:r>
+      <w:r>
+        <w:t xml:space="preserve">the outcome of these models </w:t>
+      </w:r>
+      <w:r>
+        <w:t>‘</w:t>
+      </w:r>
+      <w:r>
+        <w:t xml:space="preserve">In two </w:t>
+      </w:r>
+      <w:proofErr w:type="spellStart"/>
+      <w:r>
+        <w:t>weeks time</w:t>
+      </w:r>
+      <w:proofErr w:type="spellEnd"/>
+      <w:r>
+        <w:t>, the optimal design was found and implemented at the plant. The plant now operates optimally with superior performance. Model accuracy was also proven using onsite data.</w:t>
+      </w:r>
+      <w:r>
+        <w:t xml:space="preserve">’ </w:t>
+      </w:r>
+      <w:sdt>
+        <w:sdtPr>
+          <w:id w:val="-1293052736"/>
+          <w:citation/>
+        </w:sdtPr>
+        <w:sdtEndPr>
+          <w:rPr>
+            <w:highlight w:val="yellow"/>
+          </w:rPr>
+        </w:sdtEndPr>
+        <w:sdtContent>
+          <w:r>
+            <w:rPr>
+              <w:highlight w:val="yellow"/>
+            </w:rPr>
+            <w:fldChar w:fldCharType="begin"/>
+          </w:r>
+          <w:r>
+            <w:rPr>
+              <w:highlight w:val="yellow"/>
+              <w:lang w:val="en-US"/>
+            </w:rPr>
+            <w:instrText xml:space="preserve"> CITATION Aud23 \l 1033 </w:instrText>
+          </w:r>
+          <w:r>
+            <w:rPr>
+              <w:highlight w:val="yellow"/>
+            </w:rPr>
+            <w:fldChar w:fldCharType="separate"/>
+          </w:r>
+          <w:r>
+            <w:rPr>
+              <w:noProof/>
+              <w:highlight w:val="yellow"/>
+              <w:lang w:val="en-US"/>
+            </w:rPr>
+            <w:t>(Audenaert, 2023)</w:t>
+          </w:r>
+          <w:r>
+            <w:rPr>
+              <w:highlight w:val="yellow"/>
+            </w:rPr>
+            <w:fldChar w:fldCharType="end"/>
+          </w:r>
+        </w:sdtContent>
+      </w:sdt>
+      <w:r>
+        <w:t>.</w:t>
+      </w:r>
+    </w:p>
+    <w:p>
+      <w:pPr>
+        <w:pStyle w:val="Heading3"/>
+      </w:pPr>
+      <w:r>
+        <w:lastRenderedPageBreak/>
+        <w:t>Addition of further variables</w:t>
+      </w:r>
+    </w:p>
+    <w:p>
+      <w:r>
+        <w:t xml:space="preserve">In addition to </w:t>
+      </w:r>
+      <w:r>
+        <w:t>the above, when simulating fluid behaviours, we can also add in extra factors and variable that extend the functionality of the model. This could include modelling how biological life in the water affects the behaviours of the larger system.</w:t>
+      </w:r>
+      <w:r>
+        <w:t xml:space="preserve"> </w:t>
+      </w:r>
+      <w:r>
+        <w:t xml:space="preserve">In general, </w:t>
+      </w:r>
+      <w:r>
+        <w:t>greater</w:t>
+      </w:r>
+      <w:r>
+        <w:t xml:space="preserve"> flexibility gives </w:t>
+      </w:r>
+      <w:r>
+        <w:t xml:space="preserve">opportunity to text a huge variety of use </w:t>
+      </w:r>
+      <w:r>
+        <w:t>cases and</w:t>
+      </w:r>
+      <w:r>
+        <w:t xml:space="preserve"> is one of the key reasons why CFD is used across so many industries.</w:t>
+      </w:r>
+    </w:p>
+    <w:p>
+      <w:pPr>
+        <w:pStyle w:val="Heading2"/>
+      </w:pPr>
+      <w:r>
+        <w:t>Use Cases of CFD</w:t>
+      </w:r>
+    </w:p>
+    <w:p>
+      <w:r>
+        <w:t>CFD</w:t>
+      </w:r>
+      <w:r>
+        <w:t xml:space="preserve"> </w:t>
+      </w:r>
+      <w:r>
+        <w:t>proves</w:t>
+      </w:r>
+      <w:r>
+        <w:t xml:space="preserve"> </w:t>
+      </w:r>
+      <w:r>
+        <w:t xml:space="preserve">a </w:t>
+      </w:r>
+      <w:r>
+        <w:t xml:space="preserve">valuable </w:t>
+      </w:r>
+      <w:r>
+        <w:t>tool that makes many engineering processes more efficient</w:t>
+      </w:r>
+      <w:r>
+        <w:t xml:space="preserve">, we see evidence of this in HVAC </w:t>
+      </w:r>
+      <w:r>
+        <w:t>as ‘</w:t>
+      </w:r>
+      <w:r>
+        <w:t>CFD can be a powerful tool for designing and optimizing fluid mechanics in a variety of use case applications.</w:t>
+      </w:r>
+      <w:r>
+        <w:t>’</w:t>
+      </w:r>
+      <w:r>
+        <w:t xml:space="preserve"> </w:t>
+      </w:r>
+      <w:sdt>
+        <w:sdtPr>
+          <w:rPr>
+            <w:highlight w:val="yellow"/>
+          </w:rPr>
+          <w:id w:val="1718555527"/>
+          <w:citation/>
+        </w:sdtPr>
+        <w:sdtContent>
+          <w:r>
+            <w:rPr>
+              <w:highlight w:val="yellow"/>
+            </w:rPr>
+            <w:fldChar w:fldCharType="begin"/>
+          </w:r>
+          <w:r>
+            <w:rPr>
+              <w:highlight w:val="yellow"/>
+              <w:lang w:val="en-US"/>
+            </w:rPr>
+            <w:instrText xml:space="preserve"> CITATION Ste23 \l 1033 </w:instrText>
+          </w:r>
+          <w:r>
+            <w:rPr>
+              <w:highlight w:val="yellow"/>
+            </w:rPr>
+            <w:fldChar w:fldCharType="separate"/>
+          </w:r>
+          <w:r>
+            <w:rPr>
+              <w:noProof/>
+              <w:highlight w:val="yellow"/>
+              <w:lang w:val="en-US"/>
+            </w:rPr>
+            <w:t>(Kenah, 2023)</w:t>
+          </w:r>
+          <w:r>
+            <w:rPr>
+              <w:highlight w:val="yellow"/>
+            </w:rPr>
+            <w:fldChar w:fldCharType="end"/>
+          </w:r>
+        </w:sdtContent>
+      </w:sdt>
+      <w:r>
+        <w:rPr>
+          <w:highlight w:val="yellow"/>
+        </w:rPr>
+        <w:t>,</w:t>
+      </w:r>
+      <w:r>
+        <w:t xml:space="preserve"> </w:t>
+      </w:r>
+      <w:r>
+        <w:t xml:space="preserve">Kenah further explains that businesses </w:t>
+      </w:r>
+      <w:r>
+        <w:t>‘</w:t>
+      </w:r>
+      <w:r>
+        <w:t>can identify potential problems, optimize system performance, and design more efficient and effective building systems.</w:t>
+      </w:r>
+      <w:r>
+        <w:t>’</w:t>
+      </w:r>
+      <w:r>
+        <w:t xml:space="preserve"> This </w:t>
+      </w:r>
+      <w:r>
+        <w:t>provides value in reducing costs to operate and maintain building systems</w:t>
+      </w:r>
+      <w:r>
+        <w:t xml:space="preserve">, and by reducing the energy cost, this reduces the impact to both the business and environment. </w:t>
+      </w:r>
+    </w:p>
+    <w:p/>
+    <w:p>
+      <w:r>
+        <w:t xml:space="preserve">In </w:t>
+      </w:r>
+      <w:r>
+        <w:t>water modelling</w:t>
+      </w:r>
+      <w:r>
+        <w:t xml:space="preserve"> CFD </w:t>
+      </w:r>
+      <w:r>
+        <w:t>is used to model how to efficiently move and process water, this is commonly used in water and wastewater treatment processes</w:t>
+      </w:r>
+      <w:r>
+        <w:t xml:space="preserve"> </w:t>
+      </w:r>
+      <w:sdt>
+        <w:sdtPr>
+          <w:id w:val="-1682968154"/>
+          <w:citation/>
+        </w:sdtPr>
+        <w:sdtEndPr>
+          <w:rPr>
+            <w:highlight w:val="yellow"/>
+          </w:rPr>
+        </w:sdtEndPr>
+        <w:sdtContent>
+          <w:r>
+            <w:rPr>
+              <w:highlight w:val="yellow"/>
+            </w:rPr>
+            <w:fldChar w:fldCharType="begin"/>
+          </w:r>
+          <w:r>
+            <w:rPr>
+              <w:highlight w:val="yellow"/>
+              <w:lang w:val="en-US"/>
+            </w:rPr>
+            <w:instrText xml:space="preserve"> CITATION Aud23 \l 1033 </w:instrText>
+          </w:r>
+          <w:r>
+            <w:rPr>
+              <w:highlight w:val="yellow"/>
+            </w:rPr>
+            <w:fldChar w:fldCharType="separate"/>
+          </w:r>
+          <w:r>
+            <w:rPr>
+              <w:noProof/>
+              <w:highlight w:val="yellow"/>
+              <w:lang w:val="en-US"/>
+            </w:rPr>
+            <w:t>(Audenaert, 2023)</w:t>
+          </w:r>
+          <w:r>
+            <w:rPr>
+              <w:highlight w:val="yellow"/>
+            </w:rPr>
+            <w:fldChar w:fldCharType="end"/>
+          </w:r>
+        </w:sdtContent>
+      </w:sdt>
+      <w:r>
+        <w:t xml:space="preserve">,  Audenaert </w:t>
+      </w:r>
+      <w:r>
+        <w:t xml:space="preserve">demonstrates how </w:t>
+      </w:r>
+      <w:r>
+        <w:t>in water storage containers we can model the flows of water from inlet to outlet which can illustrate</w:t>
+      </w:r>
+      <w:r>
+        <w:t xml:space="preserve"> how the water mixes – this provides information on how long </w:t>
+      </w:r>
+      <w:r>
+        <w:t xml:space="preserve">a given water molecule will remain in the container. </w:t>
+      </w:r>
+      <w:r>
+        <w:t>By</w:t>
+      </w:r>
+      <w:r>
+        <w:t xml:space="preserve"> modelling </w:t>
+      </w:r>
+      <w:r>
+        <w:t xml:space="preserve">this it </w:t>
+      </w:r>
+      <w:r>
+        <w:t xml:space="preserve">allows changing of a system design </w:t>
+      </w:r>
+      <w:r>
+        <w:t xml:space="preserve">to see the outcome of different inlet-outlet locations and how it affects </w:t>
+      </w:r>
+      <w:r>
+        <w:t>behaviour</w:t>
+      </w:r>
+      <w:r>
+        <w:t xml:space="preserve"> in a cheaper way than manufacturing and measuring real-world </w:t>
+      </w:r>
+      <w:r>
+        <w:t>implementations.</w:t>
+      </w:r>
+      <w:r>
+        <w:t xml:space="preserve"> </w:t>
+      </w:r>
+    </w:p>
+    <w:p/>
+    <w:p>
+      <w:r>
+        <w:t>Aerodynamics</w:t>
+      </w:r>
+    </w:p>
+    <w:p>
+      <w:pPr>
+        <w:pStyle w:val="Heading2"/>
+      </w:pPr>
+      <w:r>
+        <w:t>Navier-Stokes Equations</w:t>
+      </w:r>
+    </w:p>
+    <w:p>
+      <w:r>
+        <w:t>CFD models further allow</w:t>
+      </w:r>
+      <w:r>
+        <w:t xml:space="preserve"> testing </w:t>
+      </w:r>
+    </w:p>
+    <w:p>
+      <w:pPr>
+        <w:pStyle w:val="Heading2"/>
+      </w:pPr>
+      <w:r>
+        <w:t>Coding specific</w:t>
+      </w:r>
+    </w:p>
+    <w:p>
+      <w:pPr>
+        <w:keepNext/>
+      </w:pPr>
+      <w:r>
+        <w:t>how it relates to other techniques in your discipline.</w:t>
+      </w:r>
+    </w:p>
+    <w:p>
+      <w:pPr>
+        <w:keepNext/>
+      </w:pPr>
+      <w:r>
+        <w:t>You will want to refer to existing games that use this or similar techniques, or that demonstrate the challenge you’d like to learn to address.</w:t>
+      </w:r>
+    </w:p>
+    <w:p>
+      <w:pPr>
+        <w:rPr>
+          <w:b/>
+          <w:bCs/>
+        </w:rPr>
+      </w:pPr>
+      <w:r>
+        <w:rPr>
+          <w:b/>
+          <w:bCs/>
+        </w:rPr>
+        <w:t xml:space="preserve">Navier stokes equations </w:t>
+      </w:r>
+    </w:p>
+    <w:p/>
+    <w:p/>
+    <w:p>
+      <w:pPr>
+        <w:pStyle w:val="Heading2"/>
+      </w:pPr>
+      <w:bookmarkStart w:id="13" w:name="_Toc221287551"/>
+      <w:r>
+        <w:lastRenderedPageBreak/>
+        <w:t>Computational Fluid Dynamics</w:t>
+      </w:r>
+      <w:bookmarkEnd w:id="13"/>
+    </w:p>
+    <w:p>
+      <w:r>
+        <w:t>Hard requirements of a CFD model</w:t>
+      </w:r>
+    </w:p>
+    <w:p>
+      <w:pPr>
+        <w:pStyle w:val="ListParagraph"/>
         <w:numPr>
           <w:ilvl w:val="0"/>
-          <w:numId w:val="5"/>
+          <w:numId w:val="6"/>
         </w:numPr>
-        <w:suppressAutoHyphens w:val="0"/>
-        <w:rPr>
-          <w:rFonts w:eastAsia="Times New Roman"/>
-          <w:color w:val="EE0000"/>
-          <w:sz w:val="40"/>
-          <w:szCs w:val="40"/>
-        </w:rPr>
-      </w:pPr>
-      <m:oMath>
-        <m:r>
-          <w:rPr>
-            <w:rFonts w:ascii="Cambria Math" w:eastAsia="Times New Roman" w:hAnsi="Cambria Math"/>
-            <w:color w:val="EE0000"/>
-            <w:sz w:val="40"/>
-            <w:szCs w:val="40"/>
-          </w:rPr>
-          <m:t>i</m:t>
-        </m:r>
-      </m:oMath>
-      <w:r>
-        <w:rPr>
-          <w:rFonts w:eastAsia="Times New Roman"/>
-          <w:color w:val="EE0000"/>
-          <w:sz w:val="40"/>
-          <w:szCs w:val="40"/>
-        </w:rPr>
-        <w:t>= the particle we’re updating</w:t>
-      </w:r>
-    </w:p>
-    <w:p>
-      <w:pPr>
+      </w:pPr>
+      <w:r>
+        <w:t>pressure</w:t>
+      </w:r>
+    </w:p>
+    <w:p>
+      <w:pPr>
+        <w:pStyle w:val="ListParagraph"/>
         <w:numPr>
           <w:ilvl w:val="0"/>
-          <w:numId w:val="5"/>
+          <w:numId w:val="6"/>
         </w:numPr>
-        <w:suppressAutoHyphens w:val="0"/>
-        <w:rPr>
-          <w:rFonts w:eastAsia="Times New Roman"/>
-          <w:color w:val="EE0000"/>
-          <w:sz w:val="40"/>
-          <w:szCs w:val="40"/>
-        </w:rPr>
-      </w:pPr>
-      <m:oMath>
-        <m:r>
-          <w:rPr>
-            <w:rFonts w:ascii="Cambria Math" w:eastAsia="Times New Roman" w:hAnsi="Cambria Math"/>
-            <w:color w:val="EE0000"/>
-            <w:sz w:val="40"/>
-            <w:szCs w:val="40"/>
-          </w:rPr>
-          <m:t>j</m:t>
-        </m:r>
-      </m:oMath>
-      <w:r>
-        <w:rPr>
-          <w:rFonts w:eastAsia="Times New Roman"/>
-          <w:color w:val="EE0000"/>
-          <w:sz w:val="40"/>
-          <w:szCs w:val="40"/>
-        </w:rPr>
-        <w:t>= every neighboring particle</w:t>
-      </w:r>
-    </w:p>
-    <w:p>
-      <w:pPr>
+      </w:pPr>
+      <w:r>
+        <w:t>viscosity</w:t>
+      </w:r>
+    </w:p>
+    <w:p>
+      <w:pPr>
+        <w:pStyle w:val="ListParagraph"/>
         <w:numPr>
           <w:ilvl w:val="0"/>
-          <w:numId w:val="5"/>
+          <w:numId w:val="6"/>
         </w:numPr>
+      </w:pPr>
+      <w:r>
+        <w:t>surface tension</w:t>
+      </w:r>
+    </w:p>
+    <w:p>
+      <w:r>
+        <w:t>Smoothed particle hydrodynamics</w:t>
+      </w:r>
+    </w:p>
+    <w:p>
+      <w:pPr>
+        <w:pStyle w:val="Heading2"/>
+      </w:pPr>
+      <w:bookmarkStart w:id="14" w:name="_Toc221287553"/>
+      <w:r>
+        <w:t>Grid based system</w:t>
+      </w:r>
+      <w:bookmarkEnd w:id="14"/>
+    </w:p>
+    <w:p/>
+    <w:p>
+      <w:pPr>
+        <w:pStyle w:val="Heading2"/>
+      </w:pPr>
+      <w:bookmarkStart w:id="15" w:name="_Toc221287554"/>
+      <w:r>
+        <w:t>Particle based system</w:t>
+      </w:r>
+      <w:bookmarkEnd w:id="15"/>
+      <w:r>
+        <w:t xml:space="preserve"> </w:t>
+      </w:r>
+      <w:bookmarkStart w:id="16" w:name="_Toc221287552"/>
+    </w:p>
+    <w:p>
+      <w:pPr>
+        <w:pStyle w:val="Heading2"/>
+      </w:pPr>
+      <w:r>
+        <w:t>Time Complexities</w:t>
+      </w:r>
+      <w:bookmarkEnd w:id="16"/>
+    </w:p>
+    <w:p>
+      <w:r>
+        <w:t>https://www.youtube.com/watch?v=BgLTDT03QtU</w:t>
+      </w:r>
+    </w:p>
+    <w:p>
+      <w:r>
+        <w:t xml:space="preserve">O(1) to create and add items to a </w:t>
+      </w:r>
+      <w:proofErr w:type="spellStart"/>
+      <w:r>
+        <w:t>hashset</w:t>
+      </w:r>
+      <w:proofErr w:type="spellEnd"/>
+    </w:p>
+    <w:p>
+      <w:pPr>
+        <w:rPr>
+          <w:color w:val="EE0000"/>
+        </w:rPr>
+      </w:pPr>
+      <w:r>
+        <w:rPr>
+          <w:color w:val="EE0000"/>
+        </w:rPr>
+        <w:t>Add a table that looks a time complexities of different data structures</w:t>
+      </w:r>
+    </w:p>
+    <w:p>
+      <w:pPr>
+        <w:rPr>
+          <w:color w:val="EE0000"/>
+        </w:rPr>
+      </w:pPr>
+      <w:proofErr w:type="spellStart"/>
+      <w:r>
+        <w:rPr>
+          <w:color w:val="EE0000"/>
+        </w:rPr>
+        <w:t>Cacheing</w:t>
+      </w:r>
+      <w:proofErr w:type="spellEnd"/>
+      <w:r>
+        <w:rPr>
+          <w:color w:val="EE0000"/>
+        </w:rPr>
+        <w:t xml:space="preserve"> </w:t>
+      </w:r>
+      <w:r>
+        <w:rPr>
+          <w:color w:val="EE0000"/>
+        </w:rPr>
+        <w:t>https://www.geeksforgeeks.org/system-design/caching-system-design-concept-for-beginners/</w:t>
+      </w:r>
+    </w:p>
+    <w:p>
+      <w:pPr>
+        <w:pStyle w:val="Heading2"/>
+      </w:pPr>
+      <w:r>
+        <w:t>Performance benchmarks</w:t>
+      </w:r>
+    </w:p>
+    <w:p>
+      <w:r>
+        <w:t xml:space="preserve">Rendering a single particle </w:t>
+      </w:r>
+      <w:r>
+        <w:t>without any behaviour 250 -400fps</w:t>
+      </w:r>
+    </w:p>
+    <w:p>
+      <w:r>
+        <w:t>500 particles spawned, not interacting 190 -210fps</w:t>
+      </w:r>
+    </w:p>
+    <w:p/>
+    <w:p/>
+    <w:p>
+      <w:pPr>
+        <w:pStyle w:val="Heading1"/>
+      </w:pPr>
+    </w:p>
+    <w:p>
+      <w:r>
+        <w:rPr>
+          <w:noProof/>
+        </w:rPr>
+        <w:drawing>
+          <wp:inline distT="0" distB="0" distL="0" distR="0" wp14:anchorId="472DA9C3" wp14:editId="79BE6E3C">
+            <wp:extent cx="5731510" cy="3218180"/>
+            <wp:effectExtent l="0" t="0" r="2540" b="1270"/>
+            <wp:docPr id="2" name="Picture 2" descr="A collage of a person's head&#10;&#10;Description automatically generated with medium confidence"/>
+            <wp:cNvGraphicFramePr>
+              <a:graphicFrameLocks xmlns:a="http://schemas.openxmlformats.org/drawingml/2006/main" noChangeAspect="1"/>
+            </wp:cNvGraphicFramePr>
+            <a:graphic xmlns:a="http://schemas.openxmlformats.org/drawingml/2006/main">
+              <a:graphicData uri="http://schemas.openxmlformats.org/drawingml/2006/picture">
+                <pic:pic xmlns:pic="http://schemas.openxmlformats.org/drawingml/2006/picture">
+                  <pic:nvPicPr>
+                    <pic:cNvPr id="2" name="Picture 2" descr="A collage of a person's head&#10;&#10;Description automatically generated with medium confidence"/>
+                    <pic:cNvPicPr>
+                      <a:picLocks noChangeAspect="1" noChangeArrowheads="1"/>
+                    </pic:cNvPicPr>
+                  </pic:nvPicPr>
+                  <pic:blipFill>
+                    <a:blip r:embed="rId13">
+                      <a:extLst>
+                        <a:ext uri="{28A0092B-C50C-407E-A947-70E740481C1C}">
+                          <a14:useLocalDpi xmlns:a14="http://schemas.microsoft.com/office/drawing/2010/main" val="0"/>
+                        </a:ext>
+                      </a:extLst>
+                    </a:blip>
+                    <a:srcRect/>
+                    <a:stretch>
+                      <a:fillRect/>
+                    </a:stretch>
+                  </pic:blipFill>
+                  <pic:spPr bwMode="auto">
+                    <a:xfrm>
+                      <a:off x="0" y="0"/>
+                      <a:ext cx="5731510" cy="3218180"/>
+                    </a:xfrm>
+                    <a:prstGeom prst="rect">
+                      <a:avLst/>
+                    </a:prstGeom>
+                    <a:noFill/>
+                    <a:ln>
+                      <a:noFill/>
+                    </a:ln>
+                  </pic:spPr>
+                </pic:pic>
+              </a:graphicData>
+            </a:graphic>
+          </wp:inline>
+        </w:drawing>
+      </w:r>
+    </w:p>
+    <w:p>
+      <w:pPr>
+        <w:pStyle w:val="Caption"/>
+      </w:pPr>
+      <w:bookmarkStart w:id="17" w:name="_Toc115450903"/>
+      <w:r>
+        <w:t xml:space="preserve">Figure </w:t>
+      </w:r>
+      <w:r>
+        <w:fldChar w:fldCharType="begin"/>
+      </w:r>
+      <w:r>
+        <w:instrText>SEQ Figure \* ARABIC</w:instrText>
+      </w:r>
+      <w:r>
+        <w:fldChar w:fldCharType="separate"/>
+      </w:r>
+      <w:r>
+        <w:rPr>
+          <w:noProof/>
+        </w:rPr>
+        <w:t>3</w:t>
+      </w:r>
+      <w:r>
+        <w:fldChar w:fldCharType="end"/>
+      </w:r>
+      <w:r>
+        <w:t xml:space="preserve">: A sample </w:t>
+      </w:r>
+      <w:r>
+        <w:rPr>
+          <w:noProof/>
+        </w:rPr>
+        <w:t>image, formatted and captioned as a figure.</w:t>
+      </w:r>
+      <w:bookmarkEnd w:id="17"/>
+    </w:p>
+    <w:p>
+      <w:pPr>
+        <w:pStyle w:val="Quote"/>
+      </w:pPr>
+      <w:r>
+        <w:t xml:space="preserve">This sample figure demonstrates the use of an image. Put the image </w:t>
+      </w:r>
+      <w:r>
+        <w:t xml:space="preserve">(or table, or other non-paragraph object) into the flow of the document at an appropriate </w:t>
+      </w:r>
+      <w:r>
+        <w:t>point and</w:t>
+      </w:r>
+      <w:r>
+        <w:t xml:space="preserve"> give it a caption so that it is automatically added to the table of figures when you next ‘update’ it.</w:t>
+      </w:r>
+    </w:p>
+    <w:p>
+      <w:r>
+        <w:t>[Enter text here]</w:t>
+      </w:r>
+      <w:r>
+        <w:br w:type="page"/>
+      </w:r>
+    </w:p>
+    <w:p>
+      <w:pPr>
+        <w:pStyle w:val="Heading1"/>
+      </w:pPr>
+      <w:bookmarkStart w:id="18" w:name="_Toc221287555"/>
+      <w:r>
+        <w:lastRenderedPageBreak/>
+        <w:t>Prior Approaches</w:t>
+      </w:r>
+      <w:bookmarkEnd w:id="18"/>
+    </w:p>
+    <w:p>
+      <w:pPr>
+        <w:pStyle w:val="Quote"/>
+      </w:pPr>
+      <w:r>
+        <w:t xml:space="preserve">Recommended word count: </w:t>
+      </w:r>
+      <w:r>
+        <w:t>700</w:t>
+      </w:r>
+      <w:r>
+        <w:t xml:space="preserve"> words, including any subsections you decide to add.</w:t>
+      </w:r>
+    </w:p>
+    <w:p>
+      <w:pPr>
+        <w:pStyle w:val="Quote"/>
+      </w:pPr>
+      <w:r>
+        <w:t xml:space="preserve">Use this major section to </w:t>
+      </w:r>
+      <w:r>
+        <w:t xml:space="preserve">examine one or more </w:t>
+      </w:r>
+      <w:r>
+        <w:t>approach</w:t>
+      </w:r>
+      <w:r>
+        <w:t>es that others have used to address the challenge you are interested in, or similar ones. Ideally you would find multiple approaches so that you can compare and contrast them, but you can concentrate on one strategy if you can find enough to say about it.</w:t>
+      </w:r>
+    </w:p>
+    <w:p>
+      <w:pPr>
+        <w:pStyle w:val="Quote"/>
+      </w:pPr>
+      <w:r>
+        <w:t>Your sources should be knowledgeable and reliable ones where possible, such as developer logs, but tutorials can be useful (especially if you can compare them or have time to try them to test how well they work). Player speculation as to how a feature is implemented can be useful, but should not be your main resource.</w:t>
+      </w:r>
+    </w:p>
+    <w:p>
+      <w:pPr>
+        <w:pStyle w:val="Quote"/>
+      </w:pPr>
+      <w:r>
+        <w:t>If you are struggling to find good enough sources as described above, you may need to adjust the direction of your investigation slightly, finding new aims that can be more easily sourced.</w:t>
+      </w:r>
+    </w:p>
+    <w:p>
+      <w:pPr>
+        <w:pStyle w:val="Quote"/>
+      </w:pPr>
+      <w:r>
+        <w:t>Try to understand (and highlight to the reader as appropriate) how these approaches work, and what makes them suitable for use in the context you’ve established. One aim of this section is for you to develop your understanding of these techniques, and demonstrate it to a deep level.</w:t>
+      </w:r>
+    </w:p>
+    <w:p>
+      <w:pPr>
+        <w:pStyle w:val="Quote"/>
+      </w:pPr>
+      <w:r>
+        <w:t>As you explore one or more approaches, you may comment on how effective they might be for you, but note that there are words available for that in the Recommendations section.</w:t>
+      </w:r>
+    </w:p>
+    <w:p>
+      <w:pPr>
+        <w:pStyle w:val="Quote"/>
+      </w:pPr>
+      <w:r>
+        <w:t>You may</w:t>
+      </w:r>
+      <w:r>
+        <w:t xml:space="preserve"> divide the approach into subsections</w:t>
+      </w:r>
+      <w:r>
+        <w:t xml:space="preserve"> (with ‘heading 2’)</w:t>
+      </w:r>
+      <w:r>
+        <w:t xml:space="preserve">, such as your methods for key areas of the project, or for particular </w:t>
+      </w:r>
+      <w:r>
+        <w:t>aspects of development</w:t>
+      </w:r>
+      <w:r>
+        <w:t>.</w:t>
+      </w:r>
+      <w:r>
+        <w:t xml:space="preserve"> Take care of the total recommended words for the section overall.</w:t>
+      </w:r>
+    </w:p>
+    <w:p>
+      <w:pPr>
+        <w:pStyle w:val="Quote"/>
+        <w:rPr>
+          <w:b/>
+          <w:bCs/>
+        </w:rPr>
+      </w:pPr>
+      <w:r>
+        <w:rPr>
+          <w:b/>
+          <w:bCs/>
+        </w:rPr>
+        <w:t xml:space="preserve">You must reference all your sources in </w:t>
+      </w:r>
+      <w:r>
+        <w:rPr>
+          <w:b/>
+          <w:bCs/>
+        </w:rPr>
+        <w:t>CTR</w:t>
+      </w:r>
+      <w:r>
+        <w:rPr>
+          <w:b/>
+          <w:bCs/>
+        </w:rPr>
+        <w:t xml:space="preserve"> Harvard Style.</w:t>
+      </w:r>
+    </w:p>
+    <w:p>
+      <w:r>
+        <w:t>[Enter text here]</w:t>
+      </w:r>
+    </w:p>
+    <w:p>
+      <w:pPr>
+        <w:pStyle w:val="Quote"/>
+      </w:pPr>
+    </w:p>
+    <w:p>
+      <w:pPr>
+        <w:pStyle w:val="Heading2"/>
+      </w:pPr>
+      <w:bookmarkStart w:id="19" w:name="_Toc221287556"/>
+      <w:r>
+        <w:t>Eulerian Approach</w:t>
+      </w:r>
+      <w:bookmarkEnd w:id="19"/>
+    </w:p>
+    <w:p/>
+    <w:p>
+      <w:pPr>
+        <w:pStyle w:val="Heading2"/>
+      </w:pPr>
+      <w:bookmarkStart w:id="20" w:name="_Toc221287557"/>
+      <w:r>
+        <w:t>Lagrangian Approach</w:t>
+      </w:r>
+      <w:bookmarkEnd w:id="20"/>
+    </w:p>
+    <w:p/>
+    <w:p>
+      <w:pPr>
+        <w:pStyle w:val="Heading2"/>
+      </w:pPr>
+      <w:bookmarkStart w:id="21" w:name="_Toc221287558"/>
+      <w:r>
+        <w:t>Eulerian-Lagrange Approach</w:t>
+      </w:r>
+      <w:bookmarkEnd w:id="21"/>
+    </w:p>
+    <w:p>
+      <w:pPr>
+        <w:pStyle w:val="Heading1"/>
+      </w:pPr>
+      <w:bookmarkStart w:id="22" w:name="_Toc221287559"/>
+      <w:r>
+        <w:lastRenderedPageBreak/>
+        <w:t>Recommendations</w:t>
+      </w:r>
+      <w:bookmarkEnd w:id="22"/>
+    </w:p>
+    <w:p>
+      <w:pPr>
+        <w:pStyle w:val="Quote"/>
+      </w:pPr>
+      <w:r>
+        <w:t xml:space="preserve">Recommended word count: </w:t>
+      </w:r>
+      <w:r>
+        <w:t>700</w:t>
+      </w:r>
+      <w:r>
+        <w:t xml:space="preserve"> words, including any subsections you decide to add.</w:t>
+      </w:r>
+    </w:p>
+    <w:p>
+      <w:pPr>
+        <w:pStyle w:val="Quote"/>
+      </w:pPr>
+      <w:r>
+        <w:t xml:space="preserve">Use </w:t>
+      </w:r>
+      <w:r>
+        <w:t xml:space="preserve">this major section to </w:t>
+      </w:r>
+      <w:r>
+        <w:t>set out the your findings, in the form of recommendations you could use or give your reader. Remember the original simulated goal of a senior coworker asking you to find out more about the technique: this is your opportunity to share what you’ve found.</w:t>
+      </w:r>
+    </w:p>
+    <w:p>
+      <w:pPr>
+        <w:pStyle w:val="Quote"/>
+      </w:pPr>
+      <w:r>
+        <w:t xml:space="preserve">Describe the technique you ought to use, </w:t>
+      </w:r>
+      <w:r>
+        <w:t xml:space="preserve">showing its strengths and </w:t>
+      </w:r>
+      <w:r>
+        <w:t>recognising any remaining issues</w:t>
+      </w:r>
+      <w:r>
+        <w:t xml:space="preserve"> (although there are additional words available for this in the next section)</w:t>
+      </w:r>
+      <w:r>
+        <w:t xml:space="preserve">. You </w:t>
+      </w:r>
+      <w:r>
+        <w:t>should</w:t>
+      </w:r>
+      <w:r>
+        <w:t xml:space="preserve"> </w:t>
+      </w:r>
+      <w:r>
+        <w:t xml:space="preserve">consider </w:t>
+      </w:r>
+      <w:r>
+        <w:t xml:space="preserve">challenges that </w:t>
+      </w:r>
+      <w:r>
+        <w:t>might still need to be solved, and how you could protect against them in a future project. You could also comment on what related things might be sensible to learn next.</w:t>
+      </w:r>
+    </w:p>
+    <w:p>
+      <w:pPr>
+        <w:pStyle w:val="Quote"/>
+      </w:pPr>
+      <w:r>
+        <w:t>You probably don’t need any new sources here, and although you should still aim for an impartial and evidence-led style, this section gives an opportunity for you to show more of your own judgement and technical decision-making, rather than restricting yourself to directly-sourced information. Refer to previous sections, but try not to repeat yourself; the word count here may be challenging.</w:t>
+      </w:r>
+    </w:p>
+    <w:p>
+      <w:pPr>
+        <w:pStyle w:val="Quote"/>
+      </w:pPr>
+      <w:r>
+        <w:t>Y</w:t>
+      </w:r>
+      <w:r>
+        <w:t xml:space="preserve">ou must include enough of </w:t>
+      </w:r>
+      <w:r>
+        <w:rPr>
+          <w:b/>
+          <w:bCs/>
+        </w:rPr>
+        <w:t>what</w:t>
+      </w:r>
+      <w:r>
+        <w:t xml:space="preserve"> the </w:t>
+      </w:r>
+      <w:r>
+        <w:t xml:space="preserve">approaches involve </w:t>
+      </w:r>
+      <w:r>
+        <w:t xml:space="preserve">to support the reader, but </w:t>
+      </w:r>
+      <w:r>
+        <w:t xml:space="preserve">will get most </w:t>
+      </w:r>
+      <w:r>
+        <w:t xml:space="preserve">benefit from writing about </w:t>
+      </w:r>
+      <w:r>
+        <w:rPr>
+          <w:b/>
+          <w:bCs/>
+        </w:rPr>
+        <w:t>why</w:t>
+      </w:r>
+      <w:r>
+        <w:t xml:space="preserve"> that is</w:t>
+      </w:r>
+      <w:r>
+        <w:t xml:space="preserve">, and </w:t>
+      </w:r>
+      <w:r>
+        <w:rPr>
+          <w:b/>
+          <w:bCs/>
+        </w:rPr>
+        <w:t>how</w:t>
+      </w:r>
+      <w:r>
+        <w:t>.</w:t>
+      </w:r>
+    </w:p>
+    <w:p>
+      <w:pPr>
+        <w:pStyle w:val="Quote"/>
+      </w:pPr>
+      <w:r>
+        <w:t>You may wish to introduce subsections</w:t>
+      </w:r>
+      <w:r>
+        <w:t xml:space="preserve"> (with ‘heading 2’)</w:t>
+      </w:r>
+      <w:r>
+        <w:t xml:space="preserve"> for different aspects of the project, or for the different challenges you wish to focus on.</w:t>
+      </w:r>
+      <w:r>
+        <w:t xml:space="preserve"> Take care that they respect the total recommended words for the section</w:t>
+      </w:r>
+      <w:r>
+        <w:t>.</w:t>
+      </w:r>
+    </w:p>
+    <w:p>
+      <w:r>
+        <w:t>[Enter text here]</w:t>
+      </w:r>
+    </w:p>
+    <w:p>
+      <w:pPr>
+        <w:pStyle w:val="Heading2"/>
+      </w:pPr>
+      <w:r>
+        <w:t>Implementation</w:t>
+      </w:r>
+    </w:p>
+    <w:p>
+      <w:pPr>
+        <w:pStyle w:val="Heading3"/>
+      </w:pPr>
+      <w:r>
+        <w:t>Particle settings</w:t>
+      </w:r>
+    </w:p>
+    <w:p>
+      <w:pPr>
+        <w:pStyle w:val="Heading3"/>
+      </w:pPr>
+      <w:r>
+        <w:t>Particle spawner</w:t>
+      </w:r>
+    </w:p>
+    <w:p>
+      <w:pPr>
+        <w:pStyle w:val="Heading3"/>
+      </w:pPr>
+      <w:r>
+        <w:t>Pressure</w:t>
+      </w:r>
+    </w:p>
+    <w:p>
+      <w:pPr>
+        <w:pStyle w:val="Heading3"/>
+      </w:pPr>
+      <w:r>
+        <w:t>Viscosity</w:t>
+      </w:r>
+    </w:p>
+    <w:p>
+      <w:pPr>
+        <w:pStyle w:val="Heading3"/>
+      </w:pPr>
+      <w:r>
+        <w:t>Surface tension</w:t>
+      </w:r>
+    </w:p>
+    <w:p/>
+    <w:p/>
+    <w:p>
+      <w:pPr>
         <w:suppressAutoHyphens w:val="0"/>
         <w:rPr>
           <w:rFonts w:eastAsia="Times New Roman"/>
-          <w:color w:val="EE0000"/>
+          <w:bCs/>
+          <w:color w:val="000000"/>
           <w:sz w:val="40"/>
-          <w:szCs w:val="40"/>
-        </w:rPr>
-      </w:pPr>
-      <m:oMath>
-        <m:sSub>
-          <m:sSubPr>
-            <m:ctrlPr>
-              <w:rPr>
-                <w:rFonts w:ascii="Cambria Math" w:eastAsia="Times New Roman" w:hAnsi="Cambria Math"/>
-                <w:color w:val="EE0000"/>
-                <w:sz w:val="40"/>
-                <w:szCs w:val="40"/>
-              </w:rPr>
-            </m:ctrlPr>
-          </m:sSubPr>
-          <m:e>
-            <m:r>
-              <w:rPr>
-                <w:rFonts w:ascii="Cambria Math" w:eastAsia="Times New Roman" w:hAnsi="Cambria Math"/>
-                <w:color w:val="EE0000"/>
-                <w:sz w:val="40"/>
-                <w:szCs w:val="40"/>
-              </w:rPr>
-              <m:t>m</m:t>
-            </m:r>
-          </m:e>
-          <m:sub>
-            <m:r>
-              <w:rPr>
-                <w:rFonts w:ascii="Cambria Math" w:eastAsia="Times New Roman" w:hAnsi="Cambria Math"/>
-                <w:color w:val="EE0000"/>
-                <w:sz w:val="40"/>
-                <w:szCs w:val="40"/>
-              </w:rPr>
-              <m:t>j</m:t>
-            </m:r>
-          </m:sub>
-        </m:sSub>
-      </m:oMath>
-      <w:r>
-        <w:rPr>
-          <w:rFonts w:eastAsia="Times New Roman"/>
-          <w:color w:val="EE0000"/>
-          <w:sz w:val="40"/>
-          <w:szCs w:val="40"/>
-        </w:rPr>
-        <w:t xml:space="preserve">= mass of particle </w:t>
-      </w:r>
-      <m:oMath>
-        <m:r>
-          <w:rPr>
-            <w:rFonts w:ascii="Cambria Math" w:eastAsia="Times New Roman" w:hAnsi="Cambria Math"/>
-            <w:color w:val="EE0000"/>
-            <w:sz w:val="40"/>
-            <w:szCs w:val="40"/>
-          </w:rPr>
-          <m:t>j</m:t>
-        </m:r>
-      </m:oMath>
-    </w:p>
-    <w:p>
-      <w:pPr>
+          <w:szCs w:val="28"/>
+        </w:rPr>
+      </w:pPr>
+    </w:p>
+    <w:p>
+      <w:pPr>
+        <w:pStyle w:val="Heading1"/>
+      </w:pPr>
+      <w:bookmarkStart w:id="23" w:name="_Toc221287560"/>
+      <w:r>
+        <w:lastRenderedPageBreak/>
+        <w:t xml:space="preserve">Conclusion and </w:t>
+      </w:r>
+      <w:r>
+        <w:t>Reflection</w:t>
+      </w:r>
+      <w:bookmarkEnd w:id="23"/>
+    </w:p>
+    <w:bookmarkEnd w:id="11"/>
+    <w:p>
+      <w:pPr>
+        <w:pStyle w:val="Quote"/>
+      </w:pPr>
+      <w:r>
+        <w:t xml:space="preserve">Recommended word count: </w:t>
+      </w:r>
+      <w:r>
+        <w:t>7</w:t>
+      </w:r>
+      <w:r>
+        <w:t>00 words, including any subsections you decide to add.</w:t>
+      </w:r>
+    </w:p>
+    <w:p>
+      <w:pPr>
+        <w:pStyle w:val="Quote"/>
+      </w:pPr>
+      <w:r>
+        <w:t xml:space="preserve">Use this section </w:t>
+      </w:r>
+      <w:r>
+        <w:t>for two things:</w:t>
+      </w:r>
+    </w:p>
+    <w:p>
+      <w:pPr>
+        <w:pStyle w:val="Quote"/>
         <w:numPr>
           <w:ilvl w:val="0"/>
-          <w:numId w:val="5"/>
+          <w:numId w:val="3"/>
         </w:numPr>
-        <w:suppressAutoHyphens w:val="0"/>
-        <w:rPr>
-          <w:rFonts w:eastAsia="Times New Roman"/>
-          <w:color w:val="EE0000"/>
-          <w:sz w:val="40"/>
-          <w:szCs w:val="40"/>
-        </w:rPr>
-      </w:pPr>
-      <m:oMath>
-        <m:r>
-          <w:rPr>
-            <w:rFonts w:ascii="Cambria Math" w:eastAsia="Times New Roman" w:hAnsi="Cambria Math"/>
-            <w:color w:val="EE0000"/>
-            <w:sz w:val="40"/>
-            <w:szCs w:val="40"/>
-          </w:rPr>
-          <m:t>W</m:t>
-        </m:r>
-      </m:oMath>
-      <w:r>
-        <w:rPr>
-          <w:rFonts w:eastAsia="Times New Roman"/>
-          <w:color w:val="EE0000"/>
-          <w:sz w:val="40"/>
-          <w:szCs w:val="40"/>
-        </w:rPr>
-        <w:t>= smoothing kernel</w:t>
-      </w:r>
-    </w:p>
-    <w:p>
-      <w:pPr>
+      </w:pPr>
+      <w:r>
+        <w:t xml:space="preserve">To </w:t>
+      </w:r>
+      <w:r>
+        <w:t xml:space="preserve">close out your report, </w:t>
+      </w:r>
+      <w:r>
+        <w:t>commenting on how effective your recommended approach might be. You are not expected to have tested it in this non-practice assessment and do not need to repeat its challenges if they were covered in Recommendations, but here is a chance to show more critical insight into how good the results are likely to be.</w:t>
+      </w:r>
+    </w:p>
+    <w:p>
+      <w:pPr>
+        <w:pStyle w:val="Quote"/>
         <w:numPr>
           <w:ilvl w:val="0"/>
-          <w:numId w:val="5"/>
+          <w:numId w:val="3"/>
         </w:numPr>
+      </w:pPr>
+      <w:r>
+        <w:t>To reflect on how your investigation has gone, trying to find things you would like to maintain or try to improve next time you are investigating. Although you don’t need to be planning the next investigation, you should bear in mind that this exercise is an opportunity to consider things that may help with Major Project next year.</w:t>
+      </w:r>
+    </w:p>
+    <w:p>
+      <w:pPr>
+        <w:pStyle w:val="Quote"/>
+      </w:pPr>
+      <w:r>
+        <w:t>These sections can be weighted roughly equally, with perhaps a slight preference for the second half.</w:t>
+      </w:r>
+    </w:p>
+    <w:p>
+      <w:pPr>
+        <w:pStyle w:val="Quote"/>
+      </w:pPr>
+      <w:r>
+        <w:t>In both cases try to be specific and detailed: you may wish to take a “case studies” approach and dive deeply into a smaller number of strengths/weaknesses of your recommendation and of your investigation, rather than spend your words on a broad and shallow survey of too many factors.</w:t>
+      </w:r>
+    </w:p>
+    <w:p>
+      <w:pPr>
+        <w:pStyle w:val="Quote"/>
+      </w:pPr>
+      <w:r>
+        <w:t>In the reflection in particular, try to understand the strengths/challenges well enough to start a concrete plan for retaining/correcting them next time. Forming such a plan will be the biggest benefit for your next project, and showing the reader key details here will earn the best marks for this criterion. Try not to dwell on circumstances beyond your control.</w:t>
+      </w:r>
+    </w:p>
+    <w:p>
+      <w:pPr>
+        <w:pStyle w:val="Quote"/>
+      </w:pPr>
+      <w:r>
+        <w:t>You may add subsections (with ‘heading 2’) here as you need them, perhaps to emphasise separation between your reflection on your practice and your potential goals for future proje</w:t>
+      </w:r>
+      <w:r>
+        <w:t>cts</w:t>
+      </w:r>
+      <w:r>
+        <w:t>.</w:t>
+      </w:r>
+    </w:p>
+    <w:p>
+      <w:r>
+        <w:t>[Enter text here]</w:t>
+      </w:r>
+    </w:p>
+    <w:p/>
+    <w:p/>
+    <w:p>
+      <w:pPr>
         <w:suppressAutoHyphens w:val="0"/>
-        <w:rPr>
-          <w:rFonts w:eastAsia="Times New Roman"/>
-          <w:color w:val="EE0000"/>
-          <w:sz w:val="40"/>
-          <w:szCs w:val="40"/>
-        </w:rPr>
-      </w:pPr>
-      <m:oMath>
-        <m:r>
-          <w:rPr>
-            <w:rFonts w:ascii="Cambria Math" w:eastAsia="Times New Roman" w:hAnsi="Cambria Math"/>
-            <w:color w:val="EE0000"/>
-            <w:sz w:val="40"/>
-            <w:szCs w:val="40"/>
-          </w:rPr>
-          <m:t>h</m:t>
-        </m:r>
-      </m:oMath>
-      <w:r>
-        <w:rPr>
-          <w:rFonts w:eastAsia="Times New Roman"/>
-          <w:color w:val="EE0000"/>
-          <w:sz w:val="40"/>
-          <w:szCs w:val="40"/>
-        </w:rPr>
-        <w:t>= smoothing radius</w:t>
-      </w:r>
-    </w:p>
-    <w:p>
-      <w:pPr>
-        <w:numPr>
-          <w:ilvl w:val="0"/>
-          <w:numId w:val="5"/>
-        </w:numPr>
-        <w:suppressAutoHyphens w:val="0"/>
-        <w:rPr>
-          <w:rFonts w:eastAsia="Times New Roman"/>
-          <w:color w:val="EE0000"/>
-          <w:sz w:val="40"/>
-          <w:szCs w:val="40"/>
-        </w:rPr>
-      </w:pPr>
-      <m:oMath>
-        <m:sSub>
-          <m:sSubPr>
-            <m:ctrlPr>
-              <w:rPr>
-                <w:rFonts w:ascii="Cambria Math" w:eastAsia="Times New Roman" w:hAnsi="Cambria Math"/>
-                <w:color w:val="EE0000"/>
-                <w:sz w:val="40"/>
-                <w:szCs w:val="40"/>
-              </w:rPr>
-            </m:ctrlPr>
-          </m:sSubPr>
-          <m:e>
-            <m:r>
-              <m:rPr>
-                <m:sty m:val="b"/>
-              </m:rPr>
-              <w:rPr>
-                <w:rFonts w:ascii="Cambria Math" w:eastAsia="Times New Roman" w:hAnsi="Cambria Math"/>
-                <w:color w:val="EE0000"/>
-                <w:sz w:val="40"/>
-                <w:szCs w:val="40"/>
-              </w:rPr>
-              <m:t>r</m:t>
-            </m:r>
-          </m:e>
-          <m:sub>
-            <m:r>
-              <w:rPr>
-                <w:rFonts w:ascii="Cambria Math" w:eastAsia="Times New Roman" w:hAnsi="Cambria Math"/>
-                <w:color w:val="EE0000"/>
-                <w:sz w:val="40"/>
-                <w:szCs w:val="40"/>
-              </w:rPr>
-              <m:t>i</m:t>
-            </m:r>
-          </m:sub>
-        </m:sSub>
-        <m:r>
-          <w:rPr>
-            <w:rFonts w:ascii="Cambria Math" w:eastAsia="Times New Roman" w:hAnsi="Cambria Math"/>
-            <w:color w:val="EE0000"/>
-            <w:sz w:val="40"/>
-            <w:szCs w:val="40"/>
-          </w:rPr>
-          <m:t>,</m:t>
-        </m:r>
-        <m:sSub>
-          <m:sSubPr>
-            <m:ctrlPr>
-              <w:rPr>
-                <w:rFonts w:ascii="Cambria Math" w:eastAsia="Times New Roman" w:hAnsi="Cambria Math"/>
-                <w:color w:val="EE0000"/>
-                <w:sz w:val="40"/>
-                <w:szCs w:val="40"/>
-              </w:rPr>
-            </m:ctrlPr>
-          </m:sSubPr>
-          <m:e>
-            <m:r>
-              <m:rPr>
-                <m:sty m:val="b"/>
-              </m:rPr>
-              <w:rPr>
-                <w:rFonts w:ascii="Cambria Math" w:eastAsia="Times New Roman" w:hAnsi="Cambria Math"/>
-                <w:color w:val="EE0000"/>
-                <w:sz w:val="40"/>
-                <w:szCs w:val="40"/>
-              </w:rPr>
-              <m:t>r</m:t>
-            </m:r>
-          </m:e>
-          <m:sub>
-            <m:r>
-              <w:rPr>
-                <w:rFonts w:ascii="Cambria Math" w:eastAsia="Times New Roman" w:hAnsi="Cambria Math"/>
-                <w:color w:val="EE0000"/>
-                <w:sz w:val="40"/>
-                <w:szCs w:val="40"/>
-              </w:rPr>
-              <m:t>j</m:t>
-            </m:r>
-          </m:sub>
-        </m:sSub>
-      </m:oMath>
-      <w:r>
-        <w:rPr>
-          <w:rFonts w:eastAsia="Times New Roman"/>
-          <w:color w:val="EE0000"/>
-          <w:sz w:val="40"/>
-          <w:szCs w:val="40"/>
-        </w:rPr>
-        <w:t>= particle positions</w:t>
-      </w:r>
-    </w:p>
-    <w:p>
-      <w:pPr>
-        <w:suppressAutoHyphens w:val="0"/>
-        <w:rPr>
-          <w:rFonts w:eastAsia="Times New Roman"/>
-          <w:color w:val="EE0000"/>
-          <w:sz w:val="40"/>
-          <w:szCs w:val="40"/>
-        </w:rPr>
-      </w:pPr>
-      <w:r>
-        <w:rPr>
-          <w:rFonts w:eastAsia="Times New Roman"/>
-          <w:color w:val="EE0000"/>
-          <w:sz w:val="40"/>
-          <w:szCs w:val="40"/>
-        </w:rPr>
-        <w:t xml:space="preserve">Settings in </w:t>
-      </w:r>
-      <w:proofErr w:type="spellStart"/>
-      <w:proofErr w:type="gramStart"/>
-      <w:r>
-        <w:rPr>
-          <w:rFonts w:eastAsia="Times New Roman"/>
-          <w:color w:val="EE0000"/>
-          <w:sz w:val="40"/>
-          <w:szCs w:val="40"/>
-        </w:rPr>
-        <w:t>F</w:t>
-      </w:r>
-      <w:r>
-        <w:rPr>
-          <w:rFonts w:eastAsia="Times New Roman"/>
-          <w:color w:val="EE0000"/>
-          <w:sz w:val="40"/>
-          <w:szCs w:val="40"/>
-        </w:rPr>
-        <w:t>i</w:t>
-      </w:r>
-      <w:r>
-        <w:rPr>
-          <w:rFonts w:eastAsia="Times New Roman"/>
-          <w:color w:val="EE0000"/>
-          <w:sz w:val="40"/>
-          <w:szCs w:val="40"/>
-        </w:rPr>
-        <w:t>ndDensity</w:t>
-      </w:r>
-      <w:proofErr w:type="spellEnd"/>
-      <w:r>
-        <w:rPr>
-          <w:rFonts w:eastAsia="Times New Roman"/>
-          <w:color w:val="EE0000"/>
-          <w:sz w:val="40"/>
-          <w:szCs w:val="40"/>
-        </w:rPr>
-        <w:t>(</w:t>
-      </w:r>
-      <w:proofErr w:type="gramEnd"/>
-      <w:r>
-        <w:rPr>
-          <w:rFonts w:eastAsia="Times New Roman"/>
-          <w:color w:val="EE0000"/>
-          <w:sz w:val="40"/>
-          <w:szCs w:val="40"/>
-        </w:rPr>
-        <w:t>); cached locally to avoid repeated lookups</w:t>
-      </w:r>
-    </w:p>
-    <w:p>
-      <w:pPr>
-        <w:suppressAutoHyphens w:val="0"/>
-        <w:rPr>
-          <w:rFonts w:eastAsia="Times New Roman"/>
-          <w:color w:val="EE0000"/>
-          <w:sz w:val="40"/>
-          <w:szCs w:val="40"/>
-        </w:rPr>
-      </w:pPr>
-      <w:r>
-        <w:rPr>
-          <w:rFonts w:eastAsia="Times New Roman"/>
-          <w:color w:val="EE0000"/>
-          <w:sz w:val="40"/>
-          <w:szCs w:val="40"/>
-        </w:rPr>
-        <w:t xml:space="preserve">Reduces time complexity from </w:t>
-      </w:r>
-      <w:r>
-        <w:rPr>
-          <w:rFonts w:eastAsia="Times New Roman"/>
-          <w:color w:val="EE0000"/>
-          <w:sz w:val="40"/>
-          <w:szCs w:val="40"/>
-        </w:rPr>
-        <w:t xml:space="preserve">2n^2 </w:t>
-      </w:r>
-      <w:proofErr w:type="spellStart"/>
-      <w:r>
-        <w:rPr>
-          <w:rFonts w:eastAsia="Times New Roman"/>
-          <w:color w:val="EE0000"/>
-          <w:sz w:val="40"/>
-          <w:szCs w:val="40"/>
-        </w:rPr>
-        <w:t>to n</w:t>
-      </w:r>
-      <w:proofErr w:type="spellEnd"/>
-      <w:r>
-        <w:rPr>
-          <w:rFonts w:eastAsia="Times New Roman"/>
-          <w:color w:val="EE0000"/>
-          <w:sz w:val="40"/>
-          <w:szCs w:val="40"/>
-        </w:rPr>
-        <w:t>^2 + 2</w:t>
-      </w:r>
-    </w:p>
-    <w:p>
-      <w:pPr>
-        <w:pStyle w:val="ListParagraph"/>
-        <w:numPr>
-          <w:ilvl w:val="1"/>
-          <w:numId w:val="4"/>
-        </w:numPr>
-        <w:suppressAutoHyphens w:val="0"/>
-        <w:rPr>
-          <w:rFonts w:eastAsia="Times New Roman"/>
-          <w:color w:val="EE0000"/>
-          <w:sz w:val="40"/>
-          <w:szCs w:val="40"/>
-        </w:rPr>
-      </w:pPr>
-      <w:r>
-        <w:rPr>
-          <w:rFonts w:eastAsia="Times New Roman"/>
+      </w:pPr>
+      <w:r>
+        <w:br w:type="page"/>
+      </w:r>
+    </w:p>
+    <w:p>
+      <w:pPr>
+        <w:pStyle w:val="Heading1"/>
+      </w:pPr>
+      <w:bookmarkStart w:id="24" w:name="_Toc221287561"/>
+      <w:r>
+        <w:lastRenderedPageBreak/>
+        <w:t>References</w:t>
+      </w:r>
+      <w:bookmarkEnd w:id="24"/>
+    </w:p>
+    <w:p>
+      <w:pPr>
+        <w:pStyle w:val="Quote"/>
+        <w:spacing w:after="120" w:line="240" w:lineRule="auto"/>
+      </w:pPr>
+      <w:r>
+        <w:t xml:space="preserve">Use this section to </w:t>
+      </w:r>
+      <w:r>
+        <w:t xml:space="preserve">list your references, including </w:t>
+      </w:r>
+      <w:r>
+        <w:t xml:space="preserve">tutorials you </w:t>
+      </w:r>
+      <w:r>
+        <w:t xml:space="preserve">may </w:t>
+      </w:r>
+      <w:r>
+        <w:t>have quoted code</w:t>
+      </w:r>
+      <w:r>
+        <w:t xml:space="preserve"> from</w:t>
+      </w:r>
+      <w:r>
+        <w:t>.</w:t>
+      </w:r>
+      <w:r>
+        <w:t xml:space="preserve"> External assets should be listed in the next section.</w:t>
+      </w:r>
+    </w:p>
+    <w:p>
+      <w:pPr>
+        <w:pStyle w:val="Quote"/>
+        <w:spacing w:after="120" w:line="240" w:lineRule="auto"/>
+      </w:pPr>
+      <w:r>
+        <w:t>U</w:t>
+      </w:r>
+      <w:r>
+        <w:t xml:space="preserve">se </w:t>
+      </w:r>
+      <w:r>
+        <w:t>CTR</w:t>
+      </w:r>
+      <w:r>
+        <w:t xml:space="preserve"> Harvard </w:t>
+      </w:r>
+      <w:r>
+        <w:t>r</w:t>
+      </w:r>
+      <w:r>
+        <w:t>eferencing</w:t>
+      </w:r>
+      <w:r>
+        <w:t>.</w:t>
+      </w:r>
+    </w:p>
+    <w:p>
+      <w:r>
+        <w:rPr>
           <w:noProof/>
-          <w:color w:val="EE0000"/>
-          <w:sz w:val="40"/>
-          <w:szCs w:val="40"/>
-        </w:rPr>
-        <w:lastRenderedPageBreak/>
+        </w:rPr>
         <mc:AlternateContent>
           <mc:Choice Requires="wps">
             <w:drawing>
-              <wp:anchor distT="45720" distB="45720" distL="114300" distR="114300" simplePos="0" relativeHeight="251659264" behindDoc="0" locked="0" layoutInCell="1" allowOverlap="1" wp14:anchorId="6AD7BC7C" wp14:editId="7E003CD7">
+              <wp:anchor distT="45720" distB="45720" distL="114300" distR="114300" simplePos="0" relativeHeight="251659264" behindDoc="0" locked="0" layoutInCell="1" allowOverlap="1" wp14:anchorId="6AD7BC7C" wp14:editId="0FE0E72D">
                 <wp:simplePos x="0" y="0"/>
-                <wp:positionH relativeFrom="column">
-                  <wp:posOffset>-226337</wp:posOffset>
+                <wp:positionH relativeFrom="margin">
+                  <wp:align>center</wp:align>
                 </wp:positionH>
                 <wp:positionV relativeFrom="paragraph">
-                  <wp:posOffset>567061</wp:posOffset>
+                  <wp:posOffset>710565</wp:posOffset>
                 </wp:positionV>
                 <wp:extent cx="6323330" cy="5327965"/>
                 <wp:effectExtent l="0" t="0" r="20320" b="25400"/>
@@ -2915,7 +3663,7 @@
                             </w:r>
                           </w:p>
                           <w:p>
-                            <w:hyperlink r:id="rId16" w:history="1">
+                            <w:hyperlink r:id="rId14" w:history="1">
                               <w:r>
                                 <w:rPr>
                                   <w:rStyle w:val="Hyperlink"/>
@@ -2938,7 +3686,7 @@
                             </w:r>
                           </w:p>
                           <w:p>
-                            <w:hyperlink r:id="rId17" w:history="1">
+                            <w:hyperlink r:id="rId15" w:history="1">
                               <w:r>
                                 <w:rPr>
                                   <w:rStyle w:val="Hyperlink"/>
@@ -2953,7 +3701,7 @@
                             </w:r>
                           </w:p>
                           <w:p>
-                            <w:hyperlink r:id="rId18" w:history="1">
+                            <w:hyperlink r:id="rId16" w:history="1">
                               <w:r>
                                 <w:rPr>
                                   <w:rStyle w:val="Hyperlink"/>
@@ -2968,7 +3716,7 @@
                             </w:r>
                           </w:p>
                           <w:p>
-                            <w:hyperlink r:id="rId19" w:history="1">
+                            <w:hyperlink r:id="rId17" w:history="1">
                               <w:r>
                                 <w:rPr>
                                   <w:rStyle w:val="Hyperlink"/>
@@ -2983,7 +3731,7 @@
                             </w:r>
                           </w:p>
                           <w:p>
-                            <w:hyperlink r:id="rId20" w:history="1">
+                            <w:hyperlink r:id="rId18" w:history="1">
                               <w:r>
                                 <w:rPr>
                                   <w:rStyle w:val="Hyperlink"/>
@@ -2998,7 +3746,7 @@
                             </w:r>
                           </w:p>
                           <w:p>
-                            <w:hyperlink r:id="rId21" w:anchor="featured-authors" w:history="1">
+                            <w:hyperlink r:id="rId19" w:anchor="featured-authors" w:history="1">
                               <w:r>
                                 <w:rPr>
                                   <w:rStyle w:val="Hyperlink"/>
@@ -3013,7 +3761,7 @@
                             </w:r>
                           </w:p>
                           <w:p>
-                            <w:hyperlink r:id="rId22" w:history="1">
+                            <w:hyperlink r:id="rId20" w:history="1">
                               <w:r>
                                 <w:rPr>
                                   <w:rStyle w:val="Hyperlink"/>
@@ -3046,7 +3794,7 @@
                 <v:stroke joinstyle="miter"/>
                 <v:path gradientshapeok="t" o:connecttype="rect"/>
               </v:shapetype>
-              <v:shape id="Text Box 2" o:spid="_x0000_s1026" type="#_x0000_t202" style="position:absolute;left:0;text-align:left;margin-left:-17.8pt;margin-top:44.65pt;width:497.9pt;height:419.5pt;z-index:251659264;visibility:visible;mso-wrap-style:square;mso-width-percent:0;mso-height-percent:0;mso-wrap-distance-left:9pt;mso-wrap-distance-top:3.6pt;mso-wrap-distance-right:9pt;mso-wrap-distance-bottom:3.6pt;mso-position-horizontal:absolute;mso-position-horizontal-relative:text;mso-position-vertical:absolute;mso-position-vertical-relative:text;mso-width-percent:0;mso-height-percent:0;mso-width-relative:margin;mso-height-relative:margin;v-text-anchor:top" o:gfxdata="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">
+              <v:shape id="Text Box 2" o:spid="_x0000_s1026" type="#_x0000_t202" style="position:absolute;margin-left:0;margin-top:55.95pt;width:497.9pt;height:419.5pt;z-index:251659264;visibility:visible;mso-wrap-style:square;mso-width-percent:0;mso-height-percent:0;mso-wrap-distance-left:9pt;mso-wrap-distance-top:3.6pt;mso-wrap-distance-right:9pt;mso-wrap-distance-bottom:3.6pt;mso-position-horizontal:center;mso-position-horizontal-relative:margin;mso-position-vertical:absolute;mso-position-vertical-relative:text;mso-width-percent:0;mso-height-percent:0;mso-width-relative:margin;mso-height-relative:margin;v-text-anchor:top" o:gfxdata="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">
                 <v:textbox>
                   <w:txbxContent>
                     <w:p>
@@ -3055,7 +3803,7 @@
                       </w:r>
                     </w:p>
                     <w:p>
-                      <w:hyperlink r:id="rId23" w:history="1">
+                      <w:hyperlink r:id="rId21" w:history="1">
                         <w:r>
                           <w:rPr>
                             <w:rStyle w:val="Hyperlink"/>
@@ -3078,7 +3826,7 @@
                       </w:r>
                     </w:p>
                     <w:p>
-                      <w:hyperlink r:id="rId24" w:history="1">
+                      <w:hyperlink r:id="rId22" w:history="1">
                         <w:r>
                           <w:rPr>
                             <w:rStyle w:val="Hyperlink"/>
@@ -3093,7 +3841,7 @@
                       </w:r>
                     </w:p>
                     <w:p>
-                      <w:hyperlink r:id="rId25" w:history="1">
+                      <w:hyperlink r:id="rId23" w:history="1">
                         <w:r>
                           <w:rPr>
                             <w:rStyle w:val="Hyperlink"/>
@@ -3108,7 +3856,7 @@
                       </w:r>
                     </w:p>
                     <w:p>
-                      <w:hyperlink r:id="rId26" w:history="1">
+                      <w:hyperlink r:id="rId24" w:history="1">
                         <w:r>
                           <w:rPr>
                             <w:rStyle w:val="Hyperlink"/>
@@ -3123,7 +3871,7 @@
                       </w:r>
                     </w:p>
                     <w:p>
-                      <w:hyperlink r:id="rId27" w:history="1">
+                      <w:hyperlink r:id="rId25" w:history="1">
                         <w:r>
                           <w:rPr>
                             <w:rStyle w:val="Hyperlink"/>
@@ -3138,7 +3886,7 @@
                       </w:r>
                     </w:p>
                     <w:p>
-                      <w:hyperlink r:id="rId28" w:anchor="featured-authors" w:history="1">
+                      <w:hyperlink r:id="rId26" w:anchor="featured-authors" w:history="1">
                         <w:r>
                           <w:rPr>
                             <w:rStyle w:val="Hyperlink"/>
@@ -3153,7 +3901,7 @@
                       </w:r>
                     </w:p>
                     <w:p>
-                      <w:hyperlink r:id="rId29" w:history="1">
+                      <w:hyperlink r:id="rId27" w:history="1">
                         <w:r>
                           <w:rPr>
                             <w:rStyle w:val="Hyperlink"/>
@@ -3165,1146 +3913,12 @@
                     <w:p/>
                   </w:txbxContent>
                 </v:textbox>
-                <w10:wrap type="square"/>
+                <w10:wrap type="square" anchorx="margin"/>
               </v:shape>
             </w:pict>
           </mc:Fallback>
         </mc:AlternateContent>
       </w:r>
-      <w:r>
-        <w:rPr>
-          <w:rFonts w:eastAsia="Times New Roman"/>
-          <w:color w:val="EE0000"/>
-          <w:sz w:val="40"/>
-          <w:szCs w:val="40"/>
-        </w:rPr>
-        <w:t xml:space="preserve">Var: </w:t>
-      </w:r>
-      <w:r>
-        <w:rPr>
-          <w:rFonts w:eastAsia="Times New Roman"/>
-          <w:color w:val="EE0000"/>
-          <w:sz w:val="40"/>
-          <w:szCs w:val="40"/>
-        </w:rPr>
-        <w:t>positions, velocity, pressure</w:t>
-      </w:r>
-    </w:p>
-    <w:p>
-      <w:pPr>
-        <w:pStyle w:val="ListParagraph"/>
-        <w:numPr>
-          <w:ilvl w:val="0"/>
-          <w:numId w:val="4"/>
-        </w:numPr>
-        <w:suppressAutoHyphens w:val="0"/>
-        <w:rPr>
-          <w:rFonts w:eastAsia="Times New Roman"/>
-          <w:color w:val="EE0000"/>
-          <w:sz w:val="40"/>
-          <w:szCs w:val="40"/>
-        </w:rPr>
-      </w:pPr>
-      <w:r>
-        <w:rPr>
-          <w:rFonts w:eastAsia="Times New Roman"/>
-          <w:color w:val="EE0000"/>
-          <w:sz w:val="40"/>
-          <w:szCs w:val="40"/>
-        </w:rPr>
-        <w:t>kernel gradient for pressure forces</w:t>
-      </w:r>
-    </w:p>
-    <w:p>
-      <w:pPr>
-        <w:suppressAutoHyphens w:val="0"/>
-        <w:rPr>
-          <w:rFonts w:eastAsia="Times New Roman"/>
-          <w:color w:val="EE0000"/>
-          <w:sz w:val="28"/>
-          <w:szCs w:val="28"/>
-        </w:rPr>
-      </w:pPr>
-      <w:r>
-        <w:rPr>
-          <w:rFonts w:eastAsia="Times New Roman"/>
-          <w:color w:val="EE0000"/>
-          <w:sz w:val="40"/>
-          <w:szCs w:val="40"/>
-        </w:rPr>
-        <w:tab/>
-      </w:r>
-    </w:p>
-    <w:p>
-      <w:pPr>
-        <w:pStyle w:val="Heading1"/>
-      </w:pPr>
-      <w:bookmarkStart w:id="12" w:name="_Toc221287549"/>
-      <w:r>
-        <w:lastRenderedPageBreak/>
-        <w:t>Context</w:t>
-      </w:r>
-      <w:bookmarkEnd w:id="12"/>
-    </w:p>
-    <w:p>
-      <w:pPr>
-        <w:pStyle w:val="Quote"/>
-      </w:pPr>
-      <w:r>
-        <w:t xml:space="preserve">Recommended word count: </w:t>
-      </w:r>
-      <w:r>
-        <w:t>700</w:t>
-      </w:r>
-      <w:r>
-        <w:t xml:space="preserve"> words, including any subsections you decide to add</w:t>
-      </w:r>
-      <w:r>
-        <w:t>.</w:t>
-      </w:r>
-    </w:p>
-    <w:p>
-      <w:pPr>
-        <w:pStyle w:val="Quote"/>
-      </w:pPr>
-      <w:r>
-        <w:t xml:space="preserve">In this section, explain the </w:t>
-      </w:r>
-      <w:r>
-        <w:t>context of the topic you have chosen, including some examples that show why it is important, and perhaps how it relates to other techniques in your discipline. You will want to refer to existing games that use this or similar techniques, or that demonstrate the challenge you’d like to learn to address. You may also want to cite player or journalistic reactions to those games, for additional depth and insight.</w:t>
-      </w:r>
-    </w:p>
-    <w:p>
-      <w:pPr>
-        <w:pStyle w:val="Quote"/>
-      </w:pPr>
-      <w:r>
-        <w:t>Use this section to establish the value of the skill you intend to learn. You may wish to consider why it interests you, but remember that the section is for third-party examples, and should not use too many words on you personally.</w:t>
-      </w:r>
-    </w:p>
-    <w:p>
-      <w:pPr>
-        <w:pStyle w:val="Quote"/>
-      </w:pPr>
-      <w:r>
-        <w:t>You should also use external sources in this section to establish what the outcome of best practice might look like. This will help inform how you would go about it, and in a practice-based investigation would help form the goals with which you could assess if practice had been successful.</w:t>
-      </w:r>
-    </w:p>
-    <w:p>
-      <w:pPr>
-        <w:pStyle w:val="Quote"/>
-      </w:pPr>
-      <w:r>
-        <w:t>In some topics, such as highly technical ones</w:t>
-      </w:r>
-      <w:r>
-        <w:t xml:space="preserve"> or those related to psychology or other scientific fields, you might be able to use academic or other professional sources. In this case you may want the same sources for this section and the next, so make sure you are familiar with the descriptions, purposes and prompts for each so that you still address the aims of each in the right place.</w:t>
-      </w:r>
-    </w:p>
-    <w:p>
-      <w:pPr>
-        <w:pStyle w:val="Quote"/>
-      </w:pPr>
-    </w:p>
-    <w:p>
-      <w:pPr>
-        <w:pStyle w:val="Quote"/>
-      </w:pPr>
-      <w:r>
-        <w:t xml:space="preserve">Make subsections </w:t>
-      </w:r>
-      <w:r>
-        <w:t xml:space="preserve">(with ‘heading 2’) </w:t>
-      </w:r>
-      <w:r>
-        <w:t>as required, for example for each potential approach or each individual background concern. Take care that the subsections belong to the recommended word count for this major section.</w:t>
-      </w:r>
-    </w:p>
-    <w:p>
-      <w:pPr>
-        <w:pStyle w:val="Quote"/>
-        <w:rPr>
-          <w:b/>
-          <w:bCs/>
-        </w:rPr>
-      </w:pPr>
-      <w:r>
-        <w:rPr>
-          <w:b/>
-          <w:bCs/>
-        </w:rPr>
-        <w:t xml:space="preserve">You must reference all your sources in </w:t>
-      </w:r>
-      <w:r>
-        <w:rPr>
-          <w:b/>
-          <w:bCs/>
-        </w:rPr>
-        <w:t>CTR</w:t>
-      </w:r>
-      <w:r>
-        <w:rPr>
-          <w:b/>
-          <w:bCs/>
-        </w:rPr>
-        <w:t xml:space="preserve"> Harvard Style.</w:t>
-      </w:r>
-    </w:p>
-    <w:p>
-      <w:pPr>
-        <w:pStyle w:val="Heading2"/>
-      </w:pPr>
-      <w:bookmarkStart w:id="13" w:name="_Toc221287551"/>
-      <w:r>
-        <w:t>Computational Fluid Dynamics</w:t>
-      </w:r>
-      <w:bookmarkEnd w:id="13"/>
-    </w:p>
-    <w:p>
-      <w:r>
-        <w:t>Hard requirements of a CFD model</w:t>
-      </w:r>
-    </w:p>
-    <w:p>
-      <w:r>
-        <w:t>Smoothed particle hydrodynamics</w:t>
-      </w:r>
-    </w:p>
-    <w:p>
-      <w:pPr>
-        <w:pStyle w:val="Heading2"/>
-      </w:pPr>
-      <w:bookmarkStart w:id="14" w:name="_Toc221287553"/>
-      <w:r>
-        <w:t>Grid based system</w:t>
-      </w:r>
-      <w:bookmarkEnd w:id="14"/>
-    </w:p>
-    <w:p/>
-    <w:p>
-      <w:pPr>
-        <w:pStyle w:val="Heading2"/>
-      </w:pPr>
-      <w:bookmarkStart w:id="15" w:name="_Toc221287554"/>
-      <w:r>
-        <w:lastRenderedPageBreak/>
-        <w:t>Particle based system</w:t>
-      </w:r>
-      <w:bookmarkEnd w:id="15"/>
-      <w:r>
-        <w:t xml:space="preserve"> </w:t>
-      </w:r>
-      <w:bookmarkStart w:id="16" w:name="_Toc221287552"/>
-    </w:p>
-    <w:p>
-      <w:pPr>
-        <w:pStyle w:val="Heading2"/>
-      </w:pPr>
-      <w:r>
-        <w:t>Time Complexities</w:t>
-      </w:r>
-      <w:bookmarkEnd w:id="16"/>
-    </w:p>
-    <w:p>
-      <w:r>
-        <w:t>https://www.youtube.com/watch?v=BgLTDT03QtU</w:t>
-      </w:r>
-    </w:p>
-    <w:p>
-      <w:proofErr w:type="gramStart"/>
-      <w:r>
-        <w:t>O(</w:t>
-      </w:r>
-      <w:proofErr w:type="gramEnd"/>
-      <w:r>
-        <w:t xml:space="preserve">1) to create and add items to a </w:t>
-      </w:r>
-      <w:proofErr w:type="spellStart"/>
-      <w:r>
-        <w:t>hashset</w:t>
-      </w:r>
-      <w:proofErr w:type="spellEnd"/>
-    </w:p>
-    <w:p>
-      <w:pPr>
-        <w:rPr>
-          <w:color w:val="EE0000"/>
-        </w:rPr>
-      </w:pPr>
-      <w:r>
-        <w:rPr>
-          <w:color w:val="EE0000"/>
-        </w:rPr>
-        <w:t>Add a table that looks a time complexities of different data structures</w:t>
-      </w:r>
-    </w:p>
-    <w:p>
-      <w:pPr>
-        <w:rPr>
-          <w:color w:val="EE0000"/>
-        </w:rPr>
-      </w:pPr>
-      <w:proofErr w:type="spellStart"/>
-      <w:r>
-        <w:rPr>
-          <w:color w:val="EE0000"/>
-        </w:rPr>
-        <w:t>Cacheing</w:t>
-      </w:r>
-      <w:proofErr w:type="spellEnd"/>
-      <w:r>
-        <w:rPr>
-          <w:color w:val="EE0000"/>
-        </w:rPr>
-        <w:t xml:space="preserve"> </w:t>
-      </w:r>
-      <w:r>
-        <w:rPr>
-          <w:color w:val="EE0000"/>
-        </w:rPr>
-        <w:t>https://www.geeksforgeeks.org/system-design/caching-system-design-concept-for-beginners/</w:t>
-      </w:r>
-    </w:p>
-    <w:p>
-      <w:pPr>
-        <w:pStyle w:val="Heading2"/>
-      </w:pPr>
-      <w:r>
-        <w:t>Performance benchmarks</w:t>
-      </w:r>
-    </w:p>
-    <w:p>
-      <w:r>
-        <w:t xml:space="preserve">Rendering a single particle </w:t>
-      </w:r>
-      <w:r>
-        <w:t>without any behaviour 250 -400fps</w:t>
-      </w:r>
-    </w:p>
-    <w:p>
-      <w:r>
-        <w:t>500 particles spawned, not interacting 190 -210fps</w:t>
-      </w:r>
-    </w:p>
-    <w:p/>
-    <w:p/>
-    <w:p>
-      <w:pPr>
-        <w:pStyle w:val="Heading2"/>
-      </w:pPr>
-      <w:r>
-        <w:t>Implementation</w:t>
-      </w:r>
-    </w:p>
-    <w:p>
-      <w:pPr>
-        <w:pStyle w:val="Heading3"/>
-      </w:pPr>
-      <w:r>
-        <w:t>Particle settings</w:t>
-      </w:r>
-    </w:p>
-    <w:p>
-      <w:pPr>
-        <w:pStyle w:val="Heading3"/>
-      </w:pPr>
-      <w:r>
-        <w:t>Particle spawner</w:t>
-      </w:r>
-    </w:p>
-    <w:p>
-      <w:pPr>
-        <w:pStyle w:val="Heading3"/>
-      </w:pPr>
-      <w:r>
-        <w:t>Pressure</w:t>
-      </w:r>
-    </w:p>
-    <w:p>
-      <w:pPr>
-        <w:pStyle w:val="Heading3"/>
-      </w:pPr>
-      <w:r>
-        <w:t>Viscosity</w:t>
-      </w:r>
-    </w:p>
-    <w:p>
-      <w:pPr>
-        <w:pStyle w:val="Heading3"/>
-      </w:pPr>
-      <w:r>
-        <w:t>Surface tension</w:t>
-      </w:r>
-    </w:p>
-    <w:p/>
-    <w:p/>
-    <w:p/>
-    <w:p>
-      <w:pPr>
-        <w:pStyle w:val="Heading1"/>
-      </w:pPr>
-    </w:p>
-    <w:p>
-      <w:r>
-        <w:rPr>
-          <w:noProof/>
-        </w:rPr>
-        <w:drawing>
-          <wp:inline distT="0" distB="0" distL="0" distR="0" wp14:anchorId="472DA9C3" wp14:editId="79BE6E3C">
-            <wp:extent cx="5731510" cy="3218180"/>
-            <wp:effectExtent l="0" t="0" r="2540" b="1270"/>
-            <wp:docPr id="2" name="Picture 2" descr="A collage of a person's head&#10;&#10;Description automatically generated with medium confidence"/>
-            <wp:cNvGraphicFramePr>
-              <a:graphicFrameLocks xmlns:a="http://schemas.openxmlformats.org/drawingml/2006/main" noChangeAspect="1"/>
-            </wp:cNvGraphicFramePr>
-            <a:graphic xmlns:a="http://schemas.openxmlformats.org/drawingml/2006/main">
-              <a:graphicData uri="http://schemas.openxmlformats.org/drawingml/2006/picture">
-                <pic:pic xmlns:pic="http://schemas.openxmlformats.org/drawingml/2006/picture">
-                  <pic:nvPicPr>
-                    <pic:cNvPr id="2" name="Picture 2" descr="A collage of a person's head&#10;&#10;Description automatically generated with medium confidence"/>
-                    <pic:cNvPicPr>
-                      <a:picLocks noChangeAspect="1" noChangeArrowheads="1"/>
-                    </pic:cNvPicPr>
-                  </pic:nvPicPr>
-                  <pic:blipFill>
-                    <a:blip r:embed="rId30">
-                      <a:extLst>
-                        <a:ext uri="{28A0092B-C50C-407E-A947-70E740481C1C}">
-                          <a14:useLocalDpi xmlns:a14="http://schemas.microsoft.com/office/drawing/2010/main" val="0"/>
-                        </a:ext>
-                      </a:extLst>
-                    </a:blip>
-                    <a:srcRect/>
-                    <a:stretch>
-                      <a:fillRect/>
-                    </a:stretch>
-                  </pic:blipFill>
-                  <pic:spPr bwMode="auto">
-                    <a:xfrm>
-                      <a:off x="0" y="0"/>
-                      <a:ext cx="5731510" cy="3218180"/>
-                    </a:xfrm>
-                    <a:prstGeom prst="rect">
-                      <a:avLst/>
-                    </a:prstGeom>
-                    <a:noFill/>
-                    <a:ln>
-                      <a:noFill/>
-                    </a:ln>
-                  </pic:spPr>
-                </pic:pic>
-              </a:graphicData>
-            </a:graphic>
-          </wp:inline>
-        </w:drawing>
-      </w:r>
-    </w:p>
-    <w:p>
-      <w:pPr>
-        <w:pStyle w:val="Caption"/>
-      </w:pPr>
-      <w:bookmarkStart w:id="17" w:name="_Toc115450903"/>
-      <w:r>
-        <w:t xml:space="preserve">Figure </w:t>
-      </w:r>
-      <w:r>
-        <w:fldChar w:fldCharType="begin"/>
-      </w:r>
-      <w:r>
-        <w:instrText>SEQ Figure \* ARABIC</w:instrText>
-      </w:r>
-      <w:r>
-        <w:fldChar w:fldCharType="separate"/>
-      </w:r>
-      <w:r>
-        <w:rPr>
-          <w:noProof/>
-        </w:rPr>
-        <w:t>1</w:t>
-      </w:r>
-      <w:r>
-        <w:fldChar w:fldCharType="end"/>
-      </w:r>
-      <w:r>
-        <w:t xml:space="preserve">: A sample </w:t>
-      </w:r>
-      <w:r>
-        <w:rPr>
-          <w:noProof/>
-        </w:rPr>
-        <w:t>image, formatted and captioned as a figure.</w:t>
-      </w:r>
-      <w:bookmarkEnd w:id="17"/>
-    </w:p>
-    <w:p>
-      <w:pPr>
-        <w:pStyle w:val="Quote"/>
-      </w:pPr>
-      <w:r>
-        <w:t xml:space="preserve">This sample figure demonstrates the use of an image. Put the image </w:t>
-      </w:r>
-      <w:r>
-        <w:t xml:space="preserve">(or table, or other non-paragraph object) into the flow of the document at an appropriate </w:t>
-      </w:r>
-      <w:r>
-        <w:t>point and</w:t>
-      </w:r>
-      <w:r>
-        <w:t xml:space="preserve"> give it a caption so that it is automatically added to the table of figures when you next ‘update’ it.</w:t>
-      </w:r>
-    </w:p>
-    <w:p>
-      <w:r>
-        <w:t>[Enter text here]</w:t>
-      </w:r>
-      <w:r>
-        <w:br w:type="page"/>
-      </w:r>
-    </w:p>
-    <w:p>
-      <w:pPr>
-        <w:pStyle w:val="Heading1"/>
-      </w:pPr>
-      <w:bookmarkStart w:id="18" w:name="_Toc221287555"/>
-      <w:r>
-        <w:lastRenderedPageBreak/>
-        <w:t>Prior Approaches</w:t>
-      </w:r>
-      <w:bookmarkEnd w:id="18"/>
-    </w:p>
-    <w:p>
-      <w:pPr>
-        <w:pStyle w:val="Quote"/>
-      </w:pPr>
-      <w:r>
-        <w:t xml:space="preserve">Recommended word count: </w:t>
-      </w:r>
-      <w:r>
-        <w:t>700</w:t>
-      </w:r>
-      <w:r>
-        <w:t xml:space="preserve"> words, including any subsections you decide to add.</w:t>
-      </w:r>
-    </w:p>
-    <w:p>
-      <w:pPr>
-        <w:pStyle w:val="Quote"/>
-      </w:pPr>
-      <w:r>
-        <w:t xml:space="preserve">Use this major section to </w:t>
-      </w:r>
-      <w:r>
-        <w:t xml:space="preserve">examine one or more </w:t>
-      </w:r>
-      <w:r>
-        <w:t>approach</w:t>
-      </w:r>
-      <w:r>
-        <w:t xml:space="preserve">es that others have used to address the challenge you are interested in, or similar ones. Ideally you would find multiple approaches so that you can </w:t>
-      </w:r>
-      <w:proofErr w:type="gramStart"/>
-      <w:r>
-        <w:t>compare and contrast</w:t>
-      </w:r>
-      <w:proofErr w:type="gramEnd"/>
-      <w:r>
-        <w:t xml:space="preserve"> them, but you can concentrate on one strategy if you can find enough to say about it.</w:t>
-      </w:r>
-    </w:p>
-    <w:p>
-      <w:pPr>
-        <w:pStyle w:val="Quote"/>
-      </w:pPr>
-      <w:r>
-        <w:t xml:space="preserve">Your sources should be knowledgeable and reliable ones where possible, such as developer logs, but tutorials can be useful (especially if you can compare them or have time to try them to test how well they work). Player speculation as to how a feature is implemented can be </w:t>
-      </w:r>
-      <w:proofErr w:type="gramStart"/>
-      <w:r>
-        <w:t>useful, but</w:t>
-      </w:r>
-      <w:proofErr w:type="gramEnd"/>
-      <w:r>
-        <w:t xml:space="preserve"> should not be your main resource.</w:t>
-      </w:r>
-    </w:p>
-    <w:p>
-      <w:pPr>
-        <w:pStyle w:val="Quote"/>
-      </w:pPr>
-      <w:r>
-        <w:t>If you are struggling to find good enough sources as described above, you may need to adjust the direction of your investigation slightly, finding new aims that can be more easily sourced.</w:t>
-      </w:r>
-    </w:p>
-    <w:p>
-      <w:pPr>
-        <w:pStyle w:val="Quote"/>
-      </w:pPr>
-      <w:r>
-        <w:t xml:space="preserve">Try to understand (and highlight to the reader as appropriate) how these approaches work, and what makes them suitable for use in the context you’ve established. One aim of this section is for you to develop your understanding of these </w:t>
-      </w:r>
-      <w:proofErr w:type="gramStart"/>
-      <w:r>
-        <w:t>techniques, and</w:t>
-      </w:r>
-      <w:proofErr w:type="gramEnd"/>
-      <w:r>
-        <w:t xml:space="preserve"> demonstrate it to a deep level.</w:t>
-      </w:r>
-    </w:p>
-    <w:p>
-      <w:pPr>
-        <w:pStyle w:val="Quote"/>
-      </w:pPr>
-      <w:r>
-        <w:t xml:space="preserve">As you explore one or more approaches, you may comment on how effective they might be for </w:t>
-      </w:r>
-      <w:proofErr w:type="gramStart"/>
-      <w:r>
-        <w:t>you, but</w:t>
-      </w:r>
-      <w:proofErr w:type="gramEnd"/>
-      <w:r>
-        <w:t xml:space="preserve"> note that there are words available for that in the Recommendations section.</w:t>
-      </w:r>
-    </w:p>
-    <w:p>
-      <w:pPr>
-        <w:pStyle w:val="Quote"/>
-      </w:pPr>
-      <w:r>
-        <w:t>You may</w:t>
-      </w:r>
-      <w:r>
-        <w:t xml:space="preserve"> divide the approach into subsections</w:t>
-      </w:r>
-      <w:r>
-        <w:t xml:space="preserve"> (with ‘heading 2’)</w:t>
-      </w:r>
-      <w:r>
-        <w:t xml:space="preserve">, such as your methods for key areas of the project, or for </w:t>
-      </w:r>
-      <w:proofErr w:type="gramStart"/>
-      <w:r>
-        <w:t xml:space="preserve">particular </w:t>
-      </w:r>
-      <w:r>
-        <w:t>aspects</w:t>
-      </w:r>
-      <w:proofErr w:type="gramEnd"/>
-      <w:r>
-        <w:t xml:space="preserve"> of development</w:t>
-      </w:r>
-      <w:r>
-        <w:t>.</w:t>
-      </w:r>
-      <w:r>
-        <w:t xml:space="preserve"> Take care of the total recommended words for the section overall.</w:t>
-      </w:r>
-    </w:p>
-    <w:p>
-      <w:pPr>
-        <w:pStyle w:val="Quote"/>
-        <w:rPr>
-          <w:b/>
-          <w:bCs/>
-        </w:rPr>
-      </w:pPr>
-      <w:r>
-        <w:rPr>
-          <w:b/>
-          <w:bCs/>
-        </w:rPr>
-        <w:t xml:space="preserve">You must reference all your sources in </w:t>
-      </w:r>
-      <w:r>
-        <w:rPr>
-          <w:b/>
-          <w:bCs/>
-        </w:rPr>
-        <w:t>CTR</w:t>
-      </w:r>
-      <w:r>
-        <w:rPr>
-          <w:b/>
-          <w:bCs/>
-        </w:rPr>
-        <w:t xml:space="preserve"> Harvard Style.</w:t>
-      </w:r>
-    </w:p>
-    <w:p>
-      <w:r>
-        <w:t>[Enter text here]</w:t>
-      </w:r>
-    </w:p>
-    <w:p>
-      <w:pPr>
-        <w:pStyle w:val="Quote"/>
-      </w:pPr>
-    </w:p>
-    <w:p>
-      <w:pPr>
-        <w:pStyle w:val="Heading2"/>
-      </w:pPr>
-      <w:bookmarkStart w:id="19" w:name="_Toc221287556"/>
-      <w:r>
-        <w:t>Eulerian Approach</w:t>
-      </w:r>
-      <w:bookmarkEnd w:id="19"/>
-    </w:p>
-    <w:p/>
-    <w:p>
-      <w:pPr>
-        <w:pStyle w:val="Heading2"/>
-      </w:pPr>
-      <w:bookmarkStart w:id="20" w:name="_Toc221287557"/>
-      <w:r>
-        <w:t>Lagrangian Approach</w:t>
-      </w:r>
-      <w:bookmarkEnd w:id="20"/>
-    </w:p>
-    <w:p/>
-    <w:p>
-      <w:pPr>
-        <w:pStyle w:val="Heading2"/>
-      </w:pPr>
-      <w:bookmarkStart w:id="21" w:name="_Toc221287558"/>
-      <w:r>
-        <w:t>Eulerian-Lagrange Approach</w:t>
-      </w:r>
-      <w:bookmarkEnd w:id="21"/>
-    </w:p>
-    <w:p/>
-    <w:p>
-      <w:pPr>
-        <w:suppressAutoHyphens w:val="0"/>
-        <w:rPr>
-          <w:rFonts w:eastAsia="Times New Roman"/>
-          <w:bCs/>
-          <w:color w:val="000000"/>
-          <w:sz w:val="40"/>
-          <w:szCs w:val="28"/>
-        </w:rPr>
-      </w:pPr>
-      <w:r>
-        <w:lastRenderedPageBreak/>
-        <w:br w:type="page"/>
-      </w:r>
-    </w:p>
-    <w:p>
-      <w:pPr>
-        <w:pStyle w:val="Heading1"/>
-      </w:pPr>
-      <w:bookmarkStart w:id="22" w:name="_Toc221287559"/>
-      <w:r>
-        <w:lastRenderedPageBreak/>
-        <w:t>Recommendations</w:t>
-      </w:r>
-      <w:bookmarkEnd w:id="22"/>
-    </w:p>
-    <w:p>
-      <w:pPr>
-        <w:pStyle w:val="Quote"/>
-      </w:pPr>
-      <w:r>
-        <w:t xml:space="preserve">Recommended word count: </w:t>
-      </w:r>
-      <w:r>
-        <w:t>700</w:t>
-      </w:r>
-      <w:r>
-        <w:t xml:space="preserve"> words, including any subsections you decide to add.</w:t>
-      </w:r>
-    </w:p>
-    <w:p>
-      <w:pPr>
-        <w:pStyle w:val="Quote"/>
-      </w:pPr>
-      <w:r>
-        <w:t xml:space="preserve">Use </w:t>
-      </w:r>
-      <w:r>
-        <w:t xml:space="preserve">this major section to </w:t>
-      </w:r>
-      <w:r>
-        <w:t xml:space="preserve">set out </w:t>
-      </w:r>
-      <w:proofErr w:type="gramStart"/>
-      <w:r>
-        <w:t>the your</w:t>
-      </w:r>
-      <w:proofErr w:type="gramEnd"/>
-      <w:r>
-        <w:t xml:space="preserve"> findings, in the form of recommendations you could use or give your reader. Remember the original simulated goal of a senior coworker asking you to find out more about the technique: this is your opportunity to share what you’ve found.</w:t>
-      </w:r>
-    </w:p>
-    <w:p>
-      <w:pPr>
-        <w:pStyle w:val="Quote"/>
-      </w:pPr>
-      <w:r>
-        <w:t xml:space="preserve">Describe the technique you ought to use, </w:t>
-      </w:r>
-      <w:r>
-        <w:t xml:space="preserve">showing its strengths and </w:t>
-      </w:r>
-      <w:r>
-        <w:t>recognising any remaining issues</w:t>
-      </w:r>
-      <w:r>
-        <w:t xml:space="preserve"> (although there are additional words available for this in the next section)</w:t>
-      </w:r>
-      <w:r>
-        <w:t xml:space="preserve">. You </w:t>
-      </w:r>
-      <w:r>
-        <w:t>should</w:t>
-      </w:r>
-      <w:r>
-        <w:t xml:space="preserve"> </w:t>
-      </w:r>
-      <w:r>
-        <w:t xml:space="preserve">consider </w:t>
-      </w:r>
-      <w:r>
-        <w:t xml:space="preserve">challenges that </w:t>
-      </w:r>
-      <w:r>
-        <w:t>might still need to be solved, and how you could protect against them in a future project. You could also comment on what related things might be sensible to learn next.</w:t>
-      </w:r>
-    </w:p>
-    <w:p>
-      <w:pPr>
-        <w:pStyle w:val="Quote"/>
-      </w:pPr>
-      <w:r>
-        <w:t xml:space="preserve">You probably don’t need any new sources here, and although you should still aim for an impartial and evidence-led style, this section gives an opportunity for you to show more of your own judgement and technical decision-making, rather than restricting yourself to </w:t>
-      </w:r>
-      <w:proofErr w:type="gramStart"/>
-      <w:r>
-        <w:t>directly-sourced</w:t>
-      </w:r>
-      <w:proofErr w:type="gramEnd"/>
-      <w:r>
-        <w:t xml:space="preserve"> information. Refer to previous </w:t>
-      </w:r>
-      <w:proofErr w:type="gramStart"/>
-      <w:r>
-        <w:t>sections, but</w:t>
-      </w:r>
-      <w:proofErr w:type="gramEnd"/>
-      <w:r>
-        <w:t xml:space="preserve"> try not to repeat yourself; the word count here may be challenging.</w:t>
-      </w:r>
-    </w:p>
-    <w:p>
-      <w:pPr>
-        <w:pStyle w:val="Quote"/>
-      </w:pPr>
-      <w:r>
-        <w:t>Y</w:t>
-      </w:r>
-      <w:r>
-        <w:t xml:space="preserve">ou must include enough of </w:t>
-      </w:r>
-      <w:r>
-        <w:rPr>
-          <w:b/>
-          <w:bCs/>
-        </w:rPr>
-        <w:t>what</w:t>
-      </w:r>
-      <w:r>
-        <w:t xml:space="preserve"> the </w:t>
-      </w:r>
-      <w:r>
-        <w:t xml:space="preserve">approaches involve </w:t>
-      </w:r>
-      <w:proofErr w:type="gramStart"/>
-      <w:r>
-        <w:t>to support</w:t>
-      </w:r>
-      <w:proofErr w:type="gramEnd"/>
-      <w:r>
-        <w:t xml:space="preserve"> the </w:t>
-      </w:r>
-      <w:proofErr w:type="gramStart"/>
-      <w:r>
-        <w:t>reader, but</w:t>
-      </w:r>
-      <w:proofErr w:type="gramEnd"/>
-      <w:r>
-        <w:t xml:space="preserve"> </w:t>
-      </w:r>
-      <w:r>
-        <w:t xml:space="preserve">will get most </w:t>
-      </w:r>
-      <w:r>
-        <w:t xml:space="preserve">benefit from writing about </w:t>
-      </w:r>
-      <w:r>
-        <w:rPr>
-          <w:b/>
-          <w:bCs/>
-        </w:rPr>
-        <w:t>why</w:t>
-      </w:r>
-      <w:r>
-        <w:t xml:space="preserve"> that is</w:t>
-      </w:r>
-      <w:r>
-        <w:t xml:space="preserve">, and </w:t>
-      </w:r>
-      <w:r>
-        <w:rPr>
-          <w:b/>
-          <w:bCs/>
-        </w:rPr>
-        <w:t>how</w:t>
-      </w:r>
-      <w:r>
-        <w:t>.</w:t>
-      </w:r>
-    </w:p>
-    <w:p>
-      <w:pPr>
-        <w:pStyle w:val="Quote"/>
-      </w:pPr>
-      <w:r>
-        <w:t>You may wish to introduce subsections</w:t>
-      </w:r>
-      <w:r>
-        <w:t xml:space="preserve"> (with ‘heading 2’)</w:t>
-      </w:r>
-      <w:r>
-        <w:t xml:space="preserve"> for different aspects of the project, or for the different challenges you wish to focus on.</w:t>
-      </w:r>
-      <w:r>
-        <w:t xml:space="preserve"> Take care that they respect the total recommended words for the section</w:t>
-      </w:r>
-      <w:r>
-        <w:t>.</w:t>
-      </w:r>
-    </w:p>
-    <w:p>
-      <w:r>
-        <w:t>[Enter text here]</w:t>
-      </w:r>
-    </w:p>
-    <w:p>
-      <w:pPr>
-        <w:suppressAutoHyphens w:val="0"/>
-        <w:rPr>
-          <w:rFonts w:eastAsia="Times New Roman"/>
-          <w:bCs/>
-          <w:color w:val="000000"/>
-          <w:sz w:val="40"/>
-          <w:szCs w:val="28"/>
-        </w:rPr>
-      </w:pPr>
-      <w:r>
-        <w:br w:type="page"/>
-      </w:r>
-    </w:p>
-    <w:p>
-      <w:pPr>
-        <w:pStyle w:val="Heading1"/>
-      </w:pPr>
-      <w:bookmarkStart w:id="23" w:name="_Toc221287560"/>
-      <w:r>
-        <w:lastRenderedPageBreak/>
-        <w:t xml:space="preserve">Conclusion and </w:t>
-      </w:r>
-      <w:r>
-        <w:t>Reflection</w:t>
-      </w:r>
-      <w:bookmarkEnd w:id="23"/>
-    </w:p>
-    <w:bookmarkEnd w:id="11"/>
-    <w:p>
-      <w:pPr>
-        <w:pStyle w:val="Quote"/>
-      </w:pPr>
-      <w:r>
-        <w:t xml:space="preserve">Recommended word count: </w:t>
-      </w:r>
-      <w:r>
-        <w:t>7</w:t>
-      </w:r>
-      <w:r>
-        <w:t>00 words, including any subsections you decide to add.</w:t>
-      </w:r>
-    </w:p>
-    <w:p>
-      <w:pPr>
-        <w:pStyle w:val="Quote"/>
-      </w:pPr>
-      <w:r>
-        <w:t xml:space="preserve">Use this section </w:t>
-      </w:r>
-      <w:r>
-        <w:t>for two things:</w:t>
-      </w:r>
-    </w:p>
-    <w:p>
-      <w:pPr>
-        <w:pStyle w:val="Quote"/>
-        <w:numPr>
-          <w:ilvl w:val="0"/>
-          <w:numId w:val="3"/>
-        </w:numPr>
-      </w:pPr>
-      <w:r>
-        <w:t xml:space="preserve">To </w:t>
-      </w:r>
-      <w:r>
-        <w:t xml:space="preserve">close out your report, </w:t>
-      </w:r>
-      <w:r>
-        <w:t>commenting on how effective your recommended approach might be. You are not expected to have tested it in this non-practice assessment and do not need to repeat its challenges if they were covered in Recommendations, but here is a chance to show more critical insight into how good the results are likely to be.</w:t>
-      </w:r>
-    </w:p>
-    <w:p>
-      <w:pPr>
-        <w:pStyle w:val="Quote"/>
-        <w:numPr>
-          <w:ilvl w:val="0"/>
-          <w:numId w:val="3"/>
-        </w:numPr>
-      </w:pPr>
-      <w:r>
-        <w:t>To reflect on how your investigation has gone, trying to find things you would like to maintain or try to improve next time you are investigating. Although you don’t need to be planning the next investigation, you should bear in mind that this exercise is an opportunity to consider things that may help with Major Project next year.</w:t>
-      </w:r>
-    </w:p>
-    <w:p>
-      <w:pPr>
-        <w:pStyle w:val="Quote"/>
-      </w:pPr>
-      <w:r>
-        <w:t>These sections can be weighted roughly equally, with perhaps a slight preference for the second half.</w:t>
-      </w:r>
-    </w:p>
-    <w:p>
-      <w:pPr>
-        <w:pStyle w:val="Quote"/>
-      </w:pPr>
-      <w:r>
-        <w:t>In both cases try to be specific and detailed: you may wish to take a “case studies” approach and dive deeply into a smaller number of strengths/weaknesses of your recommendation and of your investigation, rather than spend your words on a broad and shallow survey of too many factors.</w:t>
-      </w:r>
-    </w:p>
-    <w:p>
-      <w:pPr>
-        <w:pStyle w:val="Quote"/>
-      </w:pPr>
-      <w:r>
-        <w:t xml:space="preserve">In the </w:t>
-      </w:r>
-      <w:proofErr w:type="gramStart"/>
-      <w:r>
-        <w:t>reflection in particular, try</w:t>
-      </w:r>
-      <w:proofErr w:type="gramEnd"/>
-      <w:r>
-        <w:t xml:space="preserve"> to understand the strengths/challenges well enough to start a concrete plan for retaining/correcting them next time. Forming such a plan will be the biggest benefit for your next project, and showing the reader key details here will earn the best marks for this criterion. Try not to dwell on circumstances beyond your control.</w:t>
-      </w:r>
-    </w:p>
-    <w:p>
-      <w:pPr>
-        <w:pStyle w:val="Quote"/>
-      </w:pPr>
-      <w:r>
-        <w:t>You may add subsections (with ‘heading 2’) here as you need them, perhaps to emphasise separation between your reflection on your practice and your potential goals for future proje</w:t>
-      </w:r>
-      <w:r>
-        <w:t>cts</w:t>
-      </w:r>
-      <w:r>
-        <w:t>.</w:t>
-      </w:r>
-    </w:p>
-    <w:p>
-      <w:r>
-        <w:t>[Enter text here]</w:t>
-      </w:r>
-    </w:p>
-    <w:p/>
-    <w:p/>
-    <w:p>
-      <w:pPr>
-        <w:suppressAutoHyphens w:val="0"/>
-      </w:pPr>
-      <w:r>
-        <w:br w:type="page"/>
-      </w:r>
-    </w:p>
-    <w:p>
-      <w:pPr>
-        <w:pStyle w:val="Heading1"/>
-      </w:pPr>
-      <w:bookmarkStart w:id="24" w:name="_Toc221287561"/>
-      <w:r>
-        <w:lastRenderedPageBreak/>
-        <w:t>References</w:t>
-      </w:r>
-      <w:bookmarkEnd w:id="24"/>
-    </w:p>
-    <w:p>
-      <w:pPr>
-        <w:pStyle w:val="Quote"/>
-        <w:spacing w:after="120" w:line="240" w:lineRule="auto"/>
-      </w:pPr>
-      <w:r>
-        <w:t xml:space="preserve">Use this section to </w:t>
-      </w:r>
-      <w:r>
-        <w:t xml:space="preserve">list your references, including </w:t>
-      </w:r>
-      <w:r>
-        <w:t xml:space="preserve">tutorials you </w:t>
-      </w:r>
-      <w:r>
-        <w:t xml:space="preserve">may </w:t>
-      </w:r>
-      <w:r>
-        <w:t>have quoted code</w:t>
-      </w:r>
-      <w:r>
-        <w:t xml:space="preserve"> from</w:t>
-      </w:r>
-      <w:r>
-        <w:t>.</w:t>
-      </w:r>
-      <w:r>
-        <w:t xml:space="preserve"> External assets should be listed in the next section.</w:t>
-      </w:r>
-    </w:p>
-    <w:p>
-      <w:pPr>
-        <w:pStyle w:val="Quote"/>
-        <w:spacing w:after="120" w:line="240" w:lineRule="auto"/>
-      </w:pPr>
-      <w:r>
-        <w:t>U</w:t>
-      </w:r>
-      <w:r>
-        <w:t xml:space="preserve">se </w:t>
-      </w:r>
-      <w:r>
-        <w:t>CTR</w:t>
-      </w:r>
-      <w:r>
-        <w:t xml:space="preserve"> Harvard </w:t>
-      </w:r>
-      <w:r>
-        <w:t>r</w:t>
-      </w:r>
-      <w:r>
-        <w:t>eferencing</w:t>
-      </w:r>
-      <w:r>
-        <w:t>.</w:t>
-      </w:r>
-    </w:p>
-    <w:p>
       <w:r>
         <w:t>[Enter text here]</w:t>
       </w:r>
@@ -4424,8 +4038,8 @@
     </w:sdt>
     <w:p/>
     <w:sectPr>
-      <w:headerReference w:type="default" r:id="rId31"/>
-      <w:footerReference w:type="default" r:id="rId32"/>
+      <w:headerReference w:type="default" r:id="rId28"/>
+      <w:footerReference w:type="default" r:id="rId29"/>
       <w:pgSz w:w="11906" w:h="16838"/>
       <w:pgMar w:top="1440" w:right="1440" w:bottom="1440" w:left="1440" w:header="708" w:footer="708" w:gutter="0"/>
       <w:pgNumType w:start="1"/>
@@ -4461,17 +4075,6 @@
 </file>
 
 <file path=word/footer1.xml><?xml version="1.0" encoding="utf-8"?>
-<w:ftr xmlns:wpc="http://schemas.microsoft.com/office/word/2010/wordprocessingCanvas" xmlns:cx="http://schemas.microsoft.com/office/drawing/2014/chartex" xmlns:cx1="http://schemas.microsoft.com/office/drawing/2015/9/8/chartex" xmlns:cx2="http://schemas.microsoft.com/office/drawing/2015/10/21/chartex" xmlns:cx3="http://schemas.microsoft.com/office/drawing/2016/5/9/chartex" xmlns:cx4="http://schemas.microsoft.com/office/drawing/2016/5/10/chartex" xmlns:cx5="http://schemas.microsoft.com/office/drawing/2016/5/11/chartex" xmlns:cx6="http://schemas.microsoft.com/office/drawing/2016/5/12/chartex" xmlns:cx7="http://schemas.microsoft.com/office/drawing/2016/5/13/chartex" xmlns:cx8="http://schemas.microsoft.com/office/drawing/2016/5/14/chartex" xmlns:mc="http://schemas.openxmlformats.org/markup-compatibility/2006" xmlns:aink="http://schemas.microsoft.com/office/drawing/2016/ink" xmlns:am3d="http://schemas.microsoft.com/office/drawing/2017/model3d" xmlns:o="urn:schemas-microsoft-com:office:office" xmlns:oel="http://schemas.microsoft.com/office/2019/extlst" xmlns:r="http://schemas.openxmlformats.org/officeDocument/2006/relationships" xmlns:m="http://schemas.openxmlformats.org/officeDocument/2006/math" xmlns:v="urn:schemas-microsoft-com:vml" xmlns:wp14="http://schemas.microsoft.com/office/word/2010/wordprocessingDrawing" xmlns:wp="http://schemas.openxmlformats.org/drawingml/2006/wordprocessingDrawing" xmlns:w10="urn:schemas-microsoft-com:office:word" xmlns:w="http://schemas.openxmlformats.org/wordprocessingml/2006/main" xmlns:w14="http://schemas.microsoft.com/office/word/2010/wordml" xmlns:w15="http://schemas.microsoft.com/office/word/2012/wordml" xmlns:w16cex="http://schemas.microsoft.com/office/word/2018/wordml/cex" xmlns:w16cid="http://schemas.microsoft.com/office/word/2016/wordml/cid" xmlns:w16="http://schemas.microsoft.com/office/word/2018/wordml" xmlns:w16du="http://schemas.microsoft.com/office/word/2023/wordml/word16du" xmlns:w16sdtdh="http://schemas.microsoft.com/office/word/2020/wordml/sdtdatahash" xmlns:w16sdtfl="http://schemas.microsoft.com/office/word/2024/wordml/sdtformatlock" xmlns:w16se="http://schemas.microsoft.com/office/word/2015/wordml/symex" xmlns:wpg="http://schemas.microsoft.com/office/word/2010/wordprocessingGroup" xmlns:wpi="http://schemas.microsoft.com/office/word/2010/wordprocessingInk" xmlns:wne="http://schemas.microsoft.com/office/word/2006/wordml" xmlns:wps="http://schemas.microsoft.com/office/word/2010/wordprocessingShape" mc:Ignorable="w14 w15 w16se w16cid w16 w16cex w16sdtdh w16sdtfl w16du wp14">
-  <w:p>
-    <w:pPr>
-      <w:pStyle w:val="Footer"/>
-      <w:jc w:val="right"/>
-    </w:pPr>
-  </w:p>
-</w:ftr>
-</file>
-
-<file path=word/footer2.xml><?xml version="1.0" encoding="utf-8"?>
 <w:ftr xmlns:wpc="http://schemas.microsoft.com/office/word/2010/wordprocessingCanvas" xmlns:cx="http://schemas.microsoft.com/office/drawing/2014/chartex" xmlns:cx1="http://schemas.microsoft.com/office/drawing/2015/9/8/chartex" xmlns:cx2="http://schemas.microsoft.com/office/drawing/2015/10/21/chartex" xmlns:cx3="http://schemas.microsoft.com/office/drawing/2016/5/9/chartex" xmlns:cx4="http://schemas.microsoft.com/office/drawing/2016/5/10/chartex" xmlns:cx5="http://schemas.microsoft.com/office/drawing/2016/5/11/chartex" xmlns:cx6="http://schemas.microsoft.com/office/drawing/2016/5/12/chartex" xmlns:cx7="http://schemas.microsoft.com/office/drawing/2016/5/13/chartex" xmlns:cx8="http://schemas.microsoft.com/office/drawing/2016/5/14/chartex" xmlns:mc="http://schemas.openxmlformats.org/markup-compatibility/2006" xmlns:aink="http://schemas.microsoft.com/office/drawing/2016/ink" xmlns:am3d="http://schemas.microsoft.com/office/drawing/2017/model3d" xmlns:o="urn:schemas-microsoft-com:office:office" xmlns:oel="http://schemas.microsoft.com/office/2019/extlst" xmlns:r="http://schemas.openxmlformats.org/officeDocument/2006/relationships" xmlns:m="http://schemas.openxmlformats.org/officeDocument/2006/math" xmlns:v="urn:schemas-microsoft-com:vml" xmlns:wp14="http://schemas.microsoft.com/office/word/2010/wordprocessingDrawing" xmlns:wp="http://schemas.openxmlformats.org/drawingml/2006/wordprocessingDrawing" xmlns:w10="urn:schemas-microsoft-com:office:word" xmlns:w="http://schemas.openxmlformats.org/wordprocessingml/2006/main" xmlns:w14="http://schemas.microsoft.com/office/word/2010/wordml" xmlns:w15="http://schemas.microsoft.com/office/word/2012/wordml" xmlns:w16cex="http://schemas.microsoft.com/office/word/2018/wordml/cex" xmlns:w16cid="http://schemas.microsoft.com/office/word/2016/wordml/cid" xmlns:w16="http://schemas.microsoft.com/office/word/2018/wordml" xmlns:w16du="http://schemas.microsoft.com/office/word/2023/wordml/word16du" xmlns:w16sdtdh="http://schemas.microsoft.com/office/word/2020/wordml/sdtdatahash" xmlns:w16sdtfl="http://schemas.microsoft.com/office/word/2024/wordml/sdtformatlock" xmlns:w16se="http://schemas.microsoft.com/office/word/2015/wordml/symex" xmlns:wpg="http://schemas.microsoft.com/office/word/2010/wordprocessingGroup" xmlns:wpi="http://schemas.microsoft.com/office/word/2010/wordprocessingInk" xmlns:wne="http://schemas.microsoft.com/office/word/2006/wordml" xmlns:wps="http://schemas.microsoft.com/office/word/2010/wordprocessingShape" mc:Ignorable="w14 w15 w16se w16cid w16 w16cex w16sdtdh w16sdtfl w16du wp14">
   <w:p>
     <w:pPr>
@@ -4526,64 +4129,6 @@
 </file>
 
 <file path=word/header1.xml><?xml version="1.0" encoding="utf-8"?>
-<w:hdr xmlns:wpc="http://schemas.microsoft.com/office/word/2010/wordprocessingCanvas" xmlns:cx="http://schemas.microsoft.com/office/drawing/2014/chartex" xmlns:cx1="http://schemas.microsoft.com/office/drawing/2015/9/8/chartex" xmlns:cx2="http://schemas.microsoft.com/office/drawing/2015/10/21/chartex" xmlns:cx3="http://schemas.microsoft.com/office/drawing/2016/5/9/chartex" xmlns:cx4="http://schemas.microsoft.com/office/drawing/2016/5/10/chartex" xmlns:cx5="http://schemas.microsoft.com/office/drawing/2016/5/11/chartex" xmlns:cx6="http://schemas.microsoft.com/office/drawing/2016/5/12/chartex" xmlns:cx7="http://schemas.microsoft.com/office/drawing/2016/5/13/chartex" xmlns:cx8="http://schemas.microsoft.com/office/drawing/2016/5/14/chartex" xmlns:mc="http://schemas.openxmlformats.org/markup-compatibility/2006" xmlns:aink="http://schemas.microsoft.com/office/drawing/2016/ink" xmlns:am3d="http://schemas.microsoft.com/office/drawing/2017/model3d" xmlns:o="urn:schemas-microsoft-com:office:office" xmlns:oel="http://schemas.microsoft.com/office/2019/extlst" xmlns:r="http://schemas.openxmlformats.org/officeDocument/2006/relationships" xmlns:m="http://schemas.openxmlformats.org/officeDocument/2006/math" xmlns:v="urn:schemas-microsoft-com:vml" xmlns:wp14="http://schemas.microsoft.com/office/word/2010/wordprocessingDrawing" xmlns:wp="http://schemas.openxmlformats.org/drawingml/2006/wordprocessingDrawing" xmlns:w10="urn:schemas-microsoft-com:office:word" xmlns:w="http://schemas.openxmlformats.org/wordprocessingml/2006/main" xmlns:w14="http://schemas.microsoft.com/office/word/2010/wordml" xmlns:w15="http://schemas.microsoft.com/office/word/2012/wordml" xmlns:w16cex="http://schemas.microsoft.com/office/word/2018/wordml/cex" xmlns:w16cid="http://schemas.microsoft.com/office/word/2016/wordml/cid" xmlns:w16="http://schemas.microsoft.com/office/word/2018/wordml" xmlns:w16du="http://schemas.microsoft.com/office/word/2023/wordml/word16du" xmlns:w16sdtdh="http://schemas.microsoft.com/office/word/2020/wordml/sdtdatahash" xmlns:w16sdtfl="http://schemas.microsoft.com/office/word/2024/wordml/sdtformatlock" xmlns:w16se="http://schemas.microsoft.com/office/word/2015/wordml/symex" xmlns:wpg="http://schemas.microsoft.com/office/word/2010/wordprocessingGroup" xmlns:wpi="http://schemas.microsoft.com/office/word/2010/wordprocessingInk" xmlns:wne="http://schemas.microsoft.com/office/word/2006/wordml" xmlns:wps="http://schemas.microsoft.com/office/word/2010/wordprocessingShape" mc:Ignorable="w14 w15 w16se w16cid w16 w16cex w16sdtdh w16sdtfl w16du wp14">
-  <w:tbl>
-    <w:tblPr>
-      <w:tblW w:w="0" w:type="auto"/>
-      <w:tblLayout w:type="fixed"/>
-      <w:tblLook w:val="06A0" w:firstRow="1" w:lastRow="0" w:firstColumn="1" w:lastColumn="0" w:noHBand="1" w:noVBand="1"/>
-    </w:tblPr>
-    <w:tblGrid>
-      <w:gridCol w:w="3005"/>
-      <w:gridCol w:w="3005"/>
-      <w:gridCol w:w="3005"/>
-    </w:tblGrid>
-    <w:tr>
-      <w:tc>
-        <w:tcPr>
-          <w:tcW w:w="3005" w:type="dxa"/>
-        </w:tcPr>
-        <w:p>
-          <w:pPr>
-            <w:pStyle w:val="Header"/>
-            <w:ind w:left="-115"/>
-          </w:pPr>
-        </w:p>
-      </w:tc>
-      <w:tc>
-        <w:tcPr>
-          <w:tcW w:w="3005" w:type="dxa"/>
-        </w:tcPr>
-        <w:p>
-          <w:pPr>
-            <w:pStyle w:val="Header"/>
-            <w:jc w:val="center"/>
-          </w:pPr>
-        </w:p>
-      </w:tc>
-      <w:tc>
-        <w:tcPr>
-          <w:tcW w:w="3005" w:type="dxa"/>
-        </w:tcPr>
-        <w:p>
-          <w:pPr>
-            <w:pStyle w:val="Header"/>
-            <w:ind w:right="-115"/>
-            <w:jc w:val="right"/>
-          </w:pPr>
-        </w:p>
-      </w:tc>
-    </w:tr>
-  </w:tbl>
-  <w:p>
-    <w:pPr>
-      <w:pStyle w:val="Header"/>
-    </w:pPr>
-  </w:p>
-</w:hdr>
-</file>
-
-<file path=word/header2.xml><?xml version="1.0" encoding="utf-8"?>
 <w:hdr xmlns:wpc="http://schemas.microsoft.com/office/word/2010/wordprocessingCanvas" xmlns:cx="http://schemas.microsoft.com/office/drawing/2014/chartex" xmlns:cx1="http://schemas.microsoft.com/office/drawing/2015/9/8/chartex" xmlns:cx2="http://schemas.microsoft.com/office/drawing/2015/10/21/chartex" xmlns:cx3="http://schemas.microsoft.com/office/drawing/2016/5/9/chartex" xmlns:cx4="http://schemas.microsoft.com/office/drawing/2016/5/10/chartex" xmlns:cx5="http://schemas.microsoft.com/office/drawing/2016/5/11/chartex" xmlns:cx6="http://schemas.microsoft.com/office/drawing/2016/5/12/chartex" xmlns:cx7="http://schemas.microsoft.com/office/drawing/2016/5/13/chartex" xmlns:cx8="http://schemas.microsoft.com/office/drawing/2016/5/14/chartex" xmlns:mc="http://schemas.openxmlformats.org/markup-compatibility/2006" xmlns:aink="http://schemas.microsoft.com/office/drawing/2016/ink" xmlns:am3d="http://schemas.microsoft.com/office/drawing/2017/model3d" xmlns:o="urn:schemas-microsoft-com:office:office" xmlns:oel="http://schemas.microsoft.com/office/2019/extlst" xmlns:r="http://schemas.openxmlformats.org/officeDocument/2006/relationships" xmlns:m="http://schemas.openxmlformats.org/officeDocument/2006/math" xmlns:v="urn:schemas-microsoft-com:vml" xmlns:wp14="http://schemas.microsoft.com/office/word/2010/wordprocessingDrawing" xmlns:wp="http://schemas.openxmlformats.org/drawingml/2006/wordprocessingDrawing" xmlns:w10="urn:schemas-microsoft-com:office:word" xmlns:w="http://schemas.openxmlformats.org/wordprocessingml/2006/main" xmlns:w14="http://schemas.microsoft.com/office/word/2010/wordml" xmlns:w15="http://schemas.microsoft.com/office/word/2012/wordml" xmlns:w16cex="http://schemas.microsoft.com/office/word/2018/wordml/cex" xmlns:w16cid="http://schemas.microsoft.com/office/word/2016/wordml/cid" xmlns:w16="http://schemas.microsoft.com/office/word/2018/wordml" xmlns:w16du="http://schemas.microsoft.com/office/word/2023/wordml/word16du" xmlns:w16sdtdh="http://schemas.microsoft.com/office/word/2020/wordml/sdtdatahash" xmlns:w16sdtfl="http://schemas.microsoft.com/office/word/2024/wordml/sdtformatlock" xmlns:w16se="http://schemas.microsoft.com/office/word/2015/wordml/symex" xmlns:wpg="http://schemas.microsoft.com/office/word/2010/wordprocessingGroup" xmlns:wpi="http://schemas.microsoft.com/office/word/2010/wordprocessingInk" xmlns:wne="http://schemas.microsoft.com/office/word/2006/wordml" xmlns:wps="http://schemas.microsoft.com/office/word/2010/wordprocessingShape" mc:Ignorable="w14 w15 w16se w16cid w16 w16cex w16sdtdh w16sdtfl w16du wp14">
   <w:tbl>
     <w:tblPr>
@@ -5009,6 +4554,119 @@
     </w:lvl>
   </w:abstractNum>
   <w:abstractNum w:abstractNumId="3" w15:restartNumberingAfterBreak="0">
+    <w:nsid w:val="2F2E21AA"/>
+    <w:multiLevelType w:val="hybridMultilevel"/>
+    <w:tmpl w:val="B5728454"/>
+    <w:lvl w:ilvl="0" w:tplc="1876E610">
+      <w:start w:val="500"/>
+      <w:numFmt w:val="bullet"/>
+      <w:lvlText w:val="-"/>
+      <w:lvlJc w:val="left"/>
+      <w:pPr>
+        <w:ind w:left="720" w:hanging="360"/>
+      </w:pPr>
+      <w:rPr>
+        <w:rFonts w:ascii="Times New Roman" w:eastAsia="Calibri" w:hAnsi="Times New Roman" w:cs="Times New Roman" w:hint="default"/>
+      </w:rPr>
+    </w:lvl>
+    <w:lvl w:ilvl="1" w:tplc="08090003" w:tentative="1">
+      <w:start w:val="1"/>
+      <w:numFmt w:val="bullet"/>
+      <w:lvlText w:val="o"/>
+      <w:lvlJc w:val="left"/>
+      <w:pPr>
+        <w:ind w:left="1440" w:hanging="360"/>
+      </w:pPr>
+      <w:rPr>
+        <w:rFonts w:ascii="Courier New" w:hAnsi="Courier New" w:cs="Courier New" w:hint="default"/>
+      </w:rPr>
+    </w:lvl>
+    <w:lvl w:ilvl="2" w:tplc="08090005" w:tentative="1">
+      <w:start w:val="1"/>
+      <w:numFmt w:val="bullet"/>
+      <w:lvlText w:val=""/>
+      <w:lvlJc w:val="left"/>
+      <w:pPr>
+        <w:ind w:left="2160" w:hanging="360"/>
+      </w:pPr>
+      <w:rPr>
+        <w:rFonts w:ascii="Wingdings" w:hAnsi="Wingdings" w:hint="default"/>
+      </w:rPr>
+    </w:lvl>
+    <w:lvl w:ilvl="3" w:tplc="08090001" w:tentative="1">
+      <w:start w:val="1"/>
+      <w:numFmt w:val="bullet"/>
+      <w:lvlText w:val=""/>
+      <w:lvlJc w:val="left"/>
+      <w:pPr>
+        <w:ind w:left="2880" w:hanging="360"/>
+      </w:pPr>
+      <w:rPr>
+        <w:rFonts w:ascii="Symbol" w:hAnsi="Symbol" w:hint="default"/>
+      </w:rPr>
+    </w:lvl>
+    <w:lvl w:ilvl="4" w:tplc="08090003" w:tentative="1">
+      <w:start w:val="1"/>
+      <w:numFmt w:val="bullet"/>
+      <w:lvlText w:val="o"/>
+      <w:lvlJc w:val="left"/>
+      <w:pPr>
+        <w:ind w:left="3600" w:hanging="360"/>
+      </w:pPr>
+      <w:rPr>
+        <w:rFonts w:ascii="Courier New" w:hAnsi="Courier New" w:cs="Courier New" w:hint="default"/>
+      </w:rPr>
+    </w:lvl>
+    <w:lvl w:ilvl="5" w:tplc="08090005" w:tentative="1">
+      <w:start w:val="1"/>
+      <w:numFmt w:val="bullet"/>
+      <w:lvlText w:val=""/>
+      <w:lvlJc w:val="left"/>
+      <w:pPr>
+        <w:ind w:left="4320" w:hanging="360"/>
+      </w:pPr>
+      <w:rPr>
+        <w:rFonts w:ascii="Wingdings" w:hAnsi="Wingdings" w:hint="default"/>
+      </w:rPr>
+    </w:lvl>
+    <w:lvl w:ilvl="6" w:tplc="08090001" w:tentative="1">
+      <w:start w:val="1"/>
+      <w:numFmt w:val="bullet"/>
+      <w:lvlText w:val=""/>
+      <w:lvlJc w:val="left"/>
+      <w:pPr>
+        <w:ind w:left="5040" w:hanging="360"/>
+      </w:pPr>
+      <w:rPr>
+        <w:rFonts w:ascii="Symbol" w:hAnsi="Symbol" w:hint="default"/>
+      </w:rPr>
+    </w:lvl>
+    <w:lvl w:ilvl="7" w:tplc="08090003" w:tentative="1">
+      <w:start w:val="1"/>
+      <w:numFmt w:val="bullet"/>
+      <w:lvlText w:val="o"/>
+      <w:lvlJc w:val="left"/>
+      <w:pPr>
+        <w:ind w:left="5760" w:hanging="360"/>
+      </w:pPr>
+      <w:rPr>
+        <w:rFonts w:ascii="Courier New" w:hAnsi="Courier New" w:cs="Courier New" w:hint="default"/>
+      </w:rPr>
+    </w:lvl>
+    <w:lvl w:ilvl="8" w:tplc="08090005" w:tentative="1">
+      <w:start w:val="1"/>
+      <w:numFmt w:val="bullet"/>
+      <w:lvlText w:val=""/>
+      <w:lvlJc w:val="left"/>
+      <w:pPr>
+        <w:ind w:left="6480" w:hanging="360"/>
+      </w:pPr>
+      <w:rPr>
+        <w:rFonts w:ascii="Wingdings" w:hAnsi="Wingdings" w:hint="default"/>
+      </w:rPr>
+    </w:lvl>
+  </w:abstractNum>
+  <w:abstractNum w:abstractNumId="4" w15:restartNumberingAfterBreak="0">
     <w:nsid w:val="491A316E"/>
     <w:multiLevelType w:val="hybridMultilevel"/>
     <w:tmpl w:val="FDE259AE"/>
@@ -5120,7 +4778,7 @@
       </w:rPr>
     </w:lvl>
   </w:abstractNum>
-  <w:abstractNum w:abstractNumId="4" w15:restartNumberingAfterBreak="0">
+  <w:abstractNum w:abstractNumId="5" w15:restartNumberingAfterBreak="0">
     <w:nsid w:val="78CA214D"/>
     <w:multiLevelType w:val="hybridMultilevel"/>
     <w:tmpl w:val="5F18B302"/>
@@ -5237,16 +4895,19 @@
     <w:abstractNumId w:val="2"/>
   </w:num>
   <w:num w:numId="2" w16cid:durableId="1095251161">
-    <w:abstractNumId w:val="3"/>
+    <w:abstractNumId w:val="4"/>
   </w:num>
   <w:num w:numId="3" w16cid:durableId="1364945142">
     <w:abstractNumId w:val="0"/>
   </w:num>
   <w:num w:numId="4" w16cid:durableId="2044745149">
-    <w:abstractNumId w:val="4"/>
+    <w:abstractNumId w:val="5"/>
   </w:num>
   <w:num w:numId="5" w16cid:durableId="447354048">
     <w:abstractNumId w:val="1"/>
+  </w:num>
+  <w:num w:numId="6" w16cid:durableId="675111278">
+    <w:abstractNumId w:val="3"/>
   </w:num>
 </w:numbering>
 </file>
@@ -6606,6 +6267,21 @@
 </file>
 
 <file path=customXml/item3.xml><?xml version="1.0" encoding="utf-8"?>
+<p:properties xmlns:p="http://schemas.microsoft.com/office/2006/metadata/properties" xmlns:xsi="http://www.w3.org/2001/XMLSchema-instance" xmlns:pc="http://schemas.microsoft.com/office/infopath/2007/PartnerControls">
+  <documentManagement>
+    <TaxCatchAll xmlns="efc3e123-a60a-4a17-aaf1-487e28d9a3b3" xsi:nil="true"/>
+    <URL xmlns="8d4a1fdf-0f94-4e24-9675-6342052676c2">
+      <Url xsi:nil="true"/>
+      <Description xsi:nil="true"/>
+    </URL>
+    <lcf76f155ced4ddcb4097134ff3c332f xmlns="8d4a1fdf-0f94-4e24-9675-6342052676c2">
+      <Terms xmlns="http://schemas.microsoft.com/office/infopath/2007/PartnerControls"/>
+    </lcf76f155ced4ddcb4097134ff3c332f>
+  </documentManagement>
+</p:properties>
+</file>
+
+<file path=customXml/item4.xml><?xml version="1.0" encoding="utf-8"?>
 <b:Sources xmlns:b="http://schemas.openxmlformats.org/officeDocument/2006/bibliography" xmlns="http://schemas.openxmlformats.org/officeDocument/2006/bibliography" SelectedStyle="\HarvardAnglia2008OfficeOnline.xsl" StyleName="Harvard - Anglia" Version="2008">
   <b:Source>
     <b:Tag>Sch22</b:Tag>
@@ -6673,22 +6349,53 @@
     <b:DOI>https://doi.org/10.1016/j.applthermaleng.2017.05.063</b:DOI>
     <b:RefOrder>2</b:RefOrder>
   </b:Source>
+  <b:Source>
+    <b:Tag>Ste23</b:Tag>
+    <b:SourceType>InternetSite</b:SourceType>
+    <b:Guid>{4E26C956-F5A0-495A-A3B1-EC0D5CE652ED}</b:Guid>
+    <b:Author>
+      <b:Author>
+        <b:NameList>
+          <b:Person>
+            <b:Last>Kenah</b:Last>
+            <b:First>Steven</b:First>
+          </b:Person>
+        </b:NameList>
+      </b:Author>
+    </b:Author>
+    <b:Title>What Are Real-World Applications of Computational Fluid Dynamics?</b:Title>
+    <b:Year>2023</b:Year>
+    <b:YearAccessed>2026</b:YearAccessed>
+    <b:MonthAccessed>2</b:MonthAccessed>
+    <b:DayAccessed>23</b:DayAccessed>
+    <b:URL>https://www.loringengineers.com/news/real-world-applications-of-computational-fluid-dynamics/</b:URL>
+    <b:RefOrder>4</b:RefOrder>
+  </b:Source>
+  <b:Source>
+    <b:Tag>Aud23</b:Tag>
+    <b:SourceType>DocumentFromInternetSite</b:SourceType>
+    <b:Guid>{1A84824B-8939-427E-8B7C-23DCB798176A}</b:Guid>
+    <b:Title>A unique overview of the application of CFD in the water industry</b:Title>
+    <b:Year>2023</b:Year>
+    <b:YearAccessed>2026</b:YearAccessed>
+    <b:MonthAccessed>2</b:MonthAccessed>
+    <b:DayAccessed>23</b:DayAccessed>
+    <b:URL>https://www.am-team.com/learning-hub/blog/cfd-for-water-sector</b:URL>
+    <b:Author>
+      <b:Author>
+        <b:NameList>
+          <b:Person>
+            <b:Last>Audenaert</b:Last>
+            <b:First>Wim</b:First>
+          </b:Person>
+        </b:NameList>
+      </b:Author>
+    </b:Author>
+    <b:Month>11</b:Month>
+    <b:Day>11</b:Day>
+    <b:RefOrder>3</b:RefOrder>
+  </b:Source>
 </b:Sources>
-</file>
-
-<file path=customXml/item4.xml><?xml version="1.0" encoding="utf-8"?>
-<p:properties xmlns:p="http://schemas.microsoft.com/office/2006/metadata/properties" xmlns:xsi="http://www.w3.org/2001/XMLSchema-instance" xmlns:pc="http://schemas.microsoft.com/office/infopath/2007/PartnerControls">
-  <documentManagement>
-    <TaxCatchAll xmlns="efc3e123-a60a-4a17-aaf1-487e28d9a3b3" xsi:nil="true"/>
-    <URL xmlns="8d4a1fdf-0f94-4e24-9675-6342052676c2">
-      <Url xsi:nil="true"/>
-      <Description xsi:nil="true"/>
-    </URL>
-    <lcf76f155ced4ddcb4097134ff3c332f xmlns="8d4a1fdf-0f94-4e24-9675-6342052676c2">
-      <Terms xmlns="http://schemas.microsoft.com/office/infopath/2007/PartnerControls"/>
-    </lcf76f155ced4ddcb4097134ff3c332f>
-  </documentManagement>
-</p:properties>
 </file>
 
 <file path=customXml/itemProps1.xml><?xml version="1.0" encoding="utf-8"?>
@@ -6720,14 +6427,6 @@
 </file>
 
 <file path=customXml/itemProps3.xml><?xml version="1.0" encoding="utf-8"?>
-<ds:datastoreItem xmlns:ds="http://schemas.openxmlformats.org/officeDocument/2006/customXml" ds:itemID="{14856066-BF45-43BF-AC7C-A462661AE98E}">
-  <ds:schemaRefs>
-    <ds:schemaRef ds:uri="http://schemas.openxmlformats.org/officeDocument/2006/bibliography"/>
-  </ds:schemaRefs>
-</ds:datastoreItem>
-</file>
-
-<file path=customXml/itemProps4.xml><?xml version="1.0" encoding="utf-8"?>
 <ds:datastoreItem xmlns:ds="http://schemas.openxmlformats.org/officeDocument/2006/customXml" ds:itemID="{42CBECF3-DA57-4A6F-BD38-883BFD60FEF9}">
   <ds:schemaRefs>
     <ds:schemaRef ds:uri="http://schemas.microsoft.com/office/2006/metadata/properties"/>
@@ -6736,4 +6435,12 @@
     <ds:schemaRef ds:uri="8d4a1fdf-0f94-4e24-9675-6342052676c2"/>
   </ds:schemaRefs>
 </ds:datastoreItem>
+</file>
+
+<file path=customXml/itemProps4.xml><?xml version="1.0" encoding="utf-8"?>
+<ds:datastoreItem xmlns:ds="http://schemas.openxmlformats.org/officeDocument/2006/customXml" ds:itemID="{75EBE1B2-8F59-4413-BD76-CD8885D94BEA}">
+  <ds:schemaRefs>
+    <ds:schemaRef ds:uri="http://schemas.openxmlformats.org/officeDocument/2006/bibliography"/>
+  </ds:schemaRefs>
+</ds:datastoreItem>
 </file>
</xml_diff>

<commit_message>
prior approaches section of report partly filled out
</commit_message>
<xml_diff>
--- a/Technical Development Report.docx
+++ b/Technical Development Report.docx
@@ -375,7 +375,7 @@
         <w:pStyle w:val="Heading1"/>
       </w:pPr>
       <w:bookmarkStart w:id="0" w:name="_Toc176769484"/>
-      <w:bookmarkStart w:id="1" w:name="_Toc221287545"/>
+      <w:bookmarkStart w:id="1" w:name="_Toc222839126"/>
       <w:bookmarkStart w:id="2" w:name="_Hlk176772257"/>
       <w:bookmarkStart w:id="3" w:name="_Toc20059944"/>
       <w:bookmarkStart w:id="4" w:name="_Toc20061035"/>
@@ -432,7 +432,7 @@
       <w:pPr>
         <w:pStyle w:val="Heading1"/>
       </w:pPr>
-      <w:bookmarkStart w:id="6" w:name="_Toc221287546"/>
+      <w:bookmarkStart w:id="6" w:name="_Toc222839127"/>
       <w:bookmarkStart w:id="7" w:name="_Toc20846673"/>
       <w:bookmarkStart w:id="8" w:name="_Toc56439735"/>
       <w:bookmarkEnd w:id="2"/>
@@ -469,7 +469,7 @@
       <w:r>
         <w:fldChar w:fldCharType="separate"/>
       </w:r>
-      <w:hyperlink w:anchor="_Toc221287545" w:history="1">
+      <w:hyperlink w:anchor="_Toc222839126" w:history="1">
         <w:r>
           <w:rPr>
             <w:rStyle w:val="Hyperlink"/>
@@ -493,7 +493,7 @@
           <w:rPr>
             <w:noProof/>
           </w:rPr>
-          <w:instrText xml:space="preserve"> PAGEREF _Toc221287545 \h </w:instrText>
+          <w:instrText xml:space="preserve"> PAGEREF _Toc222839126 \h </w:instrText>
         </w:r>
         <w:r>
           <w:rPr>
@@ -536,7 +536,7 @@
           <w14:ligatures w14:val="standardContextual"/>
         </w:rPr>
       </w:pPr>
-      <w:hyperlink w:anchor="_Toc221287546" w:history="1">
+      <w:hyperlink w:anchor="_Toc222839127" w:history="1">
         <w:r>
           <w:rPr>
             <w:rStyle w:val="Hyperlink"/>
@@ -560,7 +560,7 @@
           <w:rPr>
             <w:noProof/>
           </w:rPr>
-          <w:instrText xml:space="preserve"> PAGEREF _Toc221287546 \h </w:instrText>
+          <w:instrText xml:space="preserve"> PAGEREF _Toc222839127 \h </w:instrText>
         </w:r>
         <w:r>
           <w:rPr>
@@ -577,7 +577,7 @@
           <w:rPr>
             <w:noProof/>
           </w:rPr>
-          <w:t>1</w:t>
+          <w:t>3</w:t>
         </w:r>
         <w:r>
           <w:rPr>
@@ -603,7 +603,7 @@
           <w14:ligatures w14:val="standardContextual"/>
         </w:rPr>
       </w:pPr>
-      <w:hyperlink w:anchor="_Toc221287547" w:history="1">
+      <w:hyperlink w:anchor="_Toc222839128" w:history="1">
         <w:r>
           <w:rPr>
             <w:rStyle w:val="Hyperlink"/>
@@ -627,7 +627,7 @@
           <w:rPr>
             <w:noProof/>
           </w:rPr>
-          <w:instrText xml:space="preserve"> PAGEREF _Toc221287547 \h </w:instrText>
+          <w:instrText xml:space="preserve"> PAGEREF _Toc222839128 \h </w:instrText>
         </w:r>
         <w:r>
           <w:rPr>
@@ -644,7 +644,7 @@
           <w:rPr>
             <w:noProof/>
           </w:rPr>
-          <w:t>1</w:t>
+          <w:t>3</w:t>
         </w:r>
         <w:r>
           <w:rPr>
@@ -670,13 +670,13 @@
           <w14:ligatures w14:val="standardContextual"/>
         </w:rPr>
       </w:pPr>
-      <w:hyperlink w:anchor="_Toc221287548" w:history="1">
+      <w:hyperlink w:anchor="_Toc222839129" w:history="1">
         <w:r>
           <w:rPr>
             <w:rStyle w:val="Hyperlink"/>
             <w:noProof/>
           </w:rPr>
-          <w:t>Introduction</w:t>
+          <w:t>Introduction – 229w</w:t>
         </w:r>
         <w:r>
           <w:rPr>
@@ -694,7 +694,7 @@
           <w:rPr>
             <w:noProof/>
           </w:rPr>
-          <w:instrText xml:space="preserve"> PAGEREF _Toc221287548 \h </w:instrText>
+          <w:instrText xml:space="preserve"> PAGEREF _Toc222839129 \h </w:instrText>
         </w:r>
         <w:r>
           <w:rPr>
@@ -711,7 +711,7 @@
           <w:rPr>
             <w:noProof/>
           </w:rPr>
-          <w:t>2</w:t>
+          <w:t>5</w:t>
         </w:r>
         <w:r>
           <w:rPr>
@@ -737,7 +737,7 @@
           <w14:ligatures w14:val="standardContextual"/>
         </w:rPr>
       </w:pPr>
-      <w:hyperlink w:anchor="_Toc221287549" w:history="1">
+      <w:hyperlink w:anchor="_Toc222839130" w:history="1">
         <w:r>
           <w:rPr>
             <w:rStyle w:val="Hyperlink"/>
@@ -761,7 +761,7 @@
           <w:rPr>
             <w:noProof/>
           </w:rPr>
-          <w:instrText xml:space="preserve"> PAGEREF _Toc221287549 \h </w:instrText>
+          <w:instrText xml:space="preserve"> PAGEREF _Toc222839130 \h </w:instrText>
         </w:r>
         <w:r>
           <w:rPr>
@@ -778,7 +778,7 @@
           <w:rPr>
             <w:noProof/>
           </w:rPr>
-          <w:t>4</w:t>
+          <w:t>6</w:t>
         </w:r>
         <w:r>
           <w:rPr>
@@ -804,13 +804,13 @@
           <w14:ligatures w14:val="standardContextual"/>
         </w:rPr>
       </w:pPr>
-      <w:hyperlink w:anchor="_Toc221287550" w:history="1">
+      <w:hyperlink w:anchor="_Toc222839131" w:history="1">
         <w:r>
           <w:rPr>
             <w:rStyle w:val="Hyperlink"/>
             <w:noProof/>
           </w:rPr>
-          <w:t>Report goal</w:t>
+          <w:t>CFD: The Why</w:t>
         </w:r>
         <w:r>
           <w:rPr>
@@ -828,7 +828,7 @@
           <w:rPr>
             <w:noProof/>
           </w:rPr>
-          <w:instrText xml:space="preserve"> PAGEREF _Toc221287550 \h </w:instrText>
+          <w:instrText xml:space="preserve"> PAGEREF _Toc222839131 \h </w:instrText>
         </w:r>
         <w:r>
           <w:rPr>
@@ -845,7 +845,7 @@
           <w:rPr>
             <w:noProof/>
           </w:rPr>
-          <w:t>4</w:t>
+          <w:t>6</w:t>
         </w:r>
         <w:r>
           <w:rPr>
@@ -857,7 +857,7 @@
     </w:p>
     <w:p>
       <w:pPr>
-        <w:pStyle w:val="TOC2"/>
+        <w:pStyle w:val="TOC3"/>
         <w:tabs>
           <w:tab w:val="right" w:leader="dot" w:pos="9016"/>
         </w:tabs>
@@ -871,13 +871,13 @@
           <w14:ligatures w14:val="standardContextual"/>
         </w:rPr>
       </w:pPr>
-      <w:hyperlink w:anchor="_Toc221287551" w:history="1">
+      <w:hyperlink w:anchor="_Toc222839132" w:history="1">
         <w:r>
           <w:rPr>
             <w:rStyle w:val="Hyperlink"/>
             <w:noProof/>
           </w:rPr>
-          <w:t>Computational Fluid Dynamics</w:t>
+          <w:t>Saving Time</w:t>
         </w:r>
         <w:r>
           <w:rPr>
@@ -895,7 +895,7 @@
           <w:rPr>
             <w:noProof/>
           </w:rPr>
-          <w:instrText xml:space="preserve"> PAGEREF _Toc221287551 \h </w:instrText>
+          <w:instrText xml:space="preserve"> PAGEREF _Toc222839132 \h </w:instrText>
         </w:r>
         <w:r>
           <w:rPr>
@@ -912,7 +912,7 @@
           <w:rPr>
             <w:noProof/>
           </w:rPr>
-          <w:t>4</w:t>
+          <w:t>6</w:t>
         </w:r>
         <w:r>
           <w:rPr>
@@ -924,7 +924,7 @@
     </w:p>
     <w:p>
       <w:pPr>
-        <w:pStyle w:val="TOC2"/>
+        <w:pStyle w:val="TOC3"/>
         <w:tabs>
           <w:tab w:val="right" w:leader="dot" w:pos="9016"/>
         </w:tabs>
@@ -938,13 +938,13 @@
           <w14:ligatures w14:val="standardContextual"/>
         </w:rPr>
       </w:pPr>
-      <w:hyperlink w:anchor="_Toc221287552" w:history="1">
+      <w:hyperlink w:anchor="_Toc222839133" w:history="1">
         <w:r>
           <w:rPr>
             <w:rStyle w:val="Hyperlink"/>
             <w:noProof/>
           </w:rPr>
-          <w:t>Time Complexities</w:t>
+          <w:t>Saving Costs</w:t>
         </w:r>
         <w:r>
           <w:rPr>
@@ -962,7 +962,7 @@
           <w:rPr>
             <w:noProof/>
           </w:rPr>
-          <w:instrText xml:space="preserve"> PAGEREF _Toc221287552 \h </w:instrText>
+          <w:instrText xml:space="preserve"> PAGEREF _Toc222839133 \h </w:instrText>
         </w:r>
         <w:r>
           <w:rPr>
@@ -979,7 +979,7 @@
           <w:rPr>
             <w:noProof/>
           </w:rPr>
-          <w:t>4</w:t>
+          <w:t>6</w:t>
         </w:r>
         <w:r>
           <w:rPr>
@@ -991,7 +991,7 @@
     </w:p>
     <w:p>
       <w:pPr>
-        <w:pStyle w:val="TOC2"/>
+        <w:pStyle w:val="TOC3"/>
         <w:tabs>
           <w:tab w:val="right" w:leader="dot" w:pos="9016"/>
         </w:tabs>
@@ -1005,13 +1005,13 @@
           <w14:ligatures w14:val="standardContextual"/>
         </w:rPr>
       </w:pPr>
-      <w:hyperlink w:anchor="_Toc221287553" w:history="1">
+      <w:hyperlink w:anchor="_Toc222839134" w:history="1">
         <w:r>
           <w:rPr>
             <w:rStyle w:val="Hyperlink"/>
             <w:noProof/>
           </w:rPr>
-          <w:t>Grid based system</w:t>
+          <w:t>Obtaining Optimal Processes</w:t>
         </w:r>
         <w:r>
           <w:rPr>
@@ -1029,7 +1029,7 @@
           <w:rPr>
             <w:noProof/>
           </w:rPr>
-          <w:instrText xml:space="preserve"> PAGEREF _Toc221287553 \h </w:instrText>
+          <w:instrText xml:space="preserve"> PAGEREF _Toc222839134 \h </w:instrText>
         </w:r>
         <w:r>
           <w:rPr>
@@ -1046,7 +1046,7 @@
           <w:rPr>
             <w:noProof/>
           </w:rPr>
-          <w:t>5</w:t>
+          <w:t>6</w:t>
         </w:r>
         <w:r>
           <w:rPr>
@@ -1058,7 +1058,7 @@
     </w:p>
     <w:p>
       <w:pPr>
-        <w:pStyle w:val="TOC2"/>
+        <w:pStyle w:val="TOC3"/>
         <w:tabs>
           <w:tab w:val="right" w:leader="dot" w:pos="9016"/>
         </w:tabs>
@@ -1072,13 +1072,13 @@
           <w14:ligatures w14:val="standardContextual"/>
         </w:rPr>
       </w:pPr>
-      <w:hyperlink w:anchor="_Toc221287554" w:history="1">
+      <w:hyperlink w:anchor="_Toc222839135" w:history="1">
         <w:r>
           <w:rPr>
             <w:rStyle w:val="Hyperlink"/>
             <w:noProof/>
           </w:rPr>
-          <w:t>Particle based system</w:t>
+          <w:t>Addition of further variables</w:t>
         </w:r>
         <w:r>
           <w:rPr>
@@ -1096,7 +1096,7 @@
           <w:rPr>
             <w:noProof/>
           </w:rPr>
-          <w:instrText xml:space="preserve"> PAGEREF _Toc221287554 \h </w:instrText>
+          <w:instrText xml:space="preserve"> PAGEREF _Toc222839135 \h </w:instrText>
         </w:r>
         <w:r>
           <w:rPr>
@@ -1113,7 +1113,7 @@
           <w:rPr>
             <w:noProof/>
           </w:rPr>
-          <w:t>5</w:t>
+          <w:t>7</w:t>
         </w:r>
         <w:r>
           <w:rPr>
@@ -1125,7 +1125,7 @@
     </w:p>
     <w:p>
       <w:pPr>
-        <w:pStyle w:val="TOC1"/>
+        <w:pStyle w:val="TOC2"/>
         <w:tabs>
           <w:tab w:val="right" w:leader="dot" w:pos="9016"/>
         </w:tabs>
@@ -1139,13 +1139,13 @@
           <w14:ligatures w14:val="standardContextual"/>
         </w:rPr>
       </w:pPr>
-      <w:hyperlink w:anchor="_Toc221287555" w:history="1">
+      <w:hyperlink w:anchor="_Toc222839136" w:history="1">
         <w:r>
           <w:rPr>
             <w:rStyle w:val="Hyperlink"/>
             <w:noProof/>
           </w:rPr>
-          <w:t>Prior Approaches</w:t>
+          <w:t>Use Cases of CFD</w:t>
         </w:r>
         <w:r>
           <w:rPr>
@@ -1163,7 +1163,7 @@
           <w:rPr>
             <w:noProof/>
           </w:rPr>
-          <w:instrText xml:space="preserve"> PAGEREF _Toc221287555 \h </w:instrText>
+          <w:instrText xml:space="preserve"> PAGEREF _Toc222839136 \h </w:instrText>
         </w:r>
         <w:r>
           <w:rPr>
@@ -1192,7 +1192,7 @@
     </w:p>
     <w:p>
       <w:pPr>
-        <w:pStyle w:val="TOC2"/>
+        <w:pStyle w:val="TOC3"/>
         <w:tabs>
           <w:tab w:val="right" w:leader="dot" w:pos="9016"/>
         </w:tabs>
@@ -1206,13 +1206,13 @@
           <w14:ligatures w14:val="standardContextual"/>
         </w:rPr>
       </w:pPr>
-      <w:hyperlink w:anchor="_Toc221287556" w:history="1">
+      <w:hyperlink w:anchor="_Toc222839137" w:history="1">
         <w:r>
           <w:rPr>
             <w:rStyle w:val="Hyperlink"/>
             <w:noProof/>
           </w:rPr>
-          <w:t>Eulerian Approach</w:t>
+          <w:t>HVAC</w:t>
         </w:r>
         <w:r>
           <w:rPr>
@@ -1230,7 +1230,7 @@
           <w:rPr>
             <w:noProof/>
           </w:rPr>
-          <w:instrText xml:space="preserve"> PAGEREF _Toc221287556 \h </w:instrText>
+          <w:instrText xml:space="preserve"> PAGEREF _Toc222839137 \h </w:instrText>
         </w:r>
         <w:r>
           <w:rPr>
@@ -1259,7 +1259,7 @@
     </w:p>
     <w:p>
       <w:pPr>
-        <w:pStyle w:val="TOC2"/>
+        <w:pStyle w:val="TOC3"/>
         <w:tabs>
           <w:tab w:val="right" w:leader="dot" w:pos="9016"/>
         </w:tabs>
@@ -1273,13 +1273,13 @@
           <w14:ligatures w14:val="standardContextual"/>
         </w:rPr>
       </w:pPr>
-      <w:hyperlink w:anchor="_Toc221287557" w:history="1">
+      <w:hyperlink w:anchor="_Toc222839138" w:history="1">
         <w:r>
           <w:rPr>
             <w:rStyle w:val="Hyperlink"/>
             <w:noProof/>
           </w:rPr>
-          <w:t>Lagrangian Approach</w:t>
+          <w:t>Water and wastewater treatment</w:t>
         </w:r>
         <w:r>
           <w:rPr>
@@ -1297,7 +1297,7 @@
           <w:rPr>
             <w:noProof/>
           </w:rPr>
-          <w:instrText xml:space="preserve"> PAGEREF _Toc221287557 \h </w:instrText>
+          <w:instrText xml:space="preserve"> PAGEREF _Toc222839138 \h </w:instrText>
         </w:r>
         <w:r>
           <w:rPr>
@@ -1326,7 +1326,7 @@
     </w:p>
     <w:p>
       <w:pPr>
-        <w:pStyle w:val="TOC2"/>
+        <w:pStyle w:val="TOC3"/>
         <w:tabs>
           <w:tab w:val="right" w:leader="dot" w:pos="9016"/>
         </w:tabs>
@@ -1340,13 +1340,13 @@
           <w14:ligatures w14:val="standardContextual"/>
         </w:rPr>
       </w:pPr>
-      <w:hyperlink w:anchor="_Toc221287558" w:history="1">
+      <w:hyperlink w:anchor="_Toc222839139" w:history="1">
         <w:r>
           <w:rPr>
             <w:rStyle w:val="Hyperlink"/>
             <w:noProof/>
           </w:rPr>
-          <w:t>Eulerian-Lagrange Approach</w:t>
+          <w:t>Vehicle Aerodynamics</w:t>
         </w:r>
         <w:r>
           <w:rPr>
@@ -1364,7 +1364,7 @@
           <w:rPr>
             <w:noProof/>
           </w:rPr>
-          <w:instrText xml:space="preserve"> PAGEREF _Toc221287558 \h </w:instrText>
+          <w:instrText xml:space="preserve"> PAGEREF _Toc222839139 \h </w:instrText>
         </w:r>
         <w:r>
           <w:rPr>
@@ -1381,7 +1381,7 @@
           <w:rPr>
             <w:noProof/>
           </w:rPr>
-          <w:t>7</w:t>
+          <w:t>8</w:t>
         </w:r>
         <w:r>
           <w:rPr>
@@ -1393,7 +1393,7 @@
     </w:p>
     <w:p>
       <w:pPr>
-        <w:pStyle w:val="TOC1"/>
+        <w:pStyle w:val="TOC2"/>
         <w:tabs>
           <w:tab w:val="right" w:leader="dot" w:pos="9016"/>
         </w:tabs>
@@ -1407,13 +1407,13 @@
           <w14:ligatures w14:val="standardContextual"/>
         </w:rPr>
       </w:pPr>
-      <w:hyperlink w:anchor="_Toc221287559" w:history="1">
+      <w:hyperlink w:anchor="_Toc222839140" w:history="1">
         <w:r>
           <w:rPr>
             <w:rStyle w:val="Hyperlink"/>
             <w:noProof/>
           </w:rPr>
-          <w:t>Recommendations</w:t>
+          <w:t>Navier-Stokes Equations</w:t>
         </w:r>
         <w:r>
           <w:rPr>
@@ -1431,7 +1431,7 @@
           <w:rPr>
             <w:noProof/>
           </w:rPr>
-          <w:instrText xml:space="preserve"> PAGEREF _Toc221287559 \h </w:instrText>
+          <w:instrText xml:space="preserve"> PAGEREF _Toc222839140 \h </w:instrText>
         </w:r>
         <w:r>
           <w:rPr>
@@ -1448,7 +1448,7 @@
           <w:rPr>
             <w:noProof/>
           </w:rPr>
-          <w:t>9</w:t>
+          <w:t>8</w:t>
         </w:r>
         <w:r>
           <w:rPr>
@@ -1460,7 +1460,7 @@
     </w:p>
     <w:p>
       <w:pPr>
-        <w:pStyle w:val="TOC1"/>
+        <w:pStyle w:val="TOC2"/>
         <w:tabs>
           <w:tab w:val="right" w:leader="dot" w:pos="9016"/>
         </w:tabs>
@@ -1474,13 +1474,13 @@
           <w14:ligatures w14:val="standardContextual"/>
         </w:rPr>
       </w:pPr>
-      <w:hyperlink w:anchor="_Toc221287560" w:history="1">
+      <w:hyperlink w:anchor="_Toc222839141" w:history="1">
         <w:r>
           <w:rPr>
             <w:rStyle w:val="Hyperlink"/>
             <w:noProof/>
           </w:rPr>
-          <w:t>Conclusion and Reflection</w:t>
+          <w:t>CFD applications to general Software Engineering</w:t>
         </w:r>
         <w:r>
           <w:rPr>
@@ -1498,7 +1498,7 @@
           <w:rPr>
             <w:noProof/>
           </w:rPr>
-          <w:instrText xml:space="preserve"> PAGEREF _Toc221287560 \h </w:instrText>
+          <w:instrText xml:space="preserve"> PAGEREF _Toc222839141 \h </w:instrText>
         </w:r>
         <w:r>
           <w:rPr>
@@ -1515,7 +1515,7 @@
           <w:rPr>
             <w:noProof/>
           </w:rPr>
-          <w:t>10</w:t>
+          <w:t>8</w:t>
         </w:r>
         <w:r>
           <w:rPr>
@@ -1541,13 +1541,13 @@
           <w14:ligatures w14:val="standardContextual"/>
         </w:rPr>
       </w:pPr>
-      <w:hyperlink w:anchor="_Toc221287561" w:history="1">
+      <w:hyperlink w:anchor="_Toc222839142" w:history="1">
         <w:r>
           <w:rPr>
             <w:rStyle w:val="Hyperlink"/>
             <w:noProof/>
           </w:rPr>
-          <w:t>References</w:t>
+          <w:t>Prior Approaches</w:t>
         </w:r>
         <w:r>
           <w:rPr>
@@ -1565,7 +1565,7 @@
           <w:rPr>
             <w:noProof/>
           </w:rPr>
-          <w:instrText xml:space="preserve"> PAGEREF _Toc221287561 \h </w:instrText>
+          <w:instrText xml:space="preserve"> PAGEREF _Toc222839142 \h </w:instrText>
         </w:r>
         <w:r>
           <w:rPr>
@@ -1582,7 +1582,7 @@
           <w:rPr>
             <w:noProof/>
           </w:rPr>
-          <w:t>11</w:t>
+          <w:t>10</w:t>
         </w:r>
         <w:r>
           <w:rPr>
@@ -1594,7 +1594,7 @@
     </w:p>
     <w:p>
       <w:pPr>
-        <w:pStyle w:val="TOC1"/>
+        <w:pStyle w:val="TOC2"/>
         <w:tabs>
           <w:tab w:val="right" w:leader="dot" w:pos="9016"/>
         </w:tabs>
@@ -1608,12 +1608,749 @@
           <w14:ligatures w14:val="standardContextual"/>
         </w:rPr>
       </w:pPr>
-      <w:hyperlink w:anchor="_Toc221287562" w:history="1">
+      <w:hyperlink w:anchor="_Toc222839143" w:history="1">
         <w:r>
           <w:rPr>
             <w:rStyle w:val="Hyperlink"/>
             <w:noProof/>
           </w:rPr>
+          <w:t>Eulerian Approach</w:t>
+        </w:r>
+        <w:r>
+          <w:rPr>
+            <w:noProof/>
+          </w:rPr>
+          <w:tab/>
+        </w:r>
+        <w:r>
+          <w:rPr>
+            <w:noProof/>
+          </w:rPr>
+          <w:fldChar w:fldCharType="begin"/>
+        </w:r>
+        <w:r>
+          <w:rPr>
+            <w:noProof/>
+          </w:rPr>
+          <w:instrText xml:space="preserve"> PAGEREF _Toc222839143 \h </w:instrText>
+        </w:r>
+        <w:r>
+          <w:rPr>
+            <w:noProof/>
+          </w:rPr>
+        </w:r>
+        <w:r>
+          <w:rPr>
+            <w:noProof/>
+          </w:rPr>
+          <w:fldChar w:fldCharType="separate"/>
+        </w:r>
+        <w:r>
+          <w:rPr>
+            <w:noProof/>
+          </w:rPr>
+          <w:t>10</w:t>
+        </w:r>
+        <w:r>
+          <w:rPr>
+            <w:noProof/>
+          </w:rPr>
+          <w:fldChar w:fldCharType="end"/>
+        </w:r>
+      </w:hyperlink>
+    </w:p>
+    <w:p>
+      <w:pPr>
+        <w:pStyle w:val="TOC2"/>
+        <w:tabs>
+          <w:tab w:val="right" w:leader="dot" w:pos="9016"/>
+        </w:tabs>
+        <w:rPr>
+          <w:rFonts w:asciiTheme="minorHAnsi" w:eastAsiaTheme="minorEastAsia" w:hAnsiTheme="minorHAnsi" w:cstheme="minorBidi"/>
+          <w:noProof/>
+          <w:kern w:val="2"/>
+          <w:sz w:val="24"/>
+          <w:szCs w:val="24"/>
+          <w:lang w:eastAsia="en-GB"/>
+          <w14:ligatures w14:val="standardContextual"/>
+        </w:rPr>
+      </w:pPr>
+      <w:hyperlink w:anchor="_Toc222839144" w:history="1">
+        <w:r>
+          <w:rPr>
+            <w:rStyle w:val="Hyperlink"/>
+            <w:noProof/>
+          </w:rPr>
+          <w:t>Lagrangian Approach</w:t>
+        </w:r>
+        <w:r>
+          <w:rPr>
+            <w:noProof/>
+          </w:rPr>
+          <w:tab/>
+        </w:r>
+        <w:r>
+          <w:rPr>
+            <w:noProof/>
+          </w:rPr>
+          <w:fldChar w:fldCharType="begin"/>
+        </w:r>
+        <w:r>
+          <w:rPr>
+            <w:noProof/>
+          </w:rPr>
+          <w:instrText xml:space="preserve"> PAGEREF _Toc222839144 \h </w:instrText>
+        </w:r>
+        <w:r>
+          <w:rPr>
+            <w:noProof/>
+          </w:rPr>
+        </w:r>
+        <w:r>
+          <w:rPr>
+            <w:noProof/>
+          </w:rPr>
+          <w:fldChar w:fldCharType="separate"/>
+        </w:r>
+        <w:r>
+          <w:rPr>
+            <w:noProof/>
+          </w:rPr>
+          <w:t>10</w:t>
+        </w:r>
+        <w:r>
+          <w:rPr>
+            <w:noProof/>
+          </w:rPr>
+          <w:fldChar w:fldCharType="end"/>
+        </w:r>
+      </w:hyperlink>
+    </w:p>
+    <w:p>
+      <w:pPr>
+        <w:pStyle w:val="TOC2"/>
+        <w:tabs>
+          <w:tab w:val="right" w:leader="dot" w:pos="9016"/>
+        </w:tabs>
+        <w:rPr>
+          <w:rFonts w:asciiTheme="minorHAnsi" w:eastAsiaTheme="minorEastAsia" w:hAnsiTheme="minorHAnsi" w:cstheme="minorBidi"/>
+          <w:noProof/>
+          <w:kern w:val="2"/>
+          <w:sz w:val="24"/>
+          <w:szCs w:val="24"/>
+          <w:lang w:eastAsia="en-GB"/>
+          <w14:ligatures w14:val="standardContextual"/>
+        </w:rPr>
+      </w:pPr>
+      <w:hyperlink w:anchor="_Toc222839145" w:history="1">
+        <w:r>
+          <w:rPr>
+            <w:rStyle w:val="Hyperlink"/>
+            <w:noProof/>
+          </w:rPr>
+          <w:t>Eulerian-Lagrange Approach</w:t>
+        </w:r>
+        <w:r>
+          <w:rPr>
+            <w:noProof/>
+          </w:rPr>
+          <w:tab/>
+        </w:r>
+        <w:r>
+          <w:rPr>
+            <w:noProof/>
+          </w:rPr>
+          <w:fldChar w:fldCharType="begin"/>
+        </w:r>
+        <w:r>
+          <w:rPr>
+            <w:noProof/>
+          </w:rPr>
+          <w:instrText xml:space="preserve"> PAGEREF _Toc222839145 \h </w:instrText>
+        </w:r>
+        <w:r>
+          <w:rPr>
+            <w:noProof/>
+          </w:rPr>
+        </w:r>
+        <w:r>
+          <w:rPr>
+            <w:noProof/>
+          </w:rPr>
+          <w:fldChar w:fldCharType="separate"/>
+        </w:r>
+        <w:r>
+          <w:rPr>
+            <w:noProof/>
+          </w:rPr>
+          <w:t>10</w:t>
+        </w:r>
+        <w:r>
+          <w:rPr>
+            <w:noProof/>
+          </w:rPr>
+          <w:fldChar w:fldCharType="end"/>
+        </w:r>
+      </w:hyperlink>
+    </w:p>
+    <w:p>
+      <w:pPr>
+        <w:pStyle w:val="TOC1"/>
+        <w:tabs>
+          <w:tab w:val="right" w:leader="dot" w:pos="9016"/>
+        </w:tabs>
+        <w:rPr>
+          <w:rFonts w:asciiTheme="minorHAnsi" w:eastAsiaTheme="minorEastAsia" w:hAnsiTheme="minorHAnsi" w:cstheme="minorBidi"/>
+          <w:noProof/>
+          <w:kern w:val="2"/>
+          <w:sz w:val="24"/>
+          <w:szCs w:val="24"/>
+          <w:lang w:eastAsia="en-GB"/>
+          <w14:ligatures w14:val="standardContextual"/>
+        </w:rPr>
+      </w:pPr>
+      <w:hyperlink w:anchor="_Toc222839146" w:history="1">
+        <w:r>
+          <w:rPr>
+            <w:rStyle w:val="Hyperlink"/>
+            <w:noProof/>
+          </w:rPr>
+          <w:t>Recommendations</w:t>
+        </w:r>
+        <w:r>
+          <w:rPr>
+            <w:noProof/>
+          </w:rPr>
+          <w:tab/>
+        </w:r>
+        <w:r>
+          <w:rPr>
+            <w:noProof/>
+          </w:rPr>
+          <w:fldChar w:fldCharType="begin"/>
+        </w:r>
+        <w:r>
+          <w:rPr>
+            <w:noProof/>
+          </w:rPr>
+          <w:instrText xml:space="preserve"> PAGEREF _Toc222839146 \h </w:instrText>
+        </w:r>
+        <w:r>
+          <w:rPr>
+            <w:noProof/>
+          </w:rPr>
+        </w:r>
+        <w:r>
+          <w:rPr>
+            <w:noProof/>
+          </w:rPr>
+          <w:fldChar w:fldCharType="separate"/>
+        </w:r>
+        <w:r>
+          <w:rPr>
+            <w:noProof/>
+          </w:rPr>
+          <w:t>11</w:t>
+        </w:r>
+        <w:r>
+          <w:rPr>
+            <w:noProof/>
+          </w:rPr>
+          <w:fldChar w:fldCharType="end"/>
+        </w:r>
+      </w:hyperlink>
+    </w:p>
+    <w:p>
+      <w:pPr>
+        <w:pStyle w:val="TOC2"/>
+        <w:tabs>
+          <w:tab w:val="right" w:leader="dot" w:pos="9016"/>
+        </w:tabs>
+        <w:rPr>
+          <w:rFonts w:asciiTheme="minorHAnsi" w:eastAsiaTheme="minorEastAsia" w:hAnsiTheme="minorHAnsi" w:cstheme="minorBidi"/>
+          <w:noProof/>
+          <w:kern w:val="2"/>
+          <w:sz w:val="24"/>
+          <w:szCs w:val="24"/>
+          <w:lang w:eastAsia="en-GB"/>
+          <w14:ligatures w14:val="standardContextual"/>
+        </w:rPr>
+      </w:pPr>
+      <w:hyperlink w:anchor="_Toc222839147" w:history="1">
+        <w:r>
+          <w:rPr>
+            <w:rStyle w:val="Hyperlink"/>
+            <w:noProof/>
+          </w:rPr>
+          <w:t>Implementation</w:t>
+        </w:r>
+        <w:r>
+          <w:rPr>
+            <w:noProof/>
+          </w:rPr>
+          <w:tab/>
+        </w:r>
+        <w:r>
+          <w:rPr>
+            <w:noProof/>
+          </w:rPr>
+          <w:fldChar w:fldCharType="begin"/>
+        </w:r>
+        <w:r>
+          <w:rPr>
+            <w:noProof/>
+          </w:rPr>
+          <w:instrText xml:space="preserve"> PAGEREF _Toc222839147 \h </w:instrText>
+        </w:r>
+        <w:r>
+          <w:rPr>
+            <w:noProof/>
+          </w:rPr>
+        </w:r>
+        <w:r>
+          <w:rPr>
+            <w:noProof/>
+          </w:rPr>
+          <w:fldChar w:fldCharType="separate"/>
+        </w:r>
+        <w:r>
+          <w:rPr>
+            <w:noProof/>
+          </w:rPr>
+          <w:t>11</w:t>
+        </w:r>
+        <w:r>
+          <w:rPr>
+            <w:noProof/>
+          </w:rPr>
+          <w:fldChar w:fldCharType="end"/>
+        </w:r>
+      </w:hyperlink>
+    </w:p>
+    <w:p>
+      <w:pPr>
+        <w:pStyle w:val="TOC3"/>
+        <w:tabs>
+          <w:tab w:val="right" w:leader="dot" w:pos="9016"/>
+        </w:tabs>
+        <w:rPr>
+          <w:rFonts w:asciiTheme="minorHAnsi" w:eastAsiaTheme="minorEastAsia" w:hAnsiTheme="minorHAnsi" w:cstheme="minorBidi"/>
+          <w:noProof/>
+          <w:kern w:val="2"/>
+          <w:sz w:val="24"/>
+          <w:szCs w:val="24"/>
+          <w:lang w:eastAsia="en-GB"/>
+          <w14:ligatures w14:val="standardContextual"/>
+        </w:rPr>
+      </w:pPr>
+      <w:hyperlink w:anchor="_Toc222839148" w:history="1">
+        <w:r>
+          <w:rPr>
+            <w:rStyle w:val="Hyperlink"/>
+            <w:noProof/>
+          </w:rPr>
+          <w:t>Particle settings</w:t>
+        </w:r>
+        <w:r>
+          <w:rPr>
+            <w:noProof/>
+          </w:rPr>
+          <w:tab/>
+        </w:r>
+        <w:r>
+          <w:rPr>
+            <w:noProof/>
+          </w:rPr>
+          <w:fldChar w:fldCharType="begin"/>
+        </w:r>
+        <w:r>
+          <w:rPr>
+            <w:noProof/>
+          </w:rPr>
+          <w:instrText xml:space="preserve"> PAGEREF _Toc222839148 \h </w:instrText>
+        </w:r>
+        <w:r>
+          <w:rPr>
+            <w:noProof/>
+          </w:rPr>
+        </w:r>
+        <w:r>
+          <w:rPr>
+            <w:noProof/>
+          </w:rPr>
+          <w:fldChar w:fldCharType="separate"/>
+        </w:r>
+        <w:r>
+          <w:rPr>
+            <w:noProof/>
+          </w:rPr>
+          <w:t>11</w:t>
+        </w:r>
+        <w:r>
+          <w:rPr>
+            <w:noProof/>
+          </w:rPr>
+          <w:fldChar w:fldCharType="end"/>
+        </w:r>
+      </w:hyperlink>
+    </w:p>
+    <w:p>
+      <w:pPr>
+        <w:pStyle w:val="TOC3"/>
+        <w:tabs>
+          <w:tab w:val="right" w:leader="dot" w:pos="9016"/>
+        </w:tabs>
+        <w:rPr>
+          <w:rFonts w:asciiTheme="minorHAnsi" w:eastAsiaTheme="minorEastAsia" w:hAnsiTheme="minorHAnsi" w:cstheme="minorBidi"/>
+          <w:noProof/>
+          <w:kern w:val="2"/>
+          <w:sz w:val="24"/>
+          <w:szCs w:val="24"/>
+          <w:lang w:eastAsia="en-GB"/>
+          <w14:ligatures w14:val="standardContextual"/>
+        </w:rPr>
+      </w:pPr>
+      <w:hyperlink w:anchor="_Toc222839149" w:history="1">
+        <w:r>
+          <w:rPr>
+            <w:rStyle w:val="Hyperlink"/>
+            <w:noProof/>
+          </w:rPr>
+          <w:t>Particle spawner</w:t>
+        </w:r>
+        <w:r>
+          <w:rPr>
+            <w:noProof/>
+          </w:rPr>
+          <w:tab/>
+        </w:r>
+        <w:r>
+          <w:rPr>
+            <w:noProof/>
+          </w:rPr>
+          <w:fldChar w:fldCharType="begin"/>
+        </w:r>
+        <w:r>
+          <w:rPr>
+            <w:noProof/>
+          </w:rPr>
+          <w:instrText xml:space="preserve"> PAGEREF _Toc222839149 \h </w:instrText>
+        </w:r>
+        <w:r>
+          <w:rPr>
+            <w:noProof/>
+          </w:rPr>
+        </w:r>
+        <w:r>
+          <w:rPr>
+            <w:noProof/>
+          </w:rPr>
+          <w:fldChar w:fldCharType="separate"/>
+        </w:r>
+        <w:r>
+          <w:rPr>
+            <w:noProof/>
+          </w:rPr>
+          <w:t>11</w:t>
+        </w:r>
+        <w:r>
+          <w:rPr>
+            <w:noProof/>
+          </w:rPr>
+          <w:fldChar w:fldCharType="end"/>
+        </w:r>
+      </w:hyperlink>
+    </w:p>
+    <w:p>
+      <w:pPr>
+        <w:pStyle w:val="TOC3"/>
+        <w:tabs>
+          <w:tab w:val="right" w:leader="dot" w:pos="9016"/>
+        </w:tabs>
+        <w:rPr>
+          <w:rFonts w:asciiTheme="minorHAnsi" w:eastAsiaTheme="minorEastAsia" w:hAnsiTheme="minorHAnsi" w:cstheme="minorBidi"/>
+          <w:noProof/>
+          <w:kern w:val="2"/>
+          <w:sz w:val="24"/>
+          <w:szCs w:val="24"/>
+          <w:lang w:eastAsia="en-GB"/>
+          <w14:ligatures w14:val="standardContextual"/>
+        </w:rPr>
+      </w:pPr>
+      <w:hyperlink w:anchor="_Toc222839150" w:history="1">
+        <w:r>
+          <w:rPr>
+            <w:rStyle w:val="Hyperlink"/>
+            <w:noProof/>
+          </w:rPr>
+          <w:t>Pressure</w:t>
+        </w:r>
+        <w:r>
+          <w:rPr>
+            <w:noProof/>
+          </w:rPr>
+          <w:tab/>
+        </w:r>
+        <w:r>
+          <w:rPr>
+            <w:noProof/>
+          </w:rPr>
+          <w:fldChar w:fldCharType="begin"/>
+        </w:r>
+        <w:r>
+          <w:rPr>
+            <w:noProof/>
+          </w:rPr>
+          <w:instrText xml:space="preserve"> PAGEREF _Toc222839150 \h </w:instrText>
+        </w:r>
+        <w:r>
+          <w:rPr>
+            <w:noProof/>
+          </w:rPr>
+        </w:r>
+        <w:r>
+          <w:rPr>
+            <w:noProof/>
+          </w:rPr>
+          <w:fldChar w:fldCharType="separate"/>
+        </w:r>
+        <w:r>
+          <w:rPr>
+            <w:noProof/>
+          </w:rPr>
+          <w:t>11</w:t>
+        </w:r>
+        <w:r>
+          <w:rPr>
+            <w:noProof/>
+          </w:rPr>
+          <w:fldChar w:fldCharType="end"/>
+        </w:r>
+      </w:hyperlink>
+    </w:p>
+    <w:p>
+      <w:pPr>
+        <w:pStyle w:val="TOC3"/>
+        <w:tabs>
+          <w:tab w:val="right" w:leader="dot" w:pos="9016"/>
+        </w:tabs>
+        <w:rPr>
+          <w:rFonts w:asciiTheme="minorHAnsi" w:eastAsiaTheme="minorEastAsia" w:hAnsiTheme="minorHAnsi" w:cstheme="minorBidi"/>
+          <w:noProof/>
+          <w:kern w:val="2"/>
+          <w:sz w:val="24"/>
+          <w:szCs w:val="24"/>
+          <w:lang w:eastAsia="en-GB"/>
+          <w14:ligatures w14:val="standardContextual"/>
+        </w:rPr>
+      </w:pPr>
+      <w:hyperlink w:anchor="_Toc222839151" w:history="1">
+        <w:r>
+          <w:rPr>
+            <w:rStyle w:val="Hyperlink"/>
+            <w:noProof/>
+          </w:rPr>
+          <w:t>Viscosity</w:t>
+        </w:r>
+        <w:r>
+          <w:rPr>
+            <w:noProof/>
+          </w:rPr>
+          <w:tab/>
+        </w:r>
+        <w:r>
+          <w:rPr>
+            <w:noProof/>
+          </w:rPr>
+          <w:fldChar w:fldCharType="begin"/>
+        </w:r>
+        <w:r>
+          <w:rPr>
+            <w:noProof/>
+          </w:rPr>
+          <w:instrText xml:space="preserve"> PAGEREF _Toc222839151 \h </w:instrText>
+        </w:r>
+        <w:r>
+          <w:rPr>
+            <w:noProof/>
+          </w:rPr>
+        </w:r>
+        <w:r>
+          <w:rPr>
+            <w:noProof/>
+          </w:rPr>
+          <w:fldChar w:fldCharType="separate"/>
+        </w:r>
+        <w:r>
+          <w:rPr>
+            <w:noProof/>
+          </w:rPr>
+          <w:t>11</w:t>
+        </w:r>
+        <w:r>
+          <w:rPr>
+            <w:noProof/>
+          </w:rPr>
+          <w:fldChar w:fldCharType="end"/>
+        </w:r>
+      </w:hyperlink>
+    </w:p>
+    <w:p>
+      <w:pPr>
+        <w:pStyle w:val="TOC3"/>
+        <w:tabs>
+          <w:tab w:val="right" w:leader="dot" w:pos="9016"/>
+        </w:tabs>
+        <w:rPr>
+          <w:rFonts w:asciiTheme="minorHAnsi" w:eastAsiaTheme="minorEastAsia" w:hAnsiTheme="minorHAnsi" w:cstheme="minorBidi"/>
+          <w:noProof/>
+          <w:kern w:val="2"/>
+          <w:sz w:val="24"/>
+          <w:szCs w:val="24"/>
+          <w:lang w:eastAsia="en-GB"/>
+          <w14:ligatures w14:val="standardContextual"/>
+        </w:rPr>
+      </w:pPr>
+      <w:hyperlink w:anchor="_Toc222839152" w:history="1">
+        <w:r>
+          <w:rPr>
+            <w:rStyle w:val="Hyperlink"/>
+            <w:noProof/>
+          </w:rPr>
+          <w:t>Surface tension</w:t>
+        </w:r>
+        <w:r>
+          <w:rPr>
+            <w:noProof/>
+          </w:rPr>
+          <w:tab/>
+        </w:r>
+        <w:r>
+          <w:rPr>
+            <w:noProof/>
+          </w:rPr>
+          <w:fldChar w:fldCharType="begin"/>
+        </w:r>
+        <w:r>
+          <w:rPr>
+            <w:noProof/>
+          </w:rPr>
+          <w:instrText xml:space="preserve"> PAGEREF _Toc222839152 \h </w:instrText>
+        </w:r>
+        <w:r>
+          <w:rPr>
+            <w:noProof/>
+          </w:rPr>
+        </w:r>
+        <w:r>
+          <w:rPr>
+            <w:noProof/>
+          </w:rPr>
+          <w:fldChar w:fldCharType="separate"/>
+        </w:r>
+        <w:r>
+          <w:rPr>
+            <w:noProof/>
+          </w:rPr>
+          <w:t>11</w:t>
+        </w:r>
+        <w:r>
+          <w:rPr>
+            <w:noProof/>
+          </w:rPr>
+          <w:fldChar w:fldCharType="end"/>
+        </w:r>
+      </w:hyperlink>
+    </w:p>
+    <w:p>
+      <w:pPr>
+        <w:pStyle w:val="TOC1"/>
+        <w:tabs>
+          <w:tab w:val="right" w:leader="dot" w:pos="9016"/>
+        </w:tabs>
+        <w:rPr>
+          <w:rFonts w:asciiTheme="minorHAnsi" w:eastAsiaTheme="minorEastAsia" w:hAnsiTheme="minorHAnsi" w:cstheme="minorBidi"/>
+          <w:noProof/>
+          <w:kern w:val="2"/>
+          <w:sz w:val="24"/>
+          <w:szCs w:val="24"/>
+          <w:lang w:eastAsia="en-GB"/>
+          <w14:ligatures w14:val="standardContextual"/>
+        </w:rPr>
+      </w:pPr>
+      <w:hyperlink w:anchor="_Toc222839153" w:history="1">
+        <w:r>
+          <w:rPr>
+            <w:rStyle w:val="Hyperlink"/>
+            <w:noProof/>
+          </w:rPr>
+          <w:t>Conclusion and Reflection</w:t>
+        </w:r>
+        <w:r>
+          <w:rPr>
+            <w:noProof/>
+          </w:rPr>
+          <w:tab/>
+        </w:r>
+        <w:r>
+          <w:rPr>
+            <w:noProof/>
+          </w:rPr>
+          <w:fldChar w:fldCharType="begin"/>
+        </w:r>
+        <w:r>
+          <w:rPr>
+            <w:noProof/>
+          </w:rPr>
+          <w:instrText xml:space="preserve"> PAGEREF _Toc222839153 \h </w:instrText>
+        </w:r>
+        <w:r>
+          <w:rPr>
+            <w:noProof/>
+          </w:rPr>
+        </w:r>
+        <w:r>
+          <w:rPr>
+            <w:noProof/>
+          </w:rPr>
+          <w:fldChar w:fldCharType="separate"/>
+        </w:r>
+        <w:r>
+          <w:rPr>
+            <w:noProof/>
+          </w:rPr>
+          <w:t>12</w:t>
+        </w:r>
+        <w:r>
+          <w:rPr>
+            <w:noProof/>
+          </w:rPr>
+          <w:fldChar w:fldCharType="end"/>
+        </w:r>
+      </w:hyperlink>
+    </w:p>
+    <w:p>
+      <w:pPr>
+        <w:pStyle w:val="TOC1"/>
+        <w:tabs>
+          <w:tab w:val="right" w:leader="dot" w:pos="9016"/>
+        </w:tabs>
+        <w:rPr>
+          <w:rFonts w:asciiTheme="minorHAnsi" w:eastAsiaTheme="minorEastAsia" w:hAnsiTheme="minorHAnsi" w:cstheme="minorBidi"/>
+          <w:noProof/>
+          <w:kern w:val="2"/>
+          <w:sz w:val="24"/>
+          <w:szCs w:val="24"/>
+          <w:lang w:eastAsia="en-GB"/>
+          <w14:ligatures w14:val="standardContextual"/>
+        </w:rPr>
+      </w:pPr>
+      <w:hyperlink w:anchor="_Toc222839154" w:history="1">
+        <w:r>
+          <w:rPr>
+            <w:rStyle w:val="Hyperlink"/>
+            <w:noProof/>
+          </w:rPr>
           <w:t>References</w:t>
         </w:r>
         <w:r>
@@ -1632,7 +2369,7 @@
           <w:rPr>
             <w:noProof/>
           </w:rPr>
-          <w:instrText xml:space="preserve"> PAGEREF _Toc221287562 \h </w:instrText>
+          <w:instrText xml:space="preserve"> PAGEREF _Toc222839154 \h </w:instrText>
         </w:r>
         <w:r>
           <w:rPr>
@@ -1649,7 +2386,74 @@
           <w:rPr>
             <w:noProof/>
           </w:rPr>
-          <w:t>12</w:t>
+          <w:t>13</w:t>
+        </w:r>
+        <w:r>
+          <w:rPr>
+            <w:noProof/>
+          </w:rPr>
+          <w:fldChar w:fldCharType="end"/>
+        </w:r>
+      </w:hyperlink>
+    </w:p>
+    <w:p>
+      <w:pPr>
+        <w:pStyle w:val="TOC1"/>
+        <w:tabs>
+          <w:tab w:val="right" w:leader="dot" w:pos="9016"/>
+        </w:tabs>
+        <w:rPr>
+          <w:rFonts w:asciiTheme="minorHAnsi" w:eastAsiaTheme="minorEastAsia" w:hAnsiTheme="minorHAnsi" w:cstheme="minorBidi"/>
+          <w:noProof/>
+          <w:kern w:val="2"/>
+          <w:sz w:val="24"/>
+          <w:szCs w:val="24"/>
+          <w:lang w:eastAsia="en-GB"/>
+          <w14:ligatures w14:val="standardContextual"/>
+        </w:rPr>
+      </w:pPr>
+      <w:hyperlink w:anchor="_Toc222839155" w:history="1">
+        <w:r>
+          <w:rPr>
+            <w:rStyle w:val="Hyperlink"/>
+            <w:noProof/>
+          </w:rPr>
+          <w:t>References</w:t>
+        </w:r>
+        <w:r>
+          <w:rPr>
+            <w:noProof/>
+          </w:rPr>
+          <w:tab/>
+        </w:r>
+        <w:r>
+          <w:rPr>
+            <w:noProof/>
+          </w:rPr>
+          <w:fldChar w:fldCharType="begin"/>
+        </w:r>
+        <w:r>
+          <w:rPr>
+            <w:noProof/>
+          </w:rPr>
+          <w:instrText xml:space="preserve"> PAGEREF _Toc222839155 \h </w:instrText>
+        </w:r>
+        <w:r>
+          <w:rPr>
+            <w:noProof/>
+          </w:rPr>
+        </w:r>
+        <w:r>
+          <w:rPr>
+            <w:noProof/>
+          </w:rPr>
+          <w:fldChar w:fldCharType="separate"/>
+        </w:r>
+        <w:r>
+          <w:rPr>
+            <w:noProof/>
+          </w:rPr>
+          <w:t>14</w:t>
         </w:r>
         <w:r>
           <w:rPr>
@@ -1682,7 +2486,7 @@
       <w:pPr>
         <w:pStyle w:val="Heading2"/>
       </w:pPr>
-      <w:bookmarkStart w:id="9" w:name="_Toc221287547"/>
+      <w:bookmarkStart w:id="9" w:name="_Toc222839128"/>
       <w:r>
         <w:t>Table of Figures</w:t>
       </w:r>
@@ -1695,7 +2499,13 @@
           <w:tab w:val="right" w:leader="dot" w:pos="9016"/>
         </w:tabs>
         <w:rPr>
+          <w:rFonts w:asciiTheme="minorHAnsi" w:eastAsiaTheme="minorEastAsia" w:hAnsiTheme="minorHAnsi" w:cstheme="minorBidi"/>
           <w:noProof/>
+          <w:kern w:val="2"/>
+          <w:sz w:val="24"/>
+          <w:szCs w:val="24"/>
+          <w:lang w:eastAsia="en-GB"/>
+          <w14:ligatures w14:val="standardContextual"/>
         </w:rPr>
       </w:pPr>
       <w:r>
@@ -1707,13 +2517,22 @@
       <w:r>
         <w:fldChar w:fldCharType="separate"/>
       </w:r>
-      <w:hyperlink w:anchor="_Toc115450903" w:history="1">
+      <w:hyperlink w:anchor="_Toc222940983" w:history="1">
         <w:r>
           <w:rPr>
             <w:rStyle w:val="Hyperlink"/>
             <w:noProof/>
           </w:rPr>
-          <w:t>Figure 1: A sample image, formatted and captioned as a figure.</w:t>
+          <w:t xml:space="preserve">Figure 1 The three reasons why water technologists use advanced CFD </w:t>
+        </w:r>
+        <w:r>
+          <w:rPr>
+            <w:rStyle w:val="Hyperlink"/>
+            <w:noProof/>
+            <w:highlight w:val="yellow"/>
+            <w:lang w:val="en-US"/>
+          </w:rPr>
+          <w:t>(Audenaert, 2023)</w:t>
         </w:r>
         <w:r>
           <w:rPr>
@@ -1734,7 +2553,7 @@
             <w:noProof/>
             <w:webHidden/>
           </w:rPr>
-          <w:instrText xml:space="preserve"> PAGEREF _Toc115450903 \h </w:instrText>
+          <w:instrText xml:space="preserve"> PAGEREF _Toc222940983 \h </w:instrText>
         </w:r>
         <w:r>
           <w:rPr>
@@ -1754,7 +2573,7 @@
             <w:noProof/>
             <w:webHidden/>
           </w:rPr>
-          <w:t>3</w:t>
+          <w:t>6</w:t>
         </w:r>
         <w:r>
           <w:rPr>
@@ -1766,6 +2585,281 @@
       </w:hyperlink>
     </w:p>
     <w:p>
+      <w:pPr>
+        <w:pStyle w:val="TableofFigures"/>
+        <w:tabs>
+          <w:tab w:val="right" w:leader="dot" w:pos="9016"/>
+        </w:tabs>
+        <w:rPr>
+          <w:rFonts w:asciiTheme="minorHAnsi" w:eastAsiaTheme="minorEastAsia" w:hAnsiTheme="minorHAnsi" w:cstheme="minorBidi"/>
+          <w:noProof/>
+          <w:kern w:val="2"/>
+          <w:sz w:val="24"/>
+          <w:szCs w:val="24"/>
+          <w:lang w:eastAsia="en-GB"/>
+          <w14:ligatures w14:val="standardContextual"/>
+        </w:rPr>
+      </w:pPr>
+      <w:hyperlink w:anchor="_Toc222940984" w:history="1">
+        <w:r>
+          <w:rPr>
+            <w:rStyle w:val="Hyperlink"/>
+            <w:noProof/>
+          </w:rPr>
+          <w:t>Figure 2 Visualisation of water flows after improving the design using CFD technology (</w:t>
+        </w:r>
+        <w:r>
+          <w:rPr>
+            <w:rStyle w:val="Hyperlink"/>
+            <w:noProof/>
+            <w:highlight w:val="yellow"/>
+          </w:rPr>
+          <w:t>AM Team, 2018</w:t>
+        </w:r>
+        <w:r>
+          <w:rPr>
+            <w:rStyle w:val="Hyperlink"/>
+            <w:noProof/>
+          </w:rPr>
+          <w:t>)</w:t>
+        </w:r>
+        <w:r>
+          <w:rPr>
+            <w:noProof/>
+            <w:webHidden/>
+          </w:rPr>
+          <w:tab/>
+        </w:r>
+        <w:r>
+          <w:rPr>
+            <w:noProof/>
+            <w:webHidden/>
+          </w:rPr>
+          <w:fldChar w:fldCharType="begin"/>
+        </w:r>
+        <w:r>
+          <w:rPr>
+            <w:noProof/>
+            <w:webHidden/>
+          </w:rPr>
+          <w:instrText xml:space="preserve"> PAGEREF _Toc222940984 \h </w:instrText>
+        </w:r>
+        <w:r>
+          <w:rPr>
+            <w:noProof/>
+            <w:webHidden/>
+          </w:rPr>
+        </w:r>
+        <w:r>
+          <w:rPr>
+            <w:noProof/>
+            <w:webHidden/>
+          </w:rPr>
+          <w:fldChar w:fldCharType="separate"/>
+        </w:r>
+        <w:r>
+          <w:rPr>
+            <w:noProof/>
+            <w:webHidden/>
+          </w:rPr>
+          <w:t>7</w:t>
+        </w:r>
+        <w:r>
+          <w:rPr>
+            <w:noProof/>
+            <w:webHidden/>
+          </w:rPr>
+          <w:fldChar w:fldCharType="end"/>
+        </w:r>
+      </w:hyperlink>
+    </w:p>
+    <w:p>
+      <w:pPr>
+        <w:pStyle w:val="TableofFigures"/>
+        <w:tabs>
+          <w:tab w:val="right" w:leader="dot" w:pos="9016"/>
+        </w:tabs>
+        <w:rPr>
+          <w:rFonts w:asciiTheme="minorHAnsi" w:eastAsiaTheme="minorEastAsia" w:hAnsiTheme="minorHAnsi" w:cstheme="minorBidi"/>
+          <w:noProof/>
+          <w:kern w:val="2"/>
+          <w:sz w:val="24"/>
+          <w:szCs w:val="24"/>
+          <w:lang w:eastAsia="en-GB"/>
+          <w14:ligatures w14:val="standardContextual"/>
+        </w:rPr>
+      </w:pPr>
+      <w:hyperlink w:anchor="_Toc222940985" w:history="1">
+        <w:r>
+          <w:rPr>
+            <w:rStyle w:val="Hyperlink"/>
+            <w:noProof/>
+          </w:rPr>
+          <w:t xml:space="preserve">Figure 3 Visualisation of pressure distribution and velocity field around the F1 car </w:t>
+        </w:r>
+        <w:r>
+          <w:rPr>
+            <w:rStyle w:val="Hyperlink"/>
+            <w:noProof/>
+            <w:highlight w:val="yellow"/>
+          </w:rPr>
+          <w:t>(Abdelkarim, 2025</w:t>
+        </w:r>
+        <w:r>
+          <w:rPr>
+            <w:rStyle w:val="Hyperlink"/>
+            <w:noProof/>
+          </w:rPr>
+          <w:t>)</w:t>
+        </w:r>
+        <w:r>
+          <w:rPr>
+            <w:noProof/>
+            <w:webHidden/>
+          </w:rPr>
+          <w:tab/>
+        </w:r>
+        <w:r>
+          <w:rPr>
+            <w:noProof/>
+            <w:webHidden/>
+          </w:rPr>
+          <w:fldChar w:fldCharType="begin"/>
+        </w:r>
+        <w:r>
+          <w:rPr>
+            <w:noProof/>
+            <w:webHidden/>
+          </w:rPr>
+          <w:instrText xml:space="preserve"> PAGEREF _Toc222940985 \h </w:instrText>
+        </w:r>
+        <w:r>
+          <w:rPr>
+            <w:noProof/>
+            <w:webHidden/>
+          </w:rPr>
+        </w:r>
+        <w:r>
+          <w:rPr>
+            <w:noProof/>
+            <w:webHidden/>
+          </w:rPr>
+          <w:fldChar w:fldCharType="separate"/>
+        </w:r>
+        <w:r>
+          <w:rPr>
+            <w:noProof/>
+            <w:webHidden/>
+          </w:rPr>
+          <w:t>8</w:t>
+        </w:r>
+        <w:r>
+          <w:rPr>
+            <w:noProof/>
+            <w:webHidden/>
+          </w:rPr>
+          <w:fldChar w:fldCharType="end"/>
+        </w:r>
+      </w:hyperlink>
+    </w:p>
+    <w:p>
+      <w:pPr>
+        <w:pStyle w:val="TableofFigures"/>
+        <w:tabs>
+          <w:tab w:val="right" w:leader="dot" w:pos="9016"/>
+        </w:tabs>
+        <w:rPr>
+          <w:rFonts w:asciiTheme="minorHAnsi" w:eastAsiaTheme="minorEastAsia" w:hAnsiTheme="minorHAnsi" w:cstheme="minorBidi"/>
+          <w:noProof/>
+          <w:kern w:val="2"/>
+          <w:sz w:val="24"/>
+          <w:szCs w:val="24"/>
+          <w:lang w:eastAsia="en-GB"/>
+          <w14:ligatures w14:val="standardContextual"/>
+        </w:rPr>
+      </w:pPr>
+      <w:hyperlink w:anchor="_Toc222940986" w:history="1">
+        <w:r>
+          <w:rPr>
+            <w:rStyle w:val="Hyperlink"/>
+            <w:noProof/>
+          </w:rPr>
+          <w:t>Figure 4</w:t>
+        </w:r>
+        <w:r>
+          <w:rPr>
+            <w:rStyle w:val="Hyperlink"/>
+            <w:noProof/>
+          </w:rPr>
+          <w:t xml:space="preserve"> </w:t>
+        </w:r>
+        <w:r>
+          <w:rPr>
+            <w:rStyle w:val="Hyperlink"/>
+            <w:noProof/>
+          </w:rPr>
+          <w:t xml:space="preserve">Navier-Stokes Equations </w:t>
+        </w:r>
+        <w:r>
+          <w:rPr>
+            <w:rStyle w:val="Hyperlink"/>
+            <w:noProof/>
+            <w:highlight w:val="yellow"/>
+            <w:lang w:val="en-US"/>
+          </w:rPr>
+          <w:t>(NASA, 2021)</w:t>
+        </w:r>
+        <w:r>
+          <w:rPr>
+            <w:noProof/>
+            <w:webHidden/>
+          </w:rPr>
+          <w:tab/>
+        </w:r>
+        <w:r>
+          <w:rPr>
+            <w:noProof/>
+            <w:webHidden/>
+          </w:rPr>
+          <w:fldChar w:fldCharType="begin"/>
+        </w:r>
+        <w:r>
+          <w:rPr>
+            <w:noProof/>
+            <w:webHidden/>
+          </w:rPr>
+          <w:instrText xml:space="preserve"> PAGEREF _Toc222940986 \h </w:instrText>
+        </w:r>
+        <w:r>
+          <w:rPr>
+            <w:noProof/>
+            <w:webHidden/>
+          </w:rPr>
+        </w:r>
+        <w:r>
+          <w:rPr>
+            <w:noProof/>
+            <w:webHidden/>
+          </w:rPr>
+          <w:fldChar w:fldCharType="separate"/>
+        </w:r>
+        <w:r>
+          <w:rPr>
+            <w:noProof/>
+            <w:webHidden/>
+          </w:rPr>
+          <w:t>9</w:t>
+        </w:r>
+        <w:r>
+          <w:rPr>
+            <w:noProof/>
+            <w:webHidden/>
+          </w:rPr>
+          <w:fldChar w:fldCharType="end"/>
+        </w:r>
+      </w:hyperlink>
+    </w:p>
+    <w:p>
       <w:r>
         <w:fldChar w:fldCharType="end"/>
       </w:r>
@@ -1794,35 +2888,35 @@
       <w:pPr>
         <w:pStyle w:val="Heading1"/>
       </w:pPr>
-      <w:bookmarkStart w:id="10" w:name="_Toc221287548"/>
+      <w:bookmarkStart w:id="10" w:name="_Toc222839129"/>
       <w:bookmarkEnd w:id="7"/>
       <w:bookmarkEnd w:id="8"/>
       <w:r>
         <w:lastRenderedPageBreak/>
         <w:t>Introduction</w:t>
       </w:r>
+      <w:r>
+        <w:t xml:space="preserve"> – </w:t>
+      </w:r>
+      <w:r>
+        <w:rPr>
+          <w:color w:val="70AD47" w:themeColor="accent6"/>
+        </w:rPr>
+        <w:t>22</w:t>
+      </w:r>
+      <w:r>
+        <w:rPr>
+          <w:color w:val="70AD47" w:themeColor="accent6"/>
+        </w:rPr>
+        <w:t>9</w:t>
+      </w:r>
+      <w:r>
+        <w:rPr>
+          <w:color w:val="70AD47" w:themeColor="accent6"/>
+        </w:rPr>
+        <w:t>w</w:t>
+      </w:r>
       <w:bookmarkEnd w:id="10"/>
-      <w:r>
-        <w:t xml:space="preserve"> – </w:t>
-      </w:r>
-      <w:r>
-        <w:rPr>
-          <w:color w:val="70AD47" w:themeColor="accent6"/>
-        </w:rPr>
-        <w:t>22</w:t>
-      </w:r>
-      <w:r>
-        <w:rPr>
-          <w:color w:val="70AD47" w:themeColor="accent6"/>
-        </w:rPr>
-        <w:t>9</w:t>
-      </w:r>
-      <w:r>
-        <w:rPr>
-          <w:color w:val="70AD47" w:themeColor="accent6"/>
-        </w:rPr>
-        <w:t>w</w:t>
-      </w:r>
     </w:p>
     <w:p>
       <w:r>
@@ -1871,6 +2965,7 @@
           <w:id w:val="1226797730"/>
           <w:citation/>
         </w:sdtPr>
+        <w:sdtEndPr/>
         <w:sdtContent>
           <w:r>
             <w:fldChar w:fldCharType="begin"/>
@@ -1915,6 +3010,7 @@
           <w:id w:val="1390226164"/>
           <w:citation/>
         </w:sdtPr>
+        <w:sdtEndPr/>
         <w:sdtContent>
           <w:r>
             <w:fldChar w:fldCharType="begin"/>
@@ -2036,31 +3132,45 @@
       <w:pPr>
         <w:pStyle w:val="Heading1"/>
       </w:pPr>
-      <w:bookmarkStart w:id="11" w:name="_Toc88436908"/>
-      <w:bookmarkStart w:id="12" w:name="_Toc221287549"/>
+      <w:bookmarkStart w:id="11" w:name="_Toc222839130"/>
+      <w:bookmarkStart w:id="12" w:name="_Toc88436908"/>
       <w:r>
         <w:lastRenderedPageBreak/>
         <w:t>Context</w:t>
       </w:r>
-      <w:bookmarkEnd w:id="12"/>
+      <w:bookmarkEnd w:id="11"/>
+      <w:r>
+        <w:t xml:space="preserve"> – 8</w:t>
+      </w:r>
+      <w:r>
+        <w:t>50</w:t>
+      </w:r>
+      <w:r>
+        <w:t>w</w:t>
+      </w:r>
     </w:p>
     <w:p>
       <w:pPr>
         <w:pStyle w:val="Heading2"/>
       </w:pPr>
+      <w:bookmarkStart w:id="13" w:name="_Toc222839131"/>
       <w:r>
         <w:t xml:space="preserve">CFD: </w:t>
       </w:r>
       <w:r>
         <w:t>The Why</w:t>
       </w:r>
-    </w:p>
-    <w:p>
-      <w:r>
-        <w:t>When considering the practical uses for CFD, there are three main reasons</w:t>
-      </w:r>
-      <w:r>
-        <w:t>, to save time, to save costs, and to obtain more optimal processes.</w:t>
+      <w:bookmarkEnd w:id="13"/>
+    </w:p>
+    <w:p>
+      <w:r>
+        <w:t xml:space="preserve">When considering the practical uses for CFD, there are three main </w:t>
+      </w:r>
+      <w:r>
+        <w:t>reasons:</w:t>
+      </w:r>
+      <w:r>
+        <w:t xml:space="preserve"> to save time, to save costs, and to obtain more optimal processes.</w:t>
       </w:r>
       <w:r>
         <w:t xml:space="preserve"> </w:t>
@@ -2138,6 +3248,7 @@
       <w:pPr>
         <w:pStyle w:val="Caption"/>
       </w:pPr>
+      <w:bookmarkStart w:id="14" w:name="_Toc222940983"/>
       <w:r>
         <w:t xml:space="preserve">Figure </w:t>
       </w:r>
@@ -2214,14 +3325,17 @@
           </w:r>
         </w:sdtContent>
       </w:sdt>
+      <w:bookmarkEnd w:id="14"/>
     </w:p>
     <w:p>
       <w:pPr>
         <w:pStyle w:val="Heading3"/>
       </w:pPr>
+      <w:bookmarkStart w:id="15" w:name="_Toc222839132"/>
       <w:r>
         <w:t>Saving Time</w:t>
       </w:r>
+      <w:bookmarkEnd w:id="15"/>
     </w:p>
     <w:p>
       <w:r>
@@ -2259,9 +3373,11 @@
       <w:pPr>
         <w:pStyle w:val="Heading3"/>
       </w:pPr>
+      <w:bookmarkStart w:id="16" w:name="_Toc222839133"/>
       <w:r>
         <w:t>Saving Costs</w:t>
       </w:r>
+      <w:bookmarkEnd w:id="16"/>
     </w:p>
     <w:p>
       <w:r>
@@ -2289,32 +3405,46 @@
       <w:r>
         <w:t xml:space="preserve">where, and how many are required to achieve the desired outcome, this could allow reducing the total amount of pumps required, or determining at which flow rates a given pump can be switched off to reduce </w:t>
       </w:r>
-      <w:proofErr w:type="spellStart"/>
       <w:r>
         <w:rPr>
           <w:lang w:val="en-US"/>
         </w:rPr>
-        <w:t>CapEx</w:t>
-      </w:r>
-      <w:proofErr w:type="spellEnd"/>
+        <w:t>Cap</w:t>
+      </w:r>
       <w:r>
         <w:rPr>
           <w:lang w:val="en-US"/>
         </w:rPr>
-        <w:t xml:space="preserve"> / </w:t>
-      </w:r>
-      <w:proofErr w:type="spellStart"/>
+        <w:t xml:space="preserve">ital Expenditure </w:t>
+      </w:r>
       <w:r>
         <w:rPr>
           <w:lang w:val="en-US"/>
         </w:rPr>
-        <w:t>OpEx</w:t>
-      </w:r>
-      <w:proofErr w:type="spellEnd"/>
+        <w:t>and</w:t>
+      </w:r>
       <w:r>
         <w:rPr>
           <w:lang w:val="en-US"/>
         </w:rPr>
+        <w:t xml:space="preserve"> Op</w:t>
+      </w:r>
+      <w:r>
+        <w:rPr>
+          <w:lang w:val="en-US"/>
+        </w:rPr>
+        <w:t xml:space="preserve">erational </w:t>
+      </w:r>
+      <w:r>
+        <w:rPr>
+          <w:lang w:val="en-US"/>
+        </w:rPr>
+        <w:t>Expenditure</w:t>
+      </w:r>
+      <w:r>
+        <w:rPr>
+          <w:lang w:val="en-US"/>
+        </w:rPr>
         <w:t>.</w:t>
       </w:r>
     </w:p>
@@ -2322,9 +3452,11 @@
       <w:pPr>
         <w:pStyle w:val="Heading3"/>
       </w:pPr>
+      <w:bookmarkStart w:id="17" w:name="_Toc222839134"/>
       <w:r>
         <w:t>Obtaining Optimal Processes</w:t>
       </w:r>
+      <w:bookmarkEnd w:id="17"/>
     </w:p>
     <w:p>
       <w:r>
@@ -2406,7 +3538,7 @@
       </w:pPr>
       <w:r>
         <w:lastRenderedPageBreak/>
-        <w:t>Addition of further variables</w:t>
+        <w:t>Flexibility</w:t>
       </w:r>
     </w:p>
     <w:p>
@@ -2429,7 +3561,13 @@
         <w:t xml:space="preserve"> flexibility gives </w:t>
       </w:r>
       <w:r>
-        <w:t xml:space="preserve">opportunity to text a huge variety of use </w:t>
+        <w:t xml:space="preserve">opportunity to text a </w:t>
+      </w:r>
+      <w:r>
+        <w:t>large</w:t>
+      </w:r>
+      <w:r>
+        <w:t xml:space="preserve"> variety of use </w:t>
       </w:r>
       <w:r>
         <w:t>cases and</w:t>
@@ -2442,9 +3580,21 @@
       <w:pPr>
         <w:pStyle w:val="Heading2"/>
       </w:pPr>
+      <w:bookmarkStart w:id="18" w:name="_Toc222839136"/>
       <w:r>
         <w:t>Use Cases of CFD</w:t>
       </w:r>
+      <w:bookmarkEnd w:id="18"/>
+    </w:p>
+    <w:p>
+      <w:pPr>
+        <w:pStyle w:val="Heading3"/>
+      </w:pPr>
+      <w:bookmarkStart w:id="19" w:name="_Toc222839137"/>
+      <w:r>
+        <w:t>HVAC</w:t>
+      </w:r>
+      <w:bookmarkEnd w:id="19"/>
     </w:p>
     <w:p>
       <w:r>
@@ -2475,13 +3625,7 @@
         <w:t>as ‘</w:t>
       </w:r>
       <w:r>
-        <w:t>CFD can be a powerful tool for designing and optimizing fluid mechanics in a variety of use case applications.</w:t>
-      </w:r>
-      <w:r>
-        <w:t>’</w:t>
-      </w:r>
-      <w:r>
-        <w:t xml:space="preserve"> </w:t>
+        <w:t xml:space="preserve">CFD can be a powerful tool for designing and optimizing fluid mechanics in a variety of use case applications.’ </w:t>
       </w:r>
       <w:sdt>
         <w:sdtPr>
@@ -2491,6 +3635,7 @@
           <w:id w:val="1718555527"/>
           <w:citation/>
         </w:sdtPr>
+        <w:sdtEndPr/>
         <w:sdtContent>
           <w:r>
             <w:rPr>
@@ -2558,7 +3703,16 @@
         <w:t xml:space="preserve">, and by reducing the energy cost, this reduces the impact to both the business and environment. </w:t>
       </w:r>
     </w:p>
-    <w:p/>
+    <w:p>
+      <w:pPr>
+        <w:pStyle w:val="Heading3"/>
+      </w:pPr>
+      <w:bookmarkStart w:id="20" w:name="_Toc222839138"/>
+      <w:r>
+        <w:t>Water and wastewater treatment</w:t>
+      </w:r>
+      <w:bookmarkEnd w:id="20"/>
+    </w:p>
     <w:p>
       <w:r>
         <w:t xml:space="preserve">In </w:t>
@@ -2664,253 +3818,19 @@
         <w:t xml:space="preserve"> </w:t>
       </w:r>
     </w:p>
-    <w:p/>
-    <w:p>
-      <w:r>
-        <w:t>Aerodynamics</w:t>
-      </w:r>
-    </w:p>
-    <w:p>
-      <w:pPr>
-        <w:pStyle w:val="Heading2"/>
-      </w:pPr>
-      <w:r>
-        <w:t>Navier-Stokes Equations</w:t>
-      </w:r>
-    </w:p>
-    <w:p>
-      <w:r>
-        <w:t>CFD models further allow</w:t>
-      </w:r>
-      <w:r>
-        <w:t xml:space="preserve"> testing </w:t>
-      </w:r>
-    </w:p>
-    <w:p>
-      <w:pPr>
-        <w:pStyle w:val="Heading2"/>
-      </w:pPr>
-      <w:r>
-        <w:t>Coding specific</w:t>
-      </w:r>
-    </w:p>
     <w:p>
       <w:pPr>
         <w:keepNext/>
       </w:pPr>
       <w:r>
-        <w:t>how it relates to other techniques in your discipline.</w:t>
-      </w:r>
-    </w:p>
-    <w:p>
-      <w:pPr>
-        <w:keepNext/>
-      </w:pPr>
-      <w:r>
-        <w:t>You will want to refer to existing games that use this or similar techniques, or that demonstrate the challenge you’d like to learn to address.</w:t>
-      </w:r>
-    </w:p>
-    <w:p>
-      <w:pPr>
-        <w:rPr>
-          <w:b/>
-          <w:bCs/>
-        </w:rPr>
-      </w:pPr>
-      <w:r>
-        <w:rPr>
-          <w:b/>
-          <w:bCs/>
-        </w:rPr>
-        <w:t xml:space="preserve">Navier stokes equations </w:t>
-      </w:r>
-    </w:p>
-    <w:p/>
-    <w:p/>
-    <w:p>
-      <w:pPr>
-        <w:pStyle w:val="Heading2"/>
-      </w:pPr>
-      <w:bookmarkStart w:id="13" w:name="_Toc221287551"/>
-      <w:r>
-        <w:lastRenderedPageBreak/>
-        <w:t>Computational Fluid Dynamics</w:t>
-      </w:r>
-      <w:bookmarkEnd w:id="13"/>
-    </w:p>
-    <w:p>
-      <w:r>
-        <w:t>Hard requirements of a CFD model</w:t>
-      </w:r>
-    </w:p>
-    <w:p>
-      <w:pPr>
-        <w:pStyle w:val="ListParagraph"/>
-        <w:numPr>
-          <w:ilvl w:val="0"/>
-          <w:numId w:val="6"/>
-        </w:numPr>
-      </w:pPr>
-      <w:r>
-        <w:t>pressure</w:t>
-      </w:r>
-    </w:p>
-    <w:p>
-      <w:pPr>
-        <w:pStyle w:val="ListParagraph"/>
-        <w:numPr>
-          <w:ilvl w:val="0"/>
-          <w:numId w:val="6"/>
-        </w:numPr>
-      </w:pPr>
-      <w:r>
-        <w:t>viscosity</w:t>
-      </w:r>
-    </w:p>
-    <w:p>
-      <w:pPr>
-        <w:pStyle w:val="ListParagraph"/>
-        <w:numPr>
-          <w:ilvl w:val="0"/>
-          <w:numId w:val="6"/>
-        </w:numPr>
-      </w:pPr>
-      <w:r>
-        <w:t>surface tension</w:t>
-      </w:r>
-    </w:p>
-    <w:p>
-      <w:r>
-        <w:t>Smoothed particle hydrodynamics</w:t>
-      </w:r>
-    </w:p>
-    <w:p>
-      <w:pPr>
-        <w:pStyle w:val="Heading2"/>
-      </w:pPr>
-      <w:bookmarkStart w:id="14" w:name="_Toc221287553"/>
-      <w:r>
-        <w:t>Grid based system</w:t>
-      </w:r>
-      <w:bookmarkEnd w:id="14"/>
-    </w:p>
-    <w:p/>
-    <w:p>
-      <w:pPr>
-        <w:pStyle w:val="Heading2"/>
-      </w:pPr>
-      <w:bookmarkStart w:id="15" w:name="_Toc221287554"/>
-      <w:r>
-        <w:t>Particle based system</w:t>
-      </w:r>
-      <w:bookmarkEnd w:id="15"/>
-      <w:r>
-        <w:t xml:space="preserve"> </w:t>
-      </w:r>
-      <w:bookmarkStart w:id="16" w:name="_Toc221287552"/>
-    </w:p>
-    <w:p>
-      <w:pPr>
-        <w:pStyle w:val="Heading2"/>
-      </w:pPr>
-      <w:r>
-        <w:t>Time Complexities</w:t>
-      </w:r>
-      <w:bookmarkEnd w:id="16"/>
-    </w:p>
-    <w:p>
-      <w:r>
-        <w:t>https://www.youtube.com/watch?v=BgLTDT03QtU</w:t>
-      </w:r>
-    </w:p>
-    <w:p>
-      <w:r>
-        <w:t xml:space="preserve">O(1) to create and add items to a </w:t>
-      </w:r>
-      <w:proofErr w:type="spellStart"/>
-      <w:r>
-        <w:t>hashset</w:t>
-      </w:r>
-      <w:proofErr w:type="spellEnd"/>
-    </w:p>
-    <w:p>
-      <w:pPr>
-        <w:rPr>
-          <w:color w:val="EE0000"/>
-        </w:rPr>
-      </w:pPr>
-      <w:r>
-        <w:rPr>
-          <w:color w:val="EE0000"/>
-        </w:rPr>
-        <w:t>Add a table that looks a time complexities of different data structures</w:t>
-      </w:r>
-    </w:p>
-    <w:p>
-      <w:pPr>
-        <w:rPr>
-          <w:color w:val="EE0000"/>
-        </w:rPr>
-      </w:pPr>
-      <w:proofErr w:type="spellStart"/>
-      <w:r>
-        <w:rPr>
-          <w:color w:val="EE0000"/>
-        </w:rPr>
-        <w:t>Cacheing</w:t>
-      </w:r>
-      <w:proofErr w:type="spellEnd"/>
-      <w:r>
-        <w:rPr>
-          <w:color w:val="EE0000"/>
-        </w:rPr>
-        <w:t xml:space="preserve"> </w:t>
-      </w:r>
-      <w:r>
-        <w:rPr>
-          <w:color w:val="EE0000"/>
-        </w:rPr>
-        <w:t>https://www.geeksforgeeks.org/system-design/caching-system-design-concept-for-beginners/</w:t>
-      </w:r>
-    </w:p>
-    <w:p>
-      <w:pPr>
-        <w:pStyle w:val="Heading2"/>
-      </w:pPr>
-      <w:r>
-        <w:t>Performance benchmarks</w:t>
-      </w:r>
-    </w:p>
-    <w:p>
-      <w:r>
-        <w:t xml:space="preserve">Rendering a single particle </w:t>
-      </w:r>
-      <w:r>
-        <w:t>without any behaviour 250 -400fps</w:t>
-      </w:r>
-    </w:p>
-    <w:p>
-      <w:r>
-        <w:t>500 particles spawned, not interacting 190 -210fps</w:t>
-      </w:r>
-    </w:p>
-    <w:p/>
-    <w:p/>
-    <w:p>
-      <w:pPr>
-        <w:pStyle w:val="Heading1"/>
-      </w:pPr>
-    </w:p>
-    <w:p>
-      <w:r>
         <w:rPr>
           <w:noProof/>
         </w:rPr>
         <w:drawing>
-          <wp:inline distT="0" distB="0" distL="0" distR="0" wp14:anchorId="472DA9C3" wp14:editId="79BE6E3C">
-            <wp:extent cx="5731510" cy="3218180"/>
-            <wp:effectExtent l="0" t="0" r="2540" b="1270"/>
-            <wp:docPr id="2" name="Picture 2" descr="A collage of a person's head&#10;&#10;Description automatically generated with medium confidence"/>
+          <wp:inline distT="0" distB="0" distL="0" distR="0" wp14:anchorId="07BC5330" wp14:editId="2D7B8FB6">
+            <wp:extent cx="5286375" cy="3034030"/>
+            <wp:effectExtent l="0" t="0" r="9525" b="0"/>
+            <wp:docPr id="683797070" name="Picture 1"/>
             <wp:cNvGraphicFramePr>
               <a:graphicFrameLocks xmlns:a="http://schemas.openxmlformats.org/drawingml/2006/main" noChangeAspect="1"/>
             </wp:cNvGraphicFramePr>
@@ -2918,13 +3838,13 @@
               <a:graphicData uri="http://schemas.openxmlformats.org/drawingml/2006/picture">
                 <pic:pic xmlns:pic="http://schemas.openxmlformats.org/drawingml/2006/picture">
                   <pic:nvPicPr>
-                    <pic:cNvPr id="2" name="Picture 2" descr="A collage of a person's head&#10;&#10;Description automatically generated with medium confidence"/>
+                    <pic:cNvPr id="0" name="Picture 1"/>
                     <pic:cNvPicPr>
                       <a:picLocks noChangeAspect="1" noChangeArrowheads="1"/>
                     </pic:cNvPicPr>
                   </pic:nvPicPr>
                   <pic:blipFill>
-                    <a:blip r:embed="rId13">
+                    <a:blip r:embed="rId13" cstate="print">
                       <a:extLst>
                         <a:ext uri="{28A0092B-C50C-407E-A947-70E740481C1C}">
                           <a14:useLocalDpi xmlns:a14="http://schemas.microsoft.com/office/drawing/2010/main" val="0"/>
@@ -2939,7 +3859,7 @@
                   <pic:spPr bwMode="auto">
                     <a:xfrm>
                       <a:off x="0" y="0"/>
-                      <a:ext cx="5731510" cy="3218180"/>
+                      <a:ext cx="5299070" cy="3041316"/>
                     </a:xfrm>
                     <a:prstGeom prst="rect">
                       <a:avLst/>
@@ -2960,7 +3880,7 @@
       <w:pPr>
         <w:pStyle w:val="Caption"/>
       </w:pPr>
-      <w:bookmarkStart w:id="17" w:name="_Toc115450903"/>
+      <w:bookmarkStart w:id="21" w:name="_Toc222940984"/>
       <w:r>
         <w:t xml:space="preserve">Figure </w:t>
       </w:r>
@@ -2968,7 +3888,7 @@
         <w:fldChar w:fldCharType="begin"/>
       </w:r>
       <w:r>
-        <w:instrText>SEQ Figure \* ARABIC</w:instrText>
+        <w:instrText xml:space="preserve"> SEQ Figure \* ARABIC </w:instrText>
       </w:r>
       <w:r>
         <w:fldChar w:fldCharType="separate"/>
@@ -2977,57 +3897,531 @@
         <w:rPr>
           <w:noProof/>
         </w:rPr>
+        <w:t>2</w:t>
+      </w:r>
+      <w:r>
+        <w:fldChar w:fldCharType="end"/>
+      </w:r>
+      <w:r>
+        <w:t xml:space="preserve"> Visualisation of water flows after improving the design using CFD technology </w:t>
+      </w:r>
+      <w:sdt>
+        <w:sdtPr>
+          <w:id w:val="-1581983855"/>
+          <w:citation/>
+        </w:sdtPr>
+        <w:sdtEndPr/>
+        <w:sdtContent>
+          <w:r>
+            <w:fldChar w:fldCharType="begin"/>
+          </w:r>
+          <w:r>
+            <w:instrText xml:space="preserve"> CITATION AMT18 \l 2057 </w:instrText>
+          </w:r>
+          <w:r>
+            <w:fldChar w:fldCharType="separate"/>
+          </w:r>
+          <w:r>
+            <w:rPr>
+              <w:noProof/>
+            </w:rPr>
+            <w:t>(</w:t>
+          </w:r>
+          <w:r>
+            <w:rPr>
+              <w:noProof/>
+              <w:highlight w:val="yellow"/>
+            </w:rPr>
+            <w:t>AM Team, 2018</w:t>
+          </w:r>
+          <w:r>
+            <w:rPr>
+              <w:noProof/>
+            </w:rPr>
+            <w:t>)</w:t>
+          </w:r>
+          <w:r>
+            <w:fldChar w:fldCharType="end"/>
+          </w:r>
+        </w:sdtContent>
+      </w:sdt>
+      <w:bookmarkEnd w:id="21"/>
+    </w:p>
+    <w:p>
+      <w:pPr>
+        <w:pStyle w:val="Heading3"/>
+      </w:pPr>
+      <w:bookmarkStart w:id="22" w:name="_Toc222839139"/>
+      <w:r>
+        <w:lastRenderedPageBreak/>
+        <w:t>Vehicle Aerodynamics</w:t>
+      </w:r>
+      <w:bookmarkEnd w:id="22"/>
+    </w:p>
+    <w:p>
+      <w:r>
+        <w:t xml:space="preserve">In a study on the applications of Aerospace Aerodynamics using CFD for optimisation of Formula 1 car performance </w:t>
+      </w:r>
+      <w:sdt>
+        <w:sdtPr>
+          <w:rPr>
+            <w:highlight w:val="yellow"/>
+          </w:rPr>
+          <w:id w:val="1769816644"/>
+          <w:citation/>
+        </w:sdtPr>
+        <w:sdtEndPr/>
+        <w:sdtContent>
+          <w:r>
+            <w:rPr>
+              <w:highlight w:val="yellow"/>
+            </w:rPr>
+            <w:fldChar w:fldCharType="begin"/>
+          </w:r>
+          <w:r>
+            <w:rPr>
+              <w:highlight w:val="yellow"/>
+            </w:rPr>
+            <w:instrText xml:space="preserve"> CITATION Abd25 \l 2057 </w:instrText>
+          </w:r>
+          <w:r>
+            <w:rPr>
+              <w:highlight w:val="yellow"/>
+            </w:rPr>
+            <w:fldChar w:fldCharType="separate"/>
+          </w:r>
+          <w:r>
+            <w:rPr>
+              <w:noProof/>
+              <w:highlight w:val="yellow"/>
+            </w:rPr>
+            <w:t>(Abdelkarim, 2025)</w:t>
+          </w:r>
+          <w:r>
+            <w:rPr>
+              <w:highlight w:val="yellow"/>
+            </w:rPr>
+            <w:fldChar w:fldCharType="end"/>
+          </w:r>
+        </w:sdtContent>
+      </w:sdt>
+      <w:r>
+        <w:t xml:space="preserve">, Karim </w:t>
+      </w:r>
+      <w:r>
+        <w:t>explores</w:t>
+      </w:r>
+      <w:r>
+        <w:t xml:space="preserve"> </w:t>
+      </w:r>
+      <w:r>
+        <w:t>the use of</w:t>
+      </w:r>
+      <w:r>
+        <w:t xml:space="preserve"> </w:t>
+      </w:r>
+      <w:r>
+        <w:t xml:space="preserve">CFD </w:t>
+      </w:r>
+      <w:r>
+        <w:t>to determine</w:t>
+      </w:r>
+      <w:r>
+        <w:t xml:space="preserve"> best wing setups with varying downforce</w:t>
+      </w:r>
+      <w:r>
+        <w:t xml:space="preserve"> </w:t>
+      </w:r>
+      <w:r>
+        <w:t xml:space="preserve">to optimise the balance between downforce and drag. It was determined that using high downforce setups at race circuits with higher cornering demand is more efficient, compared to using low drag setups at tracks with more </w:t>
+      </w:r>
+      <w:r>
+        <w:t>straight-line</w:t>
+      </w:r>
+      <w:r>
+        <w:t xml:space="preserve"> sections. Karim used the </w:t>
+      </w:r>
+      <w:proofErr w:type="spellStart"/>
+      <w:r>
+        <w:t>SimScale</w:t>
+      </w:r>
+      <w:proofErr w:type="spellEnd"/>
+      <w:r>
+        <w:t xml:space="preserve"> cloud based CFD platform to replicate wind-tunnel conditions to test the turbulent flow properties when applied across a simplified mesh of a formula 1 car.</w:t>
+      </w:r>
+    </w:p>
+    <w:p>
+      <w:pPr>
+        <w:keepNext/>
+      </w:pPr>
+      <w:r>
+        <w:rPr>
+          <w:noProof/>
+        </w:rPr>
+        <w:drawing>
+          <wp:inline distT="0" distB="0" distL="0" distR="0" wp14:anchorId="7178EE39" wp14:editId="3875A8A4">
+            <wp:extent cx="5372100" cy="3070196"/>
+            <wp:effectExtent l="0" t="0" r="0" b="0"/>
+            <wp:docPr id="1876787697" name="Picture 8" descr="A formula one car model&#10;&#10;AI-generated content may be incorrect."/>
+            <wp:cNvGraphicFramePr>
+              <a:graphicFrameLocks xmlns:a="http://schemas.openxmlformats.org/drawingml/2006/main" noChangeAspect="1"/>
+            </wp:cNvGraphicFramePr>
+            <a:graphic xmlns:a="http://schemas.openxmlformats.org/drawingml/2006/main">
+              <a:graphicData uri="http://schemas.openxmlformats.org/drawingml/2006/picture">
+                <pic:pic xmlns:pic="http://schemas.openxmlformats.org/drawingml/2006/picture">
+                  <pic:nvPicPr>
+                    <pic:cNvPr id="1876787697" name="Picture 8" descr="A formula one car model&#10;&#10;AI-generated content may be incorrect."/>
+                    <pic:cNvPicPr>
+                      <a:picLocks noChangeAspect="1"/>
+                    </pic:cNvPicPr>
+                  </pic:nvPicPr>
+                  <pic:blipFill rotWithShape="1">
+                    <a:blip r:embed="rId14"/>
+                    <a:srcRect l="1389" t="2652" r="1757" b="10417"/>
+                    <a:stretch>
+                      <a:fillRect/>
+                    </a:stretch>
+                  </pic:blipFill>
+                  <pic:spPr bwMode="auto">
+                    <a:xfrm>
+                      <a:off x="0" y="0"/>
+                      <a:ext cx="5386208" cy="3078259"/>
+                    </a:xfrm>
+                    <a:prstGeom prst="rect">
+                      <a:avLst/>
+                    </a:prstGeom>
+                    <a:ln>
+                      <a:noFill/>
+                    </a:ln>
+                    <a:extLst>
+                      <a:ext uri="{53640926-AAD7-44D8-BBD7-CCE9431645EC}">
+                        <a14:shadowObscured xmlns:a14="http://schemas.microsoft.com/office/drawing/2010/main"/>
+                      </a:ext>
+                    </a:extLst>
+                  </pic:spPr>
+                </pic:pic>
+              </a:graphicData>
+            </a:graphic>
+          </wp:inline>
+        </w:drawing>
+      </w:r>
+    </w:p>
+    <w:p>
+      <w:pPr>
+        <w:pStyle w:val="Caption"/>
+      </w:pPr>
+      <w:bookmarkStart w:id="23" w:name="_Toc222940985"/>
+      <w:r>
+        <w:t xml:space="preserve">Figure </w:t>
+      </w:r>
+      <w:r>
+        <w:fldChar w:fldCharType="begin"/>
+      </w:r>
+      <w:r>
+        <w:instrText xml:space="preserve"> SEQ Figure \* ARABIC </w:instrText>
+      </w:r>
+      <w:r>
+        <w:fldChar w:fldCharType="separate"/>
+      </w:r>
+      <w:r>
+        <w:rPr>
+          <w:noProof/>
+        </w:rPr>
         <w:t>3</w:t>
       </w:r>
       <w:r>
         <w:fldChar w:fldCharType="end"/>
       </w:r>
       <w:r>
-        <w:t xml:space="preserve">: A sample </w:t>
+        <w:t xml:space="preserve"> Visualisation of pressure distribution and velocity field around the F1 car </w:t>
+      </w:r>
+      <w:sdt>
+        <w:sdtPr>
+          <w:id w:val="-664628595"/>
+          <w:citation/>
+        </w:sdtPr>
+        <w:sdtEndPr/>
+        <w:sdtContent>
+          <w:r>
+            <w:fldChar w:fldCharType="begin"/>
+          </w:r>
+          <w:r>
+            <w:instrText xml:space="preserve"> CITATION Abd25 \l 2057 </w:instrText>
+          </w:r>
+          <w:r>
+            <w:fldChar w:fldCharType="separate"/>
+          </w:r>
+          <w:r>
+            <w:rPr>
+              <w:noProof/>
+              <w:highlight w:val="yellow"/>
+            </w:rPr>
+            <w:t>(Abdelkarim, 2025</w:t>
+          </w:r>
+          <w:r>
+            <w:rPr>
+              <w:noProof/>
+            </w:rPr>
+            <w:t>)</w:t>
+          </w:r>
+          <w:r>
+            <w:fldChar w:fldCharType="end"/>
+          </w:r>
+        </w:sdtContent>
+      </w:sdt>
+      <w:bookmarkEnd w:id="23"/>
+    </w:p>
+    <w:p>
+      <w:pPr>
+        <w:pStyle w:val="Heading2"/>
+      </w:pPr>
+      <w:bookmarkStart w:id="24" w:name="_Toc222839140"/>
+      <w:r>
+        <w:t>Navier-Stokes Equations</w:t>
+      </w:r>
+      <w:bookmarkEnd w:id="24"/>
+    </w:p>
+    <w:p>
+      <w:r>
+        <w:t xml:space="preserve">The Navier-Stokes equations are a set of coupled differential equations that describe the relationship between pressure, temperature, and density of a moving fluid </w:t>
+      </w:r>
+      <w:sdt>
+        <w:sdtPr>
+          <w:id w:val="-1844849807"/>
+          <w:citation/>
+        </w:sdtPr>
+        <w:sdtEndPr/>
+        <w:sdtContent>
+          <w:r>
+            <w:fldChar w:fldCharType="begin"/>
+          </w:r>
+          <w:r>
+            <w:instrText xml:space="preserve"> CITATION NAS21 \l 2057 </w:instrText>
+          </w:r>
+          <w:r>
+            <w:fldChar w:fldCharType="separate"/>
+          </w:r>
+          <w:r>
+            <w:rPr>
+              <w:noProof/>
+            </w:rPr>
+            <w:t>(</w:t>
+          </w:r>
+          <w:r>
+            <w:rPr>
+              <w:noProof/>
+              <w:highlight w:val="yellow"/>
+            </w:rPr>
+            <w:t>NASA, 2021</w:t>
+          </w:r>
+          <w:r>
+            <w:rPr>
+              <w:noProof/>
+            </w:rPr>
+            <w:t>)</w:t>
+          </w:r>
+          <w:r>
+            <w:fldChar w:fldCharType="end"/>
+          </w:r>
+        </w:sdtContent>
+      </w:sdt>
+      <w:r>
+        <w:t>. NASA outlines the complexity of these equations</w:t>
+      </w:r>
+      <w:r>
+        <w:t xml:space="preserve">, describing them as too difficult to solve analytically. By using CFD to solve these equations in real-time we can approximate the behaviour for effective modelling of fluids in real-world applications. </w:t>
+      </w:r>
+    </w:p>
+    <w:p>
+      <w:pPr>
+        <w:keepNext/>
+      </w:pPr>
+      <w:r>
+        <w:lastRenderedPageBreak/>
+        <w:drawing>
+          <wp:inline distT="0" distB="0" distL="0" distR="0" wp14:anchorId="1C79ADD7" wp14:editId="233C6644">
+            <wp:extent cx="5731510" cy="3583940"/>
+            <wp:effectExtent l="0" t="0" r="2540" b="0"/>
+            <wp:docPr id="503725637" name="Picture 1"/>
+            <wp:cNvGraphicFramePr>
+              <a:graphicFrameLocks xmlns:a="http://schemas.openxmlformats.org/drawingml/2006/main" noChangeAspect="1"/>
+            </wp:cNvGraphicFramePr>
+            <a:graphic xmlns:a="http://schemas.openxmlformats.org/drawingml/2006/main">
+              <a:graphicData uri="http://schemas.openxmlformats.org/drawingml/2006/picture">
+                <pic:pic xmlns:pic="http://schemas.openxmlformats.org/drawingml/2006/picture">
+                  <pic:nvPicPr>
+                    <pic:cNvPr id="503725637" name=""/>
+                    <pic:cNvPicPr/>
+                  </pic:nvPicPr>
+                  <pic:blipFill>
+                    <a:blip r:embed="rId15"/>
+                    <a:stretch>
+                      <a:fillRect/>
+                    </a:stretch>
+                  </pic:blipFill>
+                  <pic:spPr>
+                    <a:xfrm>
+                      <a:off x="0" y="0"/>
+                      <a:ext cx="5731510" cy="3583940"/>
+                    </a:xfrm>
+                    <a:prstGeom prst="rect">
+                      <a:avLst/>
+                    </a:prstGeom>
+                  </pic:spPr>
+                </pic:pic>
+              </a:graphicData>
+            </a:graphic>
+          </wp:inline>
+        </w:drawing>
+      </w:r>
+    </w:p>
+    <w:p>
+      <w:pPr>
+        <w:pStyle w:val="Caption"/>
+      </w:pPr>
+      <w:bookmarkStart w:id="25" w:name="_Toc222940986"/>
+      <w:r>
+        <w:t xml:space="preserve">Figure </w:t>
+      </w:r>
+      <w:r>
+        <w:fldChar w:fldCharType="begin"/>
+      </w:r>
+      <w:r>
+        <w:instrText xml:space="preserve"> SEQ Figure \* ARABIC </w:instrText>
+      </w:r>
+      <w:r>
+        <w:fldChar w:fldCharType="separate"/>
       </w:r>
       <w:r>
         <w:rPr>
           <w:noProof/>
         </w:rPr>
-        <w:t>image, formatted and captioned as a figure.</w:t>
-      </w:r>
-      <w:bookmarkEnd w:id="17"/>
-    </w:p>
-    <w:p>
-      <w:pPr>
-        <w:pStyle w:val="Quote"/>
-      </w:pPr>
-      <w:r>
-        <w:t xml:space="preserve">This sample figure demonstrates the use of an image. Put the image </w:t>
-      </w:r>
-      <w:r>
-        <w:t xml:space="preserve">(or table, or other non-paragraph object) into the flow of the document at an appropriate </w:t>
-      </w:r>
-      <w:r>
-        <w:t>point and</w:t>
-      </w:r>
-      <w:r>
-        <w:t xml:space="preserve"> give it a caption so that it is automatically added to the table of figures when you next ‘update’ it.</w:t>
-      </w:r>
-    </w:p>
-    <w:p>
-      <w:r>
-        <w:t>[Enter text here]</w:t>
-      </w:r>
-      <w:r>
-        <w:br w:type="page"/>
+        <w:t>4</w:t>
+      </w:r>
+      <w:r>
+        <w:fldChar w:fldCharType="end"/>
+      </w:r>
+      <w:r>
+        <w:t xml:space="preserve"> </w:t>
+      </w:r>
+      <w:r>
+        <w:t xml:space="preserve">Navier-Stokes Equations </w:t>
+      </w:r>
+      <w:sdt>
+        <w:sdtPr>
+          <w:id w:val="1486823824"/>
+          <w:citation/>
+        </w:sdtPr>
+        <w:sdtEndPr>
+          <w:rPr>
+            <w:highlight w:val="yellow"/>
+          </w:rPr>
+        </w:sdtEndPr>
+        <w:sdtContent>
+          <w:r>
+            <w:rPr>
+              <w:highlight w:val="yellow"/>
+            </w:rPr>
+            <w:fldChar w:fldCharType="begin"/>
+          </w:r>
+          <w:r>
+            <w:rPr>
+              <w:highlight w:val="yellow"/>
+              <w:lang w:val="en-US"/>
+            </w:rPr>
+            <w:instrText xml:space="preserve"> CITATION NAS21 \l 1033 </w:instrText>
+          </w:r>
+          <w:r>
+            <w:rPr>
+              <w:highlight w:val="yellow"/>
+            </w:rPr>
+            <w:fldChar w:fldCharType="separate"/>
+          </w:r>
+          <w:r>
+            <w:rPr>
+              <w:noProof/>
+              <w:highlight w:val="yellow"/>
+              <w:lang w:val="en-US"/>
+            </w:rPr>
+            <w:t>(NASA, 2021)</w:t>
+          </w:r>
+          <w:r>
+            <w:rPr>
+              <w:highlight w:val="yellow"/>
+            </w:rPr>
+            <w:fldChar w:fldCharType="end"/>
+          </w:r>
+        </w:sdtContent>
+      </w:sdt>
+      <w:bookmarkEnd w:id="25"/>
+    </w:p>
+    <w:p>
+      <w:pPr>
+        <w:pStyle w:val="Heading2"/>
+      </w:pPr>
+      <w:bookmarkStart w:id="26" w:name="_Toc222839141"/>
+      <w:r>
+        <w:t>CFD applications to general Software Engineering</w:t>
+      </w:r>
+      <w:bookmarkEnd w:id="26"/>
+    </w:p>
+    <w:p>
+      <w:pPr>
+        <w:keepNext/>
+      </w:pPr>
+      <w:r>
+        <w:t xml:space="preserve">CFD modelling touches on a few key concepts that can be applied to other areas of software engineering. As CFD is very computationally heavy, we can learn from the necessarily time efficient nature of CFD projects to ensure we build </w:t>
+      </w:r>
+      <w:r>
+        <w:t xml:space="preserve">systems that have lower computational </w:t>
+      </w:r>
+      <w:r>
+        <w:t>overhead.</w:t>
+      </w:r>
+      <w:r>
+        <w:t xml:space="preserve"> </w:t>
+      </w:r>
+      <w:r>
+        <w:t>Data driven decision philosophy is also an important concept in CFD, as the systems are designed to measure the simulated outcome of a given setup, we can use this design – test – improve cycle to apply to project</w:t>
+      </w:r>
+      <w:r>
+        <w:t>s</w:t>
+      </w:r>
+      <w:r>
+        <w:t xml:space="preserve"> in any software program we create</w:t>
+      </w:r>
+      <w:r>
+        <w:t xml:space="preserve"> to ensure a proper validation process</w:t>
+      </w:r>
+      <w:r>
+        <w:t xml:space="preserve"> with</w:t>
+      </w:r>
+      <w:r>
+        <w:t xml:space="preserve"> a</w:t>
+      </w:r>
+      <w:r>
+        <w:t xml:space="preserve"> </w:t>
+      </w:r>
+      <w:r>
+        <w:t>test-driven</w:t>
+      </w:r>
+      <w:r>
+        <w:t xml:space="preserve"> production</w:t>
+      </w:r>
+      <w:r>
+        <w:t>.</w:t>
       </w:r>
     </w:p>
     <w:p>
       <w:pPr>
         <w:pStyle w:val="Heading1"/>
       </w:pPr>
-      <w:bookmarkStart w:id="18" w:name="_Toc221287555"/>
+      <w:bookmarkStart w:id="27" w:name="_Toc222839142"/>
       <w:r>
         <w:lastRenderedPageBreak/>
         <w:t>Prior Approaches</w:t>
       </w:r>
-      <w:bookmarkEnd w:id="18"/>
+      <w:bookmarkEnd w:id="27"/>
     </w:p>
     <w:p>
       <w:pPr>
@@ -3057,7 +4451,15 @@
         <w:t>approach</w:t>
       </w:r>
       <w:r>
-        <w:t>es that others have used to address the challenge you are interested in, or similar ones. Ideally you would find multiple approaches so that you can compare and contrast them, but you can concentrate on one strategy if you can find enough to say about it.</w:t>
+        <w:t xml:space="preserve">es that others have used to address the challenge you are interested in, or similar ones. Ideally you would find multiple approaches so that you can </w:t>
+      </w:r>
+      <w:proofErr w:type="gramStart"/>
+      <w:r>
+        <w:t>compare and contrast</w:t>
+      </w:r>
+      <w:proofErr w:type="gramEnd"/>
+      <w:r>
+        <w:t xml:space="preserve"> them, but you can concentrate on one strategy if you can find enough to say about it.</w:t>
       </w:r>
     </w:p>
     <w:p>
@@ -3065,7 +4467,15 @@
         <w:pStyle w:val="Quote"/>
       </w:pPr>
       <w:r>
-        <w:t>Your sources should be knowledgeable and reliable ones where possible, such as developer logs, but tutorials can be useful (especially if you can compare them or have time to try them to test how well they work). Player speculation as to how a feature is implemented can be useful, but should not be your main resource.</w:t>
+        <w:t xml:space="preserve">Your sources should be knowledgeable and reliable ones where possible, such as developer logs, but tutorials can be useful (especially if you can compare them or have time to try them to test how well they work). Player speculation as to how a feature is implemented can be </w:t>
+      </w:r>
+      <w:proofErr w:type="gramStart"/>
+      <w:r>
+        <w:t>useful, but</w:t>
+      </w:r>
+      <w:proofErr w:type="gramEnd"/>
+      <w:r>
+        <w:t xml:space="preserve"> should not be your main resource.</w:t>
       </w:r>
     </w:p>
     <w:p>
@@ -3081,7 +4491,15 @@
         <w:pStyle w:val="Quote"/>
       </w:pPr>
       <w:r>
-        <w:t>Try to understand (and highlight to the reader as appropriate) how these approaches work, and what makes them suitable for use in the context you’ve established. One aim of this section is for you to develop your understanding of these techniques, and demonstrate it to a deep level.</w:t>
+        <w:t xml:space="preserve">Try to understand (and highlight to the reader as appropriate) how these approaches work, and what makes them suitable for use in the context you’ve established. One aim of this section is for you to develop your understanding of these </w:t>
+      </w:r>
+      <w:proofErr w:type="gramStart"/>
+      <w:r>
+        <w:t>techniques, and</w:t>
+      </w:r>
+      <w:proofErr w:type="gramEnd"/>
+      <w:r>
+        <w:t xml:space="preserve"> demonstrate it to a deep level.</w:t>
       </w:r>
     </w:p>
     <w:p>
@@ -3089,7 +4507,15 @@
         <w:pStyle w:val="Quote"/>
       </w:pPr>
       <w:r>
-        <w:t>As you explore one or more approaches, you may comment on how effective they might be for you, but note that there are words available for that in the Recommendations section.</w:t>
+        <w:t xml:space="preserve">As you explore one or more approaches, you may comment on how effective they might be for </w:t>
+      </w:r>
+      <w:proofErr w:type="gramStart"/>
+      <w:r>
+        <w:t>you, but</w:t>
+      </w:r>
+      <w:proofErr w:type="gramEnd"/>
+      <w:r>
+        <w:t xml:space="preserve"> note that there are words available for that in the Recommendations section.</w:t>
       </w:r>
     </w:p>
     <w:p>
@@ -3106,10 +4532,18 @@
         <w:t xml:space="preserve"> (with ‘heading 2’)</w:t>
       </w:r>
       <w:r>
-        <w:t xml:space="preserve">, such as your methods for key areas of the project, or for particular </w:t>
-      </w:r>
-      <w:r>
-        <w:t>aspects of development</w:t>
+        <w:t xml:space="preserve">, such as your methods for key areas of the project, or for </w:t>
+      </w:r>
+      <w:proofErr w:type="gramStart"/>
+      <w:r>
+        <w:t xml:space="preserve">particular </w:t>
+      </w:r>
+      <w:r>
+        <w:t>aspects</w:t>
+      </w:r>
+      <w:proofErr w:type="gramEnd"/>
+      <w:r>
+        <w:t xml:space="preserve"> of development</w:t>
       </w:r>
       <w:r>
         <w:t>.</w:t>
@@ -3150,56 +4584,260 @@
     </w:p>
     <w:p>
       <w:r>
-        <w:t>[Enter text here]</w:t>
-      </w:r>
-    </w:p>
-    <w:p>
-      <w:pPr>
-        <w:pStyle w:val="Quote"/>
-      </w:pPr>
+        <w:t xml:space="preserve">There are </w:t>
+      </w:r>
+      <w:r>
+        <w:t>two</w:t>
+      </w:r>
+      <w:r>
+        <w:t xml:space="preserve"> </w:t>
+      </w:r>
+      <w:r>
+        <w:t>unique</w:t>
+      </w:r>
+      <w:r>
+        <w:t xml:space="preserve"> approaches when creatin</w:t>
+      </w:r>
+      <w:r>
+        <w:t>g</w:t>
+      </w:r>
+      <w:r>
+        <w:t xml:space="preserve"> a CFD model to simulate fluid behaviour. The Eulerian model</w:t>
+      </w:r>
+      <w:r>
+        <w:t xml:space="preserve"> looks at specific locations that the fluid moves through to track the changes, this could be visualised as sitting on the bank of a river and watching the water pass the fixed location, whereas the Lagrangian model follows and individual parcel of fluid as it moves through space and time, this can be visualised as sitting in a boat and drifting down a river. This report will investigate how each approach has a different solution for each of the problems posed by CFD.</w:t>
+      </w:r>
     </w:p>
     <w:p>
       <w:pPr>
         <w:pStyle w:val="Heading2"/>
       </w:pPr>
-      <w:bookmarkStart w:id="19" w:name="_Toc221287556"/>
+      <w:bookmarkStart w:id="28" w:name="_Toc222839143"/>
       <w:r>
         <w:t>Eulerian Approach</w:t>
       </w:r>
-      <w:bookmarkEnd w:id="19"/>
+      <w:bookmarkEnd w:id="28"/>
+      <w:r>
+        <w:t xml:space="preserve"> </w:t>
+      </w:r>
+    </w:p>
+    <w:p>
+      <w:r>
+        <w:t>As mentioned previously, the Eulerian approach focuses on observing how fluid properties change at fixed locations in space, rather than tracking individual particles as they move. In this framework, variables such as velocity, pressure, density and temperature are defined as continuous fields within a grid of control volumes. The Navier–Stokes equations are then solved at each grid cell over time. Because the equations are applied to the mesh rather than to individual particles, the overall computational cost depends primarily on mesh resolution.</w:t>
+      </w:r>
+    </w:p>
+    <w:p>
+      <w:bookmarkStart w:id="29" w:name="_Toc222839144"/>
+      <w:r>
+        <w:t xml:space="preserve">In multiphase modelling, this approach is often implemented using </w:t>
+      </w:r>
+      <w:r>
+        <w:t>a</w:t>
+      </w:r>
+      <w:r>
+        <w:t xml:space="preserve"> Euler–Euler formulation. In this model both gas and solid phases are treated as interpenetrating continua rather than as separate </w:t>
+      </w:r>
+      <w:r>
+        <w:lastRenderedPageBreak/>
+        <w:t xml:space="preserve">discrete particles. Instead of tracking each particle individually, the dispersed phase is represented using averaged properties such as volume fraction and momentum exchange terms. Wang et al. </w:t>
+      </w:r>
+      <w:sdt>
+        <w:sdtPr>
+          <w:id w:val="-790980604"/>
+          <w:citation/>
+        </w:sdtPr>
+        <w:sdtContent>
+          <w:r>
+            <w:fldChar w:fldCharType="begin"/>
+          </w:r>
+          <w:r>
+            <w:rPr>
+              <w:lang w:val="en-US"/>
+            </w:rPr>
+            <w:instrText xml:space="preserve">CITATION Wan17 \n  \l 1033 </w:instrText>
+          </w:r>
+          <w:r>
+            <w:fldChar w:fldCharType="separate"/>
+          </w:r>
+          <w:r>
+            <w:rPr>
+              <w:noProof/>
+              <w:lang w:val="en-US"/>
+            </w:rPr>
+            <w:t>(</w:t>
+          </w:r>
+          <w:r>
+            <w:rPr>
+              <w:noProof/>
+              <w:highlight w:val="yellow"/>
+              <w:lang w:val="en-US"/>
+            </w:rPr>
+            <w:t>2017</w:t>
+          </w:r>
+          <w:r>
+            <w:rPr>
+              <w:noProof/>
+              <w:lang w:val="en-US"/>
+            </w:rPr>
+            <w:t>)</w:t>
+          </w:r>
+          <w:r>
+            <w:fldChar w:fldCharType="end"/>
+          </w:r>
+        </w:sdtContent>
+      </w:sdt>
+      <w:r>
+        <w:rPr>
+          <w:b/>
+          <w:bCs/>
+        </w:rPr>
+        <w:t xml:space="preserve"> </w:t>
+      </w:r>
+      <w:r>
+        <w:t>explain that this method is particularly suitable for dense gas–solid flows where the number of particles would make individual tracking computationally impractical. By representing the solid phase statistically, the system can model large-scale interactions without resolving every collision.</w:t>
+      </w:r>
+    </w:p>
+    <w:p>
+      <w:r>
+        <w:t>One of the main advantages highlighted by Wang et al.</w:t>
+      </w:r>
+      <w:r>
+        <w:t xml:space="preserve"> </w:t>
+      </w:r>
+      <w:sdt>
+        <w:sdtPr>
+          <w:id w:val="-484160930"/>
+          <w:citation/>
+        </w:sdtPr>
+        <w:sdtContent>
+          <w:r>
+            <w:fldChar w:fldCharType="begin"/>
+          </w:r>
+          <w:r>
+            <w:rPr>
+              <w:lang w:val="en-US"/>
+            </w:rPr>
+            <w:instrText xml:space="preserve">CITATION Wan17 \n  \l 1033 </w:instrText>
+          </w:r>
+          <w:r>
+            <w:fldChar w:fldCharType="separate"/>
+          </w:r>
+          <w:r>
+            <w:rPr>
+              <w:noProof/>
+              <w:lang w:val="en-US"/>
+            </w:rPr>
+            <w:t>(</w:t>
+          </w:r>
+          <w:r>
+            <w:rPr>
+              <w:noProof/>
+              <w:highlight w:val="yellow"/>
+              <w:lang w:val="en-US"/>
+            </w:rPr>
+            <w:t>2017</w:t>
+          </w:r>
+          <w:r>
+            <w:rPr>
+              <w:noProof/>
+              <w:lang w:val="en-US"/>
+            </w:rPr>
+            <w:t>)</w:t>
+          </w:r>
+          <w:r>
+            <w:fldChar w:fldCharType="end"/>
+          </w:r>
+        </w:sdtContent>
+      </w:sdt>
+      <w:r>
+        <w:t xml:space="preserve"> is scalability. Because the number of equations solved is determined by the number of grid cells rather than the number of particles, Eulerian models are more efficient for industrial-scale systems such as pneumatic conveying. This makes the approach more appropriate for modelling large domains where capturing overall flow behaviour is more important than resolving individual particle trajectories.</w:t>
+      </w:r>
+    </w:p>
+    <w:p>
+      <w:pPr>
+        <w:pStyle w:val="Heading2"/>
+      </w:pPr>
+      <w:r>
+        <w:t>Lagrangian Approach</w:t>
+      </w:r>
+      <w:bookmarkEnd w:id="29"/>
+    </w:p>
+    <w:p>
+      <w:r>
+        <w:t xml:space="preserve">The Lagrangian method in CFD analyses fluid motion by tracking individual particles as the move through space and time. Instead of focusing on fixed locations, it </w:t>
+      </w:r>
+      <w:r>
+        <w:t>focuses</w:t>
+      </w:r>
+      <w:r>
+        <w:t xml:space="preserve"> on following each particle and computes how its </w:t>
+      </w:r>
+      <w:r>
+        <w:t>velocity, position, and density change along its trajectory. This method is particularly useful for modelling particle transport, spra</w:t>
+      </w:r>
+      <w:r>
+        <w:t>ys, and multiphase flows. It provides detailed path information but can become computationally intensive for large fluid systems.</w:t>
+      </w:r>
+    </w:p>
+    <w:p>
+      <w:pPr>
+        <w:pStyle w:val="Heading2"/>
+      </w:pPr>
+      <w:bookmarkStart w:id="30" w:name="_Toc222839145"/>
+      <w:r>
+        <w:t>Lagrangian-Eulerian</w:t>
+      </w:r>
+      <w:r>
+        <w:t xml:space="preserve"> Approach</w:t>
+      </w:r>
+      <w:bookmarkEnd w:id="30"/>
+    </w:p>
+    <w:p>
+      <w:pPr>
+        <w:rPr>
+          <w:color w:val="EE0000"/>
+        </w:rPr>
+      </w:pPr>
+      <w:r>
+        <w:rPr>
+          <w:color w:val="EE0000"/>
+        </w:rPr>
+        <w:t>CFD-DEM model</w:t>
+      </w:r>
+    </w:p>
+    <w:p>
+      <w:r>
+        <w:t xml:space="preserve">The Lagrangian–Eulerian approach in Computational Fluid Dynamics (CFD) combines both fixed spatial observation and particle tracking methods. The fluid phase is typically solved using the Eulerian framework on a grid, while discrete particles, droplets, or bubbles are tracked individually using the Lagrangian method. This hybrid technique is especially effective for </w:t>
+      </w:r>
+      <w:r>
+        <w:t>modelling</w:t>
+      </w:r>
+      <w:r>
+        <w:t xml:space="preserve"> multiphase flows, sprays, and particle-laden systems. It captures detailed particle </w:t>
+      </w:r>
+      <w:r>
+        <w:t>behaviour</w:t>
+      </w:r>
+      <w:r>
+        <w:t xml:space="preserve"> while efficiently resolving the surrounding continuous fluid field.</w:t>
+      </w:r>
     </w:p>
     <w:p/>
     <w:p>
-      <w:pPr>
-        <w:pStyle w:val="Heading2"/>
-      </w:pPr>
-      <w:bookmarkStart w:id="20" w:name="_Toc221287557"/>
-      <w:r>
-        <w:t>Lagrangian Approach</w:t>
-      </w:r>
-      <w:bookmarkEnd w:id="20"/>
-    </w:p>
-    <w:p/>
-    <w:p>
-      <w:pPr>
-        <w:pStyle w:val="Heading2"/>
-      </w:pPr>
-      <w:bookmarkStart w:id="21" w:name="_Toc221287558"/>
-      <w:r>
-        <w:t>Eulerian-Lagrange Approach</w:t>
-      </w:r>
-      <w:bookmarkEnd w:id="21"/>
+      <w:r>
+        <w:t>https://web.archive.org/web/20140725014123/https://docs.nvidia.com/cuda/samples/5_Simulations/particles/doc/particles.pdf</w:t>
+      </w:r>
     </w:p>
     <w:p>
       <w:pPr>
         <w:pStyle w:val="Heading1"/>
       </w:pPr>
-      <w:bookmarkStart w:id="22" w:name="_Toc221287559"/>
+      <w:bookmarkStart w:id="31" w:name="_Toc222839146"/>
       <w:r>
         <w:lastRenderedPageBreak/>
         <w:t>Recommendations</w:t>
       </w:r>
-      <w:bookmarkEnd w:id="22"/>
+      <w:bookmarkEnd w:id="31"/>
     </w:p>
     <w:p>
       <w:pPr>
@@ -3226,7 +4864,15 @@
         <w:t xml:space="preserve">this major section to </w:t>
       </w:r>
       <w:r>
-        <w:t>set out the your findings, in the form of recommendations you could use or give your reader. Remember the original simulated goal of a senior coworker asking you to find out more about the technique: this is your opportunity to share what you’ve found.</w:t>
+        <w:t xml:space="preserve">set out </w:t>
+      </w:r>
+      <w:proofErr w:type="gramStart"/>
+      <w:r>
+        <w:t>the your</w:t>
+      </w:r>
+      <w:proofErr w:type="gramEnd"/>
+      <w:r>
+        <w:t xml:space="preserve"> findings, in the form of recommendations you could use or give your reader. Remember the original simulated goal of a senior coworker asking you to find out more about the technique: this is your opportunity to share what you’ve found.</w:t>
       </w:r>
     </w:p>
     <w:p>
@@ -3269,7 +4915,23 @@
         <w:pStyle w:val="Quote"/>
       </w:pPr>
       <w:r>
-        <w:t>You probably don’t need any new sources here, and although you should still aim for an impartial and evidence-led style, this section gives an opportunity for you to show more of your own judgement and technical decision-making, rather than restricting yourself to directly-sourced information. Refer to previous sections, but try not to repeat yourself; the word count here may be challenging.</w:t>
+        <w:t xml:space="preserve">You probably don’t need any new sources here, and although you should still aim for an impartial and evidence-led style, this section gives an opportunity for you to show more of your own judgement and technical decision-making, rather than restricting yourself to </w:t>
+      </w:r>
+      <w:proofErr w:type="gramStart"/>
+      <w:r>
+        <w:t>directly-sourced</w:t>
+      </w:r>
+      <w:proofErr w:type="gramEnd"/>
+      <w:r>
+        <w:t xml:space="preserve"> information. Refer to previous </w:t>
+      </w:r>
+      <w:proofErr w:type="gramStart"/>
+      <w:r>
+        <w:t>sections, but</w:t>
+      </w:r>
+      <w:proofErr w:type="gramEnd"/>
+      <w:r>
+        <w:t xml:space="preserve"> try not to repeat yourself; the word count here may be challenging.</w:t>
       </w:r>
     </w:p>
     <w:p>
@@ -3295,8 +4957,21 @@
       <w:r>
         <w:t xml:space="preserve">approaches involve </w:t>
       </w:r>
-      <w:r>
-        <w:t xml:space="preserve">to support the reader, but </w:t>
+      <w:proofErr w:type="gramStart"/>
+      <w:r>
+        <w:t>to support</w:t>
+      </w:r>
+      <w:proofErr w:type="gramEnd"/>
+      <w:r>
+        <w:t xml:space="preserve"> the </w:t>
+      </w:r>
+      <w:proofErr w:type="gramStart"/>
+      <w:r>
+        <w:t>reader, but</w:t>
+      </w:r>
+      <w:proofErr w:type="gramEnd"/>
+      <w:r>
+        <w:t xml:space="preserve"> </w:t>
       </w:r>
       <w:r>
         <w:t xml:space="preserve">will get most </w:t>
@@ -3357,49 +5032,61 @@
       <w:pPr>
         <w:pStyle w:val="Heading2"/>
       </w:pPr>
+      <w:bookmarkStart w:id="32" w:name="_Toc222839147"/>
       <w:r>
         <w:t>Implementation</w:t>
       </w:r>
+      <w:bookmarkEnd w:id="32"/>
     </w:p>
     <w:p>
       <w:pPr>
         <w:pStyle w:val="Heading3"/>
       </w:pPr>
+      <w:bookmarkStart w:id="33" w:name="_Toc222839148"/>
       <w:r>
         <w:t>Particle settings</w:t>
       </w:r>
+      <w:bookmarkEnd w:id="33"/>
     </w:p>
     <w:p>
       <w:pPr>
         <w:pStyle w:val="Heading3"/>
       </w:pPr>
+      <w:bookmarkStart w:id="34" w:name="_Toc222839149"/>
       <w:r>
         <w:t>Particle spawner</w:t>
       </w:r>
+      <w:bookmarkEnd w:id="34"/>
     </w:p>
     <w:p>
       <w:pPr>
         <w:pStyle w:val="Heading3"/>
       </w:pPr>
+      <w:bookmarkStart w:id="35" w:name="_Toc222839150"/>
       <w:r>
         <w:t>Pressure</w:t>
       </w:r>
+      <w:bookmarkEnd w:id="35"/>
     </w:p>
     <w:p>
       <w:pPr>
         <w:pStyle w:val="Heading3"/>
       </w:pPr>
+      <w:bookmarkStart w:id="36" w:name="_Toc222839151"/>
       <w:r>
         <w:t>Viscosity</w:t>
       </w:r>
+      <w:bookmarkEnd w:id="36"/>
     </w:p>
     <w:p>
       <w:pPr>
         <w:pStyle w:val="Heading3"/>
       </w:pPr>
+      <w:bookmarkStart w:id="37" w:name="_Toc222839152"/>
       <w:r>
         <w:t>Surface tension</w:t>
       </w:r>
+      <w:bookmarkEnd w:id="37"/>
     </w:p>
     <w:p/>
     <w:p/>
@@ -3419,7 +5106,7 @@
       <w:pPr>
         <w:pStyle w:val="Heading1"/>
       </w:pPr>
-      <w:bookmarkStart w:id="23" w:name="_Toc221287560"/>
+      <w:bookmarkStart w:id="38" w:name="_Toc222839153"/>
       <w:r>
         <w:lastRenderedPageBreak/>
         <w:t xml:space="preserve">Conclusion and </w:t>
@@ -3427,9 +5114,9 @@
       <w:r>
         <w:t>Reflection</w:t>
       </w:r>
-      <w:bookmarkEnd w:id="23"/>
-    </w:p>
-    <w:bookmarkEnd w:id="11"/>
+      <w:bookmarkEnd w:id="38"/>
+    </w:p>
+    <w:bookmarkEnd w:id="12"/>
     <w:p>
       <w:pPr>
         <w:pStyle w:val="Quote"/>
@@ -3506,7 +5193,15 @@
         <w:pStyle w:val="Quote"/>
       </w:pPr>
       <w:r>
-        <w:t>In the reflection in particular, try to understand the strengths/challenges well enough to start a concrete plan for retaining/correcting them next time. Forming such a plan will be the biggest benefit for your next project, and showing the reader key details here will earn the best marks for this criterion. Try not to dwell on circumstances beyond your control.</w:t>
+        <w:t xml:space="preserve">In the </w:t>
+      </w:r>
+      <w:proofErr w:type="gramStart"/>
+      <w:r>
+        <w:t>reflection in particular, try</w:t>
+      </w:r>
+      <w:proofErr w:type="gramEnd"/>
+      <w:r>
+        <w:t xml:space="preserve"> to understand the strengths/challenges well enough to start a concrete plan for retaining/correcting them next time. Forming such a plan will be the biggest benefit for your next project, and showing the reader key details here will earn the best marks for this criterion. Try not to dwell on circumstances beyond your control.</w:t>
       </w:r>
     </w:p>
     <w:p>
@@ -3531,6 +5226,21 @@
     <w:p/>
     <w:p/>
     <w:p>
+      <w:r>
+        <w:t>In conclusion</w:t>
+      </w:r>
+      <w:r>
+        <w:t xml:space="preserve">, CFD method selection represents a trade-off between accuracy and computational efficiency, with Euler–Euler models favouring scalability and </w:t>
+      </w:r>
+      <w:r>
+        <w:t>Lagrangian</w:t>
+      </w:r>
+      <w:r>
+        <w:t xml:space="preserve"> prioritising detailed physical representation at higher computational cost.</w:t>
+      </w:r>
+    </w:p>
+    <w:p/>
+    <w:p>
       <w:pPr>
         <w:suppressAutoHyphens w:val="0"/>
       </w:pPr>
@@ -3542,75 +5252,11 @@
       <w:pPr>
         <w:pStyle w:val="Heading1"/>
       </w:pPr>
-      <w:bookmarkStart w:id="24" w:name="_Toc221287561"/>
-      <w:r>
+      <w:r>
+        <w:rPr>
+          <w:noProof/>
+        </w:rPr>
         <w:lastRenderedPageBreak/>
-        <w:t>References</w:t>
-      </w:r>
-      <w:bookmarkEnd w:id="24"/>
-    </w:p>
-    <w:p>
-      <w:pPr>
-        <w:pStyle w:val="Quote"/>
-        <w:spacing w:after="120" w:line="240" w:lineRule="auto"/>
-      </w:pPr>
-      <w:r>
-        <w:t xml:space="preserve">Use this section to </w:t>
-      </w:r>
-      <w:r>
-        <w:t xml:space="preserve">list your references, including </w:t>
-      </w:r>
-      <w:r>
-        <w:t xml:space="preserve">tutorials you </w:t>
-      </w:r>
-      <w:r>
-        <w:t xml:space="preserve">may </w:t>
-      </w:r>
-      <w:r>
-        <w:t>have quoted code</w:t>
-      </w:r>
-      <w:r>
-        <w:t xml:space="preserve"> from</w:t>
-      </w:r>
-      <w:r>
-        <w:t>.</w:t>
-      </w:r>
-      <w:r>
-        <w:t xml:space="preserve"> External assets should be listed in the next section.</w:t>
-      </w:r>
-    </w:p>
-    <w:p>
-      <w:pPr>
-        <w:pStyle w:val="Quote"/>
-        <w:spacing w:after="120" w:line="240" w:lineRule="auto"/>
-      </w:pPr>
-      <w:r>
-        <w:t>U</w:t>
-      </w:r>
-      <w:r>
-        <w:t xml:space="preserve">se </w:t>
-      </w:r>
-      <w:r>
-        <w:t>CTR</w:t>
-      </w:r>
-      <w:r>
-        <w:t xml:space="preserve"> Harvard </w:t>
-      </w:r>
-      <w:r>
-        <w:t>r</w:t>
-      </w:r>
-      <w:r>
-        <w:t>eferencing</w:t>
-      </w:r>
-      <w:r>
-        <w:t>.</w:t>
-      </w:r>
-    </w:p>
-    <w:p>
-      <w:r>
-        <w:rPr>
-          <w:noProof/>
-        </w:rPr>
         <mc:AlternateContent>
           <mc:Choice Requires="wps">
             <w:drawing>
@@ -3663,7 +5309,7 @@
                             </w:r>
                           </w:p>
                           <w:p>
-                            <w:hyperlink r:id="rId14" w:history="1">
+                            <w:hyperlink r:id="rId16" w:history="1">
                               <w:r>
                                 <w:rPr>
                                   <w:rStyle w:val="Hyperlink"/>
@@ -3686,7 +5332,7 @@
                             </w:r>
                           </w:p>
                           <w:p>
-                            <w:hyperlink r:id="rId15" w:history="1">
+                            <w:hyperlink r:id="rId17" w:history="1">
                               <w:r>
                                 <w:rPr>
                                   <w:rStyle w:val="Hyperlink"/>
@@ -3701,7 +5347,7 @@
                             </w:r>
                           </w:p>
                           <w:p>
-                            <w:hyperlink r:id="rId16" w:history="1">
+                            <w:hyperlink r:id="rId18" w:history="1">
                               <w:r>
                                 <w:rPr>
                                   <w:rStyle w:val="Hyperlink"/>
@@ -3716,7 +5362,7 @@
                             </w:r>
                           </w:p>
                           <w:p>
-                            <w:hyperlink r:id="rId17" w:history="1">
+                            <w:hyperlink r:id="rId19" w:history="1">
                               <w:r>
                                 <w:rPr>
                                   <w:rStyle w:val="Hyperlink"/>
@@ -3731,7 +5377,7 @@
                             </w:r>
                           </w:p>
                           <w:p>
-                            <w:hyperlink r:id="rId18" w:history="1">
+                            <w:hyperlink r:id="rId20" w:history="1">
                               <w:r>
                                 <w:rPr>
                                   <w:rStyle w:val="Hyperlink"/>
@@ -3746,7 +5392,7 @@
                             </w:r>
                           </w:p>
                           <w:p>
-                            <w:hyperlink r:id="rId19" w:anchor="featured-authors" w:history="1">
+                            <w:hyperlink r:id="rId21" w:anchor="featured-authors" w:history="1">
                               <w:r>
                                 <w:rPr>
                                   <w:rStyle w:val="Hyperlink"/>
@@ -3761,7 +5407,7 @@
                             </w:r>
                           </w:p>
                           <w:p>
-                            <w:hyperlink r:id="rId20" w:history="1">
+                            <w:hyperlink r:id="rId22" w:history="1">
                               <w:r>
                                 <w:rPr>
                                   <w:rStyle w:val="Hyperlink"/>
@@ -3770,6 +5416,13 @@
                               </w:r>
                             </w:hyperlink>
                           </w:p>
+                          <w:p/>
+                          <w:p>
+                            <w:r>
+                              <w:t>https://www.youtube.com/watch?v=BgLTDT03QtU</w:t>
+                            </w:r>
+                          </w:p>
+                          <w:p/>
                           <w:p/>
                         </w:txbxContent>
                       </wps:txbx>
@@ -3803,7 +5456,7 @@
                       </w:r>
                     </w:p>
                     <w:p>
-                      <w:hyperlink r:id="rId21" w:history="1">
+                      <w:hyperlink r:id="rId23" w:history="1">
                         <w:r>
                           <w:rPr>
                             <w:rStyle w:val="Hyperlink"/>
@@ -3826,7 +5479,7 @@
                       </w:r>
                     </w:p>
                     <w:p>
-                      <w:hyperlink r:id="rId22" w:history="1">
+                      <w:hyperlink r:id="rId24" w:history="1">
                         <w:r>
                           <w:rPr>
                             <w:rStyle w:val="Hyperlink"/>
@@ -3841,7 +5494,7 @@
                       </w:r>
                     </w:p>
                     <w:p>
-                      <w:hyperlink r:id="rId23" w:history="1">
+                      <w:hyperlink r:id="rId25" w:history="1">
                         <w:r>
                           <w:rPr>
                             <w:rStyle w:val="Hyperlink"/>
@@ -3856,7 +5509,7 @@
                       </w:r>
                     </w:p>
                     <w:p>
-                      <w:hyperlink r:id="rId24" w:history="1">
+                      <w:hyperlink r:id="rId26" w:history="1">
                         <w:r>
                           <w:rPr>
                             <w:rStyle w:val="Hyperlink"/>
@@ -3871,7 +5524,7 @@
                       </w:r>
                     </w:p>
                     <w:p>
-                      <w:hyperlink r:id="rId25" w:history="1">
+                      <w:hyperlink r:id="rId27" w:history="1">
                         <w:r>
                           <w:rPr>
                             <w:rStyle w:val="Hyperlink"/>
@@ -3886,7 +5539,7 @@
                       </w:r>
                     </w:p>
                     <w:p>
-                      <w:hyperlink r:id="rId26" w:anchor="featured-authors" w:history="1">
+                      <w:hyperlink r:id="rId28" w:anchor="featured-authors" w:history="1">
                         <w:r>
                           <w:rPr>
                             <w:rStyle w:val="Hyperlink"/>
@@ -3901,7 +5554,7 @@
                       </w:r>
                     </w:p>
                     <w:p>
-                      <w:hyperlink r:id="rId27" w:history="1">
+                      <w:hyperlink r:id="rId29" w:history="1">
                         <w:r>
                           <w:rPr>
                             <w:rStyle w:val="Hyperlink"/>
@@ -3911,6 +5564,13 @@
                       </w:hyperlink>
                     </w:p>
                     <w:p/>
+                    <w:p>
+                      <w:r>
+                        <w:t>https://www.youtube.com/watch?v=BgLTDT03QtU</w:t>
+                      </w:r>
+                    </w:p>
+                    <w:p/>
+                    <w:p/>
                   </w:txbxContent>
                 </v:textbox>
                 <w10:wrap type="square" anchorx="margin"/>
@@ -3919,11 +5579,8 @@
           </mc:Fallback>
         </mc:AlternateContent>
       </w:r>
-      <w:r>
-        <w:t>[Enter text here]</w:t>
-      </w:r>
-    </w:p>
-    <w:bookmarkStart w:id="25" w:name="_Toc221287562" w:displacedByCustomXml="next"/>
+    </w:p>
+    <w:bookmarkStart w:id="39" w:name="_Toc222839155" w:displacedByCustomXml="next"/>
     <w:sdt>
       <w:sdtPr>
         <w:rPr>
@@ -3939,6 +5596,7 @@
           <w:docPartUnique/>
         </w:docPartObj>
       </w:sdtPr>
+      <w:sdtEndPr/>
       <w:sdtContent>
         <w:p>
           <w:pPr>
@@ -3947,13 +5605,14 @@
           <w:r>
             <w:t>References</w:t>
           </w:r>
-          <w:bookmarkEnd w:id="25"/>
+          <w:bookmarkEnd w:id="39"/>
         </w:p>
         <w:sdt>
           <w:sdtPr>
             <w:id w:val="-573587230"/>
             <w:bibliography/>
           </w:sdtPr>
+          <w:sdtEndPr/>
           <w:sdtContent>
             <w:p>
               <w:pPr>
@@ -3973,6 +5632,230 @@
               <w:r>
                 <w:fldChar w:fldCharType="separate"/>
               </w:r>
+              <w:r>
+                <w:rPr>
+                  <w:noProof/>
+                </w:rPr>
+                <w:t xml:space="preserve">Abdelkarim, K., 2025. </w:t>
+              </w:r>
+              <w:r>
+                <w:rPr>
+                  <w:i/>
+                  <w:iCs/>
+                  <w:noProof/>
+                </w:rPr>
+                <w:t xml:space="preserve">Application of Aerospace Aerodynamics and CFD in Optimizing Forumla 1 Car Performance, </w:t>
+              </w:r>
+              <w:r>
+                <w:rPr>
+                  <w:noProof/>
+                </w:rPr>
+                <w:t>Jabriya: Engineering Archive.</w:t>
+              </w:r>
+            </w:p>
+            <w:p>
+              <w:pPr>
+                <w:pStyle w:val="Bibliography"/>
+                <w:rPr>
+                  <w:noProof/>
+                </w:rPr>
+              </w:pPr>
+              <w:r>
+                <w:rPr>
+                  <w:noProof/>
+                </w:rPr>
+                <w:t xml:space="preserve">AM Team, 2018. </w:t>
+              </w:r>
+              <w:r>
+                <w:rPr>
+                  <w:i/>
+                  <w:iCs/>
+                  <w:noProof/>
+                </w:rPr>
+                <w:t xml:space="preserve">Optimal inlet and outlet design was critical for process performance. </w:t>
+              </w:r>
+              <w:r>
+                <w:rPr>
+                  <w:noProof/>
+                </w:rPr>
+                <w:t xml:space="preserve">[Online] </w:t>
+              </w:r>
+              <w:r>
+                <w:rPr>
+                  <w:noProof/>
+                </w:rPr>
+                <w:br/>
+                <w:t xml:space="preserve">Available at: </w:t>
+              </w:r>
+              <w:r>
+                <w:rPr>
+                  <w:noProof/>
+                  <w:u w:val="single"/>
+                </w:rPr>
+                <w:t>https://www.am-team.com/projects/optimal-inlet-and-outlet-design-was-critical-for-process-performance</w:t>
+              </w:r>
+              <w:r>
+                <w:rPr>
+                  <w:noProof/>
+                </w:rPr>
+                <w:br/>
+                <w:t>[Accessed 2024 2 2026].</w:t>
+              </w:r>
+            </w:p>
+            <w:p>
+              <w:pPr>
+                <w:pStyle w:val="Bibliography"/>
+                <w:rPr>
+                  <w:noProof/>
+                </w:rPr>
+              </w:pPr>
+              <w:r>
+                <w:rPr>
+                  <w:noProof/>
+                </w:rPr>
+                <w:t xml:space="preserve">Audenaert, W., 2023. </w:t>
+              </w:r>
+              <w:r>
+                <w:rPr>
+                  <w:i/>
+                  <w:iCs/>
+                  <w:noProof/>
+                </w:rPr>
+                <w:t xml:space="preserve">A unique overview of the application of CFD in the water industry. </w:t>
+              </w:r>
+              <w:r>
+                <w:rPr>
+                  <w:noProof/>
+                </w:rPr>
+                <w:t xml:space="preserve">[Online] </w:t>
+              </w:r>
+              <w:r>
+                <w:rPr>
+                  <w:noProof/>
+                </w:rPr>
+                <w:br/>
+                <w:t xml:space="preserve">Available at: </w:t>
+              </w:r>
+              <w:r>
+                <w:rPr>
+                  <w:noProof/>
+                  <w:u w:val="single"/>
+                </w:rPr>
+                <w:t>https://www.am-team.com/learning-hub/blog/cfd-for-water-sector</w:t>
+              </w:r>
+              <w:r>
+                <w:rPr>
+                  <w:noProof/>
+                </w:rPr>
+                <w:br/>
+                <w:t>[Accessed 23 2 2026].</w:t>
+              </w:r>
+            </w:p>
+            <w:p>
+              <w:pPr>
+                <w:pStyle w:val="Bibliography"/>
+                <w:rPr>
+                  <w:noProof/>
+                </w:rPr>
+              </w:pPr>
+              <w:r>
+                <w:rPr>
+                  <w:noProof/>
+                </w:rPr>
+                <w:t xml:space="preserve">Kenah, S., 2023. </w:t>
+              </w:r>
+              <w:r>
+                <w:rPr>
+                  <w:i/>
+                  <w:iCs/>
+                  <w:noProof/>
+                </w:rPr>
+                <w:t xml:space="preserve">What Are Real-World Applications of Computational Fluid Dynamics?. </w:t>
+              </w:r>
+              <w:r>
+                <w:rPr>
+                  <w:noProof/>
+                </w:rPr>
+                <w:t xml:space="preserve">[Online] </w:t>
+              </w:r>
+              <w:r>
+                <w:rPr>
+                  <w:noProof/>
+                </w:rPr>
+                <w:br/>
+                <w:t xml:space="preserve">Available at: </w:t>
+              </w:r>
+              <w:r>
+                <w:rPr>
+                  <w:noProof/>
+                  <w:u w:val="single"/>
+                </w:rPr>
+                <w:t>https://www.loringengineers.com/news/real-world-applications-of-computational-fluid-dynamics/</w:t>
+              </w:r>
+              <w:r>
+                <w:rPr>
+                  <w:noProof/>
+                </w:rPr>
+                <w:br/>
+                <w:t>[Accessed 23 2 2026].</w:t>
+              </w:r>
+            </w:p>
+            <w:p>
+              <w:pPr>
+                <w:pStyle w:val="Bibliography"/>
+                <w:rPr>
+                  <w:noProof/>
+                </w:rPr>
+              </w:pPr>
+              <w:r>
+                <w:rPr>
+                  <w:noProof/>
+                </w:rPr>
+                <w:t xml:space="preserve">NASA, 2021. </w:t>
+              </w:r>
+              <w:r>
+                <w:rPr>
+                  <w:i/>
+                  <w:iCs/>
+                  <w:noProof/>
+                </w:rPr>
+                <w:t xml:space="preserve">Navier-Stokes Equations. </w:t>
+              </w:r>
+              <w:r>
+                <w:rPr>
+                  <w:noProof/>
+                </w:rPr>
+                <w:t xml:space="preserve">[Online] </w:t>
+              </w:r>
+              <w:r>
+                <w:rPr>
+                  <w:noProof/>
+                </w:rPr>
+                <w:br/>
+                <w:t xml:space="preserve">Available at: </w:t>
+              </w:r>
+              <w:r>
+                <w:rPr>
+                  <w:noProof/>
+                  <w:u w:val="single"/>
+                </w:rPr>
+                <w:t>https://www.grc.nasa.gov/www/k-12/airplane/nseqs.html</w:t>
+              </w:r>
+              <w:r>
+                <w:rPr>
+                  <w:noProof/>
+                </w:rPr>
+                <w:br/>
+                <w:t>[Accessed 24 2 2026].</w:t>
+              </w:r>
+            </w:p>
+            <w:p>
+              <w:pPr>
+                <w:pStyle w:val="Bibliography"/>
+                <w:rPr>
+                  <w:noProof/>
+                </w:rPr>
+              </w:pPr>
               <w:r>
                 <w:rPr>
                   <w:noProof/>
@@ -4038,8 +5921,8 @@
     </w:sdt>
     <w:p/>
     <w:sectPr>
-      <w:headerReference w:type="default" r:id="rId28"/>
-      <w:footerReference w:type="default" r:id="rId29"/>
+      <w:headerReference w:type="default" r:id="rId30"/>
+      <w:footerReference w:type="default" r:id="rId31"/>
       <w:pgSz w:w="11906" w:h="16838"/>
       <w:pgMar w:top="1440" w:right="1440" w:bottom="1440" w:left="1440" w:header="708" w:footer="708" w:gutter="0"/>
       <w:pgNumType w:start="1"/>
@@ -6395,6 +8278,101 @@
     <b:Day>11</b:Day>
     <b:RefOrder>3</b:RefOrder>
   </b:Source>
+  <b:Source>
+    <b:Tag>Abd25</b:Tag>
+    <b:SourceType>Report</b:SourceType>
+    <b:Guid>{20933E40-E7F2-466F-81F3-6A2C7BE2055F}</b:Guid>
+    <b:Author>
+      <b:Author>
+        <b:NameList>
+          <b:Person>
+            <b:Last>Abdelkarim</b:Last>
+            <b:First>Karim</b:First>
+          </b:Person>
+        </b:NameList>
+      </b:Author>
+    </b:Author>
+    <b:Title>Application of Aerospace Aerodynamics and CFD in Optimizing Forumla 1 Car Performance</b:Title>
+    <b:Year>2025</b:Year>
+    <b:City>Jabriya</b:City>
+    <b:Publisher>Engineering Archive</b:Publisher>
+    <b:RefOrder>6</b:RefOrder>
+  </b:Source>
+  <b:Source>
+    <b:Tag>AMT18</b:Tag>
+    <b:SourceType>InternetSite</b:SourceType>
+    <b:Guid>{CE2A2D4D-7686-42D7-9572-49E42DC994E1}</b:Guid>
+    <b:Author>
+      <b:Author>
+        <b:Corporate>AM Team</b:Corporate>
+      </b:Author>
+    </b:Author>
+    <b:Title>Optimal inlet and outlet design was critical for process performance</b:Title>
+    <b:Year>2018</b:Year>
+    <b:YearAccessed>2026</b:YearAccessed>
+    <b:MonthAccessed>2</b:MonthAccessed>
+    <b:DayAccessed>2024</b:DayAccessed>
+    <b:URL>https://www.am-team.com/projects/optimal-inlet-and-outlet-design-was-critical-for-process-performance</b:URL>
+    <b:RefOrder>5</b:RefOrder>
+  </b:Source>
+  <b:Source>
+    <b:Tag>NAS21</b:Tag>
+    <b:SourceType>DocumentFromInternetSite</b:SourceType>
+    <b:Guid>{E21CA710-A77C-4634-AD4B-94275B88AAA4}</b:Guid>
+    <b:Author>
+      <b:Author>
+        <b:Corporate>NASA</b:Corporate>
+      </b:Author>
+    </b:Author>
+    <b:Title>Navier-Stokes Equations</b:Title>
+    <b:Year>2021</b:Year>
+    <b:YearAccessed>2026</b:YearAccessed>
+    <b:MonthAccessed>2</b:MonthAccessed>
+    <b:DayAccessed>24</b:DayAccessed>
+    <b:URL>https://www.grc.nasa.gov/www/k-12/airplane/nseqs.html</b:URL>
+    <b:Month>5</b:Month>
+    <b:Day>13</b:Day>
+    <b:RefOrder>7</b:RefOrder>
+  </b:Source>
+  <b:Source>
+    <b:Tag>RLH</b:Tag>
+    <b:SourceType>InternetSite</b:SourceType>
+    <b:Guid>{D763ECE7-D87B-40FB-B2CD-BA07DF2D8A76}</b:Guid>
+    <b:Title>Real-time Eulerian fluid simulation on a Macbook Air, using GPU shaders</b:Title>
+    <b:Author>
+      <b:Author>
+        <b:NameList>
+          <b:Person>
+            <b:Last>Hugh</b:Last>
+            <b:First>RL</b:First>
+          </b:Person>
+        </b:NameList>
+      </b:Author>
+    </b:Author>
+    <b:Year>2023</b:Year>
+    <b:YearAccessed>2026</b:YearAccessed>
+    <b:MonthAccessed>2</b:MonthAccessed>
+    <b:DayAccessed>25</b:DayAccessed>
+    <b:URL>https://www.youtube.com/watch?v=x6mcua0HOJs</b:URL>
+    <b:RefOrder>8</b:RefOrder>
+  </b:Source>
+  <b:Source>
+    <b:Tag>Con17</b:Tag>
+    <b:SourceType>InternetSite</b:SourceType>
+    <b:Guid>{158CE08B-C206-4DE0-AC01-FE50AED9279A}</b:Guid>
+    <b:Author>
+      <b:Author>
+        <b:Corporate>ConvergeCFD</b:Corporate>
+      </b:Author>
+    </b:Author>
+    <b:Title>Eulerian Multi-Phase</b:Title>
+    <b:Year>2017</b:Year>
+    <b:YearAccessed>2026</b:YearAccessed>
+    <b:MonthAccessed>2</b:MonthAccessed>
+    <b:DayAccessed>25</b:DayAccessed>
+    <b:URL>https://convergecfd.com/benefits/eulerian-multi-phase</b:URL>
+    <b:RefOrder>9</b:RefOrder>
+  </b:Source>
 </b:Sources>
 </file>
 
@@ -6438,7 +8416,7 @@
 </file>
 
 <file path=customXml/itemProps4.xml><?xml version="1.0" encoding="utf-8"?>
-<ds:datastoreItem xmlns:ds="http://schemas.openxmlformats.org/officeDocument/2006/customXml" ds:itemID="{75EBE1B2-8F59-4413-BD76-CD8885D94BEA}">
+<ds:datastoreItem xmlns:ds="http://schemas.openxmlformats.org/officeDocument/2006/customXml" ds:itemID="{E9E99760-C3D3-4F15-8BD7-48F3783CF8A6}">
   <ds:schemaRefs>
     <ds:schemaRef ds:uri="http://schemas.openxmlformats.org/officeDocument/2006/bibliography"/>
   </ds:schemaRefs>

</xml_diff>

<commit_message>
added some notes and a sentence to thee Navier-Stokes equation section
</commit_message>
<xml_diff>
--- a/Technical Development Report.docx
+++ b/Technical Development Report.docx
@@ -2517,7 +2517,7 @@
       <w:r>
         <w:fldChar w:fldCharType="separate"/>
       </w:r>
-      <w:hyperlink w:anchor="_Toc222940983" w:history="1">
+      <w:hyperlink w:anchor="_Toc222949275" w:history="1">
         <w:r>
           <w:rPr>
             <w:rStyle w:val="Hyperlink"/>
@@ -2553,7 +2553,7 @@
             <w:noProof/>
             <w:webHidden/>
           </w:rPr>
-          <w:instrText xml:space="preserve"> PAGEREF _Toc222940983 \h </w:instrText>
+          <w:instrText xml:space="preserve"> PAGEREF _Toc222949275 \h </w:instrText>
         </w:r>
         <w:r>
           <w:rPr>
@@ -2600,28 +2600,13 @@
           <w14:ligatures w14:val="standardContextual"/>
         </w:rPr>
       </w:pPr>
-      <w:hyperlink w:anchor="_Toc222940984" w:history="1">
+      <w:hyperlink w:anchor="_Toc222949276" w:history="1">
         <w:r>
           <w:rPr>
             <w:rStyle w:val="Hyperlink"/>
             <w:noProof/>
           </w:rPr>
-          <w:t>Figure 2 Visualisation of water flows after improving the design using CFD technology (</w:t>
-        </w:r>
-        <w:r>
-          <w:rPr>
-            <w:rStyle w:val="Hyperlink"/>
-            <w:noProof/>
-            <w:highlight w:val="yellow"/>
-          </w:rPr>
-          <w:t>AM Team, 2018</w:t>
-        </w:r>
-        <w:r>
-          <w:rPr>
-            <w:rStyle w:val="Hyperlink"/>
-            <w:noProof/>
-          </w:rPr>
-          <w:t>)</w:t>
+          <w:t>Figure 2 Visualisation of water flows after improving the design using CFD technology (AM Team, 2018)</w:t>
         </w:r>
         <w:r>
           <w:rPr>
@@ -2642,7 +2627,7 @@
             <w:noProof/>
             <w:webHidden/>
           </w:rPr>
-          <w:instrText xml:space="preserve"> PAGEREF _Toc222940984 \h </w:instrText>
+          <w:instrText xml:space="preserve"> PAGEREF _Toc222949276 \h </w:instrText>
         </w:r>
         <w:r>
           <w:rPr>
@@ -2689,28 +2674,13 @@
           <w14:ligatures w14:val="standardContextual"/>
         </w:rPr>
       </w:pPr>
-      <w:hyperlink w:anchor="_Toc222940985" w:history="1">
+      <w:hyperlink w:anchor="_Toc222949277" w:history="1">
         <w:r>
           <w:rPr>
             <w:rStyle w:val="Hyperlink"/>
             <w:noProof/>
           </w:rPr>
-          <w:t xml:space="preserve">Figure 3 Visualisation of pressure distribution and velocity field around the F1 car </w:t>
-        </w:r>
-        <w:r>
-          <w:rPr>
-            <w:rStyle w:val="Hyperlink"/>
-            <w:noProof/>
-            <w:highlight w:val="yellow"/>
-          </w:rPr>
-          <w:t>(Abdelkarim, 2025</w:t>
-        </w:r>
-        <w:r>
-          <w:rPr>
-            <w:rStyle w:val="Hyperlink"/>
-            <w:noProof/>
-          </w:rPr>
-          <w:t>)</w:t>
+          <w:t>Figure 3 Visualisation of pressure distribution and velocity field around the F1 car (Abdelkarim, 2025)</w:t>
         </w:r>
         <w:r>
           <w:rPr>
@@ -2731,7 +2701,7 @@
             <w:noProof/>
             <w:webHidden/>
           </w:rPr>
-          <w:instrText xml:space="preserve"> PAGEREF _Toc222940985 \h </w:instrText>
+          <w:instrText xml:space="preserve"> PAGEREF _Toc222949277 \h </w:instrText>
         </w:r>
         <w:r>
           <w:rPr>
@@ -2778,27 +2748,13 @@
           <w14:ligatures w14:val="standardContextual"/>
         </w:rPr>
       </w:pPr>
-      <w:hyperlink w:anchor="_Toc222940986" w:history="1">
+      <w:hyperlink w:anchor="_Toc222949278" w:history="1">
         <w:r>
           <w:rPr>
             <w:rStyle w:val="Hyperlink"/>
             <w:noProof/>
           </w:rPr>
-          <w:t>Figure 4</w:t>
-        </w:r>
-        <w:r>
-          <w:rPr>
-            <w:rStyle w:val="Hyperlink"/>
-            <w:noProof/>
-          </w:rPr>
-          <w:t xml:space="preserve"> </w:t>
-        </w:r>
-        <w:r>
-          <w:rPr>
-            <w:rStyle w:val="Hyperlink"/>
-            <w:noProof/>
-          </w:rPr>
-          <w:t xml:space="preserve">Navier-Stokes Equations </w:t>
+          <w:t xml:space="preserve">Figure 4 Navier-Stokes Equations </w:t>
         </w:r>
         <w:r>
           <w:rPr>
@@ -2828,7 +2784,7 @@
             <w:noProof/>
             <w:webHidden/>
           </w:rPr>
-          <w:instrText xml:space="preserve"> PAGEREF _Toc222940986 \h </w:instrText>
+          <w:instrText xml:space="preserve"> PAGEREF _Toc222949278 \h </w:instrText>
         </w:r>
         <w:r>
           <w:rPr>
@@ -2896,23 +2852,23 @@
         <w:t>Introduction</w:t>
       </w:r>
       <w:r>
-        <w:t xml:space="preserve"> – </w:t>
-      </w:r>
-      <w:r>
-        <w:rPr>
-          <w:color w:val="70AD47" w:themeColor="accent6"/>
-        </w:rPr>
-        <w:t>22</w:t>
-      </w:r>
-      <w:r>
-        <w:rPr>
-          <w:color w:val="70AD47" w:themeColor="accent6"/>
+        <w:t xml:space="preserve"> </w:t>
+      </w:r>
+      <w:r>
+        <w:rPr>
+          <w:color w:val="EE0000"/>
+        </w:rPr>
+        <w:t>– 22</w:t>
+      </w:r>
+      <w:r>
+        <w:rPr>
+          <w:color w:val="EE0000"/>
         </w:rPr>
         <w:t>9</w:t>
       </w:r>
       <w:r>
         <w:rPr>
-          <w:color w:val="70AD47" w:themeColor="accent6"/>
+          <w:color w:val="EE0000"/>
         </w:rPr>
         <w:t>w</w:t>
       </w:r>
@@ -2982,17 +2938,9 @@
           <w:r>
             <w:rPr>
               <w:noProof/>
-              <w:highlight w:val="yellow"/>
               <w:lang w:val="en-US"/>
             </w:rPr>
-            <w:t>(Schroder &amp; Schanz, 2022</w:t>
-          </w:r>
-          <w:r>
-            <w:rPr>
-              <w:noProof/>
-              <w:lang w:val="en-US"/>
-            </w:rPr>
-            <w:t>)</w:t>
+            <w:t>(Schroder &amp; Schanz, 2022)</w:t>
           </w:r>
           <w:r>
             <w:fldChar w:fldCharType="end"/>
@@ -3029,15 +2977,7 @@
               <w:noProof/>
               <w:lang w:val="en-US"/>
             </w:rPr>
-            <w:t>(</w:t>
-          </w:r>
-          <w:r>
-            <w:rPr>
-              <w:noProof/>
-              <w:highlight w:val="yellow"/>
-              <w:lang w:val="en-US"/>
-            </w:rPr>
-            <w:t>Wang, et al., 2017)</w:t>
+            <w:t>(Wang, et al., 2017)</w:t>
           </w:r>
           <w:r>
             <w:fldChar w:fldCharType="end"/>
@@ -3131,6 +3071,9 @@
     <w:p>
       <w:pPr>
         <w:pStyle w:val="Heading1"/>
+        <w:rPr>
+          <w:color w:val="EE0000"/>
+        </w:rPr>
       </w:pPr>
       <w:bookmarkStart w:id="11" w:name="_Toc222839130"/>
       <w:bookmarkStart w:id="12" w:name="_Toc88436908"/>
@@ -3140,13 +3083,13 @@
       </w:r>
       <w:bookmarkEnd w:id="11"/>
       <w:r>
-        <w:t xml:space="preserve"> – 8</w:t>
-      </w:r>
-      <w:r>
-        <w:t>50</w:t>
-      </w:r>
-      <w:r>
-        <w:t>w</w:t>
+        <w:t xml:space="preserve"> – </w:t>
+      </w:r>
+      <w:r>
+        <w:rPr>
+          <w:color w:val="EE0000"/>
+        </w:rPr>
+        <w:t>876w</w:t>
       </w:r>
     </w:p>
     <w:p>
@@ -3248,7 +3191,7 @@
       <w:pPr>
         <w:pStyle w:val="Caption"/>
       </w:pPr>
-      <w:bookmarkStart w:id="14" w:name="_Toc222940983"/>
+      <w:bookmarkStart w:id="14" w:name="_Toc222949275"/>
       <w:r>
         <w:t xml:space="preserve">Figure </w:t>
       </w:r>
@@ -3880,7 +3823,7 @@
       <w:pPr>
         <w:pStyle w:val="Caption"/>
       </w:pPr>
-      <w:bookmarkStart w:id="21" w:name="_Toc222940984"/>
+      <w:bookmarkStart w:id="21" w:name="_Toc222949276"/>
       <w:r>
         <w:t xml:space="preserve">Figure </w:t>
       </w:r>
@@ -3925,20 +3868,7 @@
             <w:rPr>
               <w:noProof/>
             </w:rPr>
-            <w:t>(</w:t>
-          </w:r>
-          <w:r>
-            <w:rPr>
-              <w:noProof/>
-              <w:highlight w:val="yellow"/>
-            </w:rPr>
-            <w:t>AM Team, 2018</w:t>
-          </w:r>
-          <w:r>
-            <w:rPr>
-              <w:noProof/>
-            </w:rPr>
-            <w:t>)</w:t>
+            <w:t>(AM Team, 2018)</w:t>
           </w:r>
           <w:r>
             <w:fldChar w:fldCharType="end"/>
@@ -4110,7 +4040,7 @@
       <w:pPr>
         <w:pStyle w:val="Caption"/>
       </w:pPr>
-      <w:bookmarkStart w:id="23" w:name="_Toc222940985"/>
+      <w:bookmarkStart w:id="23" w:name="_Toc222949277"/>
       <w:r>
         <w:t xml:space="preserve">Figure </w:t>
       </w:r>
@@ -4154,15 +4084,8 @@
           <w:r>
             <w:rPr>
               <w:noProof/>
-              <w:highlight w:val="yellow"/>
             </w:rPr>
-            <w:t>(Abdelkarim, 2025</w:t>
-          </w:r>
-          <w:r>
-            <w:rPr>
-              <w:noProof/>
-            </w:rPr>
-            <w:t>)</w:t>
+            <w:t>(Abdelkarim, 2025)</w:t>
           </w:r>
           <w:r>
             <w:fldChar w:fldCharType="end"/>
@@ -4205,26 +4128,22 @@
             <w:rPr>
               <w:noProof/>
             </w:rPr>
-            <w:t>(</w:t>
-          </w:r>
-          <w:r>
-            <w:rPr>
-              <w:noProof/>
-              <w:highlight w:val="yellow"/>
-            </w:rPr>
-            <w:t>NASA, 2021</w:t>
-          </w:r>
-          <w:r>
-            <w:rPr>
-              <w:noProof/>
-            </w:rPr>
-            <w:t>)</w:t>
+            <w:t>(NASA, 2021)</w:t>
           </w:r>
           <w:r>
             <w:fldChar w:fldCharType="end"/>
           </w:r>
         </w:sdtContent>
       </w:sdt>
+      <w:r>
+        <w:t xml:space="preserve">, these equations </w:t>
+      </w:r>
+      <w:r>
+        <w:t xml:space="preserve">play an important role in any CFD model as they model the behaviour of the fluids used in </w:t>
+      </w:r>
+      <w:r>
+        <w:t>a built system</w:t>
+      </w:r>
       <w:r>
         <w:t>. NASA outlines the complexity of these equations</w:t>
       </w:r>
@@ -4279,7 +4198,7 @@
       <w:pPr>
         <w:pStyle w:val="Caption"/>
       </w:pPr>
-      <w:bookmarkStart w:id="25" w:name="_Toc222940986"/>
+      <w:bookmarkStart w:id="25" w:name="_Toc222949278"/>
       <w:r>
         <w:t xml:space="preserve">Figure </w:t>
       </w:r>
@@ -4664,22 +4583,7 @@
               <w:noProof/>
               <w:lang w:val="en-US"/>
             </w:rPr>
-            <w:t>(</w:t>
-          </w:r>
-          <w:r>
-            <w:rPr>
-              <w:noProof/>
-              <w:highlight w:val="yellow"/>
-              <w:lang w:val="en-US"/>
-            </w:rPr>
-            <w:t>2017</w:t>
-          </w:r>
-          <w:r>
-            <w:rPr>
-              <w:noProof/>
-              <w:lang w:val="en-US"/>
-            </w:rPr>
-            <w:t>)</w:t>
+            <w:t>(2017)</w:t>
           </w:r>
           <w:r>
             <w:fldChar w:fldCharType="end"/>
@@ -4727,22 +4631,79 @@
               <w:noProof/>
               <w:lang w:val="en-US"/>
             </w:rPr>
-            <w:t>(</w:t>
+            <w:t>(2017)</w:t>
+          </w:r>
+          <w:r>
+            <w:fldChar w:fldCharType="end"/>
+          </w:r>
+        </w:sdtContent>
+      </w:sdt>
+      <w:r>
+        <w:t xml:space="preserve"> is scalability. Because the number of equations solved is determined by the number of grid cells rather than the number of particles, Eulerian models are more efficient for industrial-scale systems such as pneumatic conveying. This makes the approach more appropriate for modelling large domains where capturing overall flow behaviour is more important than resolving individual particle trajectories.</w:t>
+      </w:r>
+    </w:p>
+    <w:p>
+      <w:pPr>
+        <w:pStyle w:val="Heading2"/>
+      </w:pPr>
+      <w:r>
+        <w:t>Lagrangian Approach</w:t>
+      </w:r>
+      <w:bookmarkEnd w:id="29"/>
+    </w:p>
+    <w:p>
+      <w:r>
+        <w:t xml:space="preserve">The Lagrangian method in CFD analyses fluid motion by tracking individual particles as the move through space and time. Instead of focusing on fixed locations, it </w:t>
+      </w:r>
+      <w:r>
+        <w:t>focuses</w:t>
+      </w:r>
+      <w:r>
+        <w:t xml:space="preserve"> on following each particle and computes how its </w:t>
+      </w:r>
+      <w:r>
+        <w:t>velocity, position, and density change along its trajectory. This method is particularly useful for modelling particle transport, spra</w:t>
+      </w:r>
+      <w:r>
+        <w:t>ys, and multiphase flows. It provides detailed path information but can become computationally intensive for large fluid systems.</w:t>
+      </w:r>
+    </w:p>
+    <w:p>
+      <w:r>
+        <w:t xml:space="preserve">In multiphase CFD modelling, the Lagrangian method is commonly used to represent dispersed phases such as droplets, bubbles, or solid particles within a continuous fluid. The surrounding fluid is often still solved using </w:t>
+      </w:r>
+      <w:proofErr w:type="gramStart"/>
+      <w:r>
+        <w:t>an</w:t>
+      </w:r>
+      <w:proofErr w:type="gramEnd"/>
+      <w:r>
+        <w:t xml:space="preserve"> Eulerian grid, while individual particles are tracked separately using Newton’s laws of motion. Schroder and Schanz </w:t>
+      </w:r>
+      <w:sdt>
+        <w:sdtPr>
+          <w:id w:val="-431738386"/>
+          <w:citation/>
+        </w:sdtPr>
+        <w:sdtContent>
+          <w:r>
+            <w:fldChar w:fldCharType="begin"/>
           </w:r>
           <w:r>
             <w:rPr>
-              <w:noProof/>
-              <w:highlight w:val="yellow"/>
               <w:lang w:val="en-US"/>
             </w:rPr>
-            <w:t>2017</w:t>
+            <w:instrText xml:space="preserve">CITATION Sch22 \n  \l 1033 </w:instrText>
+          </w:r>
+          <w:r>
+            <w:fldChar w:fldCharType="separate"/>
           </w:r>
           <w:r>
             <w:rPr>
               <w:noProof/>
               <w:lang w:val="en-US"/>
             </w:rPr>
-            <w:t>)</w:t>
+            <w:t>(2022)</w:t>
           </w:r>
           <w:r>
             <w:fldChar w:fldCharType="end"/>
@@ -4750,39 +4711,29 @@
         </w:sdtContent>
       </w:sdt>
       <w:r>
-        <w:t xml:space="preserve"> is scalability. Because the number of equations solved is determined by the number of grid cells rather than the number of particles, Eulerian models are more efficient for industrial-scale systems such as pneumatic conveying. This makes the approach more appropriate for modelling large domains where capturing overall flow behaviour is more important than resolving individual particle trajectories.</w:t>
-      </w:r>
-    </w:p>
+        <w:t xml:space="preserve"> explain that this approach allows highly detailed measurement of particle trajectories, making it particularly useful when understanding transport mechanisms, collision behaviour, or particle dispersion is important.</w:t>
+      </w:r>
+    </w:p>
+    <w:p>
+      <w:r>
+        <w:t>The main advantage of the Lagrangian approach is the level of detail it provides. Because each particle is resolved individually, the model can capture micro-scale interactions and precise path information. This makes it suitable for simulations involving sprays, combustion systems, sediment transport, or particle tracking studies where trajectory accuracy is required.</w:t>
+      </w:r>
+    </w:p>
+    <w:p>
+      <w:r>
+        <w:t>However, the computational cost increases significantly as the number of particles increases. Unlike the Eulerian model, where complexity depends on mesh size, the Lagrangian method scales directly with particle count. In systems with very high particle density, this can make simulations expensive and less practical for large-scale industrial problems. As particle numbers grow, additional calculations are required for forces such as drag, lift, gravity, and potential collisions, which further increases processing time.</w:t>
+      </w:r>
+    </w:p>
+    <w:p>
+      <w:r>
+        <w:t>For this reason, while the Lagrangian approach provides greater physical detail, it is often more suitable for dilute flows or systems where particle-level behaviour is a priority rather than overall averaged flow behaviour.</w:t>
+      </w:r>
+    </w:p>
+    <w:p/>
     <w:p>
       <w:pPr>
         <w:pStyle w:val="Heading2"/>
       </w:pPr>
-      <w:r>
-        <w:t>Lagrangian Approach</w:t>
-      </w:r>
-      <w:bookmarkEnd w:id="29"/>
-    </w:p>
-    <w:p>
-      <w:r>
-        <w:t xml:space="preserve">The Lagrangian method in CFD analyses fluid motion by tracking individual particles as the move through space and time. Instead of focusing on fixed locations, it </w:t>
-      </w:r>
-      <w:r>
-        <w:t>focuses</w:t>
-      </w:r>
-      <w:r>
-        <w:t xml:space="preserve"> on following each particle and computes how its </w:t>
-      </w:r>
-      <w:r>
-        <w:t>velocity, position, and density change along its trajectory. This method is particularly useful for modelling particle transport, spra</w:t>
-      </w:r>
-      <w:r>
-        <w:t>ys, and multiphase flows. It provides detailed path information but can become computationally intensive for large fluid systems.</w:t>
-      </w:r>
-    </w:p>
-    <w:p>
-      <w:pPr>
-        <w:pStyle w:val="Heading2"/>
-      </w:pPr>
       <w:bookmarkStart w:id="30" w:name="_Toc222839145"/>
       <w:r>
         <w:t>Lagrangian-Eulerian</w:t>
@@ -4813,7 +4764,11 @@
         <w:t>modelling</w:t>
       </w:r>
       <w:r>
-        <w:t xml:space="preserve"> multiphase flows, sprays, and particle-laden systems. It captures detailed particle </w:t>
+        <w:t xml:space="preserve"> multiphase </w:t>
+      </w:r>
+      <w:r>
+        <w:lastRenderedPageBreak/>
+        <w:t xml:space="preserve">flows, sprays, and particle-laden systems. It captures detailed particle </w:t>
       </w:r>
       <w:r>
         <w:t>behaviour</w:t>
@@ -4822,9 +4777,23 @@
         <w:t xml:space="preserve"> while efficiently resolving the surrounding continuous fluid field.</w:t>
       </w:r>
     </w:p>
-    <w:p/>
-    <w:p>
-      <w:r>
+    <w:p>
+      <w:pPr>
+        <w:rPr>
+          <w:color w:val="EE0000"/>
+        </w:rPr>
+      </w:pPr>
+    </w:p>
+    <w:p>
+      <w:pPr>
+        <w:rPr>
+          <w:color w:val="EE0000"/>
+        </w:rPr>
+      </w:pPr>
+      <w:r>
+        <w:rPr>
+          <w:color w:val="EE0000"/>
+        </w:rPr>
         <w:t>https://web.archive.org/web/20140725014123/https://docs.nvidia.com/cuda/samples/5_Simulations/particles/doc/particles.pdf</w:t>
       </w:r>
     </w:p>
@@ -5026,6 +4995,45 @@
     <w:p>
       <w:r>
         <w:t>[Enter text here]</w:t>
+      </w:r>
+    </w:p>
+    <w:p>
+      <w:pPr>
+        <w:rPr>
+          <w:color w:val="EE0000"/>
+        </w:rPr>
+      </w:pPr>
+      <w:r>
+        <w:rPr>
+          <w:color w:val="EE0000"/>
+        </w:rPr>
+        <w:t xml:space="preserve">Having good understanding of exactly what the </w:t>
+      </w:r>
+      <w:r>
+        <w:rPr>
+          <w:color w:val="EE0000"/>
+        </w:rPr>
+        <w:t>project outcome is desired will allow the developers to choose the most effective approach to take. Likely a Lagrangian-Eulerian approach provides a good mix of scalability</w:t>
+      </w:r>
+      <w:r>
+        <w:rPr>
+          <w:color w:val="EE0000"/>
+        </w:rPr>
+        <w:t xml:space="preserve"> coming from </w:t>
+      </w:r>
+      <w:proofErr w:type="gramStart"/>
+      <w:r>
+        <w:rPr>
+          <w:color w:val="EE0000"/>
+        </w:rPr>
+        <w:t>thee</w:t>
+      </w:r>
+      <w:proofErr w:type="gramEnd"/>
+      <w:r>
+        <w:rPr>
+          <w:color w:val="EE0000"/>
+        </w:rPr>
+        <w:t xml:space="preserve"> Eulerian method, and the finer detail from discrete collisions and states from the Lagrangian method.</w:t>
       </w:r>
     </w:p>
     <w:p>
@@ -5224,27 +5232,115 @@
       </w:r>
     </w:p>
     <w:p/>
-    <w:p/>
-    <w:p>
-      <w:r>
+    <w:p>
+      <w:pPr>
+        <w:rPr>
+          <w:color w:val="EE0000"/>
+        </w:rPr>
+      </w:pPr>
+    </w:p>
+    <w:p>
+      <w:pPr>
+        <w:rPr>
+          <w:color w:val="EE0000"/>
+        </w:rPr>
+      </w:pPr>
+      <w:r>
+        <w:rPr>
+          <w:color w:val="EE0000"/>
+        </w:rPr>
         <w:t>In conclusion</w:t>
       </w:r>
       <w:r>
+        <w:rPr>
+          <w:color w:val="EE0000"/>
+        </w:rPr>
         <w:t xml:space="preserve">, CFD method selection represents a trade-off between accuracy and computational efficiency, with Euler–Euler models favouring scalability and </w:t>
       </w:r>
       <w:r>
+        <w:rPr>
+          <w:color w:val="EE0000"/>
+        </w:rPr>
         <w:t>Lagrangian</w:t>
       </w:r>
       <w:r>
+        <w:rPr>
+          <w:color w:val="EE0000"/>
+        </w:rPr>
         <w:t xml:space="preserve"> prioritising detailed physical representation at higher computational cost.</w:t>
       </w:r>
     </w:p>
-    <w:p/>
+    <w:p>
+      <w:pPr>
+        <w:rPr>
+          <w:color w:val="EE0000"/>
+        </w:rPr>
+      </w:pPr>
+    </w:p>
+    <w:p>
+      <w:pPr>
+        <w:rPr>
+          <w:color w:val="EE0000"/>
+        </w:rPr>
+      </w:pPr>
+      <w:r>
+        <w:rPr>
+          <w:color w:val="EE0000"/>
+        </w:rPr>
+        <w:t xml:space="preserve">Talb about how </w:t>
+      </w:r>
+      <w:r>
+        <w:rPr>
+          <w:color w:val="EE0000"/>
+        </w:rPr>
+        <w:t xml:space="preserve">spending time building a simplified model gave a greater understanding of </w:t>
+      </w:r>
+      <w:r>
+        <w:rPr>
+          <w:color w:val="EE0000"/>
+        </w:rPr>
+        <w:t>the</w:t>
+      </w:r>
+      <w:r>
+        <w:rPr>
+          <w:color w:val="EE0000"/>
+        </w:rPr>
+        <w:t xml:space="preserve"> specific problems the system engineer would </w:t>
+      </w:r>
+      <w:proofErr w:type="gramStart"/>
+      <w:r>
+        <w:rPr>
+          <w:color w:val="EE0000"/>
+        </w:rPr>
+        <w:t>face</w:t>
+      </w:r>
+      <w:r>
+        <w:rPr>
+          <w:color w:val="EE0000"/>
+        </w:rPr>
+        <w:t>, and</w:t>
+      </w:r>
+      <w:proofErr w:type="gramEnd"/>
+      <w:r>
+        <w:rPr>
+          <w:color w:val="EE0000"/>
+        </w:rPr>
+        <w:t xml:space="preserve"> gives context for how to approach the problem.</w:t>
+      </w:r>
+    </w:p>
+    <w:p>
+      <w:pPr>
+        <w:rPr>
+          <w:color w:val="EE0000"/>
+        </w:rPr>
+      </w:pPr>
+    </w:p>
     <w:p>
       <w:pPr>
         <w:suppressAutoHyphens w:val="0"/>
       </w:pPr>
       <w:r>
+        <w:lastRenderedPageBreak/>
         <w:br w:type="page"/>
       </w:r>
     </w:p>
@@ -5749,6 +5845,104 @@
                 </w:rPr>
                 <w:br/>
                 <w:t>[Accessed 23 2 2026].</w:t>
+              </w:r>
+            </w:p>
+            <w:p>
+              <w:pPr>
+                <w:pStyle w:val="Bibliography"/>
+                <w:rPr>
+                  <w:noProof/>
+                </w:rPr>
+              </w:pPr>
+              <w:r>
+                <w:rPr>
+                  <w:noProof/>
+                </w:rPr>
+                <w:t xml:space="preserve">ConvergeCFD, 2017. </w:t>
+              </w:r>
+              <w:r>
+                <w:rPr>
+                  <w:i/>
+                  <w:iCs/>
+                  <w:noProof/>
+                </w:rPr>
+                <w:t xml:space="preserve">Eulerian Multi-Phase. </w:t>
+              </w:r>
+              <w:r>
+                <w:rPr>
+                  <w:noProof/>
+                </w:rPr>
+                <w:t xml:space="preserve">[Online] </w:t>
+              </w:r>
+              <w:r>
+                <w:rPr>
+                  <w:noProof/>
+                </w:rPr>
+                <w:br/>
+                <w:t xml:space="preserve">Available at: </w:t>
+              </w:r>
+              <w:r>
+                <w:rPr>
+                  <w:noProof/>
+                  <w:u w:val="single"/>
+                </w:rPr>
+                <w:t>https://convergecfd.com/benefits/eulerian-multi-phase</w:t>
+              </w:r>
+              <w:r>
+                <w:rPr>
+                  <w:noProof/>
+                </w:rPr>
+                <w:br/>
+                <w:t>[Accessed 25 2 2026].</w:t>
+              </w:r>
+            </w:p>
+            <w:p>
+              <w:pPr>
+                <w:pStyle w:val="Bibliography"/>
+                <w:rPr>
+                  <w:noProof/>
+                </w:rPr>
+              </w:pPr>
+              <w:r>
+                <w:rPr>
+                  <w:noProof/>
+                </w:rPr>
+                <w:t xml:space="preserve">Hugh, R., 2023. </w:t>
+              </w:r>
+              <w:r>
+                <w:rPr>
+                  <w:i/>
+                  <w:iCs/>
+                  <w:noProof/>
+                </w:rPr>
+                <w:t xml:space="preserve">Real-time Eulerian fluid simulation on a Macbook Air, using GPU shaders. </w:t>
+              </w:r>
+              <w:r>
+                <w:rPr>
+                  <w:noProof/>
+                </w:rPr>
+                <w:t xml:space="preserve">[Online] </w:t>
+              </w:r>
+              <w:r>
+                <w:rPr>
+                  <w:noProof/>
+                </w:rPr>
+                <w:br/>
+                <w:t xml:space="preserve">Available at: </w:t>
+              </w:r>
+              <w:r>
+                <w:rPr>
+                  <w:noProof/>
+                  <w:u w:val="single"/>
+                </w:rPr>
+                <w:t>https://www.youtube.com/watch?v=x6mcua0HOJs</w:t>
+              </w:r>
+              <w:r>
+                <w:rPr>
+                  <w:noProof/>
+                </w:rPr>
+                <w:br/>
+                <w:t>[Accessed 25 2 2026].</w:t>
               </w:r>
             </w:p>
             <w:p>

</xml_diff>

<commit_message>
minor changes to highlight referecnes etc
</commit_message>
<xml_diff>
--- a/Technical Development Report.docx
+++ b/Technical Development Report.docx
@@ -2937,9 +2937,47 @@
           <w:r>
             <w:rPr>
               <w:noProof/>
+              <w:highlight w:val="yellow"/>
               <w:lang w:val="en-US"/>
             </w:rPr>
-            <w:t>(Schroder &amp; Schanz, 2022)</w:t>
+            <w:t>(Schroder</w:t>
+          </w:r>
+          <w:r>
+            <w:rPr>
+              <w:noProof/>
+              <w:lang w:val="en-US"/>
+            </w:rPr>
+            <w:t xml:space="preserve"> &amp; </w:t>
+          </w:r>
+          <w:r>
+            <w:rPr>
+              <w:noProof/>
+              <w:highlight w:val="yellow"/>
+              <w:lang w:val="en-US"/>
+            </w:rPr>
+            <w:t>Schanz</w:t>
+          </w:r>
+          <w:r>
+            <w:rPr>
+              <w:noProof/>
+              <w:lang w:val="en-US"/>
+            </w:rPr>
+            <w:t xml:space="preserve">, </w:t>
+          </w:r>
+          <w:r>
+            <w:rPr>
+              <w:noProof/>
+              <w:highlight w:val="yellow"/>
+              <w:lang w:val="en-US"/>
+            </w:rPr>
+            <w:t>2022</w:t>
+          </w:r>
+          <w:r>
+            <w:rPr>
+              <w:noProof/>
+              <w:lang w:val="en-US"/>
+            </w:rPr>
+            <w:t>)</w:t>
           </w:r>
           <w:r>
             <w:fldChar w:fldCharType="end"/>
@@ -2957,27 +2995,43 @@
           <w:id w:val="1390226164"/>
           <w:citation/>
         </w:sdtPr>
+        <w:sdtEndPr>
+          <w:rPr>
+            <w:highlight w:val="yellow"/>
+          </w:rPr>
+        </w:sdtEndPr>
         <w:sdtContent>
           <w:r>
+            <w:rPr>
+              <w:highlight w:val="yellow"/>
+            </w:rPr>
             <w:fldChar w:fldCharType="begin"/>
           </w:r>
           <w:r>
             <w:rPr>
+              <w:highlight w:val="yellow"/>
               <w:lang w:val="en-US"/>
             </w:rPr>
             <w:instrText xml:space="preserve"> CITATION Wan17 \l 1033 </w:instrText>
           </w:r>
           <w:r>
+            <w:rPr>
+              <w:highlight w:val="yellow"/>
+            </w:rPr>
             <w:fldChar w:fldCharType="separate"/>
           </w:r>
           <w:r>
             <w:rPr>
               <w:noProof/>
+              <w:highlight w:val="yellow"/>
               <w:lang w:val="en-US"/>
             </w:rPr>
             <w:t>(Wang, et al., 2017)</w:t>
           </w:r>
           <w:r>
+            <w:rPr>
+              <w:highlight w:val="yellow"/>
+            </w:rPr>
             <w:fldChar w:fldCharType="end"/>
           </w:r>
         </w:sdtContent>
@@ -5442,15 +5496,7 @@
                           </w:p>
                           <w:p>
                             <w:r>
-                              <w:t xml:space="preserve">How to write an </w:t>
-                            </w:r>
-                            <w:proofErr w:type="spellStart"/>
-                            <w:r>
-                              <w:t>eulerian</w:t>
-                            </w:r>
-                            <w:proofErr w:type="spellEnd"/>
-                            <w:r>
-                              <w:t xml:space="preserve"> fluid sim with 200 lines of code</w:t>
+                              <w:t>How to write an eulerian fluid sim with 200 lines of code</w:t>
                             </w:r>
                           </w:p>
                           <w:p>
@@ -5589,15 +5635,7 @@
                     </w:p>
                     <w:p>
                       <w:r>
-                        <w:t xml:space="preserve">How to write an </w:t>
-                      </w:r>
-                      <w:proofErr w:type="spellStart"/>
-                      <w:r>
-                        <w:t>eulerian</w:t>
-                      </w:r>
-                      <w:proofErr w:type="spellEnd"/>
-                      <w:r>
-                        <w:t xml:space="preserve"> fluid sim with 200 lines of code</w:t>
+                        <w:t>How to write an eulerian fluid sim with 200 lines of code</w:t>
                       </w:r>
                     </w:p>
                     <w:p>
@@ -8099,15 +8137,6 @@
 </file>
 
 <file path=customXml/item1.xml><?xml version="1.0" encoding="utf-8"?>
-<?mso-contentType ?>
-<FormTemplates xmlns="http://schemas.microsoft.com/sharepoint/v3/contenttype/forms">
-  <Display>DocumentLibraryForm</Display>
-  <Edit>DocumentLibraryForm</Edit>
-  <New>DocumentLibraryForm</New>
-</FormTemplates>
-</file>
-
-<file path=customXml/item2.xml><?xml version="1.0" encoding="utf-8"?>
 <ct:contentTypeSchema xmlns:ct="http://schemas.microsoft.com/office/2006/metadata/contentType" xmlns:ma="http://schemas.microsoft.com/office/2006/metadata/properties/metaAttributes" ct:_="" ma:_="" ma:contentTypeName="Document" ma:contentTypeID="0x010100D9F37D7A4EDC1040A880A2099F6664D1" ma:contentTypeVersion="17" ma:contentTypeDescription="Create a new document." ma:contentTypeScope="" ma:versionID="08efb0d5db8d1d6db33b2f38db1086d5">
   <xsd:schema xmlns:xsd="http://www.w3.org/2001/XMLSchema" xmlns:xs="http://www.w3.org/2001/XMLSchema" xmlns:p="http://schemas.microsoft.com/office/2006/metadata/properties" xmlns:ns2="8d4a1fdf-0f94-4e24-9675-6342052676c2" xmlns:ns3="e2a5ad16-c4e7-4aee-be6c-2d964216012c" xmlns:ns4="efc3e123-a60a-4a17-aaf1-487e28d9a3b3" targetNamespace="http://schemas.microsoft.com/office/2006/metadata/properties" ma:root="true" ma:fieldsID="8080e491b76ba13211cd04da0d5e9449" ns2:_="" ns3:_="" ns4:_="">
     <xsd:import namespace="8d4a1fdf-0f94-4e24-9675-6342052676c2"/>
@@ -8368,7 +8397,31 @@
 </ct:contentTypeSchema>
 </file>
 
+<file path=customXml/item2.xml><?xml version="1.0" encoding="utf-8"?>
+<?mso-contentType ?>
+<FormTemplates xmlns="http://schemas.microsoft.com/sharepoint/v3/contenttype/forms">
+  <Display>DocumentLibraryForm</Display>
+  <Edit>DocumentLibraryForm</Edit>
+  <New>DocumentLibraryForm</New>
+</FormTemplates>
+</file>
+
 <file path=customXml/item3.xml><?xml version="1.0" encoding="utf-8"?>
+<p:properties xmlns:p="http://schemas.microsoft.com/office/2006/metadata/properties" xmlns:xsi="http://www.w3.org/2001/XMLSchema-instance" xmlns:pc="http://schemas.microsoft.com/office/infopath/2007/PartnerControls">
+  <documentManagement>
+    <TaxCatchAll xmlns="efc3e123-a60a-4a17-aaf1-487e28d9a3b3" xsi:nil="true"/>
+    <URL xmlns="8d4a1fdf-0f94-4e24-9675-6342052676c2">
+      <Url xsi:nil="true"/>
+      <Description xsi:nil="true"/>
+    </URL>
+    <lcf76f155ced4ddcb4097134ff3c332f xmlns="8d4a1fdf-0f94-4e24-9675-6342052676c2">
+      <Terms xmlns="http://schemas.microsoft.com/office/infopath/2007/PartnerControls"/>
+    </lcf76f155ced4ddcb4097134ff3c332f>
+  </documentManagement>
+</p:properties>
+</file>
+
+<file path=customXml/item4.xml><?xml version="1.0" encoding="utf-8"?>
 <b:Sources xmlns:b="http://schemas.openxmlformats.org/officeDocument/2006/bibliography" xmlns="http://schemas.openxmlformats.org/officeDocument/2006/bibliography" SelectedStyle="\HarvardAnglia2008OfficeOnline.xsl" StyleName="Harvard - Anglia" Version="2008">
   <b:Source>
     <b:Tag>Sch22</b:Tag>
@@ -8580,30 +8633,7 @@
 </b:Sources>
 </file>
 
-<file path=customXml/item4.xml><?xml version="1.0" encoding="utf-8"?>
-<p:properties xmlns:p="http://schemas.microsoft.com/office/2006/metadata/properties" xmlns:xsi="http://www.w3.org/2001/XMLSchema-instance" xmlns:pc="http://schemas.microsoft.com/office/infopath/2007/PartnerControls">
-  <documentManagement>
-    <TaxCatchAll xmlns="efc3e123-a60a-4a17-aaf1-487e28d9a3b3" xsi:nil="true"/>
-    <URL xmlns="8d4a1fdf-0f94-4e24-9675-6342052676c2">
-      <Url xsi:nil="true"/>
-      <Description xsi:nil="true"/>
-    </URL>
-    <lcf76f155ced4ddcb4097134ff3c332f xmlns="8d4a1fdf-0f94-4e24-9675-6342052676c2">
-      <Terms xmlns="http://schemas.microsoft.com/office/infopath/2007/PartnerControls"/>
-    </lcf76f155ced4ddcb4097134ff3c332f>
-  </documentManagement>
-</p:properties>
-</file>
-
 <file path=customXml/itemProps1.xml><?xml version="1.0" encoding="utf-8"?>
-<ds:datastoreItem xmlns:ds="http://schemas.openxmlformats.org/officeDocument/2006/customXml" ds:itemID="{0C9F64BE-1583-4619-A2B5-DACC1568FF50}">
-  <ds:schemaRefs>
-    <ds:schemaRef ds:uri="http://schemas.microsoft.com/sharepoint/v3/contenttype/forms"/>
-  </ds:schemaRefs>
-</ds:datastoreItem>
-</file>
-
-<file path=customXml/itemProps2.xml><?xml version="1.0" encoding="utf-8"?>
 <ds:datastoreItem xmlns:ds="http://schemas.openxmlformats.org/officeDocument/2006/customXml" ds:itemID="{277562E8-9AEC-4BC0-8DEC-73418E65CD9A}">
   <ds:schemaRefs>
     <ds:schemaRef ds:uri="http://schemas.microsoft.com/office/2006/metadata/contentType"/>
@@ -8623,15 +8653,15 @@
 </ds:datastoreItem>
 </file>
 
-<file path=customXml/itemProps3.xml><?xml version="1.0" encoding="utf-8"?>
-<ds:datastoreItem xmlns:ds="http://schemas.openxmlformats.org/officeDocument/2006/customXml" ds:itemID="{E9E99760-C3D3-4F15-8BD7-48F3783CF8A6}">
+<file path=customXml/itemProps2.xml><?xml version="1.0" encoding="utf-8"?>
+<ds:datastoreItem xmlns:ds="http://schemas.openxmlformats.org/officeDocument/2006/customXml" ds:itemID="{0C9F64BE-1583-4619-A2B5-DACC1568FF50}">
   <ds:schemaRefs>
-    <ds:schemaRef ds:uri="http://schemas.openxmlformats.org/officeDocument/2006/bibliography"/>
+    <ds:schemaRef ds:uri="http://schemas.microsoft.com/sharepoint/v3/contenttype/forms"/>
   </ds:schemaRefs>
 </ds:datastoreItem>
 </file>
 
-<file path=customXml/itemProps4.xml><?xml version="1.0" encoding="utf-8"?>
+<file path=customXml/itemProps3.xml><?xml version="1.0" encoding="utf-8"?>
 <ds:datastoreItem xmlns:ds="http://schemas.openxmlformats.org/officeDocument/2006/customXml" ds:itemID="{42CBECF3-DA57-4A6F-BD38-883BFD60FEF9}">
   <ds:schemaRefs>
     <ds:schemaRef ds:uri="http://schemas.microsoft.com/office/2006/metadata/properties"/>
@@ -8640,4 +8670,12 @@
     <ds:schemaRef ds:uri="8d4a1fdf-0f94-4e24-9675-6342052676c2"/>
   </ds:schemaRefs>
 </ds:datastoreItem>
+</file>
+
+<file path=customXml/itemProps4.xml><?xml version="1.0" encoding="utf-8"?>
+<ds:datastoreItem xmlns:ds="http://schemas.openxmlformats.org/officeDocument/2006/customXml" ds:itemID="{E9E99760-C3D3-4F15-8BD7-48F3783CF8A6}">
+  <ds:schemaRefs>
+    <ds:schemaRef ds:uri="http://schemas.openxmlformats.org/officeDocument/2006/bibliography"/>
+  </ds:schemaRefs>
+</ds:datastoreItem>
 </file>
</xml_diff>

<commit_message>
redcomendations section added. minor changes elsewhere. ready for draft checking TODO: complete conclusion section final formatting needed and deletion of purpletext
</commit_message>
<xml_diff>
--- a/Technical Development Report.docx
+++ b/Technical Development Report.docx
@@ -375,16 +375,16 @@
         <w:pStyle w:val="Heading1"/>
       </w:pPr>
       <w:bookmarkStart w:id="0" w:name="_Toc176769484"/>
-      <w:bookmarkStart w:id="1" w:name="_Toc222839126"/>
-      <w:bookmarkStart w:id="2" w:name="_Hlk176772257"/>
-      <w:bookmarkStart w:id="3" w:name="_Toc20059944"/>
-      <w:bookmarkStart w:id="4" w:name="_Toc20061035"/>
+      <w:bookmarkStart w:id="1" w:name="_Hlk176772257"/>
+      <w:bookmarkStart w:id="2" w:name="_Toc20059944"/>
+      <w:bookmarkStart w:id="3" w:name="_Toc20061035"/>
+      <w:bookmarkStart w:id="4" w:name="_Toc224572948"/>
       <w:r>
         <w:lastRenderedPageBreak/>
         <w:t>Declarations</w:t>
       </w:r>
       <w:bookmarkEnd w:id="0"/>
-      <w:bookmarkEnd w:id="1"/>
+      <w:bookmarkEnd w:id="4"/>
     </w:p>
     <w:p>
       <w:pPr>
@@ -432,17 +432,17 @@
       <w:pPr>
         <w:pStyle w:val="Heading1"/>
       </w:pPr>
-      <w:bookmarkStart w:id="6" w:name="_Toc222839127"/>
-      <w:bookmarkStart w:id="7" w:name="_Toc20846673"/>
-      <w:bookmarkStart w:id="8" w:name="_Toc56439735"/>
+      <w:bookmarkStart w:id="6" w:name="_Toc20846673"/>
+      <w:bookmarkStart w:id="7" w:name="_Toc56439735"/>
+      <w:bookmarkStart w:id="8" w:name="_Toc224572949"/>
+      <w:bookmarkEnd w:id="1"/>
       <w:bookmarkEnd w:id="2"/>
       <w:bookmarkEnd w:id="3"/>
-      <w:bookmarkEnd w:id="4"/>
       <w:r>
         <w:lastRenderedPageBreak/>
         <w:t>Contents</w:t>
       </w:r>
-      <w:bookmarkEnd w:id="6"/>
+      <w:bookmarkEnd w:id="8"/>
     </w:p>
     <w:p>
       <w:pPr>
@@ -469,7 +469,7 @@
       <w:r>
         <w:fldChar w:fldCharType="separate"/>
       </w:r>
-      <w:hyperlink w:anchor="_Toc222839126" w:history="1">
+      <w:hyperlink w:anchor="_Toc224572948" w:history="1">
         <w:r>
           <w:rPr>
             <w:rStyle w:val="Hyperlink"/>
@@ -493,7 +493,7 @@
           <w:rPr>
             <w:noProof/>
           </w:rPr>
-          <w:instrText xml:space="preserve"> PAGEREF _Toc222839126 \h </w:instrText>
+          <w:instrText xml:space="preserve"> PAGEREF _Toc224572948 \h </w:instrText>
         </w:r>
         <w:r>
           <w:rPr>
@@ -536,7 +536,7 @@
           <w14:ligatures w14:val="standardContextual"/>
         </w:rPr>
       </w:pPr>
-      <w:hyperlink w:anchor="_Toc222839127" w:history="1">
+      <w:hyperlink w:anchor="_Toc224572949" w:history="1">
         <w:r>
           <w:rPr>
             <w:rStyle w:val="Hyperlink"/>
@@ -560,7 +560,7 @@
           <w:rPr>
             <w:noProof/>
           </w:rPr>
-          <w:instrText xml:space="preserve"> PAGEREF _Toc222839127 \h </w:instrText>
+          <w:instrText xml:space="preserve"> PAGEREF _Toc224572949 \h </w:instrText>
         </w:r>
         <w:r>
           <w:rPr>
@@ -603,7 +603,7 @@
           <w14:ligatures w14:val="standardContextual"/>
         </w:rPr>
       </w:pPr>
-      <w:hyperlink w:anchor="_Toc222839128" w:history="1">
+      <w:hyperlink w:anchor="_Toc224572950" w:history="1">
         <w:r>
           <w:rPr>
             <w:rStyle w:val="Hyperlink"/>
@@ -627,7 +627,7 @@
           <w:rPr>
             <w:noProof/>
           </w:rPr>
-          <w:instrText xml:space="preserve"> PAGEREF _Toc222839128 \h </w:instrText>
+          <w:instrText xml:space="preserve"> PAGEREF _Toc224572950 \h </w:instrText>
         </w:r>
         <w:r>
           <w:rPr>
@@ -670,7 +670,7 @@
           <w14:ligatures w14:val="standardContextual"/>
         </w:rPr>
       </w:pPr>
-      <w:hyperlink w:anchor="_Toc222839129" w:history="1">
+      <w:hyperlink w:anchor="_Toc224572951" w:history="1">
         <w:r>
           <w:rPr>
             <w:rStyle w:val="Hyperlink"/>
@@ -694,7 +694,7 @@
           <w:rPr>
             <w:noProof/>
           </w:rPr>
-          <w:instrText xml:space="preserve"> PAGEREF _Toc222839129 \h </w:instrText>
+          <w:instrText xml:space="preserve"> PAGEREF _Toc224572951 \h </w:instrText>
         </w:r>
         <w:r>
           <w:rPr>
@@ -737,13 +737,13 @@
           <w14:ligatures w14:val="standardContextual"/>
         </w:rPr>
       </w:pPr>
-      <w:hyperlink w:anchor="_Toc222839130" w:history="1">
+      <w:hyperlink w:anchor="_Toc224572952" w:history="1">
         <w:r>
           <w:rPr>
             <w:rStyle w:val="Hyperlink"/>
             <w:noProof/>
           </w:rPr>
-          <w:t>Context</w:t>
+          <w:t>Context – 876words</w:t>
         </w:r>
         <w:r>
           <w:rPr>
@@ -761,7 +761,7 @@
           <w:rPr>
             <w:noProof/>
           </w:rPr>
-          <w:instrText xml:space="preserve"> PAGEREF _Toc222839130 \h </w:instrText>
+          <w:instrText xml:space="preserve"> PAGEREF _Toc224572952 \h </w:instrText>
         </w:r>
         <w:r>
           <w:rPr>
@@ -804,7 +804,7 @@
           <w14:ligatures w14:val="standardContextual"/>
         </w:rPr>
       </w:pPr>
-      <w:hyperlink w:anchor="_Toc222839131" w:history="1">
+      <w:hyperlink w:anchor="_Toc224572953" w:history="1">
         <w:r>
           <w:rPr>
             <w:rStyle w:val="Hyperlink"/>
@@ -828,7 +828,7 @@
           <w:rPr>
             <w:noProof/>
           </w:rPr>
-          <w:instrText xml:space="preserve"> PAGEREF _Toc222839131 \h </w:instrText>
+          <w:instrText xml:space="preserve"> PAGEREF _Toc224572953 \h </w:instrText>
         </w:r>
         <w:r>
           <w:rPr>
@@ -871,7 +871,7 @@
           <w14:ligatures w14:val="standardContextual"/>
         </w:rPr>
       </w:pPr>
-      <w:hyperlink w:anchor="_Toc222839132" w:history="1">
+      <w:hyperlink w:anchor="_Toc224572954" w:history="1">
         <w:r>
           <w:rPr>
             <w:rStyle w:val="Hyperlink"/>
@@ -895,7 +895,7 @@
           <w:rPr>
             <w:noProof/>
           </w:rPr>
-          <w:instrText xml:space="preserve"> PAGEREF _Toc222839132 \h </w:instrText>
+          <w:instrText xml:space="preserve"> PAGEREF _Toc224572954 \h </w:instrText>
         </w:r>
         <w:r>
           <w:rPr>
@@ -938,7 +938,7 @@
           <w14:ligatures w14:val="standardContextual"/>
         </w:rPr>
       </w:pPr>
-      <w:hyperlink w:anchor="_Toc222839133" w:history="1">
+      <w:hyperlink w:anchor="_Toc224572955" w:history="1">
         <w:r>
           <w:rPr>
             <w:rStyle w:val="Hyperlink"/>
@@ -962,7 +962,7 @@
           <w:rPr>
             <w:noProof/>
           </w:rPr>
-          <w:instrText xml:space="preserve"> PAGEREF _Toc222839133 \h </w:instrText>
+          <w:instrText xml:space="preserve"> PAGEREF _Toc224572955 \h </w:instrText>
         </w:r>
         <w:r>
           <w:rPr>
@@ -1005,7 +1005,7 @@
           <w14:ligatures w14:val="standardContextual"/>
         </w:rPr>
       </w:pPr>
-      <w:hyperlink w:anchor="_Toc222839134" w:history="1">
+      <w:hyperlink w:anchor="_Toc224572956" w:history="1">
         <w:r>
           <w:rPr>
             <w:rStyle w:val="Hyperlink"/>
@@ -1029,7 +1029,7 @@
           <w:rPr>
             <w:noProof/>
           </w:rPr>
-          <w:instrText xml:space="preserve"> PAGEREF _Toc222839134 \h </w:instrText>
+          <w:instrText xml:space="preserve"> PAGEREF _Toc224572956 \h </w:instrText>
         </w:r>
         <w:r>
           <w:rPr>
@@ -1072,13 +1072,13 @@
           <w14:ligatures w14:val="standardContextual"/>
         </w:rPr>
       </w:pPr>
-      <w:hyperlink w:anchor="_Toc222839135" w:history="1">
+      <w:hyperlink w:anchor="_Toc224572957" w:history="1">
         <w:r>
           <w:rPr>
             <w:rStyle w:val="Hyperlink"/>
             <w:noProof/>
           </w:rPr>
-          <w:t>Addition of further variables</w:t>
+          <w:t>Flexibility</w:t>
         </w:r>
         <w:r>
           <w:rPr>
@@ -1096,7 +1096,7 @@
           <w:rPr>
             <w:noProof/>
           </w:rPr>
-          <w:instrText xml:space="preserve"> PAGEREF _Toc222839135 \h </w:instrText>
+          <w:instrText xml:space="preserve"> PAGEREF _Toc224572957 \h </w:instrText>
         </w:r>
         <w:r>
           <w:rPr>
@@ -1139,7 +1139,7 @@
           <w14:ligatures w14:val="standardContextual"/>
         </w:rPr>
       </w:pPr>
-      <w:hyperlink w:anchor="_Toc222839136" w:history="1">
+      <w:hyperlink w:anchor="_Toc224572958" w:history="1">
         <w:r>
           <w:rPr>
             <w:rStyle w:val="Hyperlink"/>
@@ -1163,7 +1163,7 @@
           <w:rPr>
             <w:noProof/>
           </w:rPr>
-          <w:instrText xml:space="preserve"> PAGEREF _Toc222839136 \h </w:instrText>
+          <w:instrText xml:space="preserve"> PAGEREF _Toc224572958 \h </w:instrText>
         </w:r>
         <w:r>
           <w:rPr>
@@ -1206,7 +1206,7 @@
           <w14:ligatures w14:val="standardContextual"/>
         </w:rPr>
       </w:pPr>
-      <w:hyperlink w:anchor="_Toc222839137" w:history="1">
+      <w:hyperlink w:anchor="_Toc224572959" w:history="1">
         <w:r>
           <w:rPr>
             <w:rStyle w:val="Hyperlink"/>
@@ -1230,7 +1230,7 @@
           <w:rPr>
             <w:noProof/>
           </w:rPr>
-          <w:instrText xml:space="preserve"> PAGEREF _Toc222839137 \h </w:instrText>
+          <w:instrText xml:space="preserve"> PAGEREF _Toc224572959 \h </w:instrText>
         </w:r>
         <w:r>
           <w:rPr>
@@ -1273,7 +1273,7 @@
           <w14:ligatures w14:val="standardContextual"/>
         </w:rPr>
       </w:pPr>
-      <w:hyperlink w:anchor="_Toc222839138" w:history="1">
+      <w:hyperlink w:anchor="_Toc224572960" w:history="1">
         <w:r>
           <w:rPr>
             <w:rStyle w:val="Hyperlink"/>
@@ -1297,7 +1297,7 @@
           <w:rPr>
             <w:noProof/>
           </w:rPr>
-          <w:instrText xml:space="preserve"> PAGEREF _Toc222839138 \h </w:instrText>
+          <w:instrText xml:space="preserve"> PAGEREF _Toc224572960 \h </w:instrText>
         </w:r>
         <w:r>
           <w:rPr>
@@ -1340,7 +1340,7 @@
           <w14:ligatures w14:val="standardContextual"/>
         </w:rPr>
       </w:pPr>
-      <w:hyperlink w:anchor="_Toc222839139" w:history="1">
+      <w:hyperlink w:anchor="_Toc224572961" w:history="1">
         <w:r>
           <w:rPr>
             <w:rStyle w:val="Hyperlink"/>
@@ -1364,7 +1364,7 @@
           <w:rPr>
             <w:noProof/>
           </w:rPr>
-          <w:instrText xml:space="preserve"> PAGEREF _Toc222839139 \h </w:instrText>
+          <w:instrText xml:space="preserve"> PAGEREF _Toc224572961 \h </w:instrText>
         </w:r>
         <w:r>
           <w:rPr>
@@ -1407,7 +1407,7 @@
           <w14:ligatures w14:val="standardContextual"/>
         </w:rPr>
       </w:pPr>
-      <w:hyperlink w:anchor="_Toc222839140" w:history="1">
+      <w:hyperlink w:anchor="_Toc224572962" w:history="1">
         <w:r>
           <w:rPr>
             <w:rStyle w:val="Hyperlink"/>
@@ -1431,7 +1431,7 @@
           <w:rPr>
             <w:noProof/>
           </w:rPr>
-          <w:instrText xml:space="preserve"> PAGEREF _Toc222839140 \h </w:instrText>
+          <w:instrText xml:space="preserve"> PAGEREF _Toc224572962 \h </w:instrText>
         </w:r>
         <w:r>
           <w:rPr>
@@ -1474,7 +1474,7 @@
           <w14:ligatures w14:val="standardContextual"/>
         </w:rPr>
       </w:pPr>
-      <w:hyperlink w:anchor="_Toc222839141" w:history="1">
+      <w:hyperlink w:anchor="_Toc224572963" w:history="1">
         <w:r>
           <w:rPr>
             <w:rStyle w:val="Hyperlink"/>
@@ -1498,7 +1498,7 @@
           <w:rPr>
             <w:noProof/>
           </w:rPr>
-          <w:instrText xml:space="preserve"> PAGEREF _Toc222839141 \h </w:instrText>
+          <w:instrText xml:space="preserve"> PAGEREF _Toc224572963 \h </w:instrText>
         </w:r>
         <w:r>
           <w:rPr>
@@ -1515,7 +1515,7 @@
           <w:rPr>
             <w:noProof/>
           </w:rPr>
-          <w:t>8</w:t>
+          <w:t>9</w:t>
         </w:r>
         <w:r>
           <w:rPr>
@@ -1541,13 +1541,13 @@
           <w14:ligatures w14:val="standardContextual"/>
         </w:rPr>
       </w:pPr>
-      <w:hyperlink w:anchor="_Toc222839142" w:history="1">
+      <w:hyperlink w:anchor="_Toc224572964" w:history="1">
         <w:r>
           <w:rPr>
             <w:rStyle w:val="Hyperlink"/>
             <w:noProof/>
           </w:rPr>
-          <w:t>Prior Approaches</w:t>
+          <w:t>Prior Approaches – 830words</w:t>
         </w:r>
         <w:r>
           <w:rPr>
@@ -1565,7 +1565,7 @@
           <w:rPr>
             <w:noProof/>
           </w:rPr>
-          <w:instrText xml:space="preserve"> PAGEREF _Toc222839142 \h </w:instrText>
+          <w:instrText xml:space="preserve"> PAGEREF _Toc224572964 \h </w:instrText>
         </w:r>
         <w:r>
           <w:rPr>
@@ -1608,7 +1608,7 @@
           <w14:ligatures w14:val="standardContextual"/>
         </w:rPr>
       </w:pPr>
-      <w:hyperlink w:anchor="_Toc222839143" w:history="1">
+      <w:hyperlink w:anchor="_Toc224572965" w:history="1">
         <w:r>
           <w:rPr>
             <w:rStyle w:val="Hyperlink"/>
@@ -1632,7 +1632,7 @@
           <w:rPr>
             <w:noProof/>
           </w:rPr>
-          <w:instrText xml:space="preserve"> PAGEREF _Toc222839143 \h </w:instrText>
+          <w:instrText xml:space="preserve"> PAGEREF _Toc224572965 \h </w:instrText>
         </w:r>
         <w:r>
           <w:rPr>
@@ -1675,7 +1675,7 @@
           <w14:ligatures w14:val="standardContextual"/>
         </w:rPr>
       </w:pPr>
-      <w:hyperlink w:anchor="_Toc222839144" w:history="1">
+      <w:hyperlink w:anchor="_Toc224572966" w:history="1">
         <w:r>
           <w:rPr>
             <w:rStyle w:val="Hyperlink"/>
@@ -1699,7 +1699,7 @@
           <w:rPr>
             <w:noProof/>
           </w:rPr>
-          <w:instrText xml:space="preserve"> PAGEREF _Toc222839144 \h </w:instrText>
+          <w:instrText xml:space="preserve"> PAGEREF _Toc224572966 \h </w:instrText>
         </w:r>
         <w:r>
           <w:rPr>
@@ -1742,13 +1742,13 @@
           <w14:ligatures w14:val="standardContextual"/>
         </w:rPr>
       </w:pPr>
-      <w:hyperlink w:anchor="_Toc222839145" w:history="1">
+      <w:hyperlink w:anchor="_Toc224572967" w:history="1">
         <w:r>
           <w:rPr>
             <w:rStyle w:val="Hyperlink"/>
             <w:noProof/>
           </w:rPr>
-          <w:t>Eulerian-Lagrange Approach</w:t>
+          <w:t>Lagrangian-Eulerian Approach</w:t>
         </w:r>
         <w:r>
           <w:rPr>
@@ -1766,7 +1766,7 @@
           <w:rPr>
             <w:noProof/>
           </w:rPr>
-          <w:instrText xml:space="preserve"> PAGEREF _Toc222839145 \h </w:instrText>
+          <w:instrText xml:space="preserve"> PAGEREF _Toc224572967 \h </w:instrText>
         </w:r>
         <w:r>
           <w:rPr>
@@ -1783,7 +1783,7 @@
           <w:rPr>
             <w:noProof/>
           </w:rPr>
-          <w:t>10</w:t>
+          <w:t>11</w:t>
         </w:r>
         <w:r>
           <w:rPr>
@@ -1809,7 +1809,7 @@
           <w14:ligatures w14:val="standardContextual"/>
         </w:rPr>
       </w:pPr>
-      <w:hyperlink w:anchor="_Toc222839146" w:history="1">
+      <w:hyperlink w:anchor="_Toc224572968" w:history="1">
         <w:r>
           <w:rPr>
             <w:rStyle w:val="Hyperlink"/>
@@ -1833,7 +1833,7 @@
           <w:rPr>
             <w:noProof/>
           </w:rPr>
-          <w:instrText xml:space="preserve"> PAGEREF _Toc222839146 \h </w:instrText>
+          <w:instrText xml:space="preserve"> PAGEREF _Toc224572968 \h </w:instrText>
         </w:r>
         <w:r>
           <w:rPr>
@@ -1850,7 +1850,7 @@
           <w:rPr>
             <w:noProof/>
           </w:rPr>
-          <w:t>11</w:t>
+          <w:t>12</w:t>
         </w:r>
         <w:r>
           <w:rPr>
@@ -1876,13 +1876,13 @@
           <w14:ligatures w14:val="standardContextual"/>
         </w:rPr>
       </w:pPr>
-      <w:hyperlink w:anchor="_Toc222839147" w:history="1">
+      <w:hyperlink w:anchor="_Toc224572969" w:history="1">
         <w:r>
           <w:rPr>
             <w:rStyle w:val="Hyperlink"/>
             <w:noProof/>
           </w:rPr>
-          <w:t>Implementation</w:t>
+          <w:t>Particle System Design</w:t>
         </w:r>
         <w:r>
           <w:rPr>
@@ -1900,7 +1900,7 @@
           <w:rPr>
             <w:noProof/>
           </w:rPr>
-          <w:instrText xml:space="preserve"> PAGEREF _Toc222839147 \h </w:instrText>
+          <w:instrText xml:space="preserve"> PAGEREF _Toc224572969 \h </w:instrText>
         </w:r>
         <w:r>
           <w:rPr>
@@ -1917,7 +1917,7 @@
           <w:rPr>
             <w:noProof/>
           </w:rPr>
-          <w:t>11</w:t>
+          <w:t>12</w:t>
         </w:r>
         <w:r>
           <w:rPr>
@@ -1929,7 +1929,7 @@
     </w:p>
     <w:p>
       <w:pPr>
-        <w:pStyle w:val="TOC3"/>
+        <w:pStyle w:val="TOC2"/>
         <w:tabs>
           <w:tab w:val="right" w:leader="dot" w:pos="9016"/>
         </w:tabs>
@@ -1943,13 +1943,13 @@
           <w14:ligatures w14:val="standardContextual"/>
         </w:rPr>
       </w:pPr>
-      <w:hyperlink w:anchor="_Toc222839148" w:history="1">
+      <w:hyperlink w:anchor="_Toc224572970" w:history="1">
         <w:r>
           <w:rPr>
             <w:rStyle w:val="Hyperlink"/>
             <w:noProof/>
           </w:rPr>
-          <w:t>Particle settings</w:t>
+          <w:t>Physical Parameter Control</w:t>
         </w:r>
         <w:r>
           <w:rPr>
@@ -1967,7 +1967,7 @@
           <w:rPr>
             <w:noProof/>
           </w:rPr>
-          <w:instrText xml:space="preserve"> PAGEREF _Toc222839148 \h </w:instrText>
+          <w:instrText xml:space="preserve"> PAGEREF _Toc224572970 \h </w:instrText>
         </w:r>
         <w:r>
           <w:rPr>
@@ -1984,7 +1984,7 @@
           <w:rPr>
             <w:noProof/>
           </w:rPr>
-          <w:t>11</w:t>
+          <w:t>13</w:t>
         </w:r>
         <w:r>
           <w:rPr>
@@ -1996,7 +1996,7 @@
     </w:p>
     <w:p>
       <w:pPr>
-        <w:pStyle w:val="TOC3"/>
+        <w:pStyle w:val="TOC2"/>
         <w:tabs>
           <w:tab w:val="right" w:leader="dot" w:pos="9016"/>
         </w:tabs>
@@ -2010,13 +2010,13 @@
           <w14:ligatures w14:val="standardContextual"/>
         </w:rPr>
       </w:pPr>
-      <w:hyperlink w:anchor="_Toc222839149" w:history="1">
+      <w:hyperlink w:anchor="_Toc224572971" w:history="1">
         <w:r>
           <w:rPr>
             <w:rStyle w:val="Hyperlink"/>
             <w:noProof/>
           </w:rPr>
-          <w:t>Particle spawner</w:t>
+          <w:t>Computational Cost</w:t>
         </w:r>
         <w:r>
           <w:rPr>
@@ -2034,7 +2034,7 @@
           <w:rPr>
             <w:noProof/>
           </w:rPr>
-          <w:instrText xml:space="preserve"> PAGEREF _Toc222839149 \h </w:instrText>
+          <w:instrText xml:space="preserve"> PAGEREF _Toc224572971 \h </w:instrText>
         </w:r>
         <w:r>
           <w:rPr>
@@ -2051,7 +2051,7 @@
           <w:rPr>
             <w:noProof/>
           </w:rPr>
-          <w:t>11</w:t>
+          <w:t>13</w:t>
         </w:r>
         <w:r>
           <w:rPr>
@@ -2063,7 +2063,7 @@
     </w:p>
     <w:p>
       <w:pPr>
-        <w:pStyle w:val="TOC3"/>
+        <w:pStyle w:val="TOC2"/>
         <w:tabs>
           <w:tab w:val="right" w:leader="dot" w:pos="9016"/>
         </w:tabs>
@@ -2077,13 +2077,13 @@
           <w14:ligatures w14:val="standardContextual"/>
         </w:rPr>
       </w:pPr>
-      <w:hyperlink w:anchor="_Toc222839150" w:history="1">
+      <w:hyperlink w:anchor="_Toc224572972" w:history="1">
         <w:r>
           <w:rPr>
             <w:rStyle w:val="Hyperlink"/>
             <w:noProof/>
           </w:rPr>
-          <w:t>Pressure</w:t>
+          <w:t>Future Development Considerations</w:t>
         </w:r>
         <w:r>
           <w:rPr>
@@ -2101,7 +2101,7 @@
           <w:rPr>
             <w:noProof/>
           </w:rPr>
-          <w:instrText xml:space="preserve"> PAGEREF _Toc222839150 \h </w:instrText>
+          <w:instrText xml:space="preserve"> PAGEREF _Toc224572972 \h </w:instrText>
         </w:r>
         <w:r>
           <w:rPr>
@@ -2118,7 +2118,7 @@
           <w:rPr>
             <w:noProof/>
           </w:rPr>
-          <w:t>11</w:t>
+          <w:t>13</w:t>
         </w:r>
         <w:r>
           <w:rPr>
@@ -2130,7 +2130,7 @@
     </w:p>
     <w:p>
       <w:pPr>
-        <w:pStyle w:val="TOC3"/>
+        <w:pStyle w:val="TOC1"/>
         <w:tabs>
           <w:tab w:val="right" w:leader="dot" w:pos="9016"/>
         </w:tabs>
@@ -2144,13 +2144,13 @@
           <w14:ligatures w14:val="standardContextual"/>
         </w:rPr>
       </w:pPr>
-      <w:hyperlink w:anchor="_Toc222839151" w:history="1">
+      <w:hyperlink w:anchor="_Toc224572973" w:history="1">
         <w:r>
           <w:rPr>
             <w:rStyle w:val="Hyperlink"/>
             <w:noProof/>
           </w:rPr>
-          <w:t>Viscosity</w:t>
+          <w:t>Conclusion and Reflection</w:t>
         </w:r>
         <w:r>
           <w:rPr>
@@ -2168,7 +2168,7 @@
           <w:rPr>
             <w:noProof/>
           </w:rPr>
-          <w:instrText xml:space="preserve"> PAGEREF _Toc222839151 \h </w:instrText>
+          <w:instrText xml:space="preserve"> PAGEREF _Toc224572973 \h </w:instrText>
         </w:r>
         <w:r>
           <w:rPr>
@@ -2185,7 +2185,7 @@
           <w:rPr>
             <w:noProof/>
           </w:rPr>
-          <w:t>11</w:t>
+          <w:t>14</w:t>
         </w:r>
         <w:r>
           <w:rPr>
@@ -2197,7 +2197,7 @@
     </w:p>
     <w:p>
       <w:pPr>
-        <w:pStyle w:val="TOC3"/>
+        <w:pStyle w:val="TOC1"/>
         <w:tabs>
           <w:tab w:val="right" w:leader="dot" w:pos="9016"/>
         </w:tabs>
@@ -2211,14 +2211,7 @@
           <w14:ligatures w14:val="standardContextual"/>
         </w:rPr>
       </w:pPr>
-      <w:hyperlink w:anchor="_Toc222839152" w:history="1">
-        <w:r>
-          <w:rPr>
-            <w:rStyle w:val="Hyperlink"/>
-            <w:noProof/>
-          </w:rPr>
-          <w:t>Surface tension</w:t>
-        </w:r>
+      <w:hyperlink w:anchor="_Toc224572974" w:history="1">
         <w:r>
           <w:rPr>
             <w:noProof/>
@@ -2235,7 +2228,7 @@
           <w:rPr>
             <w:noProof/>
           </w:rPr>
-          <w:instrText xml:space="preserve"> PAGEREF _Toc222839152 \h </w:instrText>
+          <w:instrText xml:space="preserve"> PAGEREF _Toc224572974 \h </w:instrText>
         </w:r>
         <w:r>
           <w:rPr>
@@ -2252,7 +2245,7 @@
           <w:rPr>
             <w:noProof/>
           </w:rPr>
-          <w:t>11</w:t>
+          <w:t>15</w:t>
         </w:r>
         <w:r>
           <w:rPr>
@@ -2278,13 +2271,13 @@
           <w14:ligatures w14:val="standardContextual"/>
         </w:rPr>
       </w:pPr>
-      <w:hyperlink w:anchor="_Toc222839153" w:history="1">
+      <w:hyperlink w:anchor="_Toc224572975" w:history="1">
         <w:r>
           <w:rPr>
             <w:rStyle w:val="Hyperlink"/>
             <w:noProof/>
           </w:rPr>
-          <w:t>Conclusion and Reflection</w:t>
+          <w:t>References</w:t>
         </w:r>
         <w:r>
           <w:rPr>
@@ -2302,7 +2295,7 @@
           <w:rPr>
             <w:noProof/>
           </w:rPr>
-          <w:instrText xml:space="preserve"> PAGEREF _Toc222839153 \h </w:instrText>
+          <w:instrText xml:space="preserve"> PAGEREF _Toc224572975 \h </w:instrText>
         </w:r>
         <w:r>
           <w:rPr>
@@ -2319,7 +2312,7 @@
           <w:rPr>
             <w:noProof/>
           </w:rPr>
-          <w:t>12</w:t>
+          <w:t>16</w:t>
         </w:r>
         <w:r>
           <w:rPr>
@@ -2332,6 +2325,35 @@
     <w:p>
       <w:pPr>
         <w:pStyle w:val="TOC1"/>
+        <w:tabs>
+          <w:tab w:val="right" w:leader="dot" w:pos="9015"/>
+        </w:tabs>
+      </w:pPr>
+      <w:r>
+        <w:fldChar w:fldCharType="end"/>
+      </w:r>
+    </w:p>
+    <w:p>
+      <w:pPr>
+        <w:pStyle w:val="TOC3"/>
+        <w:tabs>
+          <w:tab w:val="right" w:leader="dot" w:pos="9016"/>
+        </w:tabs>
+      </w:pPr>
+    </w:p>
+    <w:p>
+      <w:pPr>
+        <w:pStyle w:val="Heading2"/>
+      </w:pPr>
+      <w:bookmarkStart w:id="9" w:name="_Toc224572950"/>
+      <w:r>
+        <w:t>Table of Figures</w:t>
+      </w:r>
+      <w:bookmarkEnd w:id="9"/>
+    </w:p>
+    <w:p>
+      <w:pPr>
+        <w:pStyle w:val="TableofFigures"/>
         <w:tabs>
           <w:tab w:val="right" w:leader="dot" w:pos="9016"/>
         </w:tabs>
@@ -2345,52 +2367,77 @@
           <w14:ligatures w14:val="standardContextual"/>
         </w:rPr>
       </w:pPr>
-      <w:hyperlink w:anchor="_Toc222839154" w:history="1">
+      <w:r>
+        <w:fldChar w:fldCharType="begin"/>
+      </w:r>
+      <w:r>
+        <w:instrText xml:space="preserve"> TOC \h \z \c "Figure" </w:instrText>
+      </w:r>
+      <w:r>
+        <w:fldChar w:fldCharType="separate"/>
+      </w:r>
+      <w:hyperlink w:anchor="_Toc224571839" w:history="1">
         <w:r>
           <w:rPr>
             <w:rStyle w:val="Hyperlink"/>
             <w:noProof/>
           </w:rPr>
-          <w:t>References</w:t>
-        </w:r>
-        <w:r>
-          <w:rPr>
-            <w:noProof/>
+          <w:t xml:space="preserve">Figure 1 The three reasons why water technologists use advanced CFD </w:t>
+        </w:r>
+        <w:r>
+          <w:rPr>
+            <w:rStyle w:val="Hyperlink"/>
+            <w:noProof/>
+            <w:highlight w:val="yellow"/>
+            <w:lang w:val="en-US"/>
+          </w:rPr>
+          <w:t>(Audenaert, 2023)</w:t>
+        </w:r>
+        <w:r>
+          <w:rPr>
+            <w:noProof/>
+            <w:webHidden/>
           </w:rPr>
           <w:tab/>
         </w:r>
         <w:r>
           <w:rPr>
             <w:noProof/>
+            <w:webHidden/>
           </w:rPr>
           <w:fldChar w:fldCharType="begin"/>
         </w:r>
         <w:r>
           <w:rPr>
             <w:noProof/>
-          </w:rPr>
-          <w:instrText xml:space="preserve"> PAGEREF _Toc222839154 \h </w:instrText>
-        </w:r>
-        <w:r>
-          <w:rPr>
-            <w:noProof/>
-          </w:rPr>
-        </w:r>
-        <w:r>
-          <w:rPr>
-            <w:noProof/>
+            <w:webHidden/>
+          </w:rPr>
+          <w:instrText xml:space="preserve"> PAGEREF _Toc224571839 \h </w:instrText>
+        </w:r>
+        <w:r>
+          <w:rPr>
+            <w:noProof/>
+            <w:webHidden/>
+          </w:rPr>
+        </w:r>
+        <w:r>
+          <w:rPr>
+            <w:noProof/>
+            <w:webHidden/>
           </w:rPr>
           <w:fldChar w:fldCharType="separate"/>
         </w:r>
         <w:r>
           <w:rPr>
             <w:noProof/>
-          </w:rPr>
-          <w:t>13</w:t>
-        </w:r>
-        <w:r>
-          <w:rPr>
-            <w:noProof/>
+            <w:webHidden/>
+          </w:rPr>
+          <w:t>6</w:t>
+        </w:r>
+        <w:r>
+          <w:rPr>
+            <w:noProof/>
+            <w:webHidden/>
           </w:rPr>
           <w:fldChar w:fldCharType="end"/>
         </w:r>
@@ -2398,7 +2445,7 @@
     </w:p>
     <w:p>
       <w:pPr>
-        <w:pStyle w:val="TOC1"/>
+        <w:pStyle w:val="TableofFigures"/>
         <w:tabs>
           <w:tab w:val="right" w:leader="dot" w:pos="9016"/>
         </w:tabs>
@@ -2412,85 +2459,63 @@
           <w14:ligatures w14:val="standardContextual"/>
         </w:rPr>
       </w:pPr>
-      <w:hyperlink w:anchor="_Toc222839155" w:history="1">
+      <w:hyperlink w:anchor="_Toc224571840" w:history="1">
         <w:r>
           <w:rPr>
             <w:rStyle w:val="Hyperlink"/>
             <w:noProof/>
           </w:rPr>
-          <w:t>References</w:t>
-        </w:r>
-        <w:r>
-          <w:rPr>
-            <w:noProof/>
+          <w:t>Figure 2 Visualisation of water flows after improving the design using CFD technology (AM Team, 2018)</w:t>
+        </w:r>
+        <w:r>
+          <w:rPr>
+            <w:noProof/>
+            <w:webHidden/>
           </w:rPr>
           <w:tab/>
         </w:r>
         <w:r>
           <w:rPr>
             <w:noProof/>
+            <w:webHidden/>
           </w:rPr>
           <w:fldChar w:fldCharType="begin"/>
         </w:r>
         <w:r>
           <w:rPr>
             <w:noProof/>
-          </w:rPr>
-          <w:instrText xml:space="preserve"> PAGEREF _Toc222839155 \h </w:instrText>
-        </w:r>
-        <w:r>
-          <w:rPr>
-            <w:noProof/>
-          </w:rPr>
-        </w:r>
-        <w:r>
-          <w:rPr>
-            <w:noProof/>
+            <w:webHidden/>
+          </w:rPr>
+          <w:instrText xml:space="preserve"> PAGEREF _Toc224571840 \h </w:instrText>
+        </w:r>
+        <w:r>
+          <w:rPr>
+            <w:noProof/>
+            <w:webHidden/>
+          </w:rPr>
+        </w:r>
+        <w:r>
+          <w:rPr>
+            <w:noProof/>
+            <w:webHidden/>
           </w:rPr>
           <w:fldChar w:fldCharType="separate"/>
         </w:r>
         <w:r>
           <w:rPr>
             <w:noProof/>
-          </w:rPr>
-          <w:t>14</w:t>
-        </w:r>
-        <w:r>
-          <w:rPr>
-            <w:noProof/>
+            <w:webHidden/>
+          </w:rPr>
+          <w:t>7</w:t>
+        </w:r>
+        <w:r>
+          <w:rPr>
+            <w:noProof/>
+            <w:webHidden/>
           </w:rPr>
           <w:fldChar w:fldCharType="end"/>
         </w:r>
       </w:hyperlink>
-    </w:p>
-    <w:p>
-      <w:pPr>
-        <w:pStyle w:val="TOC1"/>
-        <w:tabs>
-          <w:tab w:val="right" w:leader="dot" w:pos="9015"/>
-        </w:tabs>
-      </w:pPr>
-      <w:r>
-        <w:fldChar w:fldCharType="end"/>
-      </w:r>
-    </w:p>
-    <w:p>
-      <w:pPr>
-        <w:pStyle w:val="TOC3"/>
-        <w:tabs>
-          <w:tab w:val="right" w:leader="dot" w:pos="9016"/>
-        </w:tabs>
-      </w:pPr>
-    </w:p>
-    <w:p>
-      <w:pPr>
-        <w:pStyle w:val="Heading2"/>
-      </w:pPr>
-      <w:bookmarkStart w:id="9" w:name="_Toc222839128"/>
-      <w:r>
-        <w:t>Table of Figures</w:t>
-      </w:r>
-      <w:bookmarkEnd w:id="9"/>
     </w:p>
     <w:p>
       <w:pPr>
@@ -2508,31 +2533,13 @@
           <w14:ligatures w14:val="standardContextual"/>
         </w:rPr>
       </w:pPr>
-      <w:r>
-        <w:fldChar w:fldCharType="begin"/>
-      </w:r>
-      <w:r>
-        <w:instrText xml:space="preserve"> TOC \h \z \c "Figure" </w:instrText>
-      </w:r>
-      <w:r>
-        <w:fldChar w:fldCharType="separate"/>
-      </w:r>
-      <w:hyperlink w:anchor="_Toc222949275" w:history="1">
+      <w:hyperlink w:anchor="_Toc224571841" w:history="1">
         <w:r>
           <w:rPr>
             <w:rStyle w:val="Hyperlink"/>
             <w:noProof/>
           </w:rPr>
-          <w:t xml:space="preserve">Figure 1 The three reasons why water technologists use advanced CFD </w:t>
-        </w:r>
-        <w:r>
-          <w:rPr>
-            <w:rStyle w:val="Hyperlink"/>
-            <w:noProof/>
-            <w:highlight w:val="yellow"/>
-            <w:lang w:val="en-US"/>
-          </w:rPr>
-          <w:t>(Audenaert, 2023)</w:t>
+          <w:t>Figure 3 Visualisation of pressure distribution and velocity field around the F1 car (Abdelkarim, 2025)</w:t>
         </w:r>
         <w:r>
           <w:rPr>
@@ -2553,7 +2560,7 @@
             <w:noProof/>
             <w:webHidden/>
           </w:rPr>
-          <w:instrText xml:space="preserve"> PAGEREF _Toc222949275 \h </w:instrText>
+          <w:instrText xml:space="preserve"> PAGEREF _Toc224571841 \h </w:instrText>
         </w:r>
         <w:r>
           <w:rPr>
@@ -2573,7 +2580,7 @@
             <w:noProof/>
             <w:webHidden/>
           </w:rPr>
-          <w:t>6</w:t>
+          <w:t>8</w:t>
         </w:r>
         <w:r>
           <w:rPr>
@@ -2600,155 +2607,7 @@
           <w14:ligatures w14:val="standardContextual"/>
         </w:rPr>
       </w:pPr>
-      <w:hyperlink w:anchor="_Toc222949276" w:history="1">
-        <w:r>
-          <w:rPr>
-            <w:rStyle w:val="Hyperlink"/>
-            <w:noProof/>
-          </w:rPr>
-          <w:t>Figure 2 Visualisation of water flows after improving the design using CFD technology (AM Team, 2018)</w:t>
-        </w:r>
-        <w:r>
-          <w:rPr>
-            <w:noProof/>
-            <w:webHidden/>
-          </w:rPr>
-          <w:tab/>
-        </w:r>
-        <w:r>
-          <w:rPr>
-            <w:noProof/>
-            <w:webHidden/>
-          </w:rPr>
-          <w:fldChar w:fldCharType="begin"/>
-        </w:r>
-        <w:r>
-          <w:rPr>
-            <w:noProof/>
-            <w:webHidden/>
-          </w:rPr>
-          <w:instrText xml:space="preserve"> PAGEREF _Toc222949276 \h </w:instrText>
-        </w:r>
-        <w:r>
-          <w:rPr>
-            <w:noProof/>
-            <w:webHidden/>
-          </w:rPr>
-        </w:r>
-        <w:r>
-          <w:rPr>
-            <w:noProof/>
-            <w:webHidden/>
-          </w:rPr>
-          <w:fldChar w:fldCharType="separate"/>
-        </w:r>
-        <w:r>
-          <w:rPr>
-            <w:noProof/>
-            <w:webHidden/>
-          </w:rPr>
-          <w:t>7</w:t>
-        </w:r>
-        <w:r>
-          <w:rPr>
-            <w:noProof/>
-            <w:webHidden/>
-          </w:rPr>
-          <w:fldChar w:fldCharType="end"/>
-        </w:r>
-      </w:hyperlink>
-    </w:p>
-    <w:p>
-      <w:pPr>
-        <w:pStyle w:val="TableofFigures"/>
-        <w:tabs>
-          <w:tab w:val="right" w:leader="dot" w:pos="9016"/>
-        </w:tabs>
-        <w:rPr>
-          <w:rFonts w:asciiTheme="minorHAnsi" w:eastAsiaTheme="minorEastAsia" w:hAnsiTheme="minorHAnsi" w:cstheme="minorBidi"/>
-          <w:noProof/>
-          <w:kern w:val="2"/>
-          <w:sz w:val="24"/>
-          <w:szCs w:val="24"/>
-          <w:lang w:eastAsia="en-GB"/>
-          <w14:ligatures w14:val="standardContextual"/>
-        </w:rPr>
-      </w:pPr>
-      <w:hyperlink w:anchor="_Toc222949277" w:history="1">
-        <w:r>
-          <w:rPr>
-            <w:rStyle w:val="Hyperlink"/>
-            <w:noProof/>
-          </w:rPr>
-          <w:t>Figure 3 Visualisation of pressure distribution and velocity field around the F1 car (Abdelkarim, 2025)</w:t>
-        </w:r>
-        <w:r>
-          <w:rPr>
-            <w:noProof/>
-            <w:webHidden/>
-          </w:rPr>
-          <w:tab/>
-        </w:r>
-        <w:r>
-          <w:rPr>
-            <w:noProof/>
-            <w:webHidden/>
-          </w:rPr>
-          <w:fldChar w:fldCharType="begin"/>
-        </w:r>
-        <w:r>
-          <w:rPr>
-            <w:noProof/>
-            <w:webHidden/>
-          </w:rPr>
-          <w:instrText xml:space="preserve"> PAGEREF _Toc222949277 \h </w:instrText>
-        </w:r>
-        <w:r>
-          <w:rPr>
-            <w:noProof/>
-            <w:webHidden/>
-          </w:rPr>
-        </w:r>
-        <w:r>
-          <w:rPr>
-            <w:noProof/>
-            <w:webHidden/>
-          </w:rPr>
-          <w:fldChar w:fldCharType="separate"/>
-        </w:r>
-        <w:r>
-          <w:rPr>
-            <w:noProof/>
-            <w:webHidden/>
-          </w:rPr>
-          <w:t>8</w:t>
-        </w:r>
-        <w:r>
-          <w:rPr>
-            <w:noProof/>
-            <w:webHidden/>
-          </w:rPr>
-          <w:fldChar w:fldCharType="end"/>
-        </w:r>
-      </w:hyperlink>
-    </w:p>
-    <w:p>
-      <w:pPr>
-        <w:pStyle w:val="TableofFigures"/>
-        <w:tabs>
-          <w:tab w:val="right" w:leader="dot" w:pos="9016"/>
-        </w:tabs>
-        <w:rPr>
-          <w:rFonts w:asciiTheme="minorHAnsi" w:eastAsiaTheme="minorEastAsia" w:hAnsiTheme="minorHAnsi" w:cstheme="minorBidi"/>
-          <w:noProof/>
-          <w:kern w:val="2"/>
-          <w:sz w:val="24"/>
-          <w:szCs w:val="24"/>
-          <w:lang w:eastAsia="en-GB"/>
-          <w14:ligatures w14:val="standardContextual"/>
-        </w:rPr>
-      </w:pPr>
-      <w:hyperlink w:anchor="_Toc222949278" w:history="1">
+      <w:hyperlink w:anchor="_Toc224571842" w:history="1">
         <w:r>
           <w:rPr>
             <w:rStyle w:val="Hyperlink"/>
@@ -2784,7 +2643,7 @@
             <w:noProof/>
             <w:webHidden/>
           </w:rPr>
-          <w:instrText xml:space="preserve"> PAGEREF _Toc222949278 \h </w:instrText>
+          <w:instrText xml:space="preserve"> PAGEREF _Toc224571842 \h </w:instrText>
         </w:r>
         <w:r>
           <w:rPr>
@@ -2817,6 +2676,7 @@
     </w:p>
     <w:p>
       <w:r>
+        <w:lastRenderedPageBreak/>
         <w:fldChar w:fldCharType="end"/>
       </w:r>
     </w:p>
@@ -2844,9 +2704,9 @@
       <w:pPr>
         <w:pStyle w:val="Heading1"/>
       </w:pPr>
-      <w:bookmarkStart w:id="10" w:name="_Toc222839129"/>
+      <w:bookmarkStart w:id="10" w:name="_Toc224572951"/>
+      <w:bookmarkEnd w:id="6"/>
       <w:bookmarkEnd w:id="7"/>
-      <w:bookmarkEnd w:id="8"/>
       <w:r>
         <w:lastRenderedPageBreak/>
         <w:t>Introduction</w:t>
@@ -2921,6 +2781,7 @@
           <w:id w:val="1226797730"/>
           <w:citation/>
         </w:sdtPr>
+        <w:sdtEndPr/>
         <w:sdtContent>
           <w:r>
             <w:fldChar w:fldCharType="begin"/>
@@ -2933,6 +2794,13 @@
           </w:r>
           <w:r>
             <w:fldChar w:fldCharType="separate"/>
+          </w:r>
+          <w:r>
+            <w:rPr>
+              <w:noProof/>
+              <w:lang w:val="en-US"/>
+            </w:rPr>
+            <w:t>(</w:t>
           </w:r>
           <w:r>
             <w:rPr>
@@ -2940,7 +2808,7 @@
               <w:highlight w:val="yellow"/>
               <w:lang w:val="en-US"/>
             </w:rPr>
-            <w:t>(Schroder</w:t>
+            <w:t>Schroder</w:t>
           </w:r>
           <w:r>
             <w:rPr>
@@ -3075,7 +2943,13 @@
         <w:t xml:space="preserve"> </w:t>
       </w:r>
       <w:r>
-        <w:t>identifying methods to improve computational efficiency and enable the modelling of larger, more complex systems.</w:t>
+        <w:t xml:space="preserve">identifying methods to improve computational efficiency and enable the modelling of </w:t>
+      </w:r>
+      <w:r>
+        <w:t>efficient and realistic</w:t>
+      </w:r>
+      <w:r>
+        <w:t xml:space="preserve"> systems.</w:t>
       </w:r>
       <w:r>
         <w:t xml:space="preserve"> </w:t>
@@ -3105,39 +2979,51 @@
         <w:rPr>
           <w:color w:val="EE0000"/>
         </w:rPr>
-        <w:t>Euler-</w:t>
-      </w:r>
-      <w:proofErr w:type="spellStart"/>
+        <w:t>Euler-Lagrangian method</w:t>
+      </w:r>
       <w:r>
         <w:rPr>
           <w:color w:val="EE0000"/>
         </w:rPr>
-        <w:t>Lagrangian</w:t>
-      </w:r>
-      <w:proofErr w:type="spellEnd"/>
+        <w:t>???</w:t>
+      </w:r>
       <w:r>
         <w:rPr>
           <w:color w:val="EE0000"/>
         </w:rPr>
-        <w:t xml:space="preserve"> method</w:t>
-      </w:r>
+        <w:t>(not implemented mesh based, purely Lagrangian currently</w:t>
+      </w:r>
+      <w:proofErr w:type="gramStart"/>
       <w:r>
         <w:rPr>
           <w:color w:val="EE0000"/>
         </w:rPr>
-        <w:t>????</w:t>
-      </w:r>
-      <w:r>
-        <w:t xml:space="preserve">, with each </w:t>
+        <w:t>)</w:t>
+      </w:r>
+      <w:r>
+        <w:rPr>
+          <w:color w:val="EE0000"/>
+        </w:rPr>
+        <w:t>?</w:t>
+      </w:r>
+      <w:r>
+        <w:t>,</w:t>
+      </w:r>
+      <w:proofErr w:type="gramEnd"/>
+      <w:r>
+        <w:t xml:space="preserve"> with each </w:t>
       </w:r>
       <w:r>
         <w:t>particle</w:t>
       </w:r>
       <w:r>
-        <w:t xml:space="preserve"> being simulated individually while also using a grid-based structure to more efficiently </w:t>
-      </w:r>
-      <w:r>
-        <w:t>process the required interactions.</w:t>
+        <w:t xml:space="preserve"> being simulated individually </w:t>
+      </w:r>
+      <w:r>
+        <w:t>to accurately process</w:t>
+      </w:r>
+      <w:r>
+        <w:t xml:space="preserve"> the required interactions.</w:t>
       </w:r>
     </w:p>
     <w:p/>
@@ -3148,13 +3034,12 @@
           <w:color w:val="EE0000"/>
         </w:rPr>
       </w:pPr>
-      <w:bookmarkStart w:id="11" w:name="_Toc222839130"/>
-      <w:bookmarkStart w:id="12" w:name="_Toc88436908"/>
+      <w:bookmarkStart w:id="11" w:name="_Toc88436908"/>
+      <w:bookmarkStart w:id="12" w:name="_Toc224572952"/>
       <w:r>
         <w:lastRenderedPageBreak/>
         <w:t>Context</w:t>
       </w:r>
-      <w:bookmarkEnd w:id="11"/>
       <w:r>
         <w:t xml:space="preserve"> – </w:t>
       </w:r>
@@ -3164,12 +3049,19 @@
         </w:rPr>
         <w:t>876w</w:t>
       </w:r>
+      <w:r>
+        <w:rPr>
+          <w:color w:val="EE0000"/>
+        </w:rPr>
+        <w:t>ords</w:t>
+      </w:r>
+      <w:bookmarkEnd w:id="12"/>
     </w:p>
     <w:p>
       <w:pPr>
         <w:pStyle w:val="Heading2"/>
       </w:pPr>
-      <w:bookmarkStart w:id="13" w:name="_Toc222839131"/>
+      <w:bookmarkStart w:id="13" w:name="_Toc224572953"/>
       <w:r>
         <w:t xml:space="preserve">CFD: </w:t>
       </w:r>
@@ -3198,7 +3090,58 @@
         <w:t xml:space="preserve"> Auden</w:t>
       </w:r>
       <w:r>
-        <w:t>aert which outlines these.</w:t>
+        <w:t xml:space="preserve">aert </w:t>
+      </w:r>
+      <w:sdt>
+        <w:sdtPr>
+          <w:id w:val="352766521"/>
+          <w:citation/>
+        </w:sdtPr>
+        <w:sdtContent>
+          <w:r>
+            <w:fldChar w:fldCharType="begin"/>
+          </w:r>
+          <w:r>
+            <w:rPr>
+              <w:lang w:val="en-US"/>
+            </w:rPr>
+            <w:instrText xml:space="preserve">CITATION Aud23 \n  \l 1033 </w:instrText>
+          </w:r>
+          <w:r>
+            <w:fldChar w:fldCharType="separate"/>
+          </w:r>
+          <w:r>
+            <w:rPr>
+              <w:noProof/>
+              <w:lang w:val="en-US"/>
+            </w:rPr>
+            <w:t>(</w:t>
+          </w:r>
+          <w:r>
+            <w:rPr>
+              <w:noProof/>
+              <w:highlight w:val="yellow"/>
+              <w:lang w:val="en-US"/>
+            </w:rPr>
+            <w:t>2023</w:t>
+          </w:r>
+          <w:r>
+            <w:rPr>
+              <w:noProof/>
+              <w:lang w:val="en-US"/>
+            </w:rPr>
+            <w:t>)</w:t>
+          </w:r>
+          <w:r>
+            <w:fldChar w:fldCharType="end"/>
+          </w:r>
+        </w:sdtContent>
+      </w:sdt>
+      <w:r>
+        <w:t xml:space="preserve"> </w:t>
+      </w:r>
+      <w:r>
+        <w:t>which outlines these.</w:t>
       </w:r>
     </w:p>
     <w:p/>
@@ -3264,7 +3207,7 @@
       <w:pPr>
         <w:pStyle w:val="Caption"/>
       </w:pPr>
-      <w:bookmarkStart w:id="14" w:name="_Toc222949275"/>
+      <w:bookmarkStart w:id="14" w:name="_Toc224571839"/>
       <w:r>
         <w:t xml:space="preserve">Figure </w:t>
       </w:r>
@@ -3347,7 +3290,7 @@
       <w:pPr>
         <w:pStyle w:val="Heading3"/>
       </w:pPr>
-      <w:bookmarkStart w:id="15" w:name="_Toc222839132"/>
+      <w:bookmarkStart w:id="15" w:name="_Toc224572954"/>
       <w:r>
         <w:t>Saving Time</w:t>
       </w:r>
@@ -3389,7 +3332,7 @@
       <w:pPr>
         <w:pStyle w:val="Heading3"/>
       </w:pPr>
-      <w:bookmarkStart w:id="16" w:name="_Toc222839133"/>
+      <w:bookmarkStart w:id="16" w:name="_Toc224572955"/>
       <w:r>
         <w:t>Saving Costs</w:t>
       </w:r>
@@ -3419,7 +3362,13 @@
         <w:t xml:space="preserve">testing placement of pumps, and mixers in a larger water system to determine </w:t>
       </w:r>
       <w:r>
-        <w:t xml:space="preserve">where, and how many are required to achieve the desired outcome, this could allow reducing the total amount of pumps required, or determining at which flow rates a given pump can be switched off to reduce </w:t>
+        <w:t>where, and how many are required to achieve the desired outcome, this could allow reducing the total amount of pumps required, or determining at which flow rates a given pump can be switched off</w:t>
+      </w:r>
+      <w:r>
+        <w:t xml:space="preserve"> – this helps to</w:t>
+      </w:r>
+      <w:r>
+        <w:t xml:space="preserve"> reduce </w:t>
       </w:r>
       <w:r>
         <w:rPr>
@@ -3431,7 +3380,7 @@
         <w:rPr>
           <w:lang w:val="en-US"/>
         </w:rPr>
-        <w:t xml:space="preserve">ital Expenditure </w:t>
+        <w:t xml:space="preserve">ital </w:t>
       </w:r>
       <w:r>
         <w:rPr>
@@ -3468,7 +3417,7 @@
       <w:pPr>
         <w:pStyle w:val="Heading3"/>
       </w:pPr>
-      <w:bookmarkStart w:id="17" w:name="_Toc222839134"/>
+      <w:bookmarkStart w:id="17" w:name="_Toc224572956"/>
       <w:r>
         <w:t>Obtaining Optimal Processes</w:t>
       </w:r>
@@ -3552,10 +3501,12 @@
       <w:pPr>
         <w:pStyle w:val="Heading3"/>
       </w:pPr>
+      <w:bookmarkStart w:id="18" w:name="_Toc224572957"/>
       <w:r>
         <w:lastRenderedPageBreak/>
         <w:t>Flexibility</w:t>
       </w:r>
+      <w:bookmarkEnd w:id="18"/>
     </w:p>
     <w:p>
       <w:r>
@@ -3596,21 +3547,21 @@
       <w:pPr>
         <w:pStyle w:val="Heading2"/>
       </w:pPr>
-      <w:bookmarkStart w:id="18" w:name="_Toc222839136"/>
+      <w:bookmarkStart w:id="19" w:name="_Toc224572958"/>
       <w:r>
         <w:t>Use Cases of CFD</w:t>
       </w:r>
-      <w:bookmarkEnd w:id="18"/>
+      <w:bookmarkEnd w:id="19"/>
     </w:p>
     <w:p>
       <w:pPr>
         <w:pStyle w:val="Heading3"/>
       </w:pPr>
-      <w:bookmarkStart w:id="19" w:name="_Toc222839137"/>
+      <w:bookmarkStart w:id="20" w:name="_Toc224572959"/>
       <w:r>
         <w:t>HVAC</w:t>
       </w:r>
-      <w:bookmarkEnd w:id="19"/>
+      <w:bookmarkEnd w:id="20"/>
     </w:p>
     <w:p>
       <w:r>
@@ -3651,6 +3602,7 @@
           <w:id w:val="1718555527"/>
           <w:citation/>
         </w:sdtPr>
+        <w:sdtEndPr/>
         <w:sdtContent>
           <w:r>
             <w:rPr>
@@ -3715,18 +3667,24 @@
         <w:t>provides value in reducing costs to operate and maintain building systems</w:t>
       </w:r>
       <w:r>
-        <w:t xml:space="preserve">, and by reducing the energy cost, this reduces the impact to both the business and environment. </w:t>
+        <w:t xml:space="preserve">, and by reducing the energy cost, this reduces the impact to both the business and </w:t>
+      </w:r>
+      <w:r>
+        <w:t xml:space="preserve">the natural </w:t>
+      </w:r>
+      <w:r>
+        <w:t xml:space="preserve">environment. </w:t>
       </w:r>
     </w:p>
     <w:p>
       <w:pPr>
         <w:pStyle w:val="Heading3"/>
       </w:pPr>
-      <w:bookmarkStart w:id="20" w:name="_Toc222839138"/>
+      <w:bookmarkStart w:id="21" w:name="_Toc224572960"/>
       <w:r>
         <w:t>Water and wastewater treatment</w:t>
       </w:r>
-      <w:bookmarkEnd w:id="20"/>
+      <w:bookmarkEnd w:id="21"/>
     </w:p>
     <w:p>
       <w:r>
@@ -3895,7 +3853,7 @@
       <w:pPr>
         <w:pStyle w:val="Caption"/>
       </w:pPr>
-      <w:bookmarkStart w:id="21" w:name="_Toc222949276"/>
+      <w:bookmarkStart w:id="22" w:name="_Toc224571840"/>
       <w:r>
         <w:t xml:space="preserve">Figure </w:t>
       </w:r>
@@ -3925,6 +3883,7 @@
           <w:id w:val="-1581983855"/>
           <w:citation/>
         </w:sdtPr>
+        <w:sdtEndPr/>
         <w:sdtContent>
           <w:r>
             <w:fldChar w:fldCharType="begin"/>
@@ -3946,18 +3905,18 @@
           </w:r>
         </w:sdtContent>
       </w:sdt>
-      <w:bookmarkEnd w:id="21"/>
+      <w:bookmarkEnd w:id="22"/>
     </w:p>
     <w:p>
       <w:pPr>
         <w:pStyle w:val="Heading3"/>
       </w:pPr>
-      <w:bookmarkStart w:id="22" w:name="_Toc222839139"/>
+      <w:bookmarkStart w:id="23" w:name="_Toc224572961"/>
       <w:r>
         <w:lastRenderedPageBreak/>
         <w:t>Vehicle Aerodynamics</w:t>
       </w:r>
-      <w:bookmarkEnd w:id="22"/>
+      <w:bookmarkEnd w:id="23"/>
     </w:p>
     <w:p>
       <w:r>
@@ -3971,6 +3930,7 @@
           <w:id w:val="1769816644"/>
           <w:citation/>
         </w:sdtPr>
+        <w:sdtEndPr/>
         <w:sdtContent>
           <w:r>
             <w:rPr>
@@ -4110,7 +4070,7 @@
       <w:pPr>
         <w:pStyle w:val="Caption"/>
       </w:pPr>
-      <w:bookmarkStart w:id="23" w:name="_Toc222949277"/>
+      <w:bookmarkStart w:id="24" w:name="_Toc224571841"/>
       <w:r>
         <w:t xml:space="preserve">Figure </w:t>
       </w:r>
@@ -4140,6 +4100,7 @@
           <w:id w:val="-664628595"/>
           <w:citation/>
         </w:sdtPr>
+        <w:sdtEndPr/>
         <w:sdtContent>
           <w:r>
             <w:fldChar w:fldCharType="begin"/>
@@ -4161,17 +4122,17 @@
           </w:r>
         </w:sdtContent>
       </w:sdt>
-      <w:bookmarkEnd w:id="23"/>
+      <w:bookmarkEnd w:id="24"/>
     </w:p>
     <w:p>
       <w:pPr>
         <w:pStyle w:val="Heading2"/>
       </w:pPr>
-      <w:bookmarkStart w:id="24" w:name="_Toc222839140"/>
+      <w:bookmarkStart w:id="25" w:name="_Toc224572962"/>
       <w:r>
         <w:t>Navier-Stokes Equations</w:t>
       </w:r>
-      <w:bookmarkEnd w:id="24"/>
+      <w:bookmarkEnd w:id="25"/>
     </w:p>
     <w:p>
       <w:r>
@@ -4182,6 +4143,7 @@
           <w:id w:val="-1844849807"/>
           <w:citation/>
         </w:sdtPr>
+        <w:sdtEndPr/>
         <w:sdtContent>
           <w:r>
             <w:fldChar w:fldCharType="begin"/>
@@ -4196,7 +4158,20 @@
             <w:rPr>
               <w:noProof/>
             </w:rPr>
-            <w:t>(NASA, 2021)</w:t>
+            <w:t>(</w:t>
+          </w:r>
+          <w:r>
+            <w:rPr>
+              <w:noProof/>
+              <w:highlight w:val="yellow"/>
+            </w:rPr>
+            <w:t>NASA</w:t>
+          </w:r>
+          <w:r>
+            <w:rPr>
+              <w:noProof/>
+            </w:rPr>
+            <w:t>, 2021)</w:t>
           </w:r>
           <w:r>
             <w:fldChar w:fldCharType="end"/>
@@ -4269,7 +4244,7 @@
       <w:pPr>
         <w:pStyle w:val="Caption"/>
       </w:pPr>
-      <w:bookmarkStart w:id="25" w:name="_Toc222949278"/>
+      <w:bookmarkStart w:id="26" w:name="_Toc224571842"/>
       <w:r>
         <w:t xml:space="preserve">Figure </w:t>
       </w:r>
@@ -4343,17 +4318,17 @@
           </w:r>
         </w:sdtContent>
       </w:sdt>
-      <w:bookmarkEnd w:id="25"/>
+      <w:bookmarkEnd w:id="26"/>
     </w:p>
     <w:p>
       <w:pPr>
         <w:pStyle w:val="Heading2"/>
       </w:pPr>
-      <w:bookmarkStart w:id="26" w:name="_Toc222839141"/>
+      <w:bookmarkStart w:id="27" w:name="_Toc224572963"/>
       <w:r>
         <w:t>CFD applications to general Software Engineering</w:t>
       </w:r>
-      <w:bookmarkEnd w:id="26"/>
+      <w:bookmarkEnd w:id="27"/>
     </w:p>
     <w:p>
       <w:pPr>
@@ -4406,171 +4381,27 @@
       <w:pPr>
         <w:pStyle w:val="Heading1"/>
       </w:pPr>
-      <w:bookmarkStart w:id="27" w:name="_Toc222839142"/>
+      <w:bookmarkStart w:id="28" w:name="_Toc224572964"/>
       <w:r>
         <w:lastRenderedPageBreak/>
         <w:t>Prior Approaches</w:t>
       </w:r>
-      <w:bookmarkEnd w:id="27"/>
-    </w:p>
-    <w:p>
-      <w:pPr>
-        <w:pStyle w:val="Quote"/>
-      </w:pPr>
-      <w:r>
-        <w:t xml:space="preserve">Recommended word count: </w:t>
-      </w:r>
-      <w:r>
-        <w:t>700</w:t>
-      </w:r>
-      <w:r>
-        <w:t xml:space="preserve"> words, including any subsections you decide to add.</w:t>
-      </w:r>
-    </w:p>
-    <w:p>
-      <w:pPr>
-        <w:pStyle w:val="Quote"/>
-      </w:pPr>
-      <w:r>
-        <w:t xml:space="preserve">Use this major section to </w:t>
-      </w:r>
-      <w:r>
-        <w:t xml:space="preserve">examine one or more </w:t>
-      </w:r>
-      <w:r>
-        <w:t>approach</w:t>
-      </w:r>
-      <w:r>
-        <w:t xml:space="preserve">es that others have used to address the challenge you are interested in, or similar ones. Ideally you would find multiple approaches so that you can </w:t>
-      </w:r>
-      <w:proofErr w:type="gramStart"/>
-      <w:r>
-        <w:t>compare and contrast</w:t>
-      </w:r>
-      <w:proofErr w:type="gramEnd"/>
-      <w:r>
-        <w:t xml:space="preserve"> them, but you can concentrate on one strategy if you can find enough to say about it.</w:t>
-      </w:r>
-    </w:p>
-    <w:p>
-      <w:pPr>
-        <w:pStyle w:val="Quote"/>
-      </w:pPr>
-      <w:r>
-        <w:t xml:space="preserve">Your sources should be knowledgeable and reliable ones where possible, such as developer logs, but tutorials can be useful (especially if you can compare them or have time to try them to test how well they work). Player speculation as to how a feature is implemented can be </w:t>
-      </w:r>
-      <w:proofErr w:type="gramStart"/>
-      <w:r>
-        <w:t>useful, but</w:t>
-      </w:r>
-      <w:proofErr w:type="gramEnd"/>
-      <w:r>
-        <w:t xml:space="preserve"> should not be your main resource.</w:t>
-      </w:r>
-    </w:p>
-    <w:p>
-      <w:pPr>
-        <w:pStyle w:val="Quote"/>
-      </w:pPr>
-      <w:r>
-        <w:t>If you are struggling to find good enough sources as described above, you may need to adjust the direction of your investigation slightly, finding new aims that can be more easily sourced.</w:t>
-      </w:r>
-    </w:p>
-    <w:p>
-      <w:pPr>
-        <w:pStyle w:val="Quote"/>
-      </w:pPr>
-      <w:r>
-        <w:t xml:space="preserve">Try to understand (and highlight to the reader as appropriate) how these approaches work, and what makes them suitable for use in the context you’ve established. One aim of this section is for you to develop your understanding of these </w:t>
-      </w:r>
-      <w:proofErr w:type="gramStart"/>
-      <w:r>
-        <w:t>techniques, and</w:t>
-      </w:r>
-      <w:proofErr w:type="gramEnd"/>
-      <w:r>
-        <w:t xml:space="preserve"> demonstrate it to a deep level.</w:t>
-      </w:r>
-    </w:p>
-    <w:p>
-      <w:pPr>
-        <w:pStyle w:val="Quote"/>
-      </w:pPr>
-      <w:r>
-        <w:t xml:space="preserve">As you explore one or more approaches, you may comment on how effective they might be for </w:t>
-      </w:r>
-      <w:proofErr w:type="gramStart"/>
-      <w:r>
-        <w:t>you, but</w:t>
-      </w:r>
-      <w:proofErr w:type="gramEnd"/>
-      <w:r>
-        <w:t xml:space="preserve"> note that there are words available for that in the Recommendations section.</w:t>
-      </w:r>
-    </w:p>
-    <w:p>
-      <w:pPr>
-        <w:pStyle w:val="Quote"/>
-      </w:pPr>
-      <w:r>
-        <w:t>You may</w:t>
-      </w:r>
-      <w:r>
-        <w:t xml:space="preserve"> divide the approach into subsections</w:t>
-      </w:r>
-      <w:r>
-        <w:t xml:space="preserve"> (with ‘heading 2’)</w:t>
-      </w:r>
-      <w:r>
-        <w:t xml:space="preserve">, such as your methods for key areas of the project, or for </w:t>
-      </w:r>
-      <w:proofErr w:type="gramStart"/>
-      <w:r>
-        <w:t xml:space="preserve">particular </w:t>
-      </w:r>
-      <w:r>
-        <w:t>aspects</w:t>
-      </w:r>
-      <w:proofErr w:type="gramEnd"/>
-      <w:r>
-        <w:t xml:space="preserve"> of development</w:t>
-      </w:r>
-      <w:r>
-        <w:t>.</w:t>
-      </w:r>
-      <w:r>
-        <w:t xml:space="preserve"> Take care of the total recommended words for the section overall.</w:t>
-      </w:r>
-    </w:p>
-    <w:p>
-      <w:pPr>
-        <w:pStyle w:val="Quote"/>
-        <w:rPr>
-          <w:b/>
-          <w:bCs/>
-        </w:rPr>
-      </w:pPr>
-      <w:r>
-        <w:rPr>
-          <w:b/>
-          <w:bCs/>
-        </w:rPr>
-        <w:t xml:space="preserve">You must reference all your sources in </w:t>
-      </w:r>
-      <w:r>
-        <w:rPr>
-          <w:b/>
-          <w:bCs/>
-        </w:rPr>
-        <w:t>CTR</w:t>
-      </w:r>
-      <w:r>
-        <w:rPr>
-          <w:b/>
-          <w:bCs/>
-        </w:rPr>
-        <w:t xml:space="preserve"> Harvard Style.</w:t>
-      </w:r>
+      <w:r>
+        <w:t xml:space="preserve"> – </w:t>
+      </w:r>
+      <w:r>
+        <w:rPr>
+          <w:color w:val="EE0000"/>
+        </w:rPr>
+        <w:t>8</w:t>
+      </w:r>
+      <w:r>
+        <w:rPr>
+          <w:color w:val="EE0000"/>
+        </w:rPr>
+        <w:t>30words</w:t>
+      </w:r>
+      <w:bookmarkEnd w:id="28"/>
     </w:p>
     <w:p>
       <w:r>
@@ -4602,11 +4433,11 @@
       <w:pPr>
         <w:pStyle w:val="Heading2"/>
       </w:pPr>
-      <w:bookmarkStart w:id="28" w:name="_Toc222839143"/>
+      <w:bookmarkStart w:id="29" w:name="_Toc224572965"/>
       <w:r>
         <w:t>Eulerian Approach</w:t>
       </w:r>
-      <w:bookmarkEnd w:id="28"/>
+      <w:bookmarkEnd w:id="29"/>
       <w:r>
         <w:t xml:space="preserve"> </w:t>
       </w:r>
@@ -4617,19 +4448,15 @@
       </w:r>
     </w:p>
     <w:p>
-      <w:bookmarkStart w:id="29" w:name="_Toc222839144"/>
-      <w:r>
-        <w:t xml:space="preserve">In multiphase modelling, this approach is often implemented using a Euler–Euler formulation. In this model both gas and solid phases are treated as interpenetrating continua rather than as separate </w:t>
-      </w:r>
-      <w:r>
-        <w:lastRenderedPageBreak/>
-        <w:t xml:space="preserve">discrete particles. Instead of tracking each particle individually, the dispersed phase is represented using averaged properties such as volume fraction and momentum exchange terms. Wang et al. </w:t>
+      <w:r>
+        <w:t xml:space="preserve">In multiphase modelling, this approach is often implemented using a Euler–Euler formulation. In this model both gas and solid phases are treated as interpenetrating continua rather than as separate discrete particles. Instead of tracking each particle individually, the dispersed phase is represented using averaged properties such as volume fraction and momentum exchange terms. Wang et al. </w:t>
       </w:r>
       <w:sdt>
         <w:sdtPr>
           <w:id w:val="-790980604"/>
           <w:citation/>
         </w:sdtPr>
+        <w:sdtEndPr/>
         <w:sdtContent>
           <w:r>
             <w:fldChar w:fldCharType="begin"/>
@@ -4693,6 +4520,7 @@
           <w:id w:val="-484160930"/>
           <w:citation/>
         </w:sdtPr>
+        <w:sdtEndPr/>
         <w:sdtContent>
           <w:r>
             <w:fldChar w:fldCharType="begin"/>
@@ -4741,14 +4569,21 @@
       <w:pPr>
         <w:pStyle w:val="Heading2"/>
       </w:pPr>
+      <w:bookmarkStart w:id="30" w:name="_Toc224572966"/>
       <w:r>
         <w:t>Lagrangian Approach</w:t>
       </w:r>
-      <w:bookmarkEnd w:id="29"/>
-    </w:p>
-    <w:p>
-      <w:r>
-        <w:t xml:space="preserve">The Lagrangian method in CFD analyses fluid motion by tracking individual particles as the move through space and time. Instead of focusing on fixed locations, it </w:t>
+      <w:bookmarkEnd w:id="30"/>
+    </w:p>
+    <w:p>
+      <w:r>
+        <w:t>The Lagrangian method in CFD analyses fluid motion by tracking individual particles as the</w:t>
+      </w:r>
+      <w:r>
+        <w:t>y</w:t>
+      </w:r>
+      <w:r>
+        <w:t xml:space="preserve"> move through space and time. Instead of focusing on fixed locations, it </w:t>
       </w:r>
       <w:r>
         <w:t>focuses</w:t>
@@ -4780,6 +4615,7 @@
           <w:id w:val="-431738386"/>
           <w:citation/>
         </w:sdtPr>
+        <w:sdtEndPr/>
         <w:sdtContent>
           <w:r>
             <w:fldChar w:fldCharType="begin"/>
@@ -4831,6 +4667,7 @@
     </w:p>
     <w:p>
       <w:r>
+        <w:lastRenderedPageBreak/>
         <w:t>However, the computational cost increases significantly as the number of particles increases. Unlike the Eulerian model, where complexity depends on mesh size, the Lagrangian method scales directly with particle count. In systems with very high particle density, this can make simulations expensive and less practical for large-scale industrial problems. As particle numbers grow, additional calculations are required for forces such as drag, lift, gravity, and potential collisions, which further increases processing time.</w:t>
       </w:r>
     </w:p>
@@ -4844,14 +4681,19 @@
       <w:pPr>
         <w:pStyle w:val="Heading2"/>
       </w:pPr>
-      <w:bookmarkStart w:id="30" w:name="_Toc222839145"/>
+      <w:bookmarkStart w:id="31" w:name="_Toc224572967"/>
       <w:r>
         <w:t>Lagrangian-Eulerian</w:t>
       </w:r>
       <w:r>
         <w:t xml:space="preserve"> Approach</w:t>
       </w:r>
-      <w:bookmarkEnd w:id="30"/>
+      <w:bookmarkEnd w:id="31"/>
+    </w:p>
+    <w:p>
+      <w:r>
+        <w:t>The Lagrangian–Eulerian approach in Computational Fluid Dynamics (CFD) combines both fixed spatial observation and particle tracking methods. The fluid phase is typically solved using the Eulerian framework on a grid, while discrete particles, droplets, or bubbles are tracked individually using the Lagrangian method. This hybrid technique is especially effective for modelling multiphase flows, sprays, and particle-laden systems. It captures detailed particle behaviour while efficiently resolving the surrounding continuous fluid field.</w:t>
+      </w:r>
     </w:p>
     <w:p>
       <w:pPr>
@@ -4860,359 +4702,225 @@
         </w:rPr>
       </w:pPr>
       <w:r>
-        <w:rPr>
-          <w:color w:val="EE0000"/>
-        </w:rPr>
-        <w:t>CFD-DEM model</w:t>
-      </w:r>
-    </w:p>
-    <w:p>
-      <w:r>
-        <w:t xml:space="preserve">The Lagrangian–Eulerian approach in Computational Fluid Dynamics (CFD) combines both fixed spatial observation and particle tracking methods. The fluid phase is typically solved using the Eulerian framework on a grid, while discrete particles, droplets, or bubbles are tracked individually using the Lagrangian method. This hybrid technique is especially effective for modelling multiphase </w:t>
-      </w:r>
-      <w:r>
-        <w:lastRenderedPageBreak/>
-        <w:t>flows, sprays, and particle-laden systems. It captures detailed particle behaviour while efficiently resolving the surrounding continuous fluid field.</w:t>
-      </w:r>
-    </w:p>
-    <w:p>
-      <w:pPr>
-        <w:rPr>
-          <w:color w:val="EE0000"/>
-        </w:rPr>
-      </w:pPr>
-    </w:p>
-    <w:p>
-      <w:pPr>
-        <w:rPr>
-          <w:color w:val="EE0000"/>
-        </w:rPr>
-      </w:pPr>
-      <w:r>
-        <w:rPr>
-          <w:color w:val="EE0000"/>
-        </w:rPr>
-        <w:t>https://web.archive.org/web/20140725014123/https://docs.nvidia.com/cuda/samples/5_Simulations/particles/doc/particles.pdf</w:t>
+        <w:t>Compute shaders provide a method of performing large numbers of particle calculations directly on the GPU, allowing simulations to run far more efficiently than traditional CPU-based implementations. The CUDA particle simulation sample from NVIDIA</w:t>
+      </w:r>
+      <w:r>
+        <w:t xml:space="preserve"> </w:t>
+      </w:r>
+      <w:sdt>
+        <w:sdtPr>
+          <w:id w:val="-2123447815"/>
+          <w:citation/>
+        </w:sdtPr>
+        <w:sdtContent>
+          <w:r>
+            <w:fldChar w:fldCharType="begin"/>
+          </w:r>
+          <w:r>
+            <w:rPr>
+              <w:lang w:val="en-US"/>
+            </w:rPr>
+            <w:instrText xml:space="preserve">CITATION NVI12 \n  \l 1033 </w:instrText>
+          </w:r>
+          <w:r>
+            <w:fldChar w:fldCharType="separate"/>
+          </w:r>
+          <w:r>
+            <w:rPr>
+              <w:noProof/>
+              <w:lang w:val="en-US"/>
+            </w:rPr>
+            <w:t>(</w:t>
+          </w:r>
+          <w:r>
+            <w:rPr>
+              <w:noProof/>
+              <w:highlight w:val="yellow"/>
+              <w:lang w:val="en-US"/>
+            </w:rPr>
+            <w:t>2012</w:t>
+          </w:r>
+          <w:r>
+            <w:rPr>
+              <w:noProof/>
+              <w:lang w:val="en-US"/>
+            </w:rPr>
+            <w:t>)</w:t>
+          </w:r>
+          <w:r>
+            <w:fldChar w:fldCharType="end"/>
+          </w:r>
+        </w:sdtContent>
+      </w:sdt>
+      <w:r>
+        <w:t xml:space="preserve"> demonstrates how GPU parallelism can be used to update and process thousands of particles simultaneously. By using CUDA to perform operations such as particle sorting and grid binning directly on the GPU, the system can simulate large interacting particle systems at interactive frame rates. This parallel processing capability makes GPU-accelerated particle methods well suited to hybrid Lagrangian–Eulerian simulations where many particles must be updated each frame</w:t>
+      </w:r>
+      <w:r>
+        <w:t>.</w:t>
       </w:r>
     </w:p>
     <w:p>
       <w:pPr>
         <w:pStyle w:val="Heading1"/>
       </w:pPr>
-      <w:bookmarkStart w:id="31" w:name="_Toc222839146"/>
+      <w:bookmarkStart w:id="32" w:name="_Toc224572968"/>
       <w:r>
         <w:lastRenderedPageBreak/>
         <w:t>Recommendations</w:t>
       </w:r>
-      <w:bookmarkEnd w:id="31"/>
-    </w:p>
-    <w:p>
-      <w:pPr>
-        <w:pStyle w:val="Quote"/>
-      </w:pPr>
-      <w:r>
-        <w:t xml:space="preserve">Recommended word count: </w:t>
-      </w:r>
-      <w:r>
-        <w:t>700</w:t>
-      </w:r>
-      <w:r>
-        <w:t xml:space="preserve"> words, including any subsections you decide to add.</w:t>
-      </w:r>
-    </w:p>
-    <w:p>
-      <w:pPr>
-        <w:pStyle w:val="Quote"/>
-      </w:pPr>
-      <w:r>
-        <w:t xml:space="preserve">Use </w:t>
-      </w:r>
-      <w:r>
-        <w:t xml:space="preserve">this major section to </w:t>
-      </w:r>
-      <w:r>
-        <w:t xml:space="preserve">set out </w:t>
+      <w:bookmarkEnd w:id="32"/>
+    </w:p>
+    <w:p>
+      <w:r>
+        <w:t xml:space="preserve">Based on the investigation of the Eulerian, Lagrangian and hybrid modelling approaches, the most </w:t>
+      </w:r>
+      <w:r>
+        <w:t>versatile</w:t>
+      </w:r>
+      <w:r>
+        <w:t xml:space="preserve"> technique for the development of the simulation model is a Lagrangian–Eulerian hybrid method. This approach combines the computational efficiency of the Eulerian framework with the detailed particle behaviour provided by the Lagrangian method. By integrating both strategies, it is possible to maintain scalability while still modelling discrete particle interactions in a meaningful way.</w:t>
+      </w:r>
+    </w:p>
+    <w:p>
+      <w:r>
+        <w:t>When developing a simplified 2D fluid simulation, the primary challenge is balancing simulation accuracy with computational cost. Purely Eulerian simulations are efficient for modelling large fluid volumes but lose detail regarding individual particle behaviour. Conversely, purely Lagrangian simulations allow precise particle tracking but become computationally expensive as particle counts increase. For this reason, a hybrid system provides a practical compromise between these two extremes.</w:t>
+      </w:r>
+    </w:p>
+    <w:p>
+      <w:r>
+        <w:t xml:space="preserve">In the recommended implementation, the fluid field should be solved using </w:t>
       </w:r>
       <w:proofErr w:type="gramStart"/>
       <w:r>
-        <w:t>the your</w:t>
+        <w:t>an</w:t>
       </w:r>
       <w:proofErr w:type="gramEnd"/>
       <w:r>
-        <w:t xml:space="preserve"> findings, in the form of recommendations you could use or give your reader. Remember the original simulated goal of a senior coworker asking you to find out more about the technique: this is your opportunity to share what you’ve found.</w:t>
-      </w:r>
-    </w:p>
-    <w:p>
-      <w:pPr>
-        <w:pStyle w:val="Quote"/>
-      </w:pPr>
-      <w:r>
-        <w:t xml:space="preserve">Describe the technique you ought to use, </w:t>
-      </w:r>
-      <w:r>
-        <w:t xml:space="preserve">showing its strengths and </w:t>
-      </w:r>
-      <w:r>
-        <w:t>recognising any remaining issues</w:t>
-      </w:r>
-      <w:r>
-        <w:t xml:space="preserve"> (although there are additional words available for this in the next section)</w:t>
-      </w:r>
-      <w:r>
-        <w:t xml:space="preserve">. You </w:t>
-      </w:r>
-      <w:r>
-        <w:t>should</w:t>
+        <w:t xml:space="preserve"> Eulerian grid, where properties such as pressure, velocity and density are calculated across fixed spatial cells. This grid allows the Navier–Stokes equations to be approximated across the simulation domain without needing to calculate the state of every particle individually. Using this approach significantly reduces computational overhead, as the simulation cost depends primarily on grid resolution rather than particle count.</w:t>
+      </w:r>
+    </w:p>
+    <w:p>
+      <w:r>
+        <w:t>Particles can then be layered on top of this system using the Lagrangian framework, where individual particles are tracked as they move through the velocity field generated by the Eulerian grid. Each particle responds to forces such as pressure gradients, drag, and gravity. This approach allows particle motion to remain physically plausible while avoiding the complexity of fully resolving all fluid interactions at the particle level.</w:t>
+      </w:r>
+    </w:p>
+    <w:p>
+      <w:r>
+        <w:t>This hybrid structure is particularly well suited for a simplified simulation environment because it allows the system to scale as more particles are added. Instead of requiring the simulation to calculate interactions between every particle pair, particles instead interact indirectly through the shared velocity field. As a result, the simulation remains stable and efficient even when particle numbers increase.</w:t>
+      </w:r>
+    </w:p>
+    <w:p>
+      <w:pPr>
+        <w:pStyle w:val="Heading2"/>
+      </w:pPr>
+      <w:bookmarkStart w:id="33" w:name="_Toc224572969"/>
+      <w:r>
+        <w:t>Particle System Design</w:t>
+      </w:r>
+      <w:bookmarkEnd w:id="33"/>
+    </w:p>
+    <w:p>
+      <w:r>
+        <w:t>A key recommendation for implementation is the use of a centralised particle spawner system. This component is responsible for generating particles within the simulation domain and assigning their initial properties such as position, velocity and lifetime. By controlling particle creation in this way, the simulation can maintain consistent particle densities and avoid sudden spikes in computational load.</w:t>
+      </w:r>
+    </w:p>
+    <w:p>
+      <w:r>
+        <w:t>Particles should store minimal state information</w:t>
+      </w:r>
+      <w:r>
+        <w:t xml:space="preserve"> - </w:t>
+      </w:r>
+      <w:r>
+        <w:t>position, velocity and density. Reducing the amount of stored data improves performance and simplifies the update process during each simulation step. The particle update cycle should follow a consistent structure: first sampling the velocity field, then applying forces, and finally updating particle position.</w:t>
       </w:r>
       <w:r>
         <w:t xml:space="preserve"> </w:t>
       </w:r>
       <w:r>
-        <w:t xml:space="preserve">consider </w:t>
-      </w:r>
-      <w:r>
-        <w:t xml:space="preserve">challenges that </w:t>
-      </w:r>
-      <w:r>
-        <w:t>might still need to be solved, and how you could protect against them in a future project. You could also comment on what related things might be sensible to learn next.</w:t>
-      </w:r>
-    </w:p>
-    <w:p>
-      <w:pPr>
-        <w:pStyle w:val="Quote"/>
-      </w:pPr>
-      <w:r>
-        <w:t xml:space="preserve">You probably don’t need any new sources here, and although you should still aim for an impartial and evidence-led style, this section gives an opportunity for you to show more of your own judgement and technical decision-making, rather than restricting yourself to </w:t>
-      </w:r>
-      <w:proofErr w:type="gramStart"/>
-      <w:r>
-        <w:t>directly-sourced</w:t>
-      </w:r>
-      <w:proofErr w:type="gramEnd"/>
-      <w:r>
-        <w:t xml:space="preserve"> information. Refer to previous </w:t>
-      </w:r>
-      <w:proofErr w:type="gramStart"/>
-      <w:r>
-        <w:t>sections, but</w:t>
-      </w:r>
-      <w:proofErr w:type="gramEnd"/>
-      <w:r>
-        <w:t xml:space="preserve"> try not to repeat yourself; the word count here may be challenging.</w:t>
-      </w:r>
-    </w:p>
-    <w:p>
-      <w:pPr>
-        <w:pStyle w:val="Quote"/>
-      </w:pPr>
-      <w:r>
-        <w:t>Y</w:t>
-      </w:r>
-      <w:r>
-        <w:t xml:space="preserve">ou must include enough of </w:t>
-      </w:r>
-      <w:r>
-        <w:rPr>
-          <w:b/>
-          <w:bCs/>
-        </w:rPr>
-        <w:t>what</w:t>
-      </w:r>
-      <w:r>
-        <w:t xml:space="preserve"> the </w:t>
-      </w:r>
-      <w:r>
-        <w:t xml:space="preserve">approaches involve </w:t>
-      </w:r>
-      <w:proofErr w:type="gramStart"/>
-      <w:r>
-        <w:t>to support</w:t>
-      </w:r>
-      <w:proofErr w:type="gramEnd"/>
-      <w:r>
-        <w:t xml:space="preserve"> the </w:t>
-      </w:r>
-      <w:proofErr w:type="gramStart"/>
-      <w:r>
-        <w:t>reader, but</w:t>
-      </w:r>
-      <w:proofErr w:type="gramEnd"/>
-      <w:r>
-        <w:t xml:space="preserve"> </w:t>
-      </w:r>
-      <w:r>
-        <w:t xml:space="preserve">will get most </w:t>
-      </w:r>
-      <w:r>
-        <w:t xml:space="preserve">benefit from writing about </w:t>
-      </w:r>
-      <w:r>
-        <w:rPr>
-          <w:b/>
-          <w:bCs/>
-        </w:rPr>
-        <w:t>why</w:t>
-      </w:r>
-      <w:r>
-        <w:t xml:space="preserve"> that is</w:t>
-      </w:r>
-      <w:r>
-        <w:t xml:space="preserve">, and </w:t>
-      </w:r>
-      <w:r>
-        <w:rPr>
-          <w:b/>
-          <w:bCs/>
-        </w:rPr>
-        <w:t>how</w:t>
-      </w:r>
-      <w:r>
-        <w:t>.</w:t>
-      </w:r>
-    </w:p>
-    <w:p>
-      <w:pPr>
-        <w:pStyle w:val="Quote"/>
-      </w:pPr>
-      <w:r>
-        <w:t>You may wish to introduce subsections</w:t>
-      </w:r>
-      <w:r>
-        <w:t xml:space="preserve"> (with ‘heading 2’)</w:t>
-      </w:r>
-      <w:r>
-        <w:t xml:space="preserve"> for different aspects of the project, or for the different challenges you wish to focus on.</w:t>
-      </w:r>
-      <w:r>
-        <w:t xml:space="preserve"> Take care that they respect the total recommended words for the section</w:t>
-      </w:r>
-      <w:r>
-        <w:t>.</w:t>
-      </w:r>
-    </w:p>
-    <w:p>
-      <w:r>
-        <w:t>[Enter text here]</w:t>
-      </w:r>
-    </w:p>
-    <w:p>
-      <w:pPr>
-        <w:rPr>
-          <w:color w:val="EE0000"/>
-        </w:rPr>
-      </w:pPr>
-      <w:r>
-        <w:rPr>
-          <w:color w:val="EE0000"/>
-        </w:rPr>
-        <w:t xml:space="preserve">Having good understanding of exactly what the </w:t>
-      </w:r>
-      <w:r>
-        <w:rPr>
-          <w:color w:val="EE0000"/>
-        </w:rPr>
-        <w:t>project outcome is desired will allow the developers to choose the most effective approach to take. Likely a Lagrangian-Eulerian approach provides a good mix of scalability</w:t>
-      </w:r>
-      <w:r>
-        <w:rPr>
-          <w:color w:val="EE0000"/>
-        </w:rPr>
-        <w:t xml:space="preserve"> coming from </w:t>
-      </w:r>
-      <w:proofErr w:type="gramStart"/>
-      <w:r>
-        <w:rPr>
-          <w:color w:val="EE0000"/>
-        </w:rPr>
-        <w:t>thee</w:t>
-      </w:r>
-      <w:proofErr w:type="gramEnd"/>
-      <w:r>
-        <w:rPr>
-          <w:color w:val="EE0000"/>
-        </w:rPr>
-        <w:t xml:space="preserve"> Eulerian method, and the finer detail from discrete collisions and states from the Lagrangian method.</w:t>
+        <w:t>This structure ensures that the particle system remains deterministic and predictable, which is important when debugging the simulation behaviour.</w:t>
       </w:r>
     </w:p>
     <w:p>
       <w:pPr>
         <w:pStyle w:val="Heading2"/>
       </w:pPr>
-      <w:bookmarkStart w:id="32" w:name="_Toc222839147"/>
-      <w:r>
-        <w:t>Implementation</w:t>
-      </w:r>
-      <w:bookmarkEnd w:id="32"/>
-    </w:p>
-    <w:p>
-      <w:pPr>
-        <w:pStyle w:val="Heading3"/>
-      </w:pPr>
-      <w:bookmarkStart w:id="33" w:name="_Toc222839148"/>
-      <w:r>
-        <w:t>Particle settings</w:t>
-      </w:r>
-      <w:bookmarkEnd w:id="33"/>
-    </w:p>
-    <w:p>
-      <w:pPr>
-        <w:pStyle w:val="Heading3"/>
-      </w:pPr>
-      <w:bookmarkStart w:id="34" w:name="_Toc222839149"/>
-      <w:r>
-        <w:t>Particle spawner</w:t>
+      <w:bookmarkStart w:id="34" w:name="_Toc224572970"/>
+      <w:r>
+        <w:lastRenderedPageBreak/>
+        <w:t>Physical Parameter Control</w:t>
       </w:r>
       <w:bookmarkEnd w:id="34"/>
     </w:p>
     <w:p>
-      <w:pPr>
-        <w:pStyle w:val="Heading3"/>
-      </w:pPr>
-      <w:bookmarkStart w:id="35" w:name="_Toc222839150"/>
-      <w:r>
-        <w:t>Pressure</w:t>
+      <w:r>
+        <w:t>Another important recommendation is the inclusion of configurable physical parameters such as pressure, viscosity and surface tension. These parameters control the overall behaviour of the simulated fluid and allow the system to represent different types of fluids without altering the core simulation logic.</w:t>
+      </w:r>
+    </w:p>
+    <w:p>
+      <w:r>
+        <w:t>Pressure forces should be calculated from differences in local density across the Eulerian grid. These forces help maintain the incompressibility of the fluid and prevent particles from clustering excessively. Without this pressure correction step, the simulation may quickly become unstable.</w:t>
+      </w:r>
+    </w:p>
+    <w:p>
+      <w:r>
+        <w:t>Viscosity should be used to smooth velocity differences between neighbouring particles or grid cells. This prevents unrealistic motion and allows the simulation to represent thicker fluids more accurately. In practical terms, viscosity reduces sharp velocity changes and stabilises the flow behaviour.</w:t>
+      </w:r>
+    </w:p>
+    <w:p>
+      <w:r>
+        <w:t>Surface tension can be included as an optional enhancement. While not strictly necessary for a simplified fluid simulation, it can improve the visual coherence of particle clusters and produce more natural fluid shapes when particles interact near boundaries or free surfaces.</w:t>
+      </w:r>
+    </w:p>
+    <w:p>
+      <w:pPr>
+        <w:pStyle w:val="Heading2"/>
+      </w:pPr>
+      <w:bookmarkStart w:id="35" w:name="_Toc224572971"/>
+      <w:r>
+        <w:t>Computational Cost</w:t>
       </w:r>
       <w:bookmarkEnd w:id="35"/>
     </w:p>
     <w:p>
-      <w:pPr>
-        <w:pStyle w:val="Heading3"/>
-      </w:pPr>
-      <w:bookmarkStart w:id="36" w:name="_Toc222839151"/>
-      <w:r>
-        <w:t>Viscosity</w:t>
-      </w:r>
-      <w:bookmarkEnd w:id="36"/>
-    </w:p>
-    <w:p>
-      <w:pPr>
-        <w:pStyle w:val="Heading3"/>
-      </w:pPr>
-      <w:bookmarkStart w:id="37" w:name="_Toc222839152"/>
-      <w:r>
-        <w:t>Surface tension</w:t>
-      </w:r>
-      <w:bookmarkEnd w:id="37"/>
+      <w:r>
+        <w:t>Even when using a hybrid model, computational cost remains an important consideration. To maintain performance, the simulation should avoid unnecessary calculations wherever possible. One effective strategy is limiting neighbour searches using spatial partitioning methods such as grid-based lookup tables. This ensures that particle interactions are only calculated between nearby particles rather than across the entire system.</w:t>
+      </w:r>
+    </w:p>
+    <w:p>
+      <w:r>
+        <w:t>Additionally, limiting the simulation to two dimensions significantly reduces the complexity of calculations while still demonstrating the core principles of fluid behaviour. This makes the model suitable for experimentation and learning without requiring large computational resources.</w:t>
+      </w:r>
+    </w:p>
+    <w:p>
+      <w:pPr>
+        <w:pStyle w:val="Heading2"/>
+      </w:pPr>
+      <w:r>
+        <w:t>Further Development</w:t>
+      </w:r>
+    </w:p>
+    <w:p>
+      <w:r>
+        <w:t>While the recommended approach is effective for a simplified CFD simulation, there are still areas where the system could be expanded in future work. For example, the introduction of GPU-based computation could significantly increase the number of particles that can be simulated in real time. Many modern CFD systems use parallel processing to solve grid calculations more efficiently.</w:t>
+      </w:r>
+    </w:p>
+    <w:p>
+      <w:r>
+        <w:t>Another potential extension would be implementing adaptive grid resolution, where areas of high activity use finer grid cells while calmer areas use larger ones. This technique would further optimise computational efficiency while preserving detail where it is most needed.</w:t>
+      </w:r>
+    </w:p>
+    <w:p>
+      <w:r>
+        <w:t>Overall, the Lagrangian–Eulerian hybrid method provides a strong foundation for implementing a manageable CFD simulation while still capturing the most important behaviours of fluid systems. It offers a balance between performance and physical accuracy, making it an appropriate choice for the model developed alongside this report.</w:t>
+      </w:r>
     </w:p>
     <w:p/>
-    <w:p/>
-    <w:p>
-      <w:pPr>
-        <w:suppressAutoHyphens w:val="0"/>
-        <w:rPr>
-          <w:rFonts w:eastAsia="Times New Roman"/>
-          <w:bCs/>
-          <w:color w:val="000000"/>
-          <w:sz w:val="40"/>
-          <w:szCs w:val="28"/>
-        </w:rPr>
-      </w:pPr>
-    </w:p>
     <w:p>
       <w:pPr>
         <w:pStyle w:val="Heading1"/>
       </w:pPr>
-      <w:bookmarkStart w:id="38" w:name="_Toc222839153"/>
+      <w:bookmarkStart w:id="36" w:name="_Toc224572973"/>
       <w:r>
         <w:lastRenderedPageBreak/>
         <w:t xml:space="preserve">Conclusion and </w:t>
@@ -5220,9 +4928,9 @@
       <w:r>
         <w:t>Reflection</w:t>
       </w:r>
-      <w:bookmarkEnd w:id="38"/>
-    </w:p>
-    <w:bookmarkEnd w:id="12"/>
+      <w:bookmarkEnd w:id="36"/>
+    </w:p>
+    <w:bookmarkEnd w:id="11"/>
     <w:p>
       <w:pPr>
         <w:pStyle w:val="Quote"/>
@@ -5325,48 +5033,107 @@
       </w:r>
     </w:p>
     <w:p>
-      <w:r>
-        <w:t>[Enter text here]</w:t>
-      </w:r>
-    </w:p>
-    <w:p/>
-    <w:p>
       <w:pPr>
         <w:rPr>
           <w:color w:val="EE0000"/>
         </w:rPr>
       </w:pPr>
-    </w:p>
-    <w:p>
-      <w:pPr>
+      <w:r>
         <w:rPr>
           <w:color w:val="EE0000"/>
         </w:rPr>
-      </w:pPr>
-      <w:r>
+        <w:t>In conclusion, CFD method selection represents a trade-off between accuracy and computational efficiency, with Euler–Euler models favouring scalability and Lagrangian prioritising detailed physical representation at higher computational cost.</w:t>
+      </w:r>
+    </w:p>
+    <w:p>
+      <w:pPr>
         <w:rPr>
           <w:color w:val="EE0000"/>
         </w:rPr>
-        <w:t>In conclusion, CFD method selection represents a trade-off between accuracy and computational efficiency, with Euler–Euler models favouring scalability and Lagrangian prioritising detailed physical representation at higher computational cost.</w:t>
-      </w:r>
-    </w:p>
-    <w:p>
-      <w:pPr>
+      </w:pPr>
+      <w:r>
         <w:rPr>
           <w:color w:val="EE0000"/>
         </w:rPr>
-      </w:pPr>
-    </w:p>
-    <w:p>
-      <w:pPr>
+        <w:t xml:space="preserve">Decision on approach to take should be </w:t>
+      </w:r>
+      <w:r>
         <w:rPr>
           <w:color w:val="EE0000"/>
         </w:rPr>
-      </w:pPr>
+        <w:t xml:space="preserve">thoroughly thought out, with a clear goal on requirements. For very large systems </w:t>
+      </w:r>
       <w:r>
         <w:rPr>
           <w:color w:val="EE0000"/>
         </w:rPr>
+        <w:t xml:space="preserve">a </w:t>
+      </w:r>
+      <w:proofErr w:type="gramStart"/>
+      <w:r>
+        <w:rPr>
+          <w:color w:val="EE0000"/>
+        </w:rPr>
+        <w:t>grid based</w:t>
+      </w:r>
+      <w:proofErr w:type="gramEnd"/>
+      <w:r>
+        <w:rPr>
+          <w:color w:val="EE0000"/>
+        </w:rPr>
+        <w:t xml:space="preserve"> mesh system should be used, if large scale with discrete interactions and/or weak </w:t>
+      </w:r>
+      <w:r>
+        <w:rPr>
+          <w:color w:val="EE0000"/>
+        </w:rPr>
+        <w:t xml:space="preserve">flow </w:t>
+      </w:r>
+      <w:r>
+        <w:rPr>
+          <w:color w:val="EE0000"/>
+        </w:rPr>
+        <w:t xml:space="preserve">requirement, a mixed approach should be used. For small scale </w:t>
+      </w:r>
+      <w:r>
+        <w:rPr>
+          <w:color w:val="EE0000"/>
+        </w:rPr>
+        <w:t xml:space="preserve">the Lagrangian method should </w:t>
+      </w:r>
+      <w:proofErr w:type="spellStart"/>
+      <w:r>
+        <w:rPr>
+          <w:color w:val="EE0000"/>
+        </w:rPr>
+        <w:t>bee</w:t>
+      </w:r>
+      <w:proofErr w:type="spellEnd"/>
+      <w:r>
+        <w:rPr>
+          <w:color w:val="EE0000"/>
+        </w:rPr>
+        <w:t xml:space="preserve"> </w:t>
+      </w:r>
+      <w:proofErr w:type="spellStart"/>
+      <w:r>
+        <w:rPr>
+          <w:color w:val="EE0000"/>
+        </w:rPr>
+        <w:t>sueed</w:t>
+      </w:r>
+      <w:proofErr w:type="spellEnd"/>
+    </w:p>
+    <w:p>
+      <w:pPr>
+        <w:rPr>
+          <w:color w:val="EE0000"/>
+        </w:rPr>
+      </w:pPr>
+      <w:r>
+        <w:rPr>
+          <w:color w:val="EE0000"/>
+        </w:rPr>
         <w:t xml:space="preserve">Talb about how </w:t>
       </w:r>
       <w:r>
@@ -5420,7 +5187,6 @@
         <w:suppressAutoHyphens w:val="0"/>
       </w:pPr>
       <w:r>
-        <w:lastRenderedPageBreak/>
         <w:br w:type="page"/>
       </w:r>
     </w:p>
@@ -5428,6 +5194,7 @@
       <w:pPr>
         <w:pStyle w:val="Heading1"/>
       </w:pPr>
+      <w:bookmarkStart w:id="37" w:name="_Toc224572974"/>
       <w:r>
         <w:rPr>
           <w:noProof/>
@@ -5739,8 +5506,12 @@
           </mc:Fallback>
         </mc:AlternateContent>
       </w:r>
-    </w:p>
-    <w:bookmarkStart w:id="39" w:name="_Toc222839155" w:displacedByCustomXml="next"/>
+      <w:bookmarkEnd w:id="37"/>
+      <w:r>
+        <w:t>below refs not implemented yet</w:t>
+      </w:r>
+    </w:p>
+    <w:bookmarkStart w:id="38" w:name="_Toc224572975" w:displacedByCustomXml="next"/>
     <w:sdt>
       <w:sdtPr>
         <w:rPr>
@@ -5756,6 +5527,7 @@
           <w:docPartUnique/>
         </w:docPartObj>
       </w:sdtPr>
+      <w:sdtEndPr/>
       <w:sdtContent>
         <w:p>
           <w:pPr>
@@ -5764,13 +5536,14 @@
           <w:r>
             <w:t>References</w:t>
           </w:r>
-          <w:bookmarkEnd w:id="39"/>
+          <w:bookmarkEnd w:id="38"/>
         </w:p>
         <w:sdt>
           <w:sdtPr>
             <w:id w:val="-573587230"/>
             <w:bibliography/>
           </w:sdtPr>
+          <w:sdtEndPr/>
           <w:sdtContent>
             <w:p>
               <w:pPr>
@@ -6103,6 +5876,55 @@
                 </w:rPr>
                 <w:br/>
                 <w:t>[Accessed 24 2 2026].</w:t>
+              </w:r>
+            </w:p>
+            <w:p>
+              <w:pPr>
+                <w:pStyle w:val="Bibliography"/>
+                <w:rPr>
+                  <w:noProof/>
+                </w:rPr>
+              </w:pPr>
+              <w:r>
+                <w:rPr>
+                  <w:noProof/>
+                </w:rPr>
+                <w:t xml:space="preserve">NVIDIA, 2012. </w:t>
+              </w:r>
+              <w:r>
+                <w:rPr>
+                  <w:i/>
+                  <w:iCs/>
+                  <w:noProof/>
+                </w:rPr>
+                <w:t xml:space="preserve">Particle Simulation using CUDA. </w:t>
+              </w:r>
+              <w:r>
+                <w:rPr>
+                  <w:noProof/>
+                </w:rPr>
+                <w:t xml:space="preserve">[Online] </w:t>
+              </w:r>
+              <w:r>
+                <w:rPr>
+                  <w:noProof/>
+                </w:rPr>
+                <w:br/>
+                <w:t xml:space="preserve">Available at: </w:t>
+              </w:r>
+              <w:r>
+                <w:rPr>
+                  <w:noProof/>
+                  <w:u w:val="single"/>
+                </w:rPr>
+                <w:t>https://docs.nvidia.com/cuda/samples/5_Simulations/particles/doc/particles.pdf</w:t>
+              </w:r>
+              <w:r>
+                <w:rPr>
+                  <w:noProof/>
+                </w:rPr>
+                <w:br/>
+                <w:t>[Accessed 12 3 2026].</w:t>
               </w:r>
             </w:p>
             <w:p>
@@ -7517,7 +7339,6 @@
   <w:style w:type="character" w:default="1" w:styleId="DefaultParagraphFont">
     <w:name w:val="Default Paragraph Font"/>
     <w:uiPriority w:val="1"/>
-    <w:semiHidden/>
     <w:unhideWhenUsed/>
   </w:style>
   <w:style w:type="table" w:default="1" w:styleId="TableNormal">
@@ -7838,6 +7659,18 @@
     <w:unhideWhenUsed/>
     <w:rsid w:val="00B95248"/>
   </w:style>
+  <w:style w:type="character" w:styleId="FollowedHyperlink">
+    <w:name w:val="FollowedHyperlink"/>
+    <w:basedOn w:val="DefaultParagraphFont"/>
+    <w:uiPriority w:val="99"/>
+    <w:semiHidden/>
+    <w:unhideWhenUsed/>
+    <w:rsid w:val="00B448B1"/>
+    <w:rPr>
+      <w:color w:val="954F72" w:themeColor="followedHyperlink"/>
+      <w:u w:val="single"/>
+    </w:rPr>
+  </w:style>
 </w:styles>
 </file>
 
@@ -8137,6 +7970,15 @@
 </file>
 
 <file path=customXml/item1.xml><?xml version="1.0" encoding="utf-8"?>
+<?mso-contentType ?>
+<FormTemplates xmlns="http://schemas.microsoft.com/sharepoint/v3/contenttype/forms">
+  <Display>DocumentLibraryForm</Display>
+  <Edit>DocumentLibraryForm</Edit>
+  <New>DocumentLibraryForm</New>
+</FormTemplates>
+</file>
+
+<file path=customXml/item2.xml><?xml version="1.0" encoding="utf-8"?>
 <ct:contentTypeSchema xmlns:ct="http://schemas.microsoft.com/office/2006/metadata/contentType" xmlns:ma="http://schemas.microsoft.com/office/2006/metadata/properties/metaAttributes" ct:_="" ma:_="" ma:contentTypeName="Document" ma:contentTypeID="0x010100D9F37D7A4EDC1040A880A2099F6664D1" ma:contentTypeVersion="17" ma:contentTypeDescription="Create a new document." ma:contentTypeScope="" ma:versionID="08efb0d5db8d1d6db33b2f38db1086d5">
   <xsd:schema xmlns:xsd="http://www.w3.org/2001/XMLSchema" xmlns:xs="http://www.w3.org/2001/XMLSchema" xmlns:p="http://schemas.microsoft.com/office/2006/metadata/properties" xmlns:ns2="8d4a1fdf-0f94-4e24-9675-6342052676c2" xmlns:ns3="e2a5ad16-c4e7-4aee-be6c-2d964216012c" xmlns:ns4="efc3e123-a60a-4a17-aaf1-487e28d9a3b3" targetNamespace="http://schemas.microsoft.com/office/2006/metadata/properties" ma:root="true" ma:fieldsID="8080e491b76ba13211cd04da0d5e9449" ns2:_="" ns3:_="" ns4:_="">
     <xsd:import namespace="8d4a1fdf-0f94-4e24-9675-6342052676c2"/>
@@ -8397,15 +8239,6 @@
 </ct:contentTypeSchema>
 </file>
 
-<file path=customXml/item2.xml><?xml version="1.0" encoding="utf-8"?>
-<?mso-contentType ?>
-<FormTemplates xmlns="http://schemas.microsoft.com/sharepoint/v3/contenttype/forms">
-  <Display>DocumentLibraryForm</Display>
-  <Edit>DocumentLibraryForm</Edit>
-  <New>DocumentLibraryForm</New>
-</FormTemplates>
-</file>
-
 <file path=customXml/item3.xml><?xml version="1.0" encoding="utf-8"?>
 <p:properties xmlns:p="http://schemas.microsoft.com/office/2006/metadata/properties" xmlns:xsi="http://www.w3.org/2001/XMLSchema-instance" xmlns:pc="http://schemas.microsoft.com/office/infopath/2007/PartnerControls">
   <documentManagement>
@@ -8611,7 +8444,7 @@
     <b:MonthAccessed>2</b:MonthAccessed>
     <b:DayAccessed>25</b:DayAccessed>
     <b:URL>https://www.youtube.com/watch?v=x6mcua0HOJs</b:URL>
-    <b:RefOrder>8</b:RefOrder>
+    <b:RefOrder>9</b:RefOrder>
   </b:Source>
   <b:Source>
     <b:Tag>Con17</b:Tag>
@@ -8628,12 +8461,37 @@
     <b:MonthAccessed>2</b:MonthAccessed>
     <b:DayAccessed>25</b:DayAccessed>
     <b:URL>https://convergecfd.com/benefits/eulerian-multi-phase</b:URL>
-    <b:RefOrder>9</b:RefOrder>
+    <b:RefOrder>10</b:RefOrder>
+  </b:Source>
+  <b:Source>
+    <b:Tag>NVI12</b:Tag>
+    <b:SourceType>InternetSite</b:SourceType>
+    <b:Guid>{66409FB9-DDBD-4A68-9D8F-748FAF2A3C71}</b:Guid>
+    <b:Author>
+      <b:Author>
+        <b:Corporate>NVIDIA</b:Corporate>
+      </b:Author>
+    </b:Author>
+    <b:Title>Particle Simulation using CUDA</b:Title>
+    <b:Year>2012</b:Year>
+    <b:YearAccessed>2026</b:YearAccessed>
+    <b:MonthAccessed>3</b:MonthAccessed>
+    <b:DayAccessed>12</b:DayAccessed>
+    <b:URL>https://docs.nvidia.com/cuda/samples/5_Simulations/particles/doc/particles.pdf</b:URL>
+    <b:RefOrder>8</b:RefOrder>
   </b:Source>
 </b:Sources>
 </file>
 
 <file path=customXml/itemProps1.xml><?xml version="1.0" encoding="utf-8"?>
+<ds:datastoreItem xmlns:ds="http://schemas.openxmlformats.org/officeDocument/2006/customXml" ds:itemID="{0C9F64BE-1583-4619-A2B5-DACC1568FF50}">
+  <ds:schemaRefs>
+    <ds:schemaRef ds:uri="http://schemas.microsoft.com/sharepoint/v3/contenttype/forms"/>
+  </ds:schemaRefs>
+</ds:datastoreItem>
+</file>
+
+<file path=customXml/itemProps2.xml><?xml version="1.0" encoding="utf-8"?>
 <ds:datastoreItem xmlns:ds="http://schemas.openxmlformats.org/officeDocument/2006/customXml" ds:itemID="{277562E8-9AEC-4BC0-8DEC-73418E65CD9A}">
   <ds:schemaRefs>
     <ds:schemaRef ds:uri="http://schemas.microsoft.com/office/2006/metadata/contentType"/>
@@ -8653,14 +8511,6 @@
 </ds:datastoreItem>
 </file>
 
-<file path=customXml/itemProps2.xml><?xml version="1.0" encoding="utf-8"?>
-<ds:datastoreItem xmlns:ds="http://schemas.openxmlformats.org/officeDocument/2006/customXml" ds:itemID="{0C9F64BE-1583-4619-A2B5-DACC1568FF50}">
-  <ds:schemaRefs>
-    <ds:schemaRef ds:uri="http://schemas.microsoft.com/sharepoint/v3/contenttype/forms"/>
-  </ds:schemaRefs>
-</ds:datastoreItem>
-</file>
-
 <file path=customXml/itemProps3.xml><?xml version="1.0" encoding="utf-8"?>
 <ds:datastoreItem xmlns:ds="http://schemas.openxmlformats.org/officeDocument/2006/customXml" ds:itemID="{42CBECF3-DA57-4A6F-BD38-883BFD60FEF9}">
   <ds:schemaRefs>
@@ -8673,7 +8523,7 @@
 </file>
 
 <file path=customXml/itemProps4.xml><?xml version="1.0" encoding="utf-8"?>
-<ds:datastoreItem xmlns:ds="http://schemas.openxmlformats.org/officeDocument/2006/customXml" ds:itemID="{E9E99760-C3D3-4F15-8BD7-48F3783CF8A6}">
+<ds:datastoreItem xmlns:ds="http://schemas.openxmlformats.org/officeDocument/2006/customXml" ds:itemID="{EA927226-856E-459B-A400-7DBA7C7D9F85}">
   <ds:schemaRefs>
     <ds:schemaRef ds:uri="http://schemas.openxmlformats.org/officeDocument/2006/bibliography"/>
   </ds:schemaRefs>

</xml_diff>

<commit_message>
notes from lecture wk10 i place for conclusion section
</commit_message>
<xml_diff>
--- a/Technical Development Report.docx
+++ b/Technical Development Report.docx
@@ -375,16 +375,16 @@
         <w:pStyle w:val="Heading1"/>
       </w:pPr>
       <w:bookmarkStart w:id="0" w:name="_Toc176769484"/>
-      <w:bookmarkStart w:id="1" w:name="_Hlk176772257"/>
-      <w:bookmarkStart w:id="2" w:name="_Toc20059944"/>
-      <w:bookmarkStart w:id="3" w:name="_Toc20061035"/>
-      <w:bookmarkStart w:id="4" w:name="_Toc224572948"/>
+      <w:bookmarkStart w:id="1" w:name="_Toc224740992"/>
+      <w:bookmarkStart w:id="2" w:name="_Hlk176772257"/>
+      <w:bookmarkStart w:id="3" w:name="_Toc20059944"/>
+      <w:bookmarkStart w:id="4" w:name="_Toc20061035"/>
       <w:r>
         <w:lastRenderedPageBreak/>
         <w:t>Declarations</w:t>
       </w:r>
       <w:bookmarkEnd w:id="0"/>
-      <w:bookmarkEnd w:id="4"/>
+      <w:bookmarkEnd w:id="1"/>
     </w:p>
     <w:p>
       <w:pPr>
@@ -432,17 +432,17 @@
       <w:pPr>
         <w:pStyle w:val="Heading1"/>
       </w:pPr>
-      <w:bookmarkStart w:id="6" w:name="_Toc20846673"/>
-      <w:bookmarkStart w:id="7" w:name="_Toc56439735"/>
-      <w:bookmarkStart w:id="8" w:name="_Toc224572949"/>
-      <w:bookmarkEnd w:id="1"/>
+      <w:bookmarkStart w:id="6" w:name="_Toc224740993"/>
+      <w:bookmarkStart w:id="7" w:name="_Toc20846673"/>
+      <w:bookmarkStart w:id="8" w:name="_Toc56439735"/>
       <w:bookmarkEnd w:id="2"/>
       <w:bookmarkEnd w:id="3"/>
+      <w:bookmarkEnd w:id="4"/>
       <w:r>
         <w:lastRenderedPageBreak/>
         <w:t>Contents</w:t>
       </w:r>
-      <w:bookmarkEnd w:id="8"/>
+      <w:bookmarkEnd w:id="6"/>
     </w:p>
     <w:p>
       <w:pPr>
@@ -469,7 +469,7 @@
       <w:r>
         <w:fldChar w:fldCharType="separate"/>
       </w:r>
-      <w:hyperlink w:anchor="_Toc224572948" w:history="1">
+      <w:hyperlink w:anchor="_Toc224740992" w:history="1">
         <w:r>
           <w:rPr>
             <w:rStyle w:val="Hyperlink"/>
@@ -493,7 +493,7 @@
           <w:rPr>
             <w:noProof/>
           </w:rPr>
-          <w:instrText xml:space="preserve"> PAGEREF _Toc224572948 \h </w:instrText>
+          <w:instrText xml:space="preserve"> PAGEREF _Toc224740992 \h </w:instrText>
         </w:r>
         <w:r>
           <w:rPr>
@@ -536,7 +536,7 @@
           <w14:ligatures w14:val="standardContextual"/>
         </w:rPr>
       </w:pPr>
-      <w:hyperlink w:anchor="_Toc224572949" w:history="1">
+      <w:hyperlink w:anchor="_Toc224740993" w:history="1">
         <w:r>
           <w:rPr>
             <w:rStyle w:val="Hyperlink"/>
@@ -560,7 +560,7 @@
           <w:rPr>
             <w:noProof/>
           </w:rPr>
-          <w:instrText xml:space="preserve"> PAGEREF _Toc224572949 \h </w:instrText>
+          <w:instrText xml:space="preserve"> PAGEREF _Toc224740993 \h </w:instrText>
         </w:r>
         <w:r>
           <w:rPr>
@@ -603,7 +603,7 @@
           <w14:ligatures w14:val="standardContextual"/>
         </w:rPr>
       </w:pPr>
-      <w:hyperlink w:anchor="_Toc224572950" w:history="1">
+      <w:hyperlink w:anchor="_Toc224740994" w:history="1">
         <w:r>
           <w:rPr>
             <w:rStyle w:val="Hyperlink"/>
@@ -627,7 +627,7 @@
           <w:rPr>
             <w:noProof/>
           </w:rPr>
-          <w:instrText xml:space="preserve"> PAGEREF _Toc224572950 \h </w:instrText>
+          <w:instrText xml:space="preserve"> PAGEREF _Toc224740994 \h </w:instrText>
         </w:r>
         <w:r>
           <w:rPr>
@@ -670,7 +670,7 @@
           <w14:ligatures w14:val="standardContextual"/>
         </w:rPr>
       </w:pPr>
-      <w:hyperlink w:anchor="_Toc224572951" w:history="1">
+      <w:hyperlink w:anchor="_Toc224740995" w:history="1">
         <w:r>
           <w:rPr>
             <w:rStyle w:val="Hyperlink"/>
@@ -694,7 +694,7 @@
           <w:rPr>
             <w:noProof/>
           </w:rPr>
-          <w:instrText xml:space="preserve"> PAGEREF _Toc224572951 \h </w:instrText>
+          <w:instrText xml:space="preserve"> PAGEREF _Toc224740995 \h </w:instrText>
         </w:r>
         <w:r>
           <w:rPr>
@@ -737,7 +737,7 @@
           <w14:ligatures w14:val="standardContextual"/>
         </w:rPr>
       </w:pPr>
-      <w:hyperlink w:anchor="_Toc224572952" w:history="1">
+      <w:hyperlink w:anchor="_Toc224740996" w:history="1">
         <w:r>
           <w:rPr>
             <w:rStyle w:val="Hyperlink"/>
@@ -761,7 +761,7 @@
           <w:rPr>
             <w:noProof/>
           </w:rPr>
-          <w:instrText xml:space="preserve"> PAGEREF _Toc224572952 \h </w:instrText>
+          <w:instrText xml:space="preserve"> PAGEREF _Toc224740996 \h </w:instrText>
         </w:r>
         <w:r>
           <w:rPr>
@@ -778,7 +778,7 @@
           <w:rPr>
             <w:noProof/>
           </w:rPr>
-          <w:t>6</w:t>
+          <w:t>5</w:t>
         </w:r>
         <w:r>
           <w:rPr>
@@ -804,7 +804,7 @@
           <w14:ligatures w14:val="standardContextual"/>
         </w:rPr>
       </w:pPr>
-      <w:hyperlink w:anchor="_Toc224572953" w:history="1">
+      <w:hyperlink w:anchor="_Toc224740997" w:history="1">
         <w:r>
           <w:rPr>
             <w:rStyle w:val="Hyperlink"/>
@@ -828,7 +828,7 @@
           <w:rPr>
             <w:noProof/>
           </w:rPr>
-          <w:instrText xml:space="preserve"> PAGEREF _Toc224572953 \h </w:instrText>
+          <w:instrText xml:space="preserve"> PAGEREF _Toc224740997 \h </w:instrText>
         </w:r>
         <w:r>
           <w:rPr>
@@ -845,7 +845,7 @@
           <w:rPr>
             <w:noProof/>
           </w:rPr>
-          <w:t>6</w:t>
+          <w:t>5</w:t>
         </w:r>
         <w:r>
           <w:rPr>
@@ -871,7 +871,7 @@
           <w14:ligatures w14:val="standardContextual"/>
         </w:rPr>
       </w:pPr>
-      <w:hyperlink w:anchor="_Toc224572954" w:history="1">
+      <w:hyperlink w:anchor="_Toc224740998" w:history="1">
         <w:r>
           <w:rPr>
             <w:rStyle w:val="Hyperlink"/>
@@ -895,7 +895,7 @@
           <w:rPr>
             <w:noProof/>
           </w:rPr>
-          <w:instrText xml:space="preserve"> PAGEREF _Toc224572954 \h </w:instrText>
+          <w:instrText xml:space="preserve"> PAGEREF _Toc224740998 \h </w:instrText>
         </w:r>
         <w:r>
           <w:rPr>
@@ -912,7 +912,7 @@
           <w:rPr>
             <w:noProof/>
           </w:rPr>
-          <w:t>6</w:t>
+          <w:t>5</w:t>
         </w:r>
         <w:r>
           <w:rPr>
@@ -938,7 +938,7 @@
           <w14:ligatures w14:val="standardContextual"/>
         </w:rPr>
       </w:pPr>
-      <w:hyperlink w:anchor="_Toc224572955" w:history="1">
+      <w:hyperlink w:anchor="_Toc224740999" w:history="1">
         <w:r>
           <w:rPr>
             <w:rStyle w:val="Hyperlink"/>
@@ -962,7 +962,7 @@
           <w:rPr>
             <w:noProof/>
           </w:rPr>
-          <w:instrText xml:space="preserve"> PAGEREF _Toc224572955 \h </w:instrText>
+          <w:instrText xml:space="preserve"> PAGEREF _Toc224740999 \h </w:instrText>
         </w:r>
         <w:r>
           <w:rPr>
@@ -979,7 +979,7 @@
           <w:rPr>
             <w:noProof/>
           </w:rPr>
-          <w:t>6</w:t>
+          <w:t>5</w:t>
         </w:r>
         <w:r>
           <w:rPr>
@@ -1005,7 +1005,7 @@
           <w14:ligatures w14:val="standardContextual"/>
         </w:rPr>
       </w:pPr>
-      <w:hyperlink w:anchor="_Toc224572956" w:history="1">
+      <w:hyperlink w:anchor="_Toc224741000" w:history="1">
         <w:r>
           <w:rPr>
             <w:rStyle w:val="Hyperlink"/>
@@ -1029,7 +1029,7 @@
           <w:rPr>
             <w:noProof/>
           </w:rPr>
-          <w:instrText xml:space="preserve"> PAGEREF _Toc224572956 \h </w:instrText>
+          <w:instrText xml:space="preserve"> PAGEREF _Toc224741000 \h </w:instrText>
         </w:r>
         <w:r>
           <w:rPr>
@@ -1046,7 +1046,7 @@
           <w:rPr>
             <w:noProof/>
           </w:rPr>
-          <w:t>6</w:t>
+          <w:t>5</w:t>
         </w:r>
         <w:r>
           <w:rPr>
@@ -1072,7 +1072,7 @@
           <w14:ligatures w14:val="standardContextual"/>
         </w:rPr>
       </w:pPr>
-      <w:hyperlink w:anchor="_Toc224572957" w:history="1">
+      <w:hyperlink w:anchor="_Toc224741001" w:history="1">
         <w:r>
           <w:rPr>
             <w:rStyle w:val="Hyperlink"/>
@@ -1096,7 +1096,7 @@
           <w:rPr>
             <w:noProof/>
           </w:rPr>
-          <w:instrText xml:space="preserve"> PAGEREF _Toc224572957 \h </w:instrText>
+          <w:instrText xml:space="preserve"> PAGEREF _Toc224741001 \h </w:instrText>
         </w:r>
         <w:r>
           <w:rPr>
@@ -1113,7 +1113,7 @@
           <w:rPr>
             <w:noProof/>
           </w:rPr>
-          <w:t>7</w:t>
+          <w:t>5</w:t>
         </w:r>
         <w:r>
           <w:rPr>
@@ -1139,7 +1139,7 @@
           <w14:ligatures w14:val="standardContextual"/>
         </w:rPr>
       </w:pPr>
-      <w:hyperlink w:anchor="_Toc224572958" w:history="1">
+      <w:hyperlink w:anchor="_Toc224741002" w:history="1">
         <w:r>
           <w:rPr>
             <w:rStyle w:val="Hyperlink"/>
@@ -1163,7 +1163,7 @@
           <w:rPr>
             <w:noProof/>
           </w:rPr>
-          <w:instrText xml:space="preserve"> PAGEREF _Toc224572958 \h </w:instrText>
+          <w:instrText xml:space="preserve"> PAGEREF _Toc224741002 \h </w:instrText>
         </w:r>
         <w:r>
           <w:rPr>
@@ -1180,7 +1180,7 @@
           <w:rPr>
             <w:noProof/>
           </w:rPr>
-          <w:t>7</w:t>
+          <w:t>5</w:t>
         </w:r>
         <w:r>
           <w:rPr>
@@ -1206,7 +1206,7 @@
           <w14:ligatures w14:val="standardContextual"/>
         </w:rPr>
       </w:pPr>
-      <w:hyperlink w:anchor="_Toc224572959" w:history="1">
+      <w:hyperlink w:anchor="_Toc224741003" w:history="1">
         <w:r>
           <w:rPr>
             <w:rStyle w:val="Hyperlink"/>
@@ -1230,7 +1230,7 @@
           <w:rPr>
             <w:noProof/>
           </w:rPr>
-          <w:instrText xml:space="preserve"> PAGEREF _Toc224572959 \h </w:instrText>
+          <w:instrText xml:space="preserve"> PAGEREF _Toc224741003 \h </w:instrText>
         </w:r>
         <w:r>
           <w:rPr>
@@ -1247,7 +1247,7 @@
           <w:rPr>
             <w:noProof/>
           </w:rPr>
-          <w:t>7</w:t>
+          <w:t>5</w:t>
         </w:r>
         <w:r>
           <w:rPr>
@@ -1273,7 +1273,7 @@
           <w14:ligatures w14:val="standardContextual"/>
         </w:rPr>
       </w:pPr>
-      <w:hyperlink w:anchor="_Toc224572960" w:history="1">
+      <w:hyperlink w:anchor="_Toc224741004" w:history="1">
         <w:r>
           <w:rPr>
             <w:rStyle w:val="Hyperlink"/>
@@ -1297,7 +1297,7 @@
           <w:rPr>
             <w:noProof/>
           </w:rPr>
-          <w:instrText xml:space="preserve"> PAGEREF _Toc224572960 \h </w:instrText>
+          <w:instrText xml:space="preserve"> PAGEREF _Toc224741004 \h </w:instrText>
         </w:r>
         <w:r>
           <w:rPr>
@@ -1314,7 +1314,7 @@
           <w:rPr>
             <w:noProof/>
           </w:rPr>
-          <w:t>7</w:t>
+          <w:t>5</w:t>
         </w:r>
         <w:r>
           <w:rPr>
@@ -1340,7 +1340,7 @@
           <w14:ligatures w14:val="standardContextual"/>
         </w:rPr>
       </w:pPr>
-      <w:hyperlink w:anchor="_Toc224572961" w:history="1">
+      <w:hyperlink w:anchor="_Toc224741005" w:history="1">
         <w:r>
           <w:rPr>
             <w:rStyle w:val="Hyperlink"/>
@@ -1364,7 +1364,7 @@
           <w:rPr>
             <w:noProof/>
           </w:rPr>
-          <w:instrText xml:space="preserve"> PAGEREF _Toc224572961 \h </w:instrText>
+          <w:instrText xml:space="preserve"> PAGEREF _Toc224741005 \h </w:instrText>
         </w:r>
         <w:r>
           <w:rPr>
@@ -1381,7 +1381,7 @@
           <w:rPr>
             <w:noProof/>
           </w:rPr>
-          <w:t>8</w:t>
+          <w:t>5</w:t>
         </w:r>
         <w:r>
           <w:rPr>
@@ -1407,7 +1407,7 @@
           <w14:ligatures w14:val="standardContextual"/>
         </w:rPr>
       </w:pPr>
-      <w:hyperlink w:anchor="_Toc224572962" w:history="1">
+      <w:hyperlink w:anchor="_Toc224741006" w:history="1">
         <w:r>
           <w:rPr>
             <w:rStyle w:val="Hyperlink"/>
@@ -1431,7 +1431,7 @@
           <w:rPr>
             <w:noProof/>
           </w:rPr>
-          <w:instrText xml:space="preserve"> PAGEREF _Toc224572962 \h </w:instrText>
+          <w:instrText xml:space="preserve"> PAGEREF _Toc224741006 \h </w:instrText>
         </w:r>
         <w:r>
           <w:rPr>
@@ -1448,7 +1448,7 @@
           <w:rPr>
             <w:noProof/>
           </w:rPr>
-          <w:t>8</w:t>
+          <w:t>5</w:t>
         </w:r>
         <w:r>
           <w:rPr>
@@ -1474,7 +1474,7 @@
           <w14:ligatures w14:val="standardContextual"/>
         </w:rPr>
       </w:pPr>
-      <w:hyperlink w:anchor="_Toc224572963" w:history="1">
+      <w:hyperlink w:anchor="_Toc224741007" w:history="1">
         <w:r>
           <w:rPr>
             <w:rStyle w:val="Hyperlink"/>
@@ -1498,7 +1498,7 @@
           <w:rPr>
             <w:noProof/>
           </w:rPr>
-          <w:instrText xml:space="preserve"> PAGEREF _Toc224572963 \h </w:instrText>
+          <w:instrText xml:space="preserve"> PAGEREF _Toc224741007 \h </w:instrText>
         </w:r>
         <w:r>
           <w:rPr>
@@ -1515,7 +1515,7 @@
           <w:rPr>
             <w:noProof/>
           </w:rPr>
-          <w:t>9</w:t>
+          <w:t>5</w:t>
         </w:r>
         <w:r>
           <w:rPr>
@@ -1541,7 +1541,7 @@
           <w14:ligatures w14:val="standardContextual"/>
         </w:rPr>
       </w:pPr>
-      <w:hyperlink w:anchor="_Toc224572964" w:history="1">
+      <w:hyperlink w:anchor="_Toc224741008" w:history="1">
         <w:r>
           <w:rPr>
             <w:rStyle w:val="Hyperlink"/>
@@ -1565,7 +1565,7 @@
           <w:rPr>
             <w:noProof/>
           </w:rPr>
-          <w:instrText xml:space="preserve"> PAGEREF _Toc224572964 \h </w:instrText>
+          <w:instrText xml:space="preserve"> PAGEREF _Toc224741008 \h </w:instrText>
         </w:r>
         <w:r>
           <w:rPr>
@@ -1582,7 +1582,7 @@
           <w:rPr>
             <w:noProof/>
           </w:rPr>
-          <w:t>10</w:t>
+          <w:t>5</w:t>
         </w:r>
         <w:r>
           <w:rPr>
@@ -1608,7 +1608,7 @@
           <w14:ligatures w14:val="standardContextual"/>
         </w:rPr>
       </w:pPr>
-      <w:hyperlink w:anchor="_Toc224572965" w:history="1">
+      <w:hyperlink w:anchor="_Toc224741009" w:history="1">
         <w:r>
           <w:rPr>
             <w:rStyle w:val="Hyperlink"/>
@@ -1632,7 +1632,7 @@
           <w:rPr>
             <w:noProof/>
           </w:rPr>
-          <w:instrText xml:space="preserve"> PAGEREF _Toc224572965 \h </w:instrText>
+          <w:instrText xml:space="preserve"> PAGEREF _Toc224741009 \h </w:instrText>
         </w:r>
         <w:r>
           <w:rPr>
@@ -1649,7 +1649,7 @@
           <w:rPr>
             <w:noProof/>
           </w:rPr>
-          <w:t>10</w:t>
+          <w:t>5</w:t>
         </w:r>
         <w:r>
           <w:rPr>
@@ -1675,7 +1675,7 @@
           <w14:ligatures w14:val="standardContextual"/>
         </w:rPr>
       </w:pPr>
-      <w:hyperlink w:anchor="_Toc224572966" w:history="1">
+      <w:hyperlink w:anchor="_Toc224741010" w:history="1">
         <w:r>
           <w:rPr>
             <w:rStyle w:val="Hyperlink"/>
@@ -1699,7 +1699,7 @@
           <w:rPr>
             <w:noProof/>
           </w:rPr>
-          <w:instrText xml:space="preserve"> PAGEREF _Toc224572966 \h </w:instrText>
+          <w:instrText xml:space="preserve"> PAGEREF _Toc224741010 \h </w:instrText>
         </w:r>
         <w:r>
           <w:rPr>
@@ -1716,7 +1716,7 @@
           <w:rPr>
             <w:noProof/>
           </w:rPr>
-          <w:t>10</w:t>
+          <w:t>5</w:t>
         </w:r>
         <w:r>
           <w:rPr>
@@ -1742,7 +1742,7 @@
           <w14:ligatures w14:val="standardContextual"/>
         </w:rPr>
       </w:pPr>
-      <w:hyperlink w:anchor="_Toc224572967" w:history="1">
+      <w:hyperlink w:anchor="_Toc224741011" w:history="1">
         <w:r>
           <w:rPr>
             <w:rStyle w:val="Hyperlink"/>
@@ -1766,7 +1766,7 @@
           <w:rPr>
             <w:noProof/>
           </w:rPr>
-          <w:instrText xml:space="preserve"> PAGEREF _Toc224572967 \h </w:instrText>
+          <w:instrText xml:space="preserve"> PAGEREF _Toc224741011 \h </w:instrText>
         </w:r>
         <w:r>
           <w:rPr>
@@ -1783,7 +1783,7 @@
           <w:rPr>
             <w:noProof/>
           </w:rPr>
-          <w:t>11</w:t>
+          <w:t>5</w:t>
         </w:r>
         <w:r>
           <w:rPr>
@@ -1809,7 +1809,7 @@
           <w14:ligatures w14:val="standardContextual"/>
         </w:rPr>
       </w:pPr>
-      <w:hyperlink w:anchor="_Toc224572968" w:history="1">
+      <w:hyperlink w:anchor="_Toc224741012" w:history="1">
         <w:r>
           <w:rPr>
             <w:rStyle w:val="Hyperlink"/>
@@ -1833,7 +1833,7 @@
           <w:rPr>
             <w:noProof/>
           </w:rPr>
-          <w:instrText xml:space="preserve"> PAGEREF _Toc224572968 \h </w:instrText>
+          <w:instrText xml:space="preserve"> PAGEREF _Toc224741012 \h </w:instrText>
         </w:r>
         <w:r>
           <w:rPr>
@@ -1850,7 +1850,7 @@
           <w:rPr>
             <w:noProof/>
           </w:rPr>
-          <w:t>12</w:t>
+          <w:t>6</w:t>
         </w:r>
         <w:r>
           <w:rPr>
@@ -1876,7 +1876,7 @@
           <w14:ligatures w14:val="standardContextual"/>
         </w:rPr>
       </w:pPr>
-      <w:hyperlink w:anchor="_Toc224572969" w:history="1">
+      <w:hyperlink w:anchor="_Toc224741013" w:history="1">
         <w:r>
           <w:rPr>
             <w:rStyle w:val="Hyperlink"/>
@@ -1900,7 +1900,7 @@
           <w:rPr>
             <w:noProof/>
           </w:rPr>
-          <w:instrText xml:space="preserve"> PAGEREF _Toc224572969 \h </w:instrText>
+          <w:instrText xml:space="preserve"> PAGEREF _Toc224741013 \h </w:instrText>
         </w:r>
         <w:r>
           <w:rPr>
@@ -1917,7 +1917,7 @@
           <w:rPr>
             <w:noProof/>
           </w:rPr>
-          <w:t>12</w:t>
+          <w:t>6</w:t>
         </w:r>
         <w:r>
           <w:rPr>
@@ -1943,7 +1943,7 @@
           <w14:ligatures w14:val="standardContextual"/>
         </w:rPr>
       </w:pPr>
-      <w:hyperlink w:anchor="_Toc224572970" w:history="1">
+      <w:hyperlink w:anchor="_Toc224741014" w:history="1">
         <w:r>
           <w:rPr>
             <w:rStyle w:val="Hyperlink"/>
@@ -1967,7 +1967,7 @@
           <w:rPr>
             <w:noProof/>
           </w:rPr>
-          <w:instrText xml:space="preserve"> PAGEREF _Toc224572970 \h </w:instrText>
+          <w:instrText xml:space="preserve"> PAGEREF _Toc224741014 \h </w:instrText>
         </w:r>
         <w:r>
           <w:rPr>
@@ -1984,7 +1984,7 @@
           <w:rPr>
             <w:noProof/>
           </w:rPr>
-          <w:t>13</w:t>
+          <w:t>7</w:t>
         </w:r>
         <w:r>
           <w:rPr>
@@ -2010,7 +2010,7 @@
           <w14:ligatures w14:val="standardContextual"/>
         </w:rPr>
       </w:pPr>
-      <w:hyperlink w:anchor="_Toc224572971" w:history="1">
+      <w:hyperlink w:anchor="_Toc224741015" w:history="1">
         <w:r>
           <w:rPr>
             <w:rStyle w:val="Hyperlink"/>
@@ -2034,7 +2034,7 @@
           <w:rPr>
             <w:noProof/>
           </w:rPr>
-          <w:instrText xml:space="preserve"> PAGEREF _Toc224572971 \h </w:instrText>
+          <w:instrText xml:space="preserve"> PAGEREF _Toc224741015 \h </w:instrText>
         </w:r>
         <w:r>
           <w:rPr>
@@ -2051,7 +2051,7 @@
           <w:rPr>
             <w:noProof/>
           </w:rPr>
-          <w:t>13</w:t>
+          <w:t>7</w:t>
         </w:r>
         <w:r>
           <w:rPr>
@@ -2077,13 +2077,13 @@
           <w14:ligatures w14:val="standardContextual"/>
         </w:rPr>
       </w:pPr>
-      <w:hyperlink w:anchor="_Toc224572972" w:history="1">
+      <w:hyperlink w:anchor="_Toc224741016" w:history="1">
         <w:r>
           <w:rPr>
             <w:rStyle w:val="Hyperlink"/>
             <w:noProof/>
           </w:rPr>
-          <w:t>Future Development Considerations</w:t>
+          <w:t>Further Development</w:t>
         </w:r>
         <w:r>
           <w:rPr>
@@ -2101,7 +2101,7 @@
           <w:rPr>
             <w:noProof/>
           </w:rPr>
-          <w:instrText xml:space="preserve"> PAGEREF _Toc224572972 \h </w:instrText>
+          <w:instrText xml:space="preserve"> PAGEREF _Toc224741016 \h </w:instrText>
         </w:r>
         <w:r>
           <w:rPr>
@@ -2118,7 +2118,7 @@
           <w:rPr>
             <w:noProof/>
           </w:rPr>
-          <w:t>13</w:t>
+          <w:t>7</w:t>
         </w:r>
         <w:r>
           <w:rPr>
@@ -2144,7 +2144,7 @@
           <w14:ligatures w14:val="standardContextual"/>
         </w:rPr>
       </w:pPr>
-      <w:hyperlink w:anchor="_Toc224572973" w:history="1">
+      <w:hyperlink w:anchor="_Toc224741017" w:history="1">
         <w:r>
           <w:rPr>
             <w:rStyle w:val="Hyperlink"/>
@@ -2168,7 +2168,7 @@
           <w:rPr>
             <w:noProof/>
           </w:rPr>
-          <w:instrText xml:space="preserve"> PAGEREF _Toc224572973 \h </w:instrText>
+          <w:instrText xml:space="preserve"> PAGEREF _Toc224741017 \h </w:instrText>
         </w:r>
         <w:r>
           <w:rPr>
@@ -2185,7 +2185,7 @@
           <w:rPr>
             <w:noProof/>
           </w:rPr>
-          <w:t>14</w:t>
+          <w:t>8</w:t>
         </w:r>
         <w:r>
           <w:rPr>
@@ -2211,7 +2211,14 @@
           <w14:ligatures w14:val="standardContextual"/>
         </w:rPr>
       </w:pPr>
-      <w:hyperlink w:anchor="_Toc224572974" w:history="1">
+      <w:hyperlink w:anchor="_Toc224741018" w:history="1">
+        <w:r>
+          <w:rPr>
+            <w:rStyle w:val="Hyperlink"/>
+            <w:noProof/>
+          </w:rPr>
+          <w:t>below refs not implemented yet</w:t>
+        </w:r>
         <w:r>
           <w:rPr>
             <w:noProof/>
@@ -2228,7 +2235,7 @@
           <w:rPr>
             <w:noProof/>
           </w:rPr>
-          <w:instrText xml:space="preserve"> PAGEREF _Toc224572974 \h </w:instrText>
+          <w:instrText xml:space="preserve"> PAGEREF _Toc224741018 \h </w:instrText>
         </w:r>
         <w:r>
           <w:rPr>
@@ -2245,7 +2252,7 @@
           <w:rPr>
             <w:noProof/>
           </w:rPr>
-          <w:t>15</w:t>
+          <w:t>9</w:t>
         </w:r>
         <w:r>
           <w:rPr>
@@ -2271,7 +2278,7 @@
           <w14:ligatures w14:val="standardContextual"/>
         </w:rPr>
       </w:pPr>
-      <w:hyperlink w:anchor="_Toc224572975" w:history="1">
+      <w:hyperlink w:anchor="_Toc224741019" w:history="1">
         <w:r>
           <w:rPr>
             <w:rStyle w:val="Hyperlink"/>
@@ -2295,7 +2302,7 @@
           <w:rPr>
             <w:noProof/>
           </w:rPr>
-          <w:instrText xml:space="preserve"> PAGEREF _Toc224572975 \h </w:instrText>
+          <w:instrText xml:space="preserve"> PAGEREF _Toc224741019 \h </w:instrText>
         </w:r>
         <w:r>
           <w:rPr>
@@ -2312,7 +2319,7 @@
           <w:rPr>
             <w:noProof/>
           </w:rPr>
-          <w:t>16</w:t>
+          <w:t>10</w:t>
         </w:r>
         <w:r>
           <w:rPr>
@@ -2345,7 +2352,7 @@
       <w:pPr>
         <w:pStyle w:val="Heading2"/>
       </w:pPr>
-      <w:bookmarkStart w:id="9" w:name="_Toc224572950"/>
+      <w:bookmarkStart w:id="9" w:name="_Toc224740994"/>
       <w:r>
         <w:t>Table of Figures</w:t>
       </w:r>
@@ -2704,9 +2711,9 @@
       <w:pPr>
         <w:pStyle w:val="Heading1"/>
       </w:pPr>
-      <w:bookmarkStart w:id="10" w:name="_Toc224572951"/>
-      <w:bookmarkEnd w:id="6"/>
+      <w:bookmarkStart w:id="10" w:name="_Toc224740995"/>
       <w:bookmarkEnd w:id="7"/>
+      <w:bookmarkEnd w:id="8"/>
       <w:r>
         <w:lastRenderedPageBreak/>
         <w:t>Introduction</w:t>
@@ -2781,7 +2788,6 @@
           <w:id w:val="1226797730"/>
           <w:citation/>
         </w:sdtPr>
-        <w:sdtEndPr/>
         <w:sdtContent>
           <w:r>
             <w:fldChar w:fldCharType="begin"/>
@@ -2800,52 +2806,7 @@
               <w:noProof/>
               <w:lang w:val="en-US"/>
             </w:rPr>
-            <w:t>(</w:t>
-          </w:r>
-          <w:r>
-            <w:rPr>
-              <w:noProof/>
-              <w:highlight w:val="yellow"/>
-              <w:lang w:val="en-US"/>
-            </w:rPr>
-            <w:t>Schroder</w:t>
-          </w:r>
-          <w:r>
-            <w:rPr>
-              <w:noProof/>
-              <w:lang w:val="en-US"/>
-            </w:rPr>
-            <w:t xml:space="preserve"> &amp; </w:t>
-          </w:r>
-          <w:r>
-            <w:rPr>
-              <w:noProof/>
-              <w:highlight w:val="yellow"/>
-              <w:lang w:val="en-US"/>
-            </w:rPr>
-            <w:t>Schanz</w:t>
-          </w:r>
-          <w:r>
-            <w:rPr>
-              <w:noProof/>
-              <w:lang w:val="en-US"/>
-            </w:rPr>
-            <w:t xml:space="preserve">, </w:t>
-          </w:r>
-          <w:r>
-            <w:rPr>
-              <w:noProof/>
-              <w:highlight w:val="yellow"/>
-              <w:lang w:val="en-US"/>
-            </w:rPr>
-            <w:t>2022</w:t>
-          </w:r>
-          <w:r>
-            <w:rPr>
-              <w:noProof/>
-              <w:lang w:val="en-US"/>
-            </w:rPr>
-            <w:t>)</w:t>
+            <w:t>(Schroder &amp; Schanz, 2022)</w:t>
           </w:r>
           <w:r>
             <w:fldChar w:fldCharType="end"/>
@@ -3034,8 +2995,8 @@
           <w:color w:val="EE0000"/>
         </w:rPr>
       </w:pPr>
-      <w:bookmarkStart w:id="11" w:name="_Toc88436908"/>
-      <w:bookmarkStart w:id="12" w:name="_Toc224572952"/>
+      <w:bookmarkStart w:id="11" w:name="_Toc224740996"/>
+      <w:bookmarkStart w:id="12" w:name="_Toc88436908"/>
       <w:r>
         <w:lastRenderedPageBreak/>
         <w:t>Context</w:t>
@@ -3055,13 +3016,13 @@
         </w:rPr>
         <w:t>ords</w:t>
       </w:r>
-      <w:bookmarkEnd w:id="12"/>
+      <w:bookmarkEnd w:id="11"/>
     </w:p>
     <w:p>
       <w:pPr>
         <w:pStyle w:val="Heading2"/>
       </w:pPr>
-      <w:bookmarkStart w:id="13" w:name="_Toc224572953"/>
+      <w:bookmarkStart w:id="13" w:name="_Toc224740997"/>
       <w:r>
         <w:t xml:space="preserve">CFD: </w:t>
       </w:r>
@@ -3115,22 +3076,7 @@
               <w:noProof/>
               <w:lang w:val="en-US"/>
             </w:rPr>
-            <w:t>(</w:t>
-          </w:r>
-          <w:r>
-            <w:rPr>
-              <w:noProof/>
-              <w:highlight w:val="yellow"/>
-              <w:lang w:val="en-US"/>
-            </w:rPr>
-            <w:t>2023</w:t>
-          </w:r>
-          <w:r>
-            <w:rPr>
-              <w:noProof/>
-              <w:lang w:val="en-US"/>
-            </w:rPr>
-            <w:t>)</w:t>
+            <w:t>(2023)</w:t>
           </w:r>
           <w:r>
             <w:fldChar w:fldCharType="end"/>
@@ -3211,24 +3157,14 @@
       <w:r>
         <w:t xml:space="preserve">Figure </w:t>
       </w:r>
-      <w:r>
-        <w:fldChar w:fldCharType="begin"/>
-      </w:r>
-      <w:r>
-        <w:instrText xml:space="preserve"> SEQ Figure \* ARABIC </w:instrText>
-      </w:r>
-      <w:r>
-        <w:fldChar w:fldCharType="separate"/>
-      </w:r>
-      <w:r>
-        <w:rPr>
-          <w:noProof/>
-        </w:rPr>
-        <w:t>1</w:t>
-      </w:r>
-      <w:r>
-        <w:fldChar w:fldCharType="end"/>
-      </w:r>
+      <w:fldSimple w:instr=" SEQ Figure \* ARABIC ">
+        <w:r>
+          <w:rPr>
+            <w:noProof/>
+          </w:rPr>
+          <w:t>1</w:t>
+        </w:r>
+      </w:fldSimple>
       <w:r>
         <w:t xml:space="preserve"> </w:t>
       </w:r>
@@ -3290,7 +3226,7 @@
       <w:pPr>
         <w:pStyle w:val="Heading3"/>
       </w:pPr>
-      <w:bookmarkStart w:id="15" w:name="_Toc224572954"/>
+      <w:bookmarkStart w:id="15" w:name="_Toc224740998"/>
       <w:r>
         <w:t>Saving Time</w:t>
       </w:r>
@@ -3332,7 +3268,7 @@
       <w:pPr>
         <w:pStyle w:val="Heading3"/>
       </w:pPr>
-      <w:bookmarkStart w:id="16" w:name="_Toc224572955"/>
+      <w:bookmarkStart w:id="16" w:name="_Toc224740999"/>
       <w:r>
         <w:t>Saving Costs</w:t>
       </w:r>
@@ -3417,7 +3353,7 @@
       <w:pPr>
         <w:pStyle w:val="Heading3"/>
       </w:pPr>
-      <w:bookmarkStart w:id="17" w:name="_Toc224572956"/>
+      <w:bookmarkStart w:id="17" w:name="_Toc224741000"/>
       <w:r>
         <w:t>Obtaining Optimal Processes</w:t>
       </w:r>
@@ -3501,7 +3437,7 @@
       <w:pPr>
         <w:pStyle w:val="Heading3"/>
       </w:pPr>
-      <w:bookmarkStart w:id="18" w:name="_Toc224572957"/>
+      <w:bookmarkStart w:id="18" w:name="_Toc224741001"/>
       <w:r>
         <w:lastRenderedPageBreak/>
         <w:t>Flexibility</w:t>
@@ -3547,7 +3483,7 @@
       <w:pPr>
         <w:pStyle w:val="Heading2"/>
       </w:pPr>
-      <w:bookmarkStart w:id="19" w:name="_Toc224572958"/>
+      <w:bookmarkStart w:id="19" w:name="_Toc224741002"/>
       <w:r>
         <w:t>Use Cases of CFD</w:t>
       </w:r>
@@ -3557,7 +3493,7 @@
       <w:pPr>
         <w:pStyle w:val="Heading3"/>
       </w:pPr>
-      <w:bookmarkStart w:id="20" w:name="_Toc224572959"/>
+      <w:bookmarkStart w:id="20" w:name="_Toc224741003"/>
       <w:r>
         <w:t>HVAC</w:t>
       </w:r>
@@ -3602,7 +3538,6 @@
           <w:id w:val="1718555527"/>
           <w:citation/>
         </w:sdtPr>
-        <w:sdtEndPr/>
         <w:sdtContent>
           <w:r>
             <w:rPr>
@@ -3680,7 +3615,7 @@
       <w:pPr>
         <w:pStyle w:val="Heading3"/>
       </w:pPr>
-      <w:bookmarkStart w:id="21" w:name="_Toc224572960"/>
+      <w:bookmarkStart w:id="21" w:name="_Toc224741004"/>
       <w:r>
         <w:t>Water and wastewater treatment</w:t>
       </w:r>
@@ -3857,24 +3792,14 @@
       <w:r>
         <w:t xml:space="preserve">Figure </w:t>
       </w:r>
-      <w:r>
-        <w:fldChar w:fldCharType="begin"/>
-      </w:r>
-      <w:r>
-        <w:instrText xml:space="preserve"> SEQ Figure \* ARABIC </w:instrText>
-      </w:r>
-      <w:r>
-        <w:fldChar w:fldCharType="separate"/>
-      </w:r>
-      <w:r>
-        <w:rPr>
-          <w:noProof/>
-        </w:rPr>
-        <w:t>2</w:t>
-      </w:r>
-      <w:r>
-        <w:fldChar w:fldCharType="end"/>
-      </w:r>
+      <w:fldSimple w:instr=" SEQ Figure \* ARABIC ">
+        <w:r>
+          <w:rPr>
+            <w:noProof/>
+          </w:rPr>
+          <w:t>2</w:t>
+        </w:r>
+      </w:fldSimple>
       <w:r>
         <w:t xml:space="preserve"> Visualisation of water flows after improving the design using CFD technology </w:t>
       </w:r>
@@ -3883,7 +3808,6 @@
           <w:id w:val="-1581983855"/>
           <w:citation/>
         </w:sdtPr>
-        <w:sdtEndPr/>
         <w:sdtContent>
           <w:r>
             <w:fldChar w:fldCharType="begin"/>
@@ -3911,7 +3835,7 @@
       <w:pPr>
         <w:pStyle w:val="Heading3"/>
       </w:pPr>
-      <w:bookmarkStart w:id="23" w:name="_Toc224572961"/>
+      <w:bookmarkStart w:id="23" w:name="_Toc224741005"/>
       <w:r>
         <w:lastRenderedPageBreak/>
         <w:t>Vehicle Aerodynamics</w:t>
@@ -3930,7 +3854,6 @@
           <w:id w:val="1769816644"/>
           <w:citation/>
         </w:sdtPr>
-        <w:sdtEndPr/>
         <w:sdtContent>
           <w:r>
             <w:rPr>
@@ -4074,24 +3997,14 @@
       <w:r>
         <w:t xml:space="preserve">Figure </w:t>
       </w:r>
-      <w:r>
-        <w:fldChar w:fldCharType="begin"/>
-      </w:r>
-      <w:r>
-        <w:instrText xml:space="preserve"> SEQ Figure \* ARABIC </w:instrText>
-      </w:r>
-      <w:r>
-        <w:fldChar w:fldCharType="separate"/>
-      </w:r>
-      <w:r>
-        <w:rPr>
-          <w:noProof/>
-        </w:rPr>
-        <w:t>3</w:t>
-      </w:r>
-      <w:r>
-        <w:fldChar w:fldCharType="end"/>
-      </w:r>
+      <w:fldSimple w:instr=" SEQ Figure \* ARABIC ">
+        <w:r>
+          <w:rPr>
+            <w:noProof/>
+          </w:rPr>
+          <w:t>3</w:t>
+        </w:r>
+      </w:fldSimple>
       <w:r>
         <w:t xml:space="preserve"> Visualisation of pressure distribution and velocity field around the F1 car </w:t>
       </w:r>
@@ -4100,7 +4013,6 @@
           <w:id w:val="-664628595"/>
           <w:citation/>
         </w:sdtPr>
-        <w:sdtEndPr/>
         <w:sdtContent>
           <w:r>
             <w:fldChar w:fldCharType="begin"/>
@@ -4128,7 +4040,7 @@
       <w:pPr>
         <w:pStyle w:val="Heading2"/>
       </w:pPr>
-      <w:bookmarkStart w:id="25" w:name="_Toc224572962"/>
+      <w:bookmarkStart w:id="25" w:name="_Toc224741006"/>
       <w:r>
         <w:t>Navier-Stokes Equations</w:t>
       </w:r>
@@ -4143,7 +4055,6 @@
           <w:id w:val="-1844849807"/>
           <w:citation/>
         </w:sdtPr>
-        <w:sdtEndPr/>
         <w:sdtContent>
           <w:r>
             <w:fldChar w:fldCharType="begin"/>
@@ -4158,20 +4069,7 @@
             <w:rPr>
               <w:noProof/>
             </w:rPr>
-            <w:t>(</w:t>
-          </w:r>
-          <w:r>
-            <w:rPr>
-              <w:noProof/>
-              <w:highlight w:val="yellow"/>
-            </w:rPr>
-            <w:t>NASA</w:t>
-          </w:r>
-          <w:r>
-            <w:rPr>
-              <w:noProof/>
-            </w:rPr>
-            <w:t>, 2021)</w:t>
+            <w:t>(NASA, 2021)</w:t>
           </w:r>
           <w:r>
             <w:fldChar w:fldCharType="end"/>
@@ -4248,24 +4146,14 @@
       <w:r>
         <w:t xml:space="preserve">Figure </w:t>
       </w:r>
-      <w:r>
-        <w:fldChar w:fldCharType="begin"/>
-      </w:r>
-      <w:r>
-        <w:instrText xml:space="preserve"> SEQ Figure \* ARABIC </w:instrText>
-      </w:r>
-      <w:r>
-        <w:fldChar w:fldCharType="separate"/>
-      </w:r>
-      <w:r>
-        <w:rPr>
-          <w:noProof/>
-        </w:rPr>
-        <w:t>4</w:t>
-      </w:r>
-      <w:r>
-        <w:fldChar w:fldCharType="end"/>
-      </w:r>
+      <w:fldSimple w:instr=" SEQ Figure \* ARABIC ">
+        <w:r>
+          <w:rPr>
+            <w:noProof/>
+          </w:rPr>
+          <w:t>4</w:t>
+        </w:r>
+      </w:fldSimple>
       <w:r>
         <w:t xml:space="preserve"> </w:t>
       </w:r>
@@ -4324,7 +4212,7 @@
       <w:pPr>
         <w:pStyle w:val="Heading2"/>
       </w:pPr>
-      <w:bookmarkStart w:id="27" w:name="_Toc224572963"/>
+      <w:bookmarkStart w:id="27" w:name="_Toc224741007"/>
       <w:r>
         <w:t>CFD applications to general Software Engineering</w:t>
       </w:r>
@@ -4379,9 +4267,19 @@
     </w:p>
     <w:p>
       <w:pPr>
+        <w:keepNext/>
+      </w:pPr>
+    </w:p>
+    <w:p>
+      <w:pPr>
+        <w:keepNext/>
+      </w:pPr>
+    </w:p>
+    <w:p>
+      <w:pPr>
         <w:pStyle w:val="Heading1"/>
       </w:pPr>
-      <w:bookmarkStart w:id="28" w:name="_Toc224572964"/>
+      <w:bookmarkStart w:id="28" w:name="_Toc224741008"/>
       <w:r>
         <w:lastRenderedPageBreak/>
         <w:t>Prior Approaches</w:t>
@@ -4433,7 +4331,7 @@
       <w:pPr>
         <w:pStyle w:val="Heading2"/>
       </w:pPr>
-      <w:bookmarkStart w:id="29" w:name="_Toc224572965"/>
+      <w:bookmarkStart w:id="29" w:name="_Toc224741009"/>
       <w:r>
         <w:t>Eulerian Approach</w:t>
       </w:r>
@@ -4456,7 +4354,6 @@
           <w:id w:val="-790980604"/>
           <w:citation/>
         </w:sdtPr>
-        <w:sdtEndPr/>
         <w:sdtContent>
           <w:r>
             <w:fldChar w:fldCharType="begin"/>
@@ -4475,22 +4372,7 @@
               <w:noProof/>
               <w:lang w:val="en-US"/>
             </w:rPr>
-            <w:t>(</w:t>
-          </w:r>
-          <w:r>
-            <w:rPr>
-              <w:noProof/>
-              <w:highlight w:val="yellow"/>
-              <w:lang w:val="en-US"/>
-            </w:rPr>
-            <w:t>2017</w:t>
-          </w:r>
-          <w:r>
-            <w:rPr>
-              <w:noProof/>
-              <w:lang w:val="en-US"/>
-            </w:rPr>
-            <w:t>)</w:t>
+            <w:t>(2017)</w:t>
           </w:r>
           <w:r>
             <w:fldChar w:fldCharType="end"/>
@@ -4520,7 +4402,6 @@
           <w:id w:val="-484160930"/>
           <w:citation/>
         </w:sdtPr>
-        <w:sdtEndPr/>
         <w:sdtContent>
           <w:r>
             <w:fldChar w:fldCharType="begin"/>
@@ -4539,22 +4420,7 @@
               <w:noProof/>
               <w:lang w:val="en-US"/>
             </w:rPr>
-            <w:t>(</w:t>
-          </w:r>
-          <w:r>
-            <w:rPr>
-              <w:noProof/>
-              <w:highlight w:val="yellow"/>
-              <w:lang w:val="en-US"/>
-            </w:rPr>
-            <w:t>2017</w:t>
-          </w:r>
-          <w:r>
-            <w:rPr>
-              <w:noProof/>
-              <w:lang w:val="en-US"/>
-            </w:rPr>
-            <w:t>)</w:t>
+            <w:t>(2017)</w:t>
           </w:r>
           <w:r>
             <w:fldChar w:fldCharType="end"/>
@@ -4569,7 +4435,7 @@
       <w:pPr>
         <w:pStyle w:val="Heading2"/>
       </w:pPr>
-      <w:bookmarkStart w:id="30" w:name="_Toc224572966"/>
+      <w:bookmarkStart w:id="30" w:name="_Toc224741010"/>
       <w:r>
         <w:t>Lagrangian Approach</w:t>
       </w:r>
@@ -4615,7 +4481,6 @@
           <w:id w:val="-431738386"/>
           <w:citation/>
         </w:sdtPr>
-        <w:sdtEndPr/>
         <w:sdtContent>
           <w:r>
             <w:fldChar w:fldCharType="begin"/>
@@ -4634,22 +4499,7 @@
               <w:noProof/>
               <w:lang w:val="en-US"/>
             </w:rPr>
-            <w:t>(</w:t>
-          </w:r>
-          <w:r>
-            <w:rPr>
-              <w:noProof/>
-              <w:highlight w:val="yellow"/>
-              <w:lang w:val="en-US"/>
-            </w:rPr>
-            <w:t>2022</w:t>
-          </w:r>
-          <w:r>
-            <w:rPr>
-              <w:noProof/>
-              <w:lang w:val="en-US"/>
-            </w:rPr>
-            <w:t>)</w:t>
+            <w:t>(2022)</w:t>
           </w:r>
           <w:r>
             <w:fldChar w:fldCharType="end"/>
@@ -4681,7 +4531,7 @@
       <w:pPr>
         <w:pStyle w:val="Heading2"/>
       </w:pPr>
-      <w:bookmarkStart w:id="31" w:name="_Toc224572967"/>
+      <w:bookmarkStart w:id="31" w:name="_Toc224741011"/>
       <w:r>
         <w:t>Lagrangian-Eulerian</w:t>
       </w:r>
@@ -4730,22 +4580,7 @@
               <w:noProof/>
               <w:lang w:val="en-US"/>
             </w:rPr>
-            <w:t>(</w:t>
-          </w:r>
-          <w:r>
-            <w:rPr>
-              <w:noProof/>
-              <w:highlight w:val="yellow"/>
-              <w:lang w:val="en-US"/>
-            </w:rPr>
-            <w:t>2012</w:t>
-          </w:r>
-          <w:r>
-            <w:rPr>
-              <w:noProof/>
-              <w:lang w:val="en-US"/>
-            </w:rPr>
-            <w:t>)</w:t>
+            <w:t>(2012)</w:t>
           </w:r>
           <w:r>
             <w:fldChar w:fldCharType="end"/>
@@ -4763,7 +4598,7 @@
       <w:pPr>
         <w:pStyle w:val="Heading1"/>
       </w:pPr>
-      <w:bookmarkStart w:id="32" w:name="_Toc224572968"/>
+      <w:bookmarkStart w:id="32" w:name="_Toc224741012"/>
       <w:r>
         <w:lastRenderedPageBreak/>
         <w:t>Recommendations</w:t>
@@ -4813,7 +4648,7 @@
       <w:pPr>
         <w:pStyle w:val="Heading2"/>
       </w:pPr>
-      <w:bookmarkStart w:id="33" w:name="_Toc224572969"/>
+      <w:bookmarkStart w:id="33" w:name="_Toc224741013"/>
       <w:r>
         <w:t>Particle System Design</w:t>
       </w:r>
@@ -4829,7 +4664,19 @@
         <w:t>Particles should store minimal state information</w:t>
       </w:r>
       <w:r>
-        <w:t xml:space="preserve"> - </w:t>
+        <w:t>;</w:t>
+      </w:r>
+      <w:r>
+        <w:t xml:space="preserve"> </w:t>
+      </w:r>
+      <w:r>
+        <w:t>I recommend</w:t>
+      </w:r>
+      <w:r>
+        <w:t xml:space="preserve"> </w:t>
+      </w:r>
+      <w:r>
+        <w:t xml:space="preserve">using only </w:t>
       </w:r>
       <w:r>
         <w:t>position, velocity and density. Reducing the amount of stored data improves performance and simplifies the update process during each simulation step. The particle update cycle should follow a consistent structure: first sampling the velocity field, then applying forces, and finally updating particle position.</w:t>
@@ -4845,7 +4692,7 @@
       <w:pPr>
         <w:pStyle w:val="Heading2"/>
       </w:pPr>
-      <w:bookmarkStart w:id="34" w:name="_Toc224572970"/>
+      <w:bookmarkStart w:id="34" w:name="_Toc224741014"/>
       <w:r>
         <w:lastRenderedPageBreak/>
         <w:t>Physical Parameter Control</w:t>
@@ -4869,14 +4716,23 @@
     </w:p>
     <w:p>
       <w:r>
-        <w:t>Surface tension can be included as an optional enhancement. While not strictly necessary for a simplified fluid simulation, it can improve the visual coherence of particle clusters and produce more natural fluid shapes when particles interact near boundaries or free surfaces.</w:t>
+        <w:t>Surface tension can be included as an optional enhancement. While not strictly necessary for a simplified fluid simulation</w:t>
+      </w:r>
+      <w:r>
+        <w:t xml:space="preserve"> as it </w:t>
+      </w:r>
+      <w:r>
+        <w:t>doesn’t apply to every fluid that may be simulated</w:t>
+      </w:r>
+      <w:r>
+        <w:t>, it can improve the visual coherence of particle clusters and produce more natural fluid shapes when particles interact near boundaries or free surfaces.</w:t>
       </w:r>
     </w:p>
     <w:p>
       <w:pPr>
         <w:pStyle w:val="Heading2"/>
       </w:pPr>
-      <w:bookmarkStart w:id="35" w:name="_Toc224572971"/>
+      <w:bookmarkStart w:id="35" w:name="_Toc224741015"/>
       <w:r>
         <w:t>Computational Cost</w:t>
       </w:r>
@@ -4884,7 +4740,37 @@
     </w:p>
     <w:p>
       <w:r>
-        <w:t>Even when using a hybrid model, computational cost remains an important consideration. To maintain performance, the simulation should avoid unnecessary calculations wherever possible. One effective strategy is limiting neighbour searches using spatial partitioning methods such as grid-based lookup tables. This ensures that particle interactions are only calculated between nearby particles rather than across the entire system.</w:t>
+        <w:t>Even when using a hybrid model, computational cost remains an important consideration. To maintain performance, the simulation should avoid unnecessary calculations wherever possible. One effective strategy is limiting neighbour searches. This</w:t>
+      </w:r>
+      <w:r>
+        <w:t xml:space="preserve"> can be done </w:t>
+      </w:r>
+      <w:r>
+        <w:t>by using a smoothing radius on particles to detect neighbours if using a particle only based system, or in the recommended hybrid approach</w:t>
+      </w:r>
+      <w:r>
+        <w:t xml:space="preserve"> we can look at neighbouring grid</w:t>
+      </w:r>
+      <w:r>
+        <w:t xml:space="preserve"> cells</w:t>
+      </w:r>
+      <w:r>
+        <w:t xml:space="preserve"> to the queried particle</w:t>
+      </w:r>
+      <w:r>
+        <w:t>’</w:t>
+      </w:r>
+      <w:r>
+        <w:t>s</w:t>
+      </w:r>
+      <w:r>
+        <w:t xml:space="preserve"> cell</w:t>
+      </w:r>
+      <w:r>
+        <w:t xml:space="preserve"> and</w:t>
+      </w:r>
+      <w:r>
+        <w:t xml:space="preserve"> ensures that particle interactions are only calculated between nearby particles rather than across the entire system.</w:t>
       </w:r>
     </w:p>
     <w:p>
@@ -4896,14 +4782,27 @@
       <w:pPr>
         <w:pStyle w:val="Heading2"/>
       </w:pPr>
+      <w:bookmarkStart w:id="36" w:name="_Toc224741016"/>
       <w:r>
         <w:t>Further Development</w:t>
       </w:r>
-    </w:p>
-    <w:p>
+      <w:bookmarkEnd w:id="36"/>
+    </w:p>
+    <w:p>
+      <w:pPr>
+        <w:rPr>
+          <w:color w:val="EE0000"/>
+        </w:rPr>
+      </w:pPr>
       <w:r>
         <w:t>While the recommended approach is effective for a simplified CFD simulation, there are still areas where the system could be expanded in future work. For example, the introduction of GPU-based computation could significantly increase the number of particles that can be simulated in real time. Many modern CFD systems use parallel processing to solve grid calculations more efficiently.</w:t>
       </w:r>
+      <w:r>
+        <w:rPr>
+          <w:color w:val="EE0000"/>
+        </w:rPr>
+        <w:t xml:space="preserve"> Reference this claim</w:t>
+      </w:r>
     </w:p>
     <w:p>
       <w:r>
@@ -4920,7 +4819,7 @@
       <w:pPr>
         <w:pStyle w:val="Heading1"/>
       </w:pPr>
-      <w:bookmarkStart w:id="36" w:name="_Toc224572973"/>
+      <w:bookmarkStart w:id="37" w:name="_Toc224741017"/>
       <w:r>
         <w:lastRenderedPageBreak/>
         <w:t xml:space="preserve">Conclusion and </w:t>
@@ -4928,9 +4827,9 @@
       <w:r>
         <w:t>Reflection</w:t>
       </w:r>
-      <w:bookmarkEnd w:id="36"/>
-    </w:p>
-    <w:bookmarkEnd w:id="11"/>
+      <w:bookmarkEnd w:id="37"/>
+    </w:p>
+    <w:bookmarkEnd w:id="12"/>
     <w:p>
       <w:pPr>
         <w:pStyle w:val="Quote"/>
@@ -5178,23 +5077,192 @@
     <w:p>
       <w:pPr>
         <w:rPr>
-          <w:color w:val="EE0000"/>
-        </w:rPr>
-      </w:pPr>
+          <w:color w:val="7030A0"/>
+        </w:rPr>
+      </w:pPr>
+      <w:r>
+        <w:rPr>
+          <w:color w:val="7030A0"/>
+        </w:rPr>
+        <w:t xml:space="preserve">Comment on how effective you </w:t>
+      </w:r>
+      <w:proofErr w:type="spellStart"/>
+      <w:r>
+        <w:rPr>
+          <w:color w:val="7030A0"/>
+        </w:rPr>
+        <w:t>beleeive</w:t>
+      </w:r>
+      <w:proofErr w:type="spellEnd"/>
+      <w:r>
+        <w:rPr>
+          <w:color w:val="7030A0"/>
+        </w:rPr>
+        <w:t xml:space="preserve"> </w:t>
+      </w:r>
+      <w:proofErr w:type="spellStart"/>
+      <w:r>
+        <w:rPr>
+          <w:color w:val="7030A0"/>
+        </w:rPr>
+        <w:t>yyour</w:t>
+      </w:r>
+      <w:proofErr w:type="spellEnd"/>
+      <w:r>
+        <w:rPr>
+          <w:color w:val="7030A0"/>
+        </w:rPr>
+        <w:t xml:space="preserve"> intended </w:t>
+      </w:r>
+      <w:proofErr w:type="spellStart"/>
+      <w:r>
+        <w:rPr>
+          <w:color w:val="7030A0"/>
+        </w:rPr>
+        <w:t>appraoh</w:t>
+      </w:r>
+      <w:proofErr w:type="spellEnd"/>
+      <w:r>
+        <w:rPr>
+          <w:color w:val="7030A0"/>
+        </w:rPr>
+        <w:t xml:space="preserve"> to be</w:t>
+      </w:r>
+    </w:p>
+    <w:p>
+      <w:pPr>
+        <w:rPr>
+          <w:color w:val="7030A0"/>
+        </w:rPr>
+      </w:pPr>
+      <w:r>
+        <w:rPr>
+          <w:color w:val="7030A0"/>
+        </w:rPr>
+        <w:t xml:space="preserve">How well does the evidence support your </w:t>
+      </w:r>
+      <w:proofErr w:type="spellStart"/>
+      <w:r>
+        <w:rPr>
+          <w:color w:val="7030A0"/>
+        </w:rPr>
+        <w:t>reccs</w:t>
+      </w:r>
+      <w:proofErr w:type="spellEnd"/>
+    </w:p>
+    <w:p>
+      <w:pPr>
+        <w:rPr>
+          <w:color w:val="7030A0"/>
+        </w:rPr>
+      </w:pPr>
+      <w:r>
+        <w:rPr>
+          <w:color w:val="7030A0"/>
+        </w:rPr>
+        <w:lastRenderedPageBreak/>
+        <w:t xml:space="preserve">What is the most significant part of your </w:t>
+      </w:r>
+      <w:proofErr w:type="spellStart"/>
+      <w:r>
+        <w:rPr>
+          <w:color w:val="7030A0"/>
+        </w:rPr>
+        <w:t>reccs</w:t>
+      </w:r>
+      <w:proofErr w:type="spellEnd"/>
+    </w:p>
+    <w:p>
+      <w:pPr>
+        <w:rPr>
+          <w:color w:val="7030A0"/>
+        </w:rPr>
+      </w:pPr>
+      <w:r>
+        <w:rPr>
+          <w:color w:val="7030A0"/>
+        </w:rPr>
+        <w:t>REFLECTION</w:t>
+      </w:r>
+    </w:p>
+    <w:p>
+      <w:pPr>
+        <w:rPr>
+          <w:color w:val="7030A0"/>
+        </w:rPr>
+      </w:pPr>
+      <w:r>
+        <w:rPr>
+          <w:color w:val="7030A0"/>
+        </w:rPr>
+        <w:t>How well has the project wrong</w:t>
+      </w:r>
+    </w:p>
+    <w:p>
+      <w:pPr>
+        <w:rPr>
+          <w:color w:val="7030A0"/>
+        </w:rPr>
+      </w:pPr>
+      <w:r>
+        <w:rPr>
+          <w:color w:val="7030A0"/>
+        </w:rPr>
+        <w:tab/>
+      </w:r>
+      <w:proofErr w:type="spellStart"/>
+      <w:r>
+        <w:rPr>
+          <w:color w:val="7030A0"/>
+        </w:rPr>
+        <w:t>Whats</w:t>
+      </w:r>
+      <w:proofErr w:type="spellEnd"/>
+      <w:r>
+        <w:rPr>
+          <w:color w:val="7030A0"/>
+        </w:rPr>
+        <w:t xml:space="preserve"> </w:t>
+      </w:r>
+      <w:proofErr w:type="gramStart"/>
+      <w:r>
+        <w:rPr>
+          <w:color w:val="7030A0"/>
+        </w:rPr>
+        <w:t>has</w:t>
+      </w:r>
+      <w:proofErr w:type="gramEnd"/>
+      <w:r>
+        <w:rPr>
+          <w:color w:val="7030A0"/>
+        </w:rPr>
+        <w:t xml:space="preserve"> gone well / what could have gone better</w:t>
+      </w:r>
     </w:p>
     <w:p>
       <w:pPr>
         <w:suppressAutoHyphens w:val="0"/>
-      </w:pPr>
-      <w:r>
-        <w:br w:type="page"/>
-      </w:r>
+        <w:rPr>
+          <w:color w:val="7030A0"/>
+        </w:rPr>
+      </w:pPr>
+      <w:r>
+        <w:rPr>
+          <w:color w:val="7030A0"/>
+        </w:rPr>
+        <w:t>How can you realise these strengths again</w:t>
+      </w:r>
+    </w:p>
+    <w:p>
+      <w:pPr>
+        <w:suppressAutoHyphens w:val="0"/>
+      </w:pPr>
     </w:p>
     <w:p>
       <w:pPr>
         <w:pStyle w:val="Heading1"/>
       </w:pPr>
-      <w:bookmarkStart w:id="37" w:name="_Toc224572974"/>
+      <w:bookmarkStart w:id="38" w:name="_Toc224741018"/>
       <w:r>
         <w:rPr>
           <w:noProof/>
@@ -5506,12 +5574,12 @@
           </mc:Fallback>
         </mc:AlternateContent>
       </w:r>
-      <w:bookmarkEnd w:id="37"/>
       <w:r>
         <w:t>below refs not implemented yet</w:t>
       </w:r>
-    </w:p>
-    <w:bookmarkStart w:id="38" w:name="_Toc224572975" w:displacedByCustomXml="next"/>
+      <w:bookmarkEnd w:id="38"/>
+    </w:p>
+    <w:bookmarkStart w:id="39" w:name="_Toc224741019" w:displacedByCustomXml="next"/>
     <w:sdt>
       <w:sdtPr>
         <w:rPr>
@@ -5527,7 +5595,6 @@
           <w:docPartUnique/>
         </w:docPartObj>
       </w:sdtPr>
-      <w:sdtEndPr/>
       <w:sdtContent>
         <w:p>
           <w:pPr>
@@ -5536,14 +5603,13 @@
           <w:r>
             <w:t>References</w:t>
           </w:r>
-          <w:bookmarkEnd w:id="38"/>
+          <w:bookmarkEnd w:id="39"/>
         </w:p>
         <w:sdt>
           <w:sdtPr>
             <w:id w:val="-573587230"/>
             <w:bibliography/>
           </w:sdtPr>
-          <w:sdtEndPr/>
           <w:sdtContent>
             <w:p>
               <w:pPr>
@@ -7339,6 +7405,7 @@
   <w:style w:type="character" w:default="1" w:styleId="DefaultParagraphFont">
     <w:name w:val="Default Paragraph Font"/>
     <w:uiPriority w:val="1"/>
+    <w:semiHidden/>
     <w:unhideWhenUsed/>
   </w:style>
   <w:style w:type="table" w:default="1" w:styleId="TableNormal">
@@ -7970,15 +8037,6 @@
 </file>
 
 <file path=customXml/item1.xml><?xml version="1.0" encoding="utf-8"?>
-<?mso-contentType ?>
-<FormTemplates xmlns="http://schemas.microsoft.com/sharepoint/v3/contenttype/forms">
-  <Display>DocumentLibraryForm</Display>
-  <Edit>DocumentLibraryForm</Edit>
-  <New>DocumentLibraryForm</New>
-</FormTemplates>
-</file>
-
-<file path=customXml/item2.xml><?xml version="1.0" encoding="utf-8"?>
 <ct:contentTypeSchema xmlns:ct="http://schemas.microsoft.com/office/2006/metadata/contentType" xmlns:ma="http://schemas.microsoft.com/office/2006/metadata/properties/metaAttributes" ct:_="" ma:_="" ma:contentTypeName="Document" ma:contentTypeID="0x010100D9F37D7A4EDC1040A880A2099F6664D1" ma:contentTypeVersion="17" ma:contentTypeDescription="Create a new document." ma:contentTypeScope="" ma:versionID="08efb0d5db8d1d6db33b2f38db1086d5">
   <xsd:schema xmlns:xsd="http://www.w3.org/2001/XMLSchema" xmlns:xs="http://www.w3.org/2001/XMLSchema" xmlns:p="http://schemas.microsoft.com/office/2006/metadata/properties" xmlns:ns2="8d4a1fdf-0f94-4e24-9675-6342052676c2" xmlns:ns3="e2a5ad16-c4e7-4aee-be6c-2d964216012c" xmlns:ns4="efc3e123-a60a-4a17-aaf1-487e28d9a3b3" targetNamespace="http://schemas.microsoft.com/office/2006/metadata/properties" ma:root="true" ma:fieldsID="8080e491b76ba13211cd04da0d5e9449" ns2:_="" ns3:_="" ns4:_="">
     <xsd:import namespace="8d4a1fdf-0f94-4e24-9675-6342052676c2"/>
@@ -8239,22 +8297,16 @@
 </ct:contentTypeSchema>
 </file>
 
-<file path=customXml/item3.xml><?xml version="1.0" encoding="utf-8"?>
-<p:properties xmlns:p="http://schemas.microsoft.com/office/2006/metadata/properties" xmlns:xsi="http://www.w3.org/2001/XMLSchema-instance" xmlns:pc="http://schemas.microsoft.com/office/infopath/2007/PartnerControls">
-  <documentManagement>
-    <TaxCatchAll xmlns="efc3e123-a60a-4a17-aaf1-487e28d9a3b3" xsi:nil="true"/>
-    <URL xmlns="8d4a1fdf-0f94-4e24-9675-6342052676c2">
-      <Url xsi:nil="true"/>
-      <Description xsi:nil="true"/>
-    </URL>
-    <lcf76f155ced4ddcb4097134ff3c332f xmlns="8d4a1fdf-0f94-4e24-9675-6342052676c2">
-      <Terms xmlns="http://schemas.microsoft.com/office/infopath/2007/PartnerControls"/>
-    </lcf76f155ced4ddcb4097134ff3c332f>
-  </documentManagement>
-</p:properties>
+<file path=customXml/item2.xml><?xml version="1.0" encoding="utf-8"?>
+<?mso-contentType ?>
+<FormTemplates xmlns="http://schemas.microsoft.com/sharepoint/v3/contenttype/forms">
+  <Display>DocumentLibraryForm</Display>
+  <Edit>DocumentLibraryForm</Edit>
+  <New>DocumentLibraryForm</New>
+</FormTemplates>
 </file>
 
-<file path=customXml/item4.xml><?xml version="1.0" encoding="utf-8"?>
+<file path=customXml/item3.xml><?xml version="1.0" encoding="utf-8"?>
 <b:Sources xmlns:b="http://schemas.openxmlformats.org/officeDocument/2006/bibliography" xmlns="http://schemas.openxmlformats.org/officeDocument/2006/bibliography" SelectedStyle="\HarvardAnglia2008OfficeOnline.xsl" StyleName="Harvard - Anglia" Version="2008">
   <b:Source>
     <b:Tag>Sch22</b:Tag>
@@ -8483,15 +8535,22 @@
 </b:Sources>
 </file>
 
-<file path=customXml/itemProps1.xml><?xml version="1.0" encoding="utf-8"?>
-<ds:datastoreItem xmlns:ds="http://schemas.openxmlformats.org/officeDocument/2006/customXml" ds:itemID="{0C9F64BE-1583-4619-A2B5-DACC1568FF50}">
-  <ds:schemaRefs>
-    <ds:schemaRef ds:uri="http://schemas.microsoft.com/sharepoint/v3/contenttype/forms"/>
-  </ds:schemaRefs>
-</ds:datastoreItem>
+<file path=customXml/item4.xml><?xml version="1.0" encoding="utf-8"?>
+<p:properties xmlns:p="http://schemas.microsoft.com/office/2006/metadata/properties" xmlns:xsi="http://www.w3.org/2001/XMLSchema-instance" xmlns:pc="http://schemas.microsoft.com/office/infopath/2007/PartnerControls">
+  <documentManagement>
+    <TaxCatchAll xmlns="efc3e123-a60a-4a17-aaf1-487e28d9a3b3" xsi:nil="true"/>
+    <URL xmlns="8d4a1fdf-0f94-4e24-9675-6342052676c2">
+      <Url xsi:nil="true"/>
+      <Description xsi:nil="true"/>
+    </URL>
+    <lcf76f155ced4ddcb4097134ff3c332f xmlns="8d4a1fdf-0f94-4e24-9675-6342052676c2">
+      <Terms xmlns="http://schemas.microsoft.com/office/infopath/2007/PartnerControls"/>
+    </lcf76f155ced4ddcb4097134ff3c332f>
+  </documentManagement>
+</p:properties>
 </file>
 
-<file path=customXml/itemProps2.xml><?xml version="1.0" encoding="utf-8"?>
+<file path=customXml/itemProps1.xml><?xml version="1.0" encoding="utf-8"?>
 <ds:datastoreItem xmlns:ds="http://schemas.openxmlformats.org/officeDocument/2006/customXml" ds:itemID="{277562E8-9AEC-4BC0-8DEC-73418E65CD9A}">
   <ds:schemaRefs>
     <ds:schemaRef ds:uri="http://schemas.microsoft.com/office/2006/metadata/contentType"/>
@@ -8511,7 +8570,23 @@
 </ds:datastoreItem>
 </file>
 
+<file path=customXml/itemProps2.xml><?xml version="1.0" encoding="utf-8"?>
+<ds:datastoreItem xmlns:ds="http://schemas.openxmlformats.org/officeDocument/2006/customXml" ds:itemID="{0C9F64BE-1583-4619-A2B5-DACC1568FF50}">
+  <ds:schemaRefs>
+    <ds:schemaRef ds:uri="http://schemas.microsoft.com/sharepoint/v3/contenttype/forms"/>
+  </ds:schemaRefs>
+</ds:datastoreItem>
+</file>
+
 <file path=customXml/itemProps3.xml><?xml version="1.0" encoding="utf-8"?>
+<ds:datastoreItem xmlns:ds="http://schemas.openxmlformats.org/officeDocument/2006/customXml" ds:itemID="{EA927226-856E-459B-A400-7DBA7C7D9F85}">
+  <ds:schemaRefs>
+    <ds:schemaRef ds:uri="http://schemas.openxmlformats.org/officeDocument/2006/bibliography"/>
+  </ds:schemaRefs>
+</ds:datastoreItem>
+</file>
+
+<file path=customXml/itemProps4.xml><?xml version="1.0" encoding="utf-8"?>
 <ds:datastoreItem xmlns:ds="http://schemas.openxmlformats.org/officeDocument/2006/customXml" ds:itemID="{42CBECF3-DA57-4A6F-BD38-883BFD60FEF9}">
   <ds:schemaRefs>
     <ds:schemaRef ds:uri="http://schemas.microsoft.com/office/2006/metadata/properties"/>
@@ -8520,12 +8595,4 @@
     <ds:schemaRef ds:uri="8d4a1fdf-0f94-4e24-9675-6342052676c2"/>
   </ds:schemaRefs>
 </ds:datastoreItem>
-</file>
-
-<file path=customXml/itemProps4.xml><?xml version="1.0" encoding="utf-8"?>
-<ds:datastoreItem xmlns:ds="http://schemas.openxmlformats.org/officeDocument/2006/customXml" ds:itemID="{EA927226-856E-459B-A400-7DBA7C7D9F85}">
-  <ds:schemaRefs>
-    <ds:schemaRef ds:uri="http://schemas.openxmlformats.org/officeDocument/2006/bibliography"/>
-  </ds:schemaRefs>
-</ds:datastoreItem>
 </file>
</xml_diff>